<commit_message>
fix(document): align action 406F mapping key to match actual template heading precisely
</commit_message>
<xml_diff>
--- a/Actielijst.docx
+++ b/Actielijst.docx
@@ -3737,7 +3737,7 @@
             <w:b/>
             <w:bCs/>
           </w:rPr>
-          <w:t>🫱</w:t>
+          <w:t>🫱🏻‍🫲🏻 406F. De baas bepaald volgende status en verifieert effort per resterende fase</w:t>
         </w:r>
         <w:r>
           <w:rPr>
@@ -3757,7 +3757,7 @@
               <w16se:symEx w16se:font="Segoe UI Emoji" w16se:char="1F3FB"/>
             </mc:Choice>
             <mc:Fallback>
-              <w:t>🏻</w:t>
+              <w:t/>
             </mc:Fallback>
           </mc:AlternateContent>
         </w:r>
@@ -3767,7 +3767,7 @@
             <w:b/>
             <w:bCs/>
           </w:rPr>
-          <w:t>‍</w:t>
+          <w:t/>
         </w:r>
         <w:r>
           <w:rPr>
@@ -3775,7 +3775,7 @@
             <w:b/>
             <w:bCs/>
           </w:rPr>
-          <w:t>🫲</w:t>
+          <w:t/>
         </w:r>
         <w:r>
           <w:rPr>
@@ -3795,7 +3795,7 @@
               <w16se:symEx w16se:font="Segoe UI Emoji" w16se:char="1F3FB"/>
             </mc:Choice>
             <mc:Fallback>
-              <w:t>🏻</w:t>
+              <w:t/>
             </mc:Fallback>
           </mc:AlternateContent>
         </w:r>
@@ -3803,25 +3803,25 @@
           <w:rPr>
             <w:rFonts w:cs="Segoe UI Emoji"/>
           </w:rPr>
-          <w:t xml:space="preserve"> </w:t>
+          <w:t xml:space="preserve"/>
         </w:r>
         <w:r>
           <w:rPr>
             <w:rFonts w:cs="Segoe UI Emoji"/>
           </w:rPr>
-          <w:t>G</w:t>
+          <w:t/>
         </w:r>
         <w:r>
           <w:rPr>
             <w:rFonts w:cs="Segoe UI Emoji"/>
           </w:rPr>
-          <w:t xml:space="preserve">. </w:t>
+          <w:t xml:space="preserve"/>
         </w:r>
         <w:r>
           <w:rPr>
             <w:rFonts w:cs="Segoe UI Emoji"/>
           </w:rPr>
-          <w:t>De baas bepaald volgende status</w:t>
+          <w:t/>
         </w:r>
       </w:ins>
     </w:p>

</xml_diff>

<commit_message>
feat(flow): combine boss presence, remove review timers, and split status/effort actions
</commit_message>
<xml_diff>
--- a/Actielijst.docx
+++ b/Actielijst.docx
@@ -1414,7 +1414,7 @@
             <w:b/>
             <w:bCs/>
           </w:rPr>
-          <w:t>🫱🏻‍🫲🏻 202. Is de baas aanwezig?</w:t>
+          <w:t>🫱</w:t>
         </w:r>
         <w:r>
           <w:rPr>
@@ -1434,7 +1434,7 @@
               <w16se:symEx w16se:font="Segoe UI Emoji" w16se:char="1F3FB"/>
             </mc:Choice>
             <mc:Fallback>
-              <w:t/>
+              <w:t>🏻</w:t>
             </mc:Fallback>
           </mc:AlternateContent>
         </w:r>
@@ -1444,7 +1444,7 @@
             <w:b/>
             <w:bCs/>
           </w:rPr>
-          <w:t/>
+          <w:t>‍</w:t>
         </w:r>
         <w:r>
           <w:rPr>
@@ -1452,7 +1452,7 @@
             <w:b/>
             <w:bCs/>
           </w:rPr>
-          <w:t/>
+          <w:t>🫲</w:t>
         </w:r>
         <w:r>
           <w:rPr>
@@ -1472,7 +1472,7 @@
               <w16se:symEx w16se:font="Segoe UI Emoji" w16se:char="1F3FB"/>
             </mc:Choice>
             <mc:Fallback>
-              <w:t/>
+              <w:t>🏻</w:t>
             </mc:Fallback>
           </mc:AlternateContent>
         </w:r>
@@ -1480,7 +1480,7 @@
           <w:rPr>
             <w:rFonts w:cs="Segoe UI Emoji"/>
           </w:rPr>
-          <w:t xml:space="preserve"/>
+          <w:t xml:space="preserve"> B. </w:t>
         </w:r>
       </w:ins>
       <w:ins w:author="Rinse Cramer" w:date="2025-12-13T10:35:00Z" w16du:dateUtc="2025-12-13T09:35:00Z" w:id="149">
@@ -1494,7 +1494,7 @@
               </w:rPr>
             </w:rPrChange>
           </w:rPr>
-          <w:t/>
+          <w:t>Is de baas aanwezig?</w:t>
         </w:r>
       </w:ins>
     </w:p>
@@ -1542,20 +1542,104 @@
     </w:p>
     <w:p>
       <w:pPr>
+        <w:pStyle w:val="ListParagraph"/>
+        <w:numPr>
+          <w:ilvl w:val="0"/>
+          <w:numId w:val="41"/>
+        </w:numPr>
+        <w:rPr>
+          <w:ins w:author="Rinse Cramer" w:date="2025-12-13T10:38:00Z" w16du:dateUtc="2025-12-13T09:38:00Z" w:id="160"/>
+        </w:rPr>
+      </w:pPr>
+      <w:ins w:author="Rinse Cramer" w:date="2025-12-13T10:43:00Z" w16du:dateUtc="2025-12-13T09:43:00Z" w:id="161">
+        <w:r>
+          <w:t>5</w:t>
+        </w:r>
+      </w:ins>
+      <w:ins w:author="Rinse Cramer" w:date="2025-12-13T10:38:00Z" w16du:dateUtc="2025-12-13T09:38:00Z" w:id="162">
+        <w:r>
+          <w:t>. Baas is schriftelijk beschikbaar</w:t>
+        </w:r>
+      </w:ins>
+    </w:p>
+    <w:p>
+      <w:pPr>
+        <w:pStyle w:val="ListParagraph"/>
+        <w:numPr>
+          <w:ilvl w:val="0"/>
+          <w:numId w:val="41"/>
+        </w:numPr>
+        <w:rPr>
+          <w:ins w:author="Rinse Cramer" w:date="2025-12-13T10:39:00Z" w16du:dateUtc="2025-12-13T09:39:00Z" w:id="163"/>
+        </w:rPr>
+      </w:pPr>
+      <w:ins w:author="Rinse Cramer" w:date="2025-12-13T10:44:00Z" w16du:dateUtc="2025-12-13T09:44:00Z" w:id="164">
+        <w:r>
+          <w:t>6</w:t>
+        </w:r>
+      </w:ins>
+      <w:ins w:author="Rinse Cramer" w:date="2025-12-13T10:38:00Z" w16du:dateUtc="2025-12-13T09:38:00Z" w:id="165">
+        <w:r>
+          <w:t>. Aa</w:t>
+        </w:r>
+      </w:ins>
+      <w:ins w:author="Rinse Cramer" w:date="2025-12-13T10:39:00Z" w16du:dateUtc="2025-12-13T09:39:00Z" w:id="166">
+        <w:r>
+          <w:t xml:space="preserve">nwezigheid </w:t>
+        </w:r>
+        <w:r>
+          <w:t>monitoren</w:t>
+        </w:r>
+      </w:ins>
+    </w:p>
+    <w:p>
+      <w:pPr>
+        <w:pStyle w:val="ListParagraph"/>
+        <w:numPr>
+          <w:ilvl w:val="0"/>
+          <w:numId w:val="41"/>
+        </w:numPr>
+        <w:rPr>
+          <w:ins w:author="Rinse Cramer" w:date="2025-12-13T10:38:00Z" w16du:dateUtc="2025-12-13T09:38:00Z" w:id="169"/>
+        </w:rPr>
+      </w:pPr>
+      <w:ins w:author="Rinse Cramer" w:date="2025-12-13T10:44:00Z" w16du:dateUtc="2025-12-13T09:44:00Z" w:id="170">
+        <w:r>
+          <w:t>7</w:t>
+        </w:r>
+      </w:ins>
+      <w:ins w:author="Rinse Cramer" w:date="2025-12-13T10:39:00Z" w16du:dateUtc="2025-12-13T09:39:00Z" w:id="171">
+        <w:r>
+          <w:t xml:space="preserve">. Baas is </w:t>
+        </w:r>
+      </w:ins>
+      <w:ins w:author="Rinse Cramer" w:date="2025-12-13T10:40:00Z" w16du:dateUtc="2025-12-13T09:40:00Z" w:id="172">
+        <w:r>
+          <w:t>mondeling</w:t>
+        </w:r>
+      </w:ins>
+      <w:ins w:author="Rinse Cramer" w:date="2025-12-13T10:39:00Z" w16du:dateUtc="2025-12-13T09:39:00Z" w:id="173">
+        <w:r>
+          <w:t xml:space="preserve"> beschikbaar</w:t>
+        </w:r>
+      </w:ins>
+    </w:p>
+    <w:p>
+      <w:pPr>
         <w:pStyle w:val="Heading1"/>
         <w:rPr>
-          <w:ins w:author="Rinse Cramer" w:date="2025-12-13T10:38:00Z" w16du:dateUtc="2025-12-13T09:38:00Z" w:id="158"/>
+          <w:ins w:author="Rinse Cramer" w:date="2025-12-13T10:40:00Z" w16du:dateUtc="2025-12-13T09:40:00Z" w:id="174"/>
           <w:rFonts w:cs="Segoe UI Emoji"/>
         </w:rPr>
       </w:pPr>
-      <w:ins w:author="Rinse Cramer" w:date="2025-12-13T10:38:00Z" w16du:dateUtc="2025-12-13T09:38:00Z" w:id="159">
+      <w:ins w:author="Rinse Cramer" w:date="2025-12-13T10:40:00Z" w16du:dateUtc="2025-12-13T09:40:00Z" w:id="175">
         <w:r>
           <w:rPr>
             <w:rFonts w:ascii="Segoe UI Emoji" w:hAnsi="Segoe UI Emoji" w:cs="Segoe UI Emoji"/>
             <w:b/>
             <w:bCs/>
           </w:rPr>
-          <w:t>🫱🏻‍🫲🏻 202F. Meteen meldplicht wanneer de baas aanwezig is</w:t>
+          <w:t>🫱</w:t>
         </w:r>
         <w:r>
           <w:rPr>
@@ -1575,7 +1659,7 @@
               <w16se:symEx w16se:font="Segoe UI Emoji" w16se:char="1F3FB"/>
             </mc:Choice>
             <mc:Fallback>
-              <w:t/>
+              <w:t>🏻</w:t>
             </mc:Fallback>
           </mc:AlternateContent>
         </w:r>
@@ -1585,7 +1669,7 @@
             <w:b/>
             <w:bCs/>
           </w:rPr>
-          <w:t/>
+          <w:t>‍</w:t>
         </w:r>
         <w:r>
           <w:rPr>
@@ -1593,7 +1677,7 @@
             <w:b/>
             <w:bCs/>
           </w:rPr>
-          <w:t/>
+          <w:t>🫲</w:t>
         </w:r>
         <w:r>
           <w:rPr>
@@ -1613,7 +1697,7 @@
               <w16se:symEx w16se:font="Segoe UI Emoji" w16se:char="1F3FB"/>
             </mc:Choice>
             <mc:Fallback>
-              <w:t/>
+              <w:t>🏻</w:t>
             </mc:Fallback>
           </mc:AlternateContent>
         </w:r>
@@ -1621,31 +1705,31 @@
           <w:rPr>
             <w:rFonts w:cs="Segoe UI Emoji"/>
           </w:rPr>
-          <w:t xml:space="preserve"/>
+          <w:t xml:space="preserve"> </w:t>
         </w:r>
         <w:r>
           <w:rPr>
             <w:rFonts w:cs="Segoe UI Emoji"/>
           </w:rPr>
-          <w:t/>
+          <w:t>E</w:t>
         </w:r>
         <w:r>
           <w:rPr>
             <w:rFonts w:cs="Segoe UI Emoji"/>
           </w:rPr>
-          <w:t xml:space="preserve"/>
+          <w:t xml:space="preserve">. </w:t>
         </w:r>
         <w:r>
           <w:rPr>
             <w:rFonts w:cs="Segoe UI Emoji"/>
           </w:rPr>
-          <w:t xml:space="preserve"/>
+          <w:t xml:space="preserve">Bespreek oplossingsrichting, </w:t>
         </w:r>
         <w:r>
           <w:rPr>
             <w:rFonts w:cs="Segoe UI Emoji"/>
           </w:rPr>
-          <w:t/>
+          <w:t>deliverables en ETC’s</w:t>
         </w:r>
       </w:ins>
     </w:p>
@@ -1657,66 +1741,39 @@
           <w:numId w:val="41"/>
         </w:numPr>
         <w:rPr>
-          <w:ins w:author="Rinse Cramer" w:date="2025-12-13T10:38:00Z" w16du:dateUtc="2025-12-13T09:38:00Z" w:id="160"/>
-        </w:rPr>
-      </w:pPr>
-      <w:ins w:author="Rinse Cramer" w:date="2025-12-13T10:43:00Z" w16du:dateUtc="2025-12-13T09:43:00Z" w:id="161">
-        <w:r>
-          <w:t>5</w:t>
-        </w:r>
-      </w:ins>
-      <w:ins w:author="Rinse Cramer" w:date="2025-12-13T10:38:00Z" w16du:dateUtc="2025-12-13T09:38:00Z" w:id="162">
-        <w:r>
-          <w:t>. Baas is schriftelijk beschikbaar</w:t>
-        </w:r>
-      </w:ins>
-    </w:p>
-    <w:p>
-      <w:pPr>
-        <w:pStyle w:val="ListParagraph"/>
-        <w:numPr>
-          <w:ilvl w:val="0"/>
-          <w:numId w:val="41"/>
-        </w:numPr>
-        <w:rPr>
-          <w:ins w:author="Rinse Cramer" w:date="2025-12-13T10:39:00Z" w16du:dateUtc="2025-12-13T09:39:00Z" w:id="163"/>
-        </w:rPr>
-      </w:pPr>
-      <w:ins w:author="Rinse Cramer" w:date="2025-12-13T10:44:00Z" w16du:dateUtc="2025-12-13T09:44:00Z" w:id="164">
-        <w:r>
-          <w:t>6</w:t>
-        </w:r>
-      </w:ins>
-      <w:ins w:author="Rinse Cramer" w:date="2025-12-13T10:38:00Z" w16du:dateUtc="2025-12-13T09:38:00Z" w:id="165">
-        <w:r>
-          <w:t>. Aa</w:t>
-        </w:r>
-      </w:ins>
-      <w:ins w:author="Rinse Cramer" w:date="2025-12-13T10:39:00Z" w16du:dateUtc="2025-12-13T09:39:00Z" w:id="166">
-        <w:r>
-          <w:t xml:space="preserve">nwezigheid </w:t>
-        </w:r>
-        <w:r>
-          <w:t>monitoren</w:t>
-        </w:r>
-      </w:ins>
+          <w:ins w:author="Rinse Cramer" w:date="2025-12-13T10:40:00Z" w16du:dateUtc="2025-12-13T09:40:00Z" w:id="176"/>
+        </w:rPr>
+      </w:pPr>
+      <w:ins w:author="Rinse Cramer" w:date="2025-12-13T10:44:00Z" w16du:dateUtc="2025-12-13T09:44:00Z" w:id="177">
+        <w:r>
+          <w:t>8</w:t>
+        </w:r>
+      </w:ins>
+      <w:ins w:author="Rinse Cramer" w:date="2025-12-13T10:40:00Z" w16du:dateUtc="2025-12-13T09:40:00Z" w:id="178">
+        <w:r>
+          <w:t xml:space="preserve">. </w:t>
+        </w:r>
+      </w:ins>
+      <w:r>
+        <w:t>Ik mail naar baas</w:t>
+      </w:r>
     </w:p>
     <w:p>
       <w:pPr>
         <w:pStyle w:val="Heading1"/>
         <w:rPr>
-          <w:ins w:author="Rinse Cramer" w:date="2025-12-13T10:39:00Z" w16du:dateUtc="2025-12-13T09:39:00Z" w:id="167"/>
+          <w:ins w:author="Rinse Cramer" w:date="2025-12-13T10:41:00Z" w16du:dateUtc="2025-12-13T09:41:00Z" w:id="179"/>
           <w:rFonts w:cs="Segoe UI Emoji"/>
         </w:rPr>
       </w:pPr>
-      <w:ins w:author="Rinse Cramer" w:date="2025-12-13T10:39:00Z" w16du:dateUtc="2025-12-13T09:39:00Z" w:id="168">
+      <w:ins w:author="Rinse Cramer" w:date="2025-12-13T10:41:00Z" w16du:dateUtc="2025-12-13T09:41:00Z" w:id="180">
         <w:r>
           <w:rPr>
             <w:rFonts w:ascii="Segoe UI Emoji" w:hAnsi="Segoe UI Emoji" w:cs="Segoe UI Emoji"/>
             <w:b/>
             <w:bCs/>
           </w:rPr>
-          <w:t>🫱🏻‍🫲🏻 202T. Na dat de baas weer aanwezig is</w:t>
+          <w:t>🫱</w:t>
         </w:r>
         <w:r>
           <w:rPr>
@@ -1736,7 +1793,7 @@
               <w16se:symEx w16se:font="Segoe UI Emoji" w16se:char="1F3FB"/>
             </mc:Choice>
             <mc:Fallback>
-              <w:t/>
+              <w:t>🏻</w:t>
             </mc:Fallback>
           </mc:AlternateContent>
         </w:r>
@@ -1746,7 +1803,7 @@
             <w:b/>
             <w:bCs/>
           </w:rPr>
-          <w:t/>
+          <w:t>‍</w:t>
         </w:r>
         <w:r>
           <w:rPr>
@@ -1754,7 +1811,7 @@
             <w:b/>
             <w:bCs/>
           </w:rPr>
-          <w:t/>
+          <w:t>🫲</w:t>
         </w:r>
         <w:r>
           <w:rPr>
@@ -1774,7 +1831,7 @@
               <w16se:symEx w16se:font="Segoe UI Emoji" w16se:char="1F3FB"/>
             </mc:Choice>
             <mc:Fallback>
-              <w:t/>
+              <w:t>🏻</w:t>
             </mc:Fallback>
           </mc:AlternateContent>
         </w:r>
@@ -1782,25 +1839,25 @@
           <w:rPr>
             <w:rFonts w:cs="Segoe UI Emoji"/>
           </w:rPr>
-          <w:t xml:space="preserve"/>
+          <w:t xml:space="preserve"> </w:t>
         </w:r>
         <w:r>
           <w:rPr>
             <w:rFonts w:cs="Segoe UI Emoji"/>
           </w:rPr>
-          <w:t/>
+          <w:t>F</w:t>
         </w:r>
         <w:r>
           <w:rPr>
             <w:rFonts w:cs="Segoe UI Emoji"/>
           </w:rPr>
-          <w:t xml:space="preserve"/>
+          <w:t xml:space="preserve">. </w:t>
         </w:r>
         <w:r>
           <w:rPr>
             <w:rFonts w:cs="Segoe UI Emoji"/>
           </w:rPr>
-          <w:t/>
+          <w:t>Goedkeuring?</w:t>
         </w:r>
       </w:ins>
     </w:p>
@@ -1812,27 +1869,32 @@
           <w:numId w:val="41"/>
         </w:numPr>
         <w:rPr>
-          <w:ins w:author="Rinse Cramer" w:date="2025-12-13T10:38:00Z" w16du:dateUtc="2025-12-13T09:38:00Z" w:id="169"/>
-        </w:rPr>
-      </w:pPr>
-      <w:ins w:author="Rinse Cramer" w:date="2025-12-13T10:44:00Z" w16du:dateUtc="2025-12-13T09:44:00Z" w:id="170">
-        <w:r>
-          <w:t>7</w:t>
-        </w:r>
-      </w:ins>
-      <w:ins w:author="Rinse Cramer" w:date="2025-12-13T10:39:00Z" w16du:dateUtc="2025-12-13T09:39:00Z" w:id="171">
-        <w:r>
-          <w:t xml:space="preserve">. Baas is </w:t>
-        </w:r>
-      </w:ins>
-      <w:ins w:author="Rinse Cramer" w:date="2025-12-13T10:40:00Z" w16du:dateUtc="2025-12-13T09:40:00Z" w:id="172">
-        <w:r>
-          <w:t>mondeling</w:t>
-        </w:r>
-      </w:ins>
-      <w:ins w:author="Rinse Cramer" w:date="2025-12-13T10:39:00Z" w16du:dateUtc="2025-12-13T09:39:00Z" w:id="173">
-        <w:r>
-          <w:t xml:space="preserve"> beschikbaar</w:t>
+          <w:ins w:author="Rinse Cramer" w:date="2025-12-13T10:41:00Z" w16du:dateUtc="2025-12-13T09:41:00Z" w:id="181"/>
+        </w:rPr>
+      </w:pPr>
+      <w:ins w:author="Rinse Cramer" w:date="2025-12-13T10:44:00Z" w16du:dateUtc="2025-12-13T09:44:00Z" w:id="182">
+        <w:r>
+          <w:t>9</w:t>
+        </w:r>
+      </w:ins>
+      <w:ins w:author="Rinse Cramer" w:date="2025-12-13T10:41:00Z" w16du:dateUtc="2025-12-13T09:41:00Z" w:id="183">
+        <w:r>
+          <w:t xml:space="preserve">. </w:t>
+        </w:r>
+      </w:ins>
+      <w:ins w:author="Rinse Cramer" w:date="2025-12-13T10:42:00Z" w16du:dateUtc="2025-12-13T09:42:00Z" w:id="184">
+        <w:r>
+          <w:t>R</w:t>
+        </w:r>
+      </w:ins>
+      <w:ins w:author="Rinse Cramer" w:date="2025-12-13T10:41:00Z" w16du:dateUtc="2025-12-13T09:41:00Z" w:id="185">
+        <w:r>
+          <w:t xml:space="preserve">esultaten </w:t>
+        </w:r>
+      </w:ins>
+      <w:ins w:author="Rinse Cramer" w:date="2025-12-13T10:42:00Z" w16du:dateUtc="2025-12-13T09:42:00Z" w:id="186">
+        <w:r>
+          <w:t>zijn goedgekeurd?</w:t>
         </w:r>
       </w:ins>
     </w:p>
@@ -1840,18 +1902,18 @@
       <w:pPr>
         <w:pStyle w:val="Heading1"/>
         <w:rPr>
-          <w:ins w:author="Rinse Cramer" w:date="2025-12-13T10:40:00Z" w16du:dateUtc="2025-12-13T09:40:00Z" w:id="174"/>
+          <w:ins w:author="Rinse Cramer" w:date="2025-12-13T10:42:00Z" w16du:dateUtc="2025-12-13T09:42:00Z" w:id="187"/>
           <w:rFonts w:cs="Segoe UI Emoji"/>
         </w:rPr>
       </w:pPr>
-      <w:ins w:author="Rinse Cramer" w:date="2025-12-13T10:40:00Z" w16du:dateUtc="2025-12-13T09:40:00Z" w:id="175">
+      <w:ins w:author="Rinse Cramer" w:date="2025-12-13T10:42:00Z" w16du:dateUtc="2025-12-13T09:42:00Z" w:id="188">
         <w:r>
           <w:rPr>
             <w:rFonts w:ascii="Segoe UI Emoji" w:hAnsi="Segoe UI Emoji" w:cs="Segoe UI Emoji"/>
             <w:b/>
             <w:bCs/>
           </w:rPr>
-          <w:t>🫱🏻‍🫲🏻 204. Bespreek oplossingsrichting, deliverables en ETC’s</w:t>
+          <w:t>🫱</w:t>
         </w:r>
         <w:r>
           <w:rPr>
@@ -1871,7 +1933,7 @@
               <w16se:symEx w16se:font="Segoe UI Emoji" w16se:char="1F3FB"/>
             </mc:Choice>
             <mc:Fallback>
-              <w:t/>
+              <w:t>🏻</w:t>
             </mc:Fallback>
           </mc:AlternateContent>
         </w:r>
@@ -1881,7 +1943,7 @@
             <w:b/>
             <w:bCs/>
           </w:rPr>
-          <w:t/>
+          <w:t>‍</w:t>
         </w:r>
         <w:r>
           <w:rPr>
@@ -1889,7 +1951,7 @@
             <w:b/>
             <w:bCs/>
           </w:rPr>
-          <w:t/>
+          <w:t>🫲</w:t>
         </w:r>
         <w:r>
           <w:rPr>
@@ -1909,7 +1971,7 @@
               <w16se:symEx w16se:font="Segoe UI Emoji" w16se:char="1F3FB"/>
             </mc:Choice>
             <mc:Fallback>
-              <w:t/>
+              <w:t>🏻</w:t>
             </mc:Fallback>
           </mc:AlternateContent>
         </w:r>
@@ -1917,31 +1979,25 @@
           <w:rPr>
             <w:rFonts w:cs="Segoe UI Emoji"/>
           </w:rPr>
-          <w:t xml:space="preserve"/>
+          <w:t xml:space="preserve"> </w:t>
         </w:r>
         <w:r>
           <w:rPr>
             <w:rFonts w:cs="Segoe UI Emoji"/>
           </w:rPr>
-          <w:t/>
+          <w:t>G</w:t>
         </w:r>
         <w:r>
           <w:rPr>
             <w:rFonts w:cs="Segoe UI Emoji"/>
           </w:rPr>
-          <w:t xml:space="preserve"/>
+          <w:t xml:space="preserve">. </w:t>
         </w:r>
         <w:r>
           <w:rPr>
             <w:rFonts w:cs="Segoe UI Emoji"/>
           </w:rPr>
-          <w:t xml:space="preserve"/>
-        </w:r>
-        <w:r>
-          <w:rPr>
-            <w:rFonts w:cs="Segoe UI Emoji"/>
-          </w:rPr>
-          <w:t/>
+          <w:t>De baas bepaald volgende status</w:t>
         </w:r>
       </w:ins>
     </w:p>
@@ -1953,39 +2009,67 @@
           <w:numId w:val="41"/>
         </w:numPr>
         <w:rPr>
-          <w:ins w:author="Rinse Cramer" w:date="2025-12-13T10:40:00Z" w16du:dateUtc="2025-12-13T09:40:00Z" w:id="176"/>
-        </w:rPr>
-      </w:pPr>
-      <w:ins w:author="Rinse Cramer" w:date="2025-12-13T10:44:00Z" w16du:dateUtc="2025-12-13T09:44:00Z" w:id="177">
-        <w:r>
-          <w:t>8</w:t>
-        </w:r>
-      </w:ins>
-      <w:ins w:author="Rinse Cramer" w:date="2025-12-13T10:40:00Z" w16du:dateUtc="2025-12-13T09:40:00Z" w:id="178">
+          <w:ins w:author="Rinse Cramer" w:date="2025-12-13T10:42:00Z" w16du:dateUtc="2025-12-13T09:42:00Z" w:id="189"/>
+        </w:rPr>
+      </w:pPr>
+      <w:ins w:author="Rinse Cramer" w:date="2025-12-13T10:43:00Z" w16du:dateUtc="2025-12-13T09:43:00Z" w:id="190">
+        <w:r>
+          <w:t>1</w:t>
+        </w:r>
+      </w:ins>
+      <w:ins w:author="Rinse Cramer" w:date="2025-12-13T10:44:00Z" w16du:dateUtc="2025-12-13T09:44:00Z" w:id="191">
+        <w:r>
+          <w:t>0</w:t>
+        </w:r>
+      </w:ins>
+      <w:ins w:author="Rinse Cramer" w:date="2025-12-13T10:42:00Z" w16du:dateUtc="2025-12-13T09:42:00Z" w:id="192">
         <w:r>
           <w:t xml:space="preserve">. </w:t>
         </w:r>
       </w:ins>
-      <w:r>
-        <w:t>Ik mail naar baas</w:t>
-      </w:r>
+      <w:ins w:author="Rinse Cramer" w:date="2025-12-13T10:45:00Z" w16du:dateUtc="2025-12-13T09:45:00Z" w:id="193">
+        <w:r>
+          <w:t>Terug n</w:t>
+        </w:r>
+      </w:ins>
+      <w:ins w:author="Rinse Cramer" w:date="2025-12-13T10:43:00Z" w16du:dateUtc="2025-12-13T09:43:00Z" w:id="194">
+        <w:r>
+          <w:t>a</w:t>
+        </w:r>
+        <w:r>
+          <w:t>ar</w:t>
+        </w:r>
+        <w:r>
+          <w:t xml:space="preserve"> </w:t>
+        </w:r>
+      </w:ins>
+      <w:ins w:author="Rinse Cramer" w:date="2025-12-13T10:45:00Z" w16du:dateUtc="2025-12-13T09:45:00Z" w:id="195">
+        <w:r>
+          <w:t>vorige</w:t>
+        </w:r>
+      </w:ins>
+      <w:ins w:author="Rinse Cramer" w:date="2025-12-13T10:43:00Z" w16du:dateUtc="2025-12-13T09:43:00Z" w:id="196">
+        <w:r>
+          <w:t xml:space="preserve"> flowchartpagina navigeren</w:t>
+        </w:r>
+      </w:ins>
     </w:p>
     <w:p>
       <w:pPr>
         <w:pStyle w:val="Heading1"/>
         <w:rPr>
-          <w:ins w:author="Rinse Cramer" w:date="2025-12-13T10:41:00Z" w16du:dateUtc="2025-12-13T09:41:00Z" w:id="179"/>
+          <w:ins w:author="Rinse Cramer" w:date="2025-12-13T10:44:00Z" w16du:dateUtc="2025-12-13T09:44:00Z" w:id="197"/>
           <w:rFonts w:cs="Segoe UI Emoji"/>
         </w:rPr>
       </w:pPr>
-      <w:ins w:author="Rinse Cramer" w:date="2025-12-13T10:41:00Z" w16du:dateUtc="2025-12-13T09:41:00Z" w:id="180">
+      <w:ins w:author="Rinse Cramer" w:date="2025-12-13T10:44:00Z" w16du:dateUtc="2025-12-13T09:44:00Z" w:id="198">
         <w:r>
           <w:rPr>
             <w:rFonts w:ascii="Segoe UI Emoji" w:hAnsi="Segoe UI Emoji" w:cs="Segoe UI Emoji"/>
             <w:b/>
             <w:bCs/>
           </w:rPr>
-          <w:t>🫱🏻‍🫲🏻 206. Goedkeuring?</w:t>
+          <w:t>🫱</w:t>
         </w:r>
         <w:r>
           <w:rPr>
@@ -2005,7 +2089,7 @@
               <w16se:symEx w16se:font="Segoe UI Emoji" w16se:char="1F3FB"/>
             </mc:Choice>
             <mc:Fallback>
-              <w:t/>
+              <w:t>🏻</w:t>
             </mc:Fallback>
           </mc:AlternateContent>
         </w:r>
@@ -2015,7 +2099,7 @@
             <w:b/>
             <w:bCs/>
           </w:rPr>
-          <w:t/>
+          <w:t>‍</w:t>
         </w:r>
         <w:r>
           <w:rPr>
@@ -2023,7 +2107,7 @@
             <w:b/>
             <w:bCs/>
           </w:rPr>
-          <w:t/>
+          <w:t>🫲</w:t>
         </w:r>
         <w:r>
           <w:rPr>
@@ -2043,7 +2127,7 @@
               <w16se:symEx w16se:font="Segoe UI Emoji" w16se:char="1F3FB"/>
             </mc:Choice>
             <mc:Fallback>
-              <w:t/>
+              <w:t>🏻</w:t>
             </mc:Fallback>
           </mc:AlternateContent>
         </w:r>
@@ -2051,321 +2135,25 @@
           <w:rPr>
             <w:rFonts w:cs="Segoe UI Emoji"/>
           </w:rPr>
-          <w:t xml:space="preserve"/>
+          <w:t xml:space="preserve"> </w:t>
         </w:r>
         <w:r>
           <w:rPr>
             <w:rFonts w:cs="Segoe UI Emoji"/>
           </w:rPr>
-          <w:t/>
+          <w:t>H</w:t>
         </w:r>
         <w:r>
           <w:rPr>
             <w:rFonts w:cs="Segoe UI Emoji"/>
           </w:rPr>
-          <w:t xml:space="preserve"/>
+          <w:t xml:space="preserve">. </w:t>
         </w:r>
         <w:r>
           <w:rPr>
             <w:rFonts w:cs="Segoe UI Emoji"/>
           </w:rPr>
-          <w:t/>
-        </w:r>
-      </w:ins>
-    </w:p>
-    <w:p>
-      <w:pPr>
-        <w:pStyle w:val="ListParagraph"/>
-        <w:numPr>
-          <w:ilvl w:val="0"/>
-          <w:numId w:val="41"/>
-        </w:numPr>
-        <w:rPr>
-          <w:ins w:author="Rinse Cramer" w:date="2025-12-13T10:41:00Z" w16du:dateUtc="2025-12-13T09:41:00Z" w:id="181"/>
-        </w:rPr>
-      </w:pPr>
-      <w:ins w:author="Rinse Cramer" w:date="2025-12-13T10:44:00Z" w16du:dateUtc="2025-12-13T09:44:00Z" w:id="182">
-        <w:r>
-          <w:t>9</w:t>
-        </w:r>
-      </w:ins>
-      <w:ins w:author="Rinse Cramer" w:date="2025-12-13T10:41:00Z" w16du:dateUtc="2025-12-13T09:41:00Z" w:id="183">
-        <w:r>
-          <w:t xml:space="preserve">. </w:t>
-        </w:r>
-      </w:ins>
-      <w:ins w:author="Rinse Cramer" w:date="2025-12-13T10:42:00Z" w16du:dateUtc="2025-12-13T09:42:00Z" w:id="184">
-        <w:r>
-          <w:t>R</w:t>
-        </w:r>
-      </w:ins>
-      <w:ins w:author="Rinse Cramer" w:date="2025-12-13T10:41:00Z" w16du:dateUtc="2025-12-13T09:41:00Z" w:id="185">
-        <w:r>
-          <w:t xml:space="preserve">esultaten </w:t>
-        </w:r>
-      </w:ins>
-      <w:ins w:author="Rinse Cramer" w:date="2025-12-13T10:42:00Z" w16du:dateUtc="2025-12-13T09:42:00Z" w:id="186">
-        <w:r>
-          <w:t>zijn goedgekeurd?</w:t>
-        </w:r>
-      </w:ins>
-    </w:p>
-    <w:p>
-      <w:pPr>
-        <w:pStyle w:val="Heading1"/>
-        <w:rPr>
-          <w:ins w:author="Rinse Cramer" w:date="2025-12-13T10:42:00Z" w16du:dateUtc="2025-12-13T09:42:00Z" w:id="187"/>
-          <w:rFonts w:cs="Segoe UI Emoji"/>
-        </w:rPr>
-      </w:pPr>
-      <w:ins w:author="Rinse Cramer" w:date="2025-12-13T10:42:00Z" w16du:dateUtc="2025-12-13T09:42:00Z" w:id="188">
-        <w:r>
-          <w:rPr>
-            <w:rFonts w:ascii="Segoe UI Emoji" w:hAnsi="Segoe UI Emoji" w:cs="Segoe UI Emoji"/>
-            <w:b/>
-            <w:bCs/>
-          </w:rPr>
-          <w:t>🫱🏻‍🫲🏻 206F. De baas bepaald volgende status</w:t>
-        </w:r>
-        <w:r>
-          <w:rPr>
-            <mc:AlternateContent>
-              <mc:Choice Requires="w16se">
-                <w:rFonts w:cs="Segoe UI Emoji"/>
-              </mc:Choice>
-              <mc:Fallback>
-                <w:rFonts w:ascii="Segoe UI Emoji" w:hAnsi="Segoe UI Emoji" w:eastAsia="Segoe UI Emoji" w:cs="Segoe UI Emoji"/>
-              </mc:Fallback>
-            </mc:AlternateContent>
-            <w:b/>
-            <w:bCs/>
-          </w:rPr>
-          <mc:AlternateContent>
-            <mc:Choice Requires="w16se">
-              <w16se:symEx w16se:font="Segoe UI Emoji" w16se:char="1F3FB"/>
-            </mc:Choice>
-            <mc:Fallback>
-              <w:t/>
-            </mc:Fallback>
-          </mc:AlternateContent>
-        </w:r>
-        <w:r>
-          <w:rPr>
-            <w:rFonts w:cs="Segoe UI Emoji"/>
-            <w:b/>
-            <w:bCs/>
-          </w:rPr>
-          <w:t/>
-        </w:r>
-        <w:r>
-          <w:rPr>
-            <w:rFonts w:ascii="Segoe UI Emoji" w:hAnsi="Segoe UI Emoji" w:cs="Segoe UI Emoji"/>
-            <w:b/>
-            <w:bCs/>
-          </w:rPr>
-          <w:t/>
-        </w:r>
-        <w:r>
-          <w:rPr>
-            <mc:AlternateContent>
-              <mc:Choice Requires="w16se">
-                <w:rFonts w:cs="Segoe UI Emoji"/>
-              </mc:Choice>
-              <mc:Fallback>
-                <w:rFonts w:ascii="Segoe UI Emoji" w:hAnsi="Segoe UI Emoji" w:eastAsia="Segoe UI Emoji" w:cs="Segoe UI Emoji"/>
-              </mc:Fallback>
-            </mc:AlternateContent>
-            <w:b/>
-            <w:bCs/>
-          </w:rPr>
-          <mc:AlternateContent>
-            <mc:Choice Requires="w16se">
-              <w16se:symEx w16se:font="Segoe UI Emoji" w16se:char="1F3FB"/>
-            </mc:Choice>
-            <mc:Fallback>
-              <w:t/>
-            </mc:Fallback>
-          </mc:AlternateContent>
-        </w:r>
-        <w:r>
-          <w:rPr>
-            <w:rFonts w:cs="Segoe UI Emoji"/>
-          </w:rPr>
-          <w:t xml:space="preserve"/>
-        </w:r>
-        <w:r>
-          <w:rPr>
-            <w:rFonts w:cs="Segoe UI Emoji"/>
-          </w:rPr>
-          <w:t/>
-        </w:r>
-        <w:r>
-          <w:rPr>
-            <w:rFonts w:cs="Segoe UI Emoji"/>
-          </w:rPr>
-          <w:t xml:space="preserve"/>
-        </w:r>
-        <w:r>
-          <w:rPr>
-            <w:rFonts w:cs="Segoe UI Emoji"/>
-          </w:rPr>
-          <w:t/>
-        </w:r>
-      </w:ins>
-    </w:p>
-    <w:p>
-      <w:pPr>
-        <w:pStyle w:val="ListParagraph"/>
-        <w:numPr>
-          <w:ilvl w:val="0"/>
-          <w:numId w:val="41"/>
-        </w:numPr>
-        <w:rPr>
-          <w:ins w:author="Rinse Cramer" w:date="2025-12-13T10:42:00Z" w16du:dateUtc="2025-12-13T09:42:00Z" w:id="189"/>
-        </w:rPr>
-      </w:pPr>
-      <w:ins w:author="Rinse Cramer" w:date="2025-12-13T10:43:00Z" w16du:dateUtc="2025-12-13T09:43:00Z" w:id="190">
-        <w:r>
-          <w:t>1</w:t>
-        </w:r>
-      </w:ins>
-      <w:ins w:author="Rinse Cramer" w:date="2025-12-13T10:44:00Z" w16du:dateUtc="2025-12-13T09:44:00Z" w:id="191">
-        <w:r>
-          <w:t>0</w:t>
-        </w:r>
-      </w:ins>
-      <w:ins w:author="Rinse Cramer" w:date="2025-12-13T10:42:00Z" w16du:dateUtc="2025-12-13T09:42:00Z" w:id="192">
-        <w:r>
-          <w:t xml:space="preserve">. </w:t>
-        </w:r>
-      </w:ins>
-      <w:ins w:author="Rinse Cramer" w:date="2025-12-13T10:45:00Z" w16du:dateUtc="2025-12-13T09:45:00Z" w:id="193">
-        <w:r>
-          <w:t>Terug n</w:t>
-        </w:r>
-      </w:ins>
-      <w:ins w:author="Rinse Cramer" w:date="2025-12-13T10:43:00Z" w16du:dateUtc="2025-12-13T09:43:00Z" w:id="194">
-        <w:r>
-          <w:t>a</w:t>
-        </w:r>
-        <w:r>
-          <w:t>ar</w:t>
-        </w:r>
-        <w:r>
-          <w:t xml:space="preserve"> </w:t>
-        </w:r>
-      </w:ins>
-      <w:ins w:author="Rinse Cramer" w:date="2025-12-13T10:45:00Z" w16du:dateUtc="2025-12-13T09:45:00Z" w:id="195">
-        <w:r>
-          <w:t>vorige</w:t>
-        </w:r>
-      </w:ins>
-      <w:ins w:author="Rinse Cramer" w:date="2025-12-13T10:43:00Z" w16du:dateUtc="2025-12-13T09:43:00Z" w:id="196">
-        <w:r>
-          <w:t xml:space="preserve"> flowchartpagina navigeren</w:t>
-        </w:r>
-      </w:ins>
-    </w:p>
-    <w:p>
-      <w:pPr>
-        <w:pStyle w:val="Heading1"/>
-        <w:rPr>
-          <w:ins w:author="Rinse Cramer" w:date="2025-12-13T10:44:00Z" w16du:dateUtc="2025-12-13T09:44:00Z" w:id="197"/>
-          <w:rFonts w:cs="Segoe UI Emoji"/>
-        </w:rPr>
-      </w:pPr>
-      <w:ins w:author="Rinse Cramer" w:date="2025-12-13T10:44:00Z" w16du:dateUtc="2025-12-13T09:44:00Z" w:id="198">
-        <w:r>
-          <w:rPr>
-            <w:rFonts w:ascii="Segoe UI Emoji" w:hAnsi="Segoe UI Emoji" w:cs="Segoe UI Emoji"/>
-            <w:b/>
-            <w:bCs/>
-          </w:rPr>
-          <w:t>🫱🏻‍🫲🏻 206T. Volg de analyse</w:t>
-        </w:r>
-        <w:r>
-          <w:rPr>
-            <mc:AlternateContent>
-              <mc:Choice Requires="w16se">
-                <w:rFonts w:cs="Segoe UI Emoji"/>
-              </mc:Choice>
-              <mc:Fallback>
-                <w:rFonts w:ascii="Segoe UI Emoji" w:hAnsi="Segoe UI Emoji" w:eastAsia="Segoe UI Emoji" w:cs="Segoe UI Emoji"/>
-              </mc:Fallback>
-            </mc:AlternateContent>
-            <w:b/>
-            <w:bCs/>
-          </w:rPr>
-          <mc:AlternateContent>
-            <mc:Choice Requires="w16se">
-              <w16se:symEx w16se:font="Segoe UI Emoji" w16se:char="1F3FB"/>
-            </mc:Choice>
-            <mc:Fallback>
-              <w:t/>
-            </mc:Fallback>
-          </mc:AlternateContent>
-        </w:r>
-        <w:r>
-          <w:rPr>
-            <w:rFonts w:cs="Segoe UI Emoji"/>
-            <w:b/>
-            <w:bCs/>
-          </w:rPr>
-          <w:t/>
-        </w:r>
-        <w:r>
-          <w:rPr>
-            <w:rFonts w:ascii="Segoe UI Emoji" w:hAnsi="Segoe UI Emoji" w:cs="Segoe UI Emoji"/>
-            <w:b/>
-            <w:bCs/>
-          </w:rPr>
-          <w:t/>
-        </w:r>
-        <w:r>
-          <w:rPr>
-            <mc:AlternateContent>
-              <mc:Choice Requires="w16se">
-                <w:rFonts w:cs="Segoe UI Emoji"/>
-              </mc:Choice>
-              <mc:Fallback>
-                <w:rFonts w:ascii="Segoe UI Emoji" w:hAnsi="Segoe UI Emoji" w:eastAsia="Segoe UI Emoji" w:cs="Segoe UI Emoji"/>
-              </mc:Fallback>
-            </mc:AlternateContent>
-            <w:b/>
-            <w:bCs/>
-          </w:rPr>
-          <mc:AlternateContent>
-            <mc:Choice Requires="w16se">
-              <w16se:symEx w16se:font="Segoe UI Emoji" w16se:char="1F3FB"/>
-            </mc:Choice>
-            <mc:Fallback>
-              <w:t/>
-            </mc:Fallback>
-          </mc:AlternateContent>
-        </w:r>
-        <w:r>
-          <w:rPr>
-            <w:rFonts w:cs="Segoe UI Emoji"/>
-          </w:rPr>
-          <w:t xml:space="preserve"/>
-        </w:r>
-        <w:r>
-          <w:rPr>
-            <w:rFonts w:cs="Segoe UI Emoji"/>
-          </w:rPr>
-          <w:t/>
-        </w:r>
-        <w:r>
-          <w:rPr>
-            <w:rFonts w:cs="Segoe UI Emoji"/>
-          </w:rPr>
-          <w:t xml:space="preserve"/>
-        </w:r>
-        <w:r>
-          <w:rPr>
-            <w:rFonts w:cs="Segoe UI Emoji"/>
-          </w:rPr>
-          <w:t/>
+          <w:t>Volg de analyse</w:t>
         </w:r>
       </w:ins>
     </w:p>
@@ -3041,7 +2829,7 @@
             <w:b/>
             <w:bCs/>
           </w:rPr>
-          <w:t>🫱🏻‍🫲🏻 402. Is de baas aanwezig?</w:t>
+          <w:t>🫱</w:t>
         </w:r>
         <w:r>
           <w:rPr>
@@ -3061,7 +2849,7 @@
               <w16se:symEx w16se:font="Segoe UI Emoji" w16se:char="1F3FB"/>
             </mc:Choice>
             <mc:Fallback>
-              <w:t/>
+              <w:t>🏻</w:t>
             </mc:Fallback>
           </mc:AlternateContent>
         </w:r>
@@ -3071,7 +2859,7 @@
             <w:b/>
             <w:bCs/>
           </w:rPr>
-          <w:t/>
+          <w:t>‍</w:t>
         </w:r>
         <w:r>
           <w:rPr>
@@ -3079,7 +2867,7 @@
             <w:b/>
             <w:bCs/>
           </w:rPr>
-          <w:t/>
+          <w:t>🫲</w:t>
         </w:r>
         <w:r>
           <w:rPr>
@@ -3099,7 +2887,7 @@
               <w16se:symEx w16se:font="Segoe UI Emoji" w16se:char="1F3FB"/>
             </mc:Choice>
             <mc:Fallback>
-              <w:t/>
+              <w:t>🏻</w:t>
             </mc:Fallback>
           </mc:AlternateContent>
         </w:r>
@@ -3107,7 +2895,7 @@
           <w:rPr>
             <w:rFonts w:cs="Segoe UI Emoji"/>
           </w:rPr>
-          <w:t xml:space="preserve"/>
+          <w:t xml:space="preserve"> B. </w:t>
         </w:r>
       </w:ins>
       <w:ins w:author="Rinse Cramer" w:date="2025-12-13T10:35:00Z" w16du:dateUtc="2025-12-13T09:35:00Z" w:id="247">
@@ -3121,7 +2909,7 @@
               </w:rPr>
             </w:rPrChange>
           </w:rPr>
-          <w:t/>
+          <w:t>Is de baas aanwezig?</w:t>
         </w:r>
       </w:ins>
     </w:p>
@@ -3169,20 +2957,101 @@
     </w:p>
     <w:p>
       <w:pPr>
+        <w:pStyle w:val="ListParagraph"/>
+        <w:numPr>
+          <w:ilvl w:val="0"/>
+          <w:numId w:val="41"/>
+        </w:numPr>
+        <w:rPr>
+          <w:ins w:author="Rinse Cramer" w:date="2025-12-13T10:38:00Z" w16du:dateUtc="2025-12-13T09:38:00Z" w:id="258"/>
+        </w:rPr>
+      </w:pPr>
+      <w:ins w:author="Rinse Cramer" w:date="2025-12-13T10:43:00Z" w16du:dateUtc="2025-12-13T09:43:00Z" w:id="259">
+        <w:r>
+          <w:t>5</w:t>
+        </w:r>
+      </w:ins>
+      <w:ins w:author="Rinse Cramer" w:date="2025-12-13T10:38:00Z" w16du:dateUtc="2025-12-13T09:38:00Z" w:id="260">
+        <w:r>
+          <w:t>. Baas is schriftelijk beschikbaar</w:t>
+        </w:r>
+      </w:ins>
+    </w:p>
+    <w:p>
+      <w:pPr>
+        <w:pStyle w:val="ListParagraph"/>
+        <w:numPr>
+          <w:ilvl w:val="0"/>
+          <w:numId w:val="41"/>
+        </w:numPr>
+        <w:rPr>
+          <w:ins w:author="Rinse Cramer" w:date="2025-12-13T10:39:00Z" w16du:dateUtc="2025-12-13T09:39:00Z" w:id="261"/>
+        </w:rPr>
+      </w:pPr>
+      <w:ins w:author="Rinse Cramer" w:date="2025-12-13T10:44:00Z" w16du:dateUtc="2025-12-13T09:44:00Z" w:id="262">
+        <w:r>
+          <w:t>6</w:t>
+        </w:r>
+      </w:ins>
+      <w:ins w:author="Rinse Cramer" w:date="2025-12-13T10:38:00Z" w16du:dateUtc="2025-12-13T09:38:00Z" w:id="263">
+        <w:r>
+          <w:t>. Aa</w:t>
+        </w:r>
+      </w:ins>
+      <w:ins w:author="Rinse Cramer" w:date="2025-12-13T10:39:00Z" w16du:dateUtc="2025-12-13T09:39:00Z" w:id="264">
+        <w:r>
+          <w:t>nwezigheid monitoren</w:t>
+        </w:r>
+      </w:ins>
+    </w:p>
+    <w:p>
+      <w:pPr>
+        <w:pStyle w:val="ListParagraph"/>
+        <w:numPr>
+          <w:ilvl w:val="0"/>
+          <w:numId w:val="41"/>
+        </w:numPr>
+        <w:rPr>
+          <w:ins w:author="Rinse Cramer" w:date="2025-12-13T10:38:00Z" w16du:dateUtc="2025-12-13T09:38:00Z" w:id="267"/>
+        </w:rPr>
+      </w:pPr>
+      <w:ins w:author="Rinse Cramer" w:date="2025-12-13T10:44:00Z" w16du:dateUtc="2025-12-13T09:44:00Z" w:id="268">
+        <w:r>
+          <w:t>7</w:t>
+        </w:r>
+      </w:ins>
+      <w:ins w:author="Rinse Cramer" w:date="2025-12-13T10:39:00Z" w16du:dateUtc="2025-12-13T09:39:00Z" w:id="269">
+        <w:r>
+          <w:t xml:space="preserve">. Baas is </w:t>
+        </w:r>
+      </w:ins>
+      <w:ins w:author="Rinse Cramer" w:date="2025-12-13T10:40:00Z" w16du:dateUtc="2025-12-13T09:40:00Z" w:id="270">
+        <w:r>
+          <w:t>mondeling</w:t>
+        </w:r>
+      </w:ins>
+      <w:ins w:author="Rinse Cramer" w:date="2025-12-13T10:39:00Z" w16du:dateUtc="2025-12-13T09:39:00Z" w:id="271">
+        <w:r>
+          <w:t xml:space="preserve"> beschikbaar</w:t>
+        </w:r>
+      </w:ins>
+    </w:p>
+    <w:p>
+      <w:pPr>
         <w:pStyle w:val="Heading1"/>
         <w:rPr>
-          <w:ins w:author="Rinse Cramer" w:date="2025-12-13T10:38:00Z" w16du:dateUtc="2025-12-13T09:38:00Z" w:id="256"/>
+          <w:ins w:author="Rinse Cramer" w:date="2025-12-13T10:40:00Z" w16du:dateUtc="2025-12-13T09:40:00Z" w:id="272"/>
           <w:rFonts w:cs="Segoe UI Emoji"/>
         </w:rPr>
       </w:pPr>
-      <w:ins w:author="Rinse Cramer" w:date="2025-12-13T10:38:00Z" w16du:dateUtc="2025-12-13T09:38:00Z" w:id="257">
+      <w:ins w:author="Rinse Cramer" w:date="2025-12-13T10:40:00Z" w16du:dateUtc="2025-12-13T09:40:00Z" w:id="273">
         <w:r>
           <w:rPr>
             <w:rFonts w:ascii="Segoe UI Emoji" w:hAnsi="Segoe UI Emoji" w:cs="Segoe UI Emoji"/>
             <w:b/>
             <w:bCs/>
           </w:rPr>
-          <w:t>🫱🏻‍🫲🏻 402F. Meteen meldplicht wanneer de baas aanwezig is</w:t>
+          <w:t>🫱</w:t>
         </w:r>
         <w:r>
           <w:rPr>
@@ -3202,7 +3071,7 @@
               <w16se:symEx w16se:font="Segoe UI Emoji" w16se:char="1F3FB"/>
             </mc:Choice>
             <mc:Fallback>
-              <w:t/>
+              <w:t>🏻</w:t>
             </mc:Fallback>
           </mc:AlternateContent>
         </w:r>
@@ -3212,7 +3081,7 @@
             <w:b/>
             <w:bCs/>
           </w:rPr>
-          <w:t/>
+          <w:t>‍</w:t>
         </w:r>
         <w:r>
           <w:rPr>
@@ -3220,7 +3089,7 @@
             <w:b/>
             <w:bCs/>
           </w:rPr>
-          <w:t/>
+          <w:t>🫲</w:t>
         </w:r>
         <w:r>
           <w:rPr>
@@ -3240,7 +3109,7 @@
               <w16se:symEx w16se:font="Segoe UI Emoji" w16se:char="1F3FB"/>
             </mc:Choice>
             <mc:Fallback>
-              <w:t/>
+              <w:t>🏻</w:t>
             </mc:Fallback>
           </mc:AlternateContent>
         </w:r>
@@ -3248,27 +3117,27 @@
           <w:rPr>
             <w:rFonts w:cs="Segoe UI Emoji"/>
           </w:rPr>
-          <w:t xml:space="preserve"/>
+          <w:t xml:space="preserve"> </w:t>
         </w:r>
         <w:r>
           <w:rPr>
             <w:rFonts w:cs="Segoe UI Emoji"/>
           </w:rPr>
-          <w:t/>
+          <w:t>E</w:t>
         </w:r>
         <w:r>
           <w:rPr>
             <w:rFonts w:cs="Segoe UI Emoji"/>
           </w:rPr>
-          <w:t xml:space="preserve"/>
-        </w:r>
-        <w:r>
-          <w:rPr>
-            <w:rFonts w:cs="Segoe UI Emoji"/>
-          </w:rPr>
-          <w:t/>
-        </w:r>
-      </w:ins>
+          <w:t xml:space="preserve">. </w:t>
+        </w:r>
+      </w:ins>
+      <w:r>
+        <w:rPr>
+          <w:rFonts w:cs="Segoe UI Emoji"/>
+        </w:rPr>
+        <w:t>Overleg resultaten voor goedkeuring vervolg</w:t>
+      </w:r>
     </w:p>
     <w:p>
       <w:pPr>
@@ -3278,63 +3147,39 @@
           <w:numId w:val="41"/>
         </w:numPr>
         <w:rPr>
-          <w:ins w:author="Rinse Cramer" w:date="2025-12-13T10:38:00Z" w16du:dateUtc="2025-12-13T09:38:00Z" w:id="258"/>
-        </w:rPr>
-      </w:pPr>
-      <w:ins w:author="Rinse Cramer" w:date="2025-12-13T10:43:00Z" w16du:dateUtc="2025-12-13T09:43:00Z" w:id="259">
-        <w:r>
-          <w:t>5</w:t>
-        </w:r>
-      </w:ins>
-      <w:ins w:author="Rinse Cramer" w:date="2025-12-13T10:38:00Z" w16du:dateUtc="2025-12-13T09:38:00Z" w:id="260">
-        <w:r>
-          <w:t>. Baas is schriftelijk beschikbaar</w:t>
-        </w:r>
-      </w:ins>
-    </w:p>
-    <w:p>
-      <w:pPr>
-        <w:pStyle w:val="ListParagraph"/>
-        <w:numPr>
-          <w:ilvl w:val="0"/>
-          <w:numId w:val="41"/>
-        </w:numPr>
-        <w:rPr>
-          <w:ins w:author="Rinse Cramer" w:date="2025-12-13T10:39:00Z" w16du:dateUtc="2025-12-13T09:39:00Z" w:id="261"/>
-        </w:rPr>
-      </w:pPr>
-      <w:ins w:author="Rinse Cramer" w:date="2025-12-13T10:44:00Z" w16du:dateUtc="2025-12-13T09:44:00Z" w:id="262">
-        <w:r>
-          <w:t>6</w:t>
-        </w:r>
-      </w:ins>
-      <w:ins w:author="Rinse Cramer" w:date="2025-12-13T10:38:00Z" w16du:dateUtc="2025-12-13T09:38:00Z" w:id="263">
-        <w:r>
-          <w:t>. Aa</w:t>
-        </w:r>
-      </w:ins>
-      <w:ins w:author="Rinse Cramer" w:date="2025-12-13T10:39:00Z" w16du:dateUtc="2025-12-13T09:39:00Z" w:id="264">
-        <w:r>
-          <w:t>nwezigheid monitoren</w:t>
-        </w:r>
-      </w:ins>
+          <w:ins w:author="Rinse Cramer" w:date="2025-12-13T10:40:00Z" w16du:dateUtc="2025-12-13T09:40:00Z" w:id="274"/>
+        </w:rPr>
+      </w:pPr>
+      <w:ins w:author="Rinse Cramer" w:date="2025-12-13T10:44:00Z" w16du:dateUtc="2025-12-13T09:44:00Z" w:id="275">
+        <w:r>
+          <w:t>8</w:t>
+        </w:r>
+      </w:ins>
+      <w:ins w:author="Rinse Cramer" w:date="2025-12-13T10:40:00Z" w16du:dateUtc="2025-12-13T09:40:00Z" w:id="276">
+        <w:r>
+          <w:t xml:space="preserve">. </w:t>
+        </w:r>
+      </w:ins>
+      <w:r>
+        <w:t>Ik mail naar baas</w:t>
+      </w:r>
     </w:p>
     <w:p>
       <w:pPr>
         <w:pStyle w:val="Heading1"/>
         <w:rPr>
-          <w:ins w:author="Rinse Cramer" w:date="2025-12-13T10:39:00Z" w16du:dateUtc="2025-12-13T09:39:00Z" w:id="265"/>
+          <w:ins w:author="Rinse Cramer" w:date="2025-12-13T10:41:00Z" w16du:dateUtc="2025-12-13T09:41:00Z" w:id="277"/>
           <w:rFonts w:cs="Segoe UI Emoji"/>
         </w:rPr>
       </w:pPr>
-      <w:ins w:author="Rinse Cramer" w:date="2025-12-13T10:39:00Z" w16du:dateUtc="2025-12-13T09:39:00Z" w:id="266">
+      <w:ins w:author="Rinse Cramer" w:date="2025-12-13T10:41:00Z" w16du:dateUtc="2025-12-13T09:41:00Z" w:id="278">
         <w:r>
           <w:rPr>
             <w:rFonts w:ascii="Segoe UI Emoji" w:hAnsi="Segoe UI Emoji" w:cs="Segoe UI Emoji"/>
             <w:b/>
             <w:bCs/>
           </w:rPr>
-          <w:t>🫱🏻‍🫲🏻 402T. Na dat de baas weer aanwezig is</w:t>
+          <w:t>🫱</w:t>
         </w:r>
         <w:r>
           <w:rPr>
@@ -3354,7 +3199,7 @@
               <w16se:symEx w16se:font="Segoe UI Emoji" w16se:char="1F3FB"/>
             </mc:Choice>
             <mc:Fallback>
-              <w:t/>
+              <w:t>🏻</w:t>
             </mc:Fallback>
           </mc:AlternateContent>
         </w:r>
@@ -3364,7 +3209,7 @@
             <w:b/>
             <w:bCs/>
           </w:rPr>
-          <w:t/>
+          <w:t>‍</w:t>
         </w:r>
         <w:r>
           <w:rPr>
@@ -3372,7 +3217,7 @@
             <w:b/>
             <w:bCs/>
           </w:rPr>
-          <w:t/>
+          <w:t>🫲</w:t>
         </w:r>
         <w:r>
           <w:rPr>
@@ -3392,7 +3237,7 @@
               <w16se:symEx w16se:font="Segoe UI Emoji" w16se:char="1F3FB"/>
             </mc:Choice>
             <mc:Fallback>
-              <w:t/>
+              <w:t>🏻</w:t>
             </mc:Fallback>
           </mc:AlternateContent>
         </w:r>
@@ -3400,25 +3245,25 @@
           <w:rPr>
             <w:rFonts w:cs="Segoe UI Emoji"/>
           </w:rPr>
-          <w:t xml:space="preserve"/>
+          <w:t xml:space="preserve"> </w:t>
         </w:r>
         <w:r>
           <w:rPr>
             <w:rFonts w:cs="Segoe UI Emoji"/>
           </w:rPr>
-          <w:t/>
+          <w:t>F</w:t>
         </w:r>
         <w:r>
           <w:rPr>
             <w:rFonts w:cs="Segoe UI Emoji"/>
           </w:rPr>
-          <w:t xml:space="preserve"/>
+          <w:t xml:space="preserve">. </w:t>
         </w:r>
         <w:r>
           <w:rPr>
             <w:rFonts w:cs="Segoe UI Emoji"/>
           </w:rPr>
-          <w:t/>
+          <w:t>Goedkeuring?</w:t>
         </w:r>
       </w:ins>
     </w:p>
@@ -3430,27 +3275,32 @@
           <w:numId w:val="41"/>
         </w:numPr>
         <w:rPr>
-          <w:ins w:author="Rinse Cramer" w:date="2025-12-13T10:38:00Z" w16du:dateUtc="2025-12-13T09:38:00Z" w:id="267"/>
-        </w:rPr>
-      </w:pPr>
-      <w:ins w:author="Rinse Cramer" w:date="2025-12-13T10:44:00Z" w16du:dateUtc="2025-12-13T09:44:00Z" w:id="268">
-        <w:r>
-          <w:t>7</w:t>
-        </w:r>
-      </w:ins>
-      <w:ins w:author="Rinse Cramer" w:date="2025-12-13T10:39:00Z" w16du:dateUtc="2025-12-13T09:39:00Z" w:id="269">
-        <w:r>
-          <w:t xml:space="preserve">. Baas is </w:t>
-        </w:r>
-      </w:ins>
-      <w:ins w:author="Rinse Cramer" w:date="2025-12-13T10:40:00Z" w16du:dateUtc="2025-12-13T09:40:00Z" w:id="270">
-        <w:r>
-          <w:t>mondeling</w:t>
-        </w:r>
-      </w:ins>
-      <w:ins w:author="Rinse Cramer" w:date="2025-12-13T10:39:00Z" w16du:dateUtc="2025-12-13T09:39:00Z" w:id="271">
-        <w:r>
-          <w:t xml:space="preserve"> beschikbaar</w:t>
+          <w:ins w:author="Rinse Cramer" w:date="2025-12-13T10:41:00Z" w16du:dateUtc="2025-12-13T09:41:00Z" w:id="279"/>
+        </w:rPr>
+      </w:pPr>
+      <w:ins w:author="Rinse Cramer" w:date="2025-12-13T10:44:00Z" w16du:dateUtc="2025-12-13T09:44:00Z" w:id="280">
+        <w:r>
+          <w:t>9</w:t>
+        </w:r>
+      </w:ins>
+      <w:ins w:author="Rinse Cramer" w:date="2025-12-13T10:41:00Z" w16du:dateUtc="2025-12-13T09:41:00Z" w:id="281">
+        <w:r>
+          <w:t xml:space="preserve">. </w:t>
+        </w:r>
+      </w:ins>
+      <w:ins w:author="Rinse Cramer" w:date="2025-12-13T10:42:00Z" w16du:dateUtc="2025-12-13T09:42:00Z" w:id="282">
+        <w:r>
+          <w:t>R</w:t>
+        </w:r>
+      </w:ins>
+      <w:ins w:author="Rinse Cramer" w:date="2025-12-13T10:41:00Z" w16du:dateUtc="2025-12-13T09:41:00Z" w:id="283">
+        <w:r>
+          <w:t xml:space="preserve">esultaten </w:t>
+        </w:r>
+      </w:ins>
+      <w:ins w:author="Rinse Cramer" w:date="2025-12-13T10:42:00Z" w16du:dateUtc="2025-12-13T09:42:00Z" w:id="284">
+        <w:r>
+          <w:t>zijn goedgekeurd?</w:t>
         </w:r>
       </w:ins>
     </w:p>
@@ -3458,18 +3308,18 @@
       <w:pPr>
         <w:pStyle w:val="Heading1"/>
         <w:rPr>
-          <w:ins w:author="Rinse Cramer" w:date="2025-12-13T10:40:00Z" w16du:dateUtc="2025-12-13T09:40:00Z" w:id="272"/>
+          <w:ins w:author="Rinse Cramer" w:date="2025-12-13T10:42:00Z" w16du:dateUtc="2025-12-13T09:42:00Z" w:id="285"/>
           <w:rFonts w:cs="Segoe UI Emoji"/>
         </w:rPr>
       </w:pPr>
-      <w:ins w:author="Rinse Cramer" w:date="2025-12-13T10:40:00Z" w16du:dateUtc="2025-12-13T09:40:00Z" w:id="273">
+      <w:ins w:author="Rinse Cramer" w:date="2025-12-13T10:42:00Z" w16du:dateUtc="2025-12-13T09:42:00Z" w:id="286">
         <w:r>
           <w:rPr>
             <w:rFonts w:ascii="Segoe UI Emoji" w:hAnsi="Segoe UI Emoji" w:cs="Segoe UI Emoji"/>
             <w:b/>
             <w:bCs/>
           </w:rPr>
-          <w:t>🫱🏻‍🫲🏻 404. Overleg resultaten voor goedkeuring vervolg</w:t>
+          <w:t>🫱</w:t>
         </w:r>
         <w:r>
           <w:rPr>
@@ -3489,7 +3339,7 @@
               <w16se:symEx w16se:font="Segoe UI Emoji" w16se:char="1F3FB"/>
             </mc:Choice>
             <mc:Fallback>
-              <w:t/>
+              <w:t>🏻</w:t>
             </mc:Fallback>
           </mc:AlternateContent>
         </w:r>
@@ -3499,7 +3349,7 @@
             <w:b/>
             <w:bCs/>
           </w:rPr>
-          <w:t/>
+          <w:t>‍</w:t>
         </w:r>
         <w:r>
           <w:rPr>
@@ -3507,7 +3357,7 @@
             <w:b/>
             <w:bCs/>
           </w:rPr>
-          <w:t/>
+          <w:t>🫲</w:t>
         </w:r>
         <w:r>
           <w:rPr>
@@ -3527,7 +3377,7 @@
               <w16se:symEx w16se:font="Segoe UI Emoji" w16se:char="1F3FB"/>
             </mc:Choice>
             <mc:Fallback>
-              <w:t/>
+              <w:t>🏻</w:t>
             </mc:Fallback>
           </mc:AlternateContent>
         </w:r>
@@ -3535,27 +3385,27 @@
           <w:rPr>
             <w:rFonts w:cs="Segoe UI Emoji"/>
           </w:rPr>
-          <w:t xml:space="preserve"/>
+          <w:t xml:space="preserve"> </w:t>
         </w:r>
         <w:r>
           <w:rPr>
             <w:rFonts w:cs="Segoe UI Emoji"/>
           </w:rPr>
-          <w:t/>
+          <w:t>G</w:t>
         </w:r>
         <w:r>
           <w:rPr>
             <w:rFonts w:cs="Segoe UI Emoji"/>
           </w:rPr>
-          <w:t xml:space="preserve"/>
-        </w:r>
-      </w:ins>
-      <w:r>
-        <w:rPr>
-          <w:rFonts w:cs="Segoe UI Emoji"/>
-        </w:rPr>
-        <w:t/>
-      </w:r>
+          <w:t xml:space="preserve">. </w:t>
+        </w:r>
+        <w:r>
+          <w:rPr>
+            <w:rFonts w:cs="Segoe UI Emoji"/>
+          </w:rPr>
+          <w:t>De baas bepaald volgende status</w:t>
+        </w:r>
+      </w:ins>
     </w:p>
     <w:p>
       <w:pPr>
@@ -3565,39 +3415,61 @@
           <w:numId w:val="41"/>
         </w:numPr>
         <w:rPr>
-          <w:ins w:author="Rinse Cramer" w:date="2025-12-13T10:40:00Z" w16du:dateUtc="2025-12-13T09:40:00Z" w:id="274"/>
-        </w:rPr>
-      </w:pPr>
-      <w:ins w:author="Rinse Cramer" w:date="2025-12-13T10:44:00Z" w16du:dateUtc="2025-12-13T09:44:00Z" w:id="275">
-        <w:r>
-          <w:t>8</w:t>
-        </w:r>
-      </w:ins>
-      <w:ins w:author="Rinse Cramer" w:date="2025-12-13T10:40:00Z" w16du:dateUtc="2025-12-13T09:40:00Z" w:id="276">
+          <w:ins w:author="Rinse Cramer" w:date="2025-12-13T10:42:00Z" w16du:dateUtc="2025-12-13T09:42:00Z" w:id="287"/>
+        </w:rPr>
+      </w:pPr>
+      <w:ins w:author="Rinse Cramer" w:date="2025-12-13T10:43:00Z" w16du:dateUtc="2025-12-13T09:43:00Z" w:id="288">
+        <w:r>
+          <w:t>1</w:t>
+        </w:r>
+      </w:ins>
+      <w:ins w:author="Rinse Cramer" w:date="2025-12-13T10:44:00Z" w16du:dateUtc="2025-12-13T09:44:00Z" w:id="289">
+        <w:r>
+          <w:t>0</w:t>
+        </w:r>
+      </w:ins>
+      <w:ins w:author="Rinse Cramer" w:date="2025-12-13T10:42:00Z" w16du:dateUtc="2025-12-13T09:42:00Z" w:id="290">
         <w:r>
           <w:t xml:space="preserve">. </w:t>
         </w:r>
       </w:ins>
-      <w:r>
-        <w:t>Ik mail naar baas</w:t>
-      </w:r>
+      <w:ins w:author="Rinse Cramer" w:date="2025-12-13T10:45:00Z" w16du:dateUtc="2025-12-13T09:45:00Z" w:id="291">
+        <w:r>
+          <w:t>Terug n</w:t>
+        </w:r>
+      </w:ins>
+      <w:ins w:author="Rinse Cramer" w:date="2025-12-13T10:43:00Z" w16du:dateUtc="2025-12-13T09:43:00Z" w:id="292">
+        <w:r>
+          <w:t xml:space="preserve">aar </w:t>
+        </w:r>
+      </w:ins>
+      <w:ins w:author="Rinse Cramer" w:date="2025-12-13T10:45:00Z" w16du:dateUtc="2025-12-13T09:45:00Z" w:id="293">
+        <w:r>
+          <w:t>vorige</w:t>
+        </w:r>
+      </w:ins>
+      <w:ins w:author="Rinse Cramer" w:date="2025-12-13T10:43:00Z" w16du:dateUtc="2025-12-13T09:43:00Z" w:id="294">
+        <w:r>
+          <w:t xml:space="preserve"> flowchartpagina navigeren</w:t>
+        </w:r>
+      </w:ins>
     </w:p>
     <w:p>
       <w:pPr>
         <w:pStyle w:val="Heading1"/>
         <w:rPr>
-          <w:ins w:author="Rinse Cramer" w:date="2025-12-13T10:41:00Z" w16du:dateUtc="2025-12-13T09:41:00Z" w:id="277"/>
+          <w:ins w:author="Rinse Cramer" w:date="2025-12-13T10:44:00Z" w16du:dateUtc="2025-12-13T09:44:00Z" w:id="295"/>
           <w:rFonts w:cs="Segoe UI Emoji"/>
         </w:rPr>
       </w:pPr>
-      <w:ins w:author="Rinse Cramer" w:date="2025-12-13T10:41:00Z" w16du:dateUtc="2025-12-13T09:41:00Z" w:id="278">
+      <w:ins w:author="Rinse Cramer" w:date="2025-12-13T10:44:00Z" w16du:dateUtc="2025-12-13T09:44:00Z" w:id="296">
         <w:r>
           <w:rPr>
             <w:rFonts w:ascii="Segoe UI Emoji" w:hAnsi="Segoe UI Emoji" w:cs="Segoe UI Emoji"/>
             <w:b/>
             <w:bCs/>
           </w:rPr>
-          <w:t>🫱🏻‍🫲🏻 406. Goedkeuring?</w:t>
+          <w:t>🫱</w:t>
         </w:r>
         <w:r>
           <w:rPr>
@@ -3617,7 +3489,7 @@
               <w16se:symEx w16se:font="Segoe UI Emoji" w16se:char="1F3FB"/>
             </mc:Choice>
             <mc:Fallback>
-              <w:t/>
+              <w:t>🏻</w:t>
             </mc:Fallback>
           </mc:AlternateContent>
         </w:r>
@@ -3627,7 +3499,7 @@
             <w:b/>
             <w:bCs/>
           </w:rPr>
-          <w:t/>
+          <w:t>‍</w:t>
         </w:r>
         <w:r>
           <w:rPr>
@@ -3635,7 +3507,7 @@
             <w:b/>
             <w:bCs/>
           </w:rPr>
-          <w:t/>
+          <w:t>🫲</w:t>
         </w:r>
         <w:r>
           <w:rPr>
@@ -3655,7 +3527,7 @@
               <w16se:symEx w16se:font="Segoe UI Emoji" w16se:char="1F3FB"/>
             </mc:Choice>
             <mc:Fallback>
-              <w:t/>
+              <w:t>🏻</w:t>
             </mc:Fallback>
           </mc:AlternateContent>
         </w:r>
@@ -3663,322 +3535,32 @@
           <w:rPr>
             <w:rFonts w:cs="Segoe UI Emoji"/>
           </w:rPr>
-          <w:t xml:space="preserve"/>
+          <w:t xml:space="preserve"> </w:t>
         </w:r>
         <w:r>
           <w:rPr>
             <w:rFonts w:cs="Segoe UI Emoji"/>
           </w:rPr>
-          <w:t/>
+          <w:t>H</w:t>
         </w:r>
         <w:r>
           <w:rPr>
             <w:rFonts w:cs="Segoe UI Emoji"/>
           </w:rPr>
-          <w:t xml:space="preserve"/>
+          <w:t xml:space="preserve">. </w:t>
         </w:r>
         <w:r>
           <w:rPr>
             <w:rFonts w:cs="Segoe UI Emoji"/>
           </w:rPr>
-          <w:t/>
-        </w:r>
-      </w:ins>
-    </w:p>
-    <w:p>
-      <w:pPr>
-        <w:pStyle w:val="ListParagraph"/>
-        <w:numPr>
-          <w:ilvl w:val="0"/>
-          <w:numId w:val="41"/>
-        </w:numPr>
-        <w:rPr>
-          <w:ins w:author="Rinse Cramer" w:date="2025-12-13T10:41:00Z" w16du:dateUtc="2025-12-13T09:41:00Z" w:id="279"/>
-        </w:rPr>
-      </w:pPr>
-      <w:ins w:author="Rinse Cramer" w:date="2025-12-13T10:44:00Z" w16du:dateUtc="2025-12-13T09:44:00Z" w:id="280">
-        <w:r>
-          <w:t>9</w:t>
-        </w:r>
-      </w:ins>
-      <w:ins w:author="Rinse Cramer" w:date="2025-12-13T10:41:00Z" w16du:dateUtc="2025-12-13T09:41:00Z" w:id="281">
-        <w:r>
-          <w:t xml:space="preserve">. </w:t>
-        </w:r>
-      </w:ins>
-      <w:ins w:author="Rinse Cramer" w:date="2025-12-13T10:42:00Z" w16du:dateUtc="2025-12-13T09:42:00Z" w:id="282">
-        <w:r>
-          <w:t>R</w:t>
-        </w:r>
-      </w:ins>
-      <w:ins w:author="Rinse Cramer" w:date="2025-12-13T10:41:00Z" w16du:dateUtc="2025-12-13T09:41:00Z" w:id="283">
-        <w:r>
-          <w:t xml:space="preserve">esultaten </w:t>
-        </w:r>
-      </w:ins>
-      <w:ins w:author="Rinse Cramer" w:date="2025-12-13T10:42:00Z" w16du:dateUtc="2025-12-13T09:42:00Z" w:id="284">
-        <w:r>
-          <w:t>zijn goedgekeurd?</w:t>
-        </w:r>
-      </w:ins>
-    </w:p>
-    <w:p>
-      <w:pPr>
-        <w:pStyle w:val="Heading1"/>
-        <w:rPr>
-          <w:ins w:author="Rinse Cramer" w:date="2025-12-13T10:42:00Z" w16du:dateUtc="2025-12-13T09:42:00Z" w:id="285"/>
+          <w:t xml:space="preserve">Volg </w:t>
+        </w:r>
+      </w:ins>
+      <w:r>
+        <w:rPr>
           <w:rFonts w:cs="Segoe UI Emoji"/>
         </w:rPr>
-      </w:pPr>
-      <w:ins w:author="Rinse Cramer" w:date="2025-12-13T10:42:00Z" w16du:dateUtc="2025-12-13T09:42:00Z" w:id="286">
-        <w:r>
-          <w:rPr>
-            <w:rFonts w:ascii="Segoe UI Emoji" w:hAnsi="Segoe UI Emoji" w:cs="Segoe UI Emoji"/>
-            <w:b/>
-            <w:bCs/>
-          </w:rPr>
-          <w:t>🫱🏻‍🫲🏻 406F. De baas bepaald volgende status en verifieert effort per resterende fase</w:t>
-        </w:r>
-        <w:r>
-          <w:rPr>
-            <mc:AlternateContent>
-              <mc:Choice Requires="w16se">
-                <w:rFonts w:cs="Segoe UI Emoji"/>
-              </mc:Choice>
-              <mc:Fallback>
-                <w:rFonts w:ascii="Segoe UI Emoji" w:hAnsi="Segoe UI Emoji" w:eastAsia="Segoe UI Emoji" w:cs="Segoe UI Emoji"/>
-              </mc:Fallback>
-            </mc:AlternateContent>
-            <w:b/>
-            <w:bCs/>
-          </w:rPr>
-          <mc:AlternateContent>
-            <mc:Choice Requires="w16se">
-              <w16se:symEx w16se:font="Segoe UI Emoji" w16se:char="1F3FB"/>
-            </mc:Choice>
-            <mc:Fallback>
-              <w:t/>
-            </mc:Fallback>
-          </mc:AlternateContent>
-        </w:r>
-        <w:r>
-          <w:rPr>
-            <w:rFonts w:cs="Segoe UI Emoji"/>
-            <w:b/>
-            <w:bCs/>
-          </w:rPr>
-          <w:t/>
-        </w:r>
-        <w:r>
-          <w:rPr>
-            <w:rFonts w:ascii="Segoe UI Emoji" w:hAnsi="Segoe UI Emoji" w:cs="Segoe UI Emoji"/>
-            <w:b/>
-            <w:bCs/>
-          </w:rPr>
-          <w:t/>
-        </w:r>
-        <w:r>
-          <w:rPr>
-            <mc:AlternateContent>
-              <mc:Choice Requires="w16se">
-                <w:rFonts w:cs="Segoe UI Emoji"/>
-              </mc:Choice>
-              <mc:Fallback>
-                <w:rFonts w:ascii="Segoe UI Emoji" w:hAnsi="Segoe UI Emoji" w:eastAsia="Segoe UI Emoji" w:cs="Segoe UI Emoji"/>
-              </mc:Fallback>
-            </mc:AlternateContent>
-            <w:b/>
-            <w:bCs/>
-          </w:rPr>
-          <mc:AlternateContent>
-            <mc:Choice Requires="w16se">
-              <w16se:symEx w16se:font="Segoe UI Emoji" w16se:char="1F3FB"/>
-            </mc:Choice>
-            <mc:Fallback>
-              <w:t/>
-            </mc:Fallback>
-          </mc:AlternateContent>
-        </w:r>
-        <w:r>
-          <w:rPr>
-            <w:rFonts w:cs="Segoe UI Emoji"/>
-          </w:rPr>
-          <w:t xml:space="preserve"/>
-        </w:r>
-        <w:r>
-          <w:rPr>
-            <w:rFonts w:cs="Segoe UI Emoji"/>
-          </w:rPr>
-          <w:t/>
-        </w:r>
-        <w:r>
-          <w:rPr>
-            <w:rFonts w:cs="Segoe UI Emoji"/>
-          </w:rPr>
-          <w:t xml:space="preserve"/>
-        </w:r>
-        <w:r>
-          <w:rPr>
-            <w:rFonts w:cs="Segoe UI Emoji"/>
-          </w:rPr>
-          <w:t/>
-        </w:r>
-      </w:ins>
-    </w:p>
-    <w:p>
-      <w:pPr>
-        <w:pStyle w:val="ListParagraph"/>
-        <w:numPr>
-          <w:ilvl w:val="0"/>
-          <w:numId w:val="41"/>
-        </w:numPr>
-        <w:rPr>
-          <w:ins w:author="Rinse Cramer" w:date="2025-12-13T10:42:00Z" w16du:dateUtc="2025-12-13T09:42:00Z" w:id="287"/>
-        </w:rPr>
-      </w:pPr>
-      <w:ins w:author="Rinse Cramer" w:date="2025-12-13T10:43:00Z" w16du:dateUtc="2025-12-13T09:43:00Z" w:id="288">
-        <w:r>
-          <w:t>1</w:t>
-        </w:r>
-      </w:ins>
-      <w:ins w:author="Rinse Cramer" w:date="2025-12-13T10:44:00Z" w16du:dateUtc="2025-12-13T09:44:00Z" w:id="289">
-        <w:r>
-          <w:t>0</w:t>
-        </w:r>
-      </w:ins>
-      <w:ins w:author="Rinse Cramer" w:date="2025-12-13T10:42:00Z" w16du:dateUtc="2025-12-13T09:42:00Z" w:id="290">
-        <w:r>
-          <w:t xml:space="preserve">. </w:t>
-        </w:r>
-      </w:ins>
-      <w:ins w:author="Rinse Cramer" w:date="2025-12-13T10:45:00Z" w16du:dateUtc="2025-12-13T09:45:00Z" w:id="291">
-        <w:r>
-          <w:t>Terug n</w:t>
-        </w:r>
-      </w:ins>
-      <w:ins w:author="Rinse Cramer" w:date="2025-12-13T10:43:00Z" w16du:dateUtc="2025-12-13T09:43:00Z" w:id="292">
-        <w:r>
-          <w:t xml:space="preserve">aar </w:t>
-        </w:r>
-      </w:ins>
-      <w:ins w:author="Rinse Cramer" w:date="2025-12-13T10:45:00Z" w16du:dateUtc="2025-12-13T09:45:00Z" w:id="293">
-        <w:r>
-          <w:t>vorige</w:t>
-        </w:r>
-      </w:ins>
-      <w:ins w:author="Rinse Cramer" w:date="2025-12-13T10:43:00Z" w16du:dateUtc="2025-12-13T09:43:00Z" w:id="294">
-        <w:r>
-          <w:t xml:space="preserve"> flowchartpagina navigeren</w:t>
-        </w:r>
-      </w:ins>
-    </w:p>
-    <w:p>
-      <w:pPr>
-        <w:pStyle w:val="Heading1"/>
-        <w:rPr>
-          <w:ins w:author="Rinse Cramer" w:date="2025-12-13T10:44:00Z" w16du:dateUtc="2025-12-13T09:44:00Z" w:id="295"/>
-          <w:rFonts w:cs="Segoe UI Emoji"/>
-        </w:rPr>
-      </w:pPr>
-      <w:ins w:author="Rinse Cramer" w:date="2025-12-13T10:44:00Z" w16du:dateUtc="2025-12-13T09:44:00Z" w:id="296">
-        <w:r>
-          <w:rPr>
-            <w:rFonts w:ascii="Segoe UI Emoji" w:hAnsi="Segoe UI Emoji" w:cs="Segoe UI Emoji"/>
-            <w:b/>
-            <w:bCs/>
-          </w:rPr>
-          <w:t>🫱🏻‍🫲🏻 406T. Volg het ontwerp</w:t>
-        </w:r>
-        <w:r>
-          <w:rPr>
-            <mc:AlternateContent>
-              <mc:Choice Requires="w16se">
-                <w:rFonts w:cs="Segoe UI Emoji"/>
-              </mc:Choice>
-              <mc:Fallback>
-                <w:rFonts w:ascii="Segoe UI Emoji" w:hAnsi="Segoe UI Emoji" w:eastAsia="Segoe UI Emoji" w:cs="Segoe UI Emoji"/>
-              </mc:Fallback>
-            </mc:AlternateContent>
-            <w:b/>
-            <w:bCs/>
-          </w:rPr>
-          <mc:AlternateContent>
-            <mc:Choice Requires="w16se">
-              <w16se:symEx w16se:font="Segoe UI Emoji" w16se:char="1F3FB"/>
-            </mc:Choice>
-            <mc:Fallback>
-              <w:t/>
-            </mc:Fallback>
-          </mc:AlternateContent>
-        </w:r>
-        <w:r>
-          <w:rPr>
-            <w:rFonts w:cs="Segoe UI Emoji"/>
-            <w:b/>
-            <w:bCs/>
-          </w:rPr>
-          <w:t/>
-        </w:r>
-        <w:r>
-          <w:rPr>
-            <w:rFonts w:ascii="Segoe UI Emoji" w:hAnsi="Segoe UI Emoji" w:cs="Segoe UI Emoji"/>
-            <w:b/>
-            <w:bCs/>
-          </w:rPr>
-          <w:t/>
-        </w:r>
-        <w:r>
-          <w:rPr>
-            <mc:AlternateContent>
-              <mc:Choice Requires="w16se">
-                <w:rFonts w:cs="Segoe UI Emoji"/>
-              </mc:Choice>
-              <mc:Fallback>
-                <w:rFonts w:ascii="Segoe UI Emoji" w:hAnsi="Segoe UI Emoji" w:eastAsia="Segoe UI Emoji" w:cs="Segoe UI Emoji"/>
-              </mc:Fallback>
-            </mc:AlternateContent>
-            <w:b/>
-            <w:bCs/>
-          </w:rPr>
-          <mc:AlternateContent>
-            <mc:Choice Requires="w16se">
-              <w16se:symEx w16se:font="Segoe UI Emoji" w16se:char="1F3FB"/>
-            </mc:Choice>
-            <mc:Fallback>
-              <w:t/>
-            </mc:Fallback>
-          </mc:AlternateContent>
-        </w:r>
-        <w:r>
-          <w:rPr>
-            <w:rFonts w:cs="Segoe UI Emoji"/>
-          </w:rPr>
-          <w:t xml:space="preserve"/>
-        </w:r>
-        <w:r>
-          <w:rPr>
-            <w:rFonts w:cs="Segoe UI Emoji"/>
-          </w:rPr>
-          <w:t/>
-        </w:r>
-        <w:r>
-          <w:rPr>
-            <w:rFonts w:cs="Segoe UI Emoji"/>
-          </w:rPr>
-          <w:t xml:space="preserve"/>
-        </w:r>
-        <w:r>
-          <w:rPr>
-            <w:rFonts w:cs="Segoe UI Emoji"/>
-          </w:rPr>
-          <w:t xml:space="preserve"/>
-        </w:r>
-      </w:ins>
-      <w:r>
-        <w:rPr>
-          <w:rFonts w:cs="Segoe UI Emoji"/>
-        </w:rPr>
-        <w:t/>
+        <w:t>het ontwerp</w:t>
       </w:r>
     </w:p>
     <w:p>
@@ -4873,7 +4455,7 @@
             <w:b/>
             <w:bCs/>
           </w:rPr>
-          <w:t>🫱🏻‍🫲🏻 602. Is de baas aanwezig?</w:t>
+          <w:t>🫱</w:t>
         </w:r>
         <w:r>
           <w:rPr>
@@ -4893,7 +4475,7 @@
               <w16se:symEx w16se:font="Segoe UI Emoji" w16se:char="1F3FB"/>
             </mc:Choice>
             <mc:Fallback>
-              <w:t/>
+              <w:t>🏻</w:t>
             </mc:Fallback>
           </mc:AlternateContent>
         </w:r>
@@ -4903,7 +4485,7 @@
             <w:b/>
             <w:bCs/>
           </w:rPr>
-          <w:t/>
+          <w:t>‍</w:t>
         </w:r>
         <w:r>
           <w:rPr>
@@ -4911,7 +4493,7 @@
             <w:b/>
             <w:bCs/>
           </w:rPr>
-          <w:t/>
+          <w:t>🫲</w:t>
         </w:r>
         <w:r>
           <w:rPr>
@@ -4931,7 +4513,7 @@
               <w16se:symEx w16se:font="Segoe UI Emoji" w16se:char="1F3FB"/>
             </mc:Choice>
             <mc:Fallback>
-              <w:t/>
+              <w:t>🏻</w:t>
             </mc:Fallback>
           </mc:AlternateContent>
         </w:r>
@@ -4939,7 +4521,7 @@
           <w:rPr>
             <w:rFonts w:cs="Segoe UI Emoji"/>
           </w:rPr>
-          <w:t xml:space="preserve"/>
+          <w:t xml:space="preserve"> B. </w:t>
         </w:r>
       </w:ins>
       <w:ins w:author="Rinse Cramer" w:date="2025-12-13T10:35:00Z" w16du:dateUtc="2025-12-13T09:35:00Z" w:id="365">
@@ -4953,7 +4535,7 @@
               </w:rPr>
             </w:rPrChange>
           </w:rPr>
-          <w:t/>
+          <w:t>Is de baas aanwezig?</w:t>
         </w:r>
       </w:ins>
     </w:p>
@@ -5001,20 +4583,101 @@
     </w:p>
     <w:p>
       <w:pPr>
+        <w:pStyle w:val="ListParagraph"/>
+        <w:numPr>
+          <w:ilvl w:val="0"/>
+          <w:numId w:val="41"/>
+        </w:numPr>
+        <w:rPr>
+          <w:ins w:author="Rinse Cramer" w:date="2025-12-13T10:38:00Z" w16du:dateUtc="2025-12-13T09:38:00Z" w:id="376"/>
+        </w:rPr>
+      </w:pPr>
+      <w:ins w:author="Rinse Cramer" w:date="2025-12-13T10:43:00Z" w16du:dateUtc="2025-12-13T09:43:00Z" w:id="377">
+        <w:r>
+          <w:t>5</w:t>
+        </w:r>
+      </w:ins>
+      <w:ins w:author="Rinse Cramer" w:date="2025-12-13T10:38:00Z" w16du:dateUtc="2025-12-13T09:38:00Z" w:id="378">
+        <w:r>
+          <w:t>. Baas is schriftelijk beschikbaar</w:t>
+        </w:r>
+      </w:ins>
+    </w:p>
+    <w:p>
+      <w:pPr>
+        <w:pStyle w:val="ListParagraph"/>
+        <w:numPr>
+          <w:ilvl w:val="0"/>
+          <w:numId w:val="41"/>
+        </w:numPr>
+        <w:rPr>
+          <w:ins w:author="Rinse Cramer" w:date="2025-12-13T10:39:00Z" w16du:dateUtc="2025-12-13T09:39:00Z" w:id="379"/>
+        </w:rPr>
+      </w:pPr>
+      <w:ins w:author="Rinse Cramer" w:date="2025-12-13T10:44:00Z" w16du:dateUtc="2025-12-13T09:44:00Z" w:id="380">
+        <w:r>
+          <w:t>6</w:t>
+        </w:r>
+      </w:ins>
+      <w:ins w:author="Rinse Cramer" w:date="2025-12-13T10:38:00Z" w16du:dateUtc="2025-12-13T09:38:00Z" w:id="381">
+        <w:r>
+          <w:t>. Aa</w:t>
+        </w:r>
+      </w:ins>
+      <w:ins w:author="Rinse Cramer" w:date="2025-12-13T10:39:00Z" w16du:dateUtc="2025-12-13T09:39:00Z" w:id="382">
+        <w:r>
+          <w:t>nwezigheid monitoren</w:t>
+        </w:r>
+      </w:ins>
+    </w:p>
+    <w:p>
+      <w:pPr>
+        <w:pStyle w:val="ListParagraph"/>
+        <w:numPr>
+          <w:ilvl w:val="0"/>
+          <w:numId w:val="41"/>
+        </w:numPr>
+        <w:rPr>
+          <w:ins w:author="Rinse Cramer" w:date="2025-12-13T10:38:00Z" w16du:dateUtc="2025-12-13T09:38:00Z" w:id="385"/>
+        </w:rPr>
+      </w:pPr>
+      <w:ins w:author="Rinse Cramer" w:date="2025-12-13T10:44:00Z" w16du:dateUtc="2025-12-13T09:44:00Z" w:id="386">
+        <w:r>
+          <w:t>7</w:t>
+        </w:r>
+      </w:ins>
+      <w:ins w:author="Rinse Cramer" w:date="2025-12-13T10:39:00Z" w16du:dateUtc="2025-12-13T09:39:00Z" w:id="387">
+        <w:r>
+          <w:t xml:space="preserve">. Baas is </w:t>
+        </w:r>
+      </w:ins>
+      <w:ins w:author="Rinse Cramer" w:date="2025-12-13T10:40:00Z" w16du:dateUtc="2025-12-13T09:40:00Z" w:id="388">
+        <w:r>
+          <w:t>mondeling</w:t>
+        </w:r>
+      </w:ins>
+      <w:ins w:author="Rinse Cramer" w:date="2025-12-13T10:39:00Z" w16du:dateUtc="2025-12-13T09:39:00Z" w:id="389">
+        <w:r>
+          <w:t xml:space="preserve"> beschikbaar</w:t>
+        </w:r>
+      </w:ins>
+    </w:p>
+    <w:p>
+      <w:pPr>
         <w:pStyle w:val="Heading1"/>
         <w:rPr>
-          <w:ins w:author="Rinse Cramer" w:date="2025-12-13T10:38:00Z" w16du:dateUtc="2025-12-13T09:38:00Z" w:id="374"/>
+          <w:ins w:author="Rinse Cramer" w:date="2025-12-13T10:40:00Z" w16du:dateUtc="2025-12-13T09:40:00Z" w:id="390"/>
           <w:rFonts w:cs="Segoe UI Emoji"/>
         </w:rPr>
       </w:pPr>
-      <w:ins w:author="Rinse Cramer" w:date="2025-12-13T10:38:00Z" w16du:dateUtc="2025-12-13T09:38:00Z" w:id="375">
+      <w:ins w:author="Rinse Cramer" w:date="2025-12-13T10:40:00Z" w16du:dateUtc="2025-12-13T09:40:00Z" w:id="391">
         <w:r>
           <w:rPr>
             <w:rFonts w:ascii="Segoe UI Emoji" w:hAnsi="Segoe UI Emoji" w:cs="Segoe UI Emoji"/>
             <w:b/>
             <w:bCs/>
           </w:rPr>
-          <w:t>🫱🏻‍🫲🏻 602F. Meteen meldplicht wanneer de baas aanwezig is</w:t>
+          <w:t>🫱</w:t>
         </w:r>
         <w:r>
           <w:rPr>
@@ -5034,7 +4697,7 @@
               <w16se:symEx w16se:font="Segoe UI Emoji" w16se:char="1F3FB"/>
             </mc:Choice>
             <mc:Fallback>
-              <w:t/>
+              <w:t>🏻</w:t>
             </mc:Fallback>
           </mc:AlternateContent>
         </w:r>
@@ -5044,7 +4707,7 @@
             <w:b/>
             <w:bCs/>
           </w:rPr>
-          <w:t/>
+          <w:t>‍</w:t>
         </w:r>
         <w:r>
           <w:rPr>
@@ -5052,7 +4715,7 @@
             <w:b/>
             <w:bCs/>
           </w:rPr>
-          <w:t/>
+          <w:t>🫲</w:t>
         </w:r>
         <w:r>
           <w:rPr>
@@ -5072,7 +4735,7 @@
               <w16se:symEx w16se:font="Segoe UI Emoji" w16se:char="1F3FB"/>
             </mc:Choice>
             <mc:Fallback>
-              <w:t/>
+              <w:t>🏻</w:t>
             </mc:Fallback>
           </mc:AlternateContent>
         </w:r>
@@ -5080,27 +4743,27 @@
           <w:rPr>
             <w:rFonts w:cs="Segoe UI Emoji"/>
           </w:rPr>
-          <w:t xml:space="preserve"/>
+          <w:t xml:space="preserve"> </w:t>
         </w:r>
         <w:r>
           <w:rPr>
             <w:rFonts w:cs="Segoe UI Emoji"/>
           </w:rPr>
-          <w:t/>
+          <w:t>E</w:t>
         </w:r>
         <w:r>
           <w:rPr>
             <w:rFonts w:cs="Segoe UI Emoji"/>
           </w:rPr>
-          <w:t xml:space="preserve"/>
-        </w:r>
-        <w:r>
-          <w:rPr>
-            <w:rFonts w:cs="Segoe UI Emoji"/>
-          </w:rPr>
-          <w:t/>
-        </w:r>
-      </w:ins>
+          <w:t xml:space="preserve">. </w:t>
+        </w:r>
+      </w:ins>
+      <w:r>
+        <w:rPr>
+          <w:rFonts w:cs="Segoe UI Emoji"/>
+        </w:rPr>
+        <w:t>Overleg resultaten voor goedkeuring vervolg</w:t>
+      </w:r>
     </w:p>
     <w:p>
       <w:pPr>
@@ -5110,63 +4773,51 @@
           <w:numId w:val="41"/>
         </w:numPr>
         <w:rPr>
-          <w:ins w:author="Rinse Cramer" w:date="2025-12-13T10:38:00Z" w16du:dateUtc="2025-12-13T09:38:00Z" w:id="376"/>
-        </w:rPr>
-      </w:pPr>
-      <w:ins w:author="Rinse Cramer" w:date="2025-12-13T10:43:00Z" w16du:dateUtc="2025-12-13T09:43:00Z" w:id="377">
-        <w:r>
-          <w:t>5</w:t>
-        </w:r>
-      </w:ins>
-      <w:ins w:author="Rinse Cramer" w:date="2025-12-13T10:38:00Z" w16du:dateUtc="2025-12-13T09:38:00Z" w:id="378">
-        <w:r>
-          <w:t>. Baas is schriftelijk beschikbaar</w:t>
-        </w:r>
-      </w:ins>
-    </w:p>
-    <w:p>
-      <w:pPr>
-        <w:pStyle w:val="ListParagraph"/>
-        <w:numPr>
-          <w:ilvl w:val="0"/>
-          <w:numId w:val="41"/>
-        </w:numPr>
-        <w:rPr>
-          <w:ins w:author="Rinse Cramer" w:date="2025-12-13T10:39:00Z" w16du:dateUtc="2025-12-13T09:39:00Z" w:id="379"/>
-        </w:rPr>
-      </w:pPr>
-      <w:ins w:author="Rinse Cramer" w:date="2025-12-13T10:44:00Z" w16du:dateUtc="2025-12-13T09:44:00Z" w:id="380">
-        <w:r>
-          <w:t>6</w:t>
-        </w:r>
-      </w:ins>
-      <w:ins w:author="Rinse Cramer" w:date="2025-12-13T10:38:00Z" w16du:dateUtc="2025-12-13T09:38:00Z" w:id="381">
-        <w:r>
-          <w:t>. Aa</w:t>
-        </w:r>
-      </w:ins>
-      <w:ins w:author="Rinse Cramer" w:date="2025-12-13T10:39:00Z" w16du:dateUtc="2025-12-13T09:39:00Z" w:id="382">
-        <w:r>
-          <w:t>nwezigheid monitoren</w:t>
-        </w:r>
-      </w:ins>
+          <w:ins w:author="Rinse Cramer" w:date="2025-12-13T10:40:00Z" w16du:dateUtc="2025-12-13T09:40:00Z" w:id="392"/>
+        </w:rPr>
+      </w:pPr>
+      <w:ins w:author="Rinse Cramer" w:date="2025-12-13T10:44:00Z" w16du:dateUtc="2025-12-13T09:44:00Z" w:id="393">
+        <w:r>
+          <w:t>8</w:t>
+        </w:r>
+      </w:ins>
+      <w:ins w:author="Rinse Cramer" w:date="2025-12-13T10:40:00Z" w16du:dateUtc="2025-12-13T09:40:00Z" w:id="394">
+        <w:r>
+          <w:t xml:space="preserve">. </w:t>
+        </w:r>
+      </w:ins>
+      <w:r>
+        <w:t xml:space="preserve">Ik </w:t>
+      </w:r>
+      <w:r>
+        <w:t>mail</w:t>
+      </w:r>
+      <w:r>
+        <w:t xml:space="preserve"> </w:t>
+      </w:r>
+      <w:r>
+        <w:t>naar</w:t>
+      </w:r>
+      <w:r>
+        <w:t xml:space="preserve"> baas</w:t>
+      </w:r>
     </w:p>
     <w:p>
       <w:pPr>
         <w:pStyle w:val="Heading1"/>
         <w:rPr>
-          <w:ins w:author="Rinse Cramer" w:date="2025-12-13T10:39:00Z" w16du:dateUtc="2025-12-13T09:39:00Z" w:id="383"/>
+          <w:ins w:author="Rinse Cramer" w:date="2025-12-13T10:41:00Z" w16du:dateUtc="2025-12-13T09:41:00Z" w:id="395"/>
           <w:rFonts w:cs="Segoe UI Emoji"/>
         </w:rPr>
       </w:pPr>
-      <w:ins w:author="Rinse Cramer" w:date="2025-12-13T10:39:00Z" w16du:dateUtc="2025-12-13T09:39:00Z" w:id="384">
+      <w:ins w:author="Rinse Cramer" w:date="2025-12-13T10:41:00Z" w16du:dateUtc="2025-12-13T09:41:00Z" w:id="396">
         <w:r>
           <w:rPr>
             <w:rFonts w:ascii="Segoe UI Emoji" w:hAnsi="Segoe UI Emoji" w:cs="Segoe UI Emoji"/>
             <w:b/>
             <w:bCs/>
           </w:rPr>
-          <w:t>🫱🏻‍🫲🏻 602T. Na dat de baas weer aanwezig is</w:t>
+          <w:t>🫱</w:t>
         </w:r>
         <w:r>
           <w:rPr>
@@ -5186,7 +4837,7 @@
               <w16se:symEx w16se:font="Segoe UI Emoji" w16se:char="1F3FB"/>
             </mc:Choice>
             <mc:Fallback>
-              <w:t/>
+              <w:t>🏻</w:t>
             </mc:Fallback>
           </mc:AlternateContent>
         </w:r>
@@ -5196,7 +4847,7 @@
             <w:b/>
             <w:bCs/>
           </w:rPr>
-          <w:t/>
+          <w:t>‍</w:t>
         </w:r>
         <w:r>
           <w:rPr>
@@ -5204,7 +4855,7 @@
             <w:b/>
             <w:bCs/>
           </w:rPr>
-          <w:t/>
+          <w:t>🫲</w:t>
         </w:r>
         <w:r>
           <w:rPr>
@@ -5224,7 +4875,7 @@
               <w16se:symEx w16se:font="Segoe UI Emoji" w16se:char="1F3FB"/>
             </mc:Choice>
             <mc:Fallback>
-              <w:t/>
+              <w:t>🏻</w:t>
             </mc:Fallback>
           </mc:AlternateContent>
         </w:r>
@@ -5232,25 +4883,25 @@
           <w:rPr>
             <w:rFonts w:cs="Segoe UI Emoji"/>
           </w:rPr>
-          <w:t xml:space="preserve"/>
+          <w:t xml:space="preserve"> </w:t>
         </w:r>
         <w:r>
           <w:rPr>
             <w:rFonts w:cs="Segoe UI Emoji"/>
           </w:rPr>
-          <w:t/>
+          <w:t>F</w:t>
         </w:r>
         <w:r>
           <w:rPr>
             <w:rFonts w:cs="Segoe UI Emoji"/>
           </w:rPr>
-          <w:t xml:space="preserve"/>
+          <w:t xml:space="preserve">. </w:t>
         </w:r>
         <w:r>
           <w:rPr>
             <w:rFonts w:cs="Segoe UI Emoji"/>
           </w:rPr>
-          <w:t/>
+          <w:t>Goedkeuring?</w:t>
         </w:r>
       </w:ins>
     </w:p>
@@ -5262,27 +4913,32 @@
           <w:numId w:val="41"/>
         </w:numPr>
         <w:rPr>
-          <w:ins w:author="Rinse Cramer" w:date="2025-12-13T10:38:00Z" w16du:dateUtc="2025-12-13T09:38:00Z" w:id="385"/>
-        </w:rPr>
-      </w:pPr>
-      <w:ins w:author="Rinse Cramer" w:date="2025-12-13T10:44:00Z" w16du:dateUtc="2025-12-13T09:44:00Z" w:id="386">
-        <w:r>
-          <w:t>7</w:t>
-        </w:r>
-      </w:ins>
-      <w:ins w:author="Rinse Cramer" w:date="2025-12-13T10:39:00Z" w16du:dateUtc="2025-12-13T09:39:00Z" w:id="387">
-        <w:r>
-          <w:t xml:space="preserve">. Baas is </w:t>
-        </w:r>
-      </w:ins>
-      <w:ins w:author="Rinse Cramer" w:date="2025-12-13T10:40:00Z" w16du:dateUtc="2025-12-13T09:40:00Z" w:id="388">
-        <w:r>
-          <w:t>mondeling</w:t>
-        </w:r>
-      </w:ins>
-      <w:ins w:author="Rinse Cramer" w:date="2025-12-13T10:39:00Z" w16du:dateUtc="2025-12-13T09:39:00Z" w:id="389">
-        <w:r>
-          <w:t xml:space="preserve"> beschikbaar</w:t>
+          <w:ins w:author="Rinse Cramer" w:date="2025-12-13T10:41:00Z" w16du:dateUtc="2025-12-13T09:41:00Z" w:id="397"/>
+        </w:rPr>
+      </w:pPr>
+      <w:ins w:author="Rinse Cramer" w:date="2025-12-13T10:44:00Z" w16du:dateUtc="2025-12-13T09:44:00Z" w:id="398">
+        <w:r>
+          <w:t>9</w:t>
+        </w:r>
+      </w:ins>
+      <w:ins w:author="Rinse Cramer" w:date="2025-12-13T10:41:00Z" w16du:dateUtc="2025-12-13T09:41:00Z" w:id="399">
+        <w:r>
+          <w:t xml:space="preserve">. </w:t>
+        </w:r>
+      </w:ins>
+      <w:ins w:author="Rinse Cramer" w:date="2025-12-13T10:42:00Z" w16du:dateUtc="2025-12-13T09:42:00Z" w:id="400">
+        <w:r>
+          <w:t>R</w:t>
+        </w:r>
+      </w:ins>
+      <w:ins w:author="Rinse Cramer" w:date="2025-12-13T10:41:00Z" w16du:dateUtc="2025-12-13T09:41:00Z" w:id="401">
+        <w:r>
+          <w:t xml:space="preserve">esultaten </w:t>
+        </w:r>
+      </w:ins>
+      <w:ins w:author="Rinse Cramer" w:date="2025-12-13T10:42:00Z" w16du:dateUtc="2025-12-13T09:42:00Z" w:id="402">
+        <w:r>
+          <w:t>zijn goedgekeurd?</w:t>
         </w:r>
       </w:ins>
     </w:p>
@@ -5290,18 +4946,18 @@
       <w:pPr>
         <w:pStyle w:val="Heading1"/>
         <w:rPr>
-          <w:ins w:author="Rinse Cramer" w:date="2025-12-13T10:40:00Z" w16du:dateUtc="2025-12-13T09:40:00Z" w:id="390"/>
+          <w:ins w:author="Rinse Cramer" w:date="2025-12-13T10:42:00Z" w16du:dateUtc="2025-12-13T09:42:00Z" w:id="403"/>
           <w:rFonts w:cs="Segoe UI Emoji"/>
         </w:rPr>
       </w:pPr>
-      <w:ins w:author="Rinse Cramer" w:date="2025-12-13T10:40:00Z" w16du:dateUtc="2025-12-13T09:40:00Z" w:id="391">
+      <w:ins w:author="Rinse Cramer" w:date="2025-12-13T10:42:00Z" w16du:dateUtc="2025-12-13T09:42:00Z" w:id="404">
         <w:r>
           <w:rPr>
             <w:rFonts w:ascii="Segoe UI Emoji" w:hAnsi="Segoe UI Emoji" w:cs="Segoe UI Emoji"/>
             <w:b/>
             <w:bCs/>
           </w:rPr>
-          <w:t>🫱🏻‍🫲🏻 604. Overleg resultaten voor goedkeuring vervolg</w:t>
+          <w:t>🫱</w:t>
         </w:r>
         <w:r>
           <w:rPr>
@@ -5321,7 +4977,7 @@
               <w16se:symEx w16se:font="Segoe UI Emoji" w16se:char="1F3FB"/>
             </mc:Choice>
             <mc:Fallback>
-              <w:t/>
+              <w:t>🏻</w:t>
             </mc:Fallback>
           </mc:AlternateContent>
         </w:r>
@@ -5331,7 +4987,7 @@
             <w:b/>
             <w:bCs/>
           </w:rPr>
-          <w:t/>
+          <w:t>‍</w:t>
         </w:r>
         <w:r>
           <w:rPr>
@@ -5339,7 +4995,7 @@
             <w:b/>
             <w:bCs/>
           </w:rPr>
-          <w:t/>
+          <w:t>🫲</w:t>
         </w:r>
         <w:r>
           <w:rPr>
@@ -5359,7 +5015,7 @@
               <w16se:symEx w16se:font="Segoe UI Emoji" w16se:char="1F3FB"/>
             </mc:Choice>
             <mc:Fallback>
-              <w:t/>
+              <w:t>🏻</w:t>
             </mc:Fallback>
           </mc:AlternateContent>
         </w:r>
@@ -5367,27 +5023,27 @@
           <w:rPr>
             <w:rFonts w:cs="Segoe UI Emoji"/>
           </w:rPr>
-          <w:t xml:space="preserve"/>
+          <w:t xml:space="preserve"> </w:t>
         </w:r>
         <w:r>
           <w:rPr>
             <w:rFonts w:cs="Segoe UI Emoji"/>
           </w:rPr>
-          <w:t/>
+          <w:t>G</w:t>
         </w:r>
         <w:r>
           <w:rPr>
             <w:rFonts w:cs="Segoe UI Emoji"/>
           </w:rPr>
-          <w:t xml:space="preserve"/>
-        </w:r>
-      </w:ins>
-      <w:r>
-        <w:rPr>
-          <w:rFonts w:cs="Segoe UI Emoji"/>
-        </w:rPr>
-        <w:t/>
-      </w:r>
+          <w:t xml:space="preserve">. </w:t>
+        </w:r>
+        <w:r>
+          <w:rPr>
+            <w:rFonts w:cs="Segoe UI Emoji"/>
+          </w:rPr>
+          <w:t>De baas bepaald volgende status</w:t>
+        </w:r>
+      </w:ins>
     </w:p>
     <w:p>
       <w:pPr>
@@ -5397,51 +5053,61 @@
           <w:numId w:val="41"/>
         </w:numPr>
         <w:rPr>
-          <w:ins w:author="Rinse Cramer" w:date="2025-12-13T10:40:00Z" w16du:dateUtc="2025-12-13T09:40:00Z" w:id="392"/>
-        </w:rPr>
-      </w:pPr>
-      <w:ins w:author="Rinse Cramer" w:date="2025-12-13T10:44:00Z" w16du:dateUtc="2025-12-13T09:44:00Z" w:id="393">
-        <w:r>
-          <w:t>8</w:t>
-        </w:r>
-      </w:ins>
-      <w:ins w:author="Rinse Cramer" w:date="2025-12-13T10:40:00Z" w16du:dateUtc="2025-12-13T09:40:00Z" w:id="394">
+          <w:ins w:author="Rinse Cramer" w:date="2025-12-13T10:42:00Z" w16du:dateUtc="2025-12-13T09:42:00Z" w:id="405"/>
+        </w:rPr>
+      </w:pPr>
+      <w:ins w:author="Rinse Cramer" w:date="2025-12-13T10:43:00Z" w16du:dateUtc="2025-12-13T09:43:00Z" w:id="406">
+        <w:r>
+          <w:t>1</w:t>
+        </w:r>
+      </w:ins>
+      <w:ins w:author="Rinse Cramer" w:date="2025-12-13T10:44:00Z" w16du:dateUtc="2025-12-13T09:44:00Z" w:id="407">
+        <w:r>
+          <w:t>0</w:t>
+        </w:r>
+      </w:ins>
+      <w:ins w:author="Rinse Cramer" w:date="2025-12-13T10:42:00Z" w16du:dateUtc="2025-12-13T09:42:00Z" w:id="408">
         <w:r>
           <w:t xml:space="preserve">. </w:t>
         </w:r>
       </w:ins>
-      <w:r>
-        <w:t xml:space="preserve">Ik </w:t>
-      </w:r>
-      <w:r>
-        <w:t>mail</w:t>
-      </w:r>
-      <w:r>
-        <w:t xml:space="preserve"> </w:t>
-      </w:r>
-      <w:r>
-        <w:t>naar</w:t>
-      </w:r>
-      <w:r>
-        <w:t xml:space="preserve"> baas</w:t>
-      </w:r>
+      <w:ins w:author="Rinse Cramer" w:date="2025-12-13T10:45:00Z" w16du:dateUtc="2025-12-13T09:45:00Z" w:id="409">
+        <w:r>
+          <w:t>Terug n</w:t>
+        </w:r>
+      </w:ins>
+      <w:ins w:author="Rinse Cramer" w:date="2025-12-13T10:43:00Z" w16du:dateUtc="2025-12-13T09:43:00Z" w:id="410">
+        <w:r>
+          <w:t xml:space="preserve">aar </w:t>
+        </w:r>
+      </w:ins>
+      <w:ins w:author="Rinse Cramer" w:date="2025-12-13T10:45:00Z" w16du:dateUtc="2025-12-13T09:45:00Z" w:id="411">
+        <w:r>
+          <w:t>vorige</w:t>
+        </w:r>
+      </w:ins>
+      <w:ins w:author="Rinse Cramer" w:date="2025-12-13T10:43:00Z" w16du:dateUtc="2025-12-13T09:43:00Z" w:id="412">
+        <w:r>
+          <w:t xml:space="preserve"> flowchartpagina navigeren</w:t>
+        </w:r>
+      </w:ins>
     </w:p>
     <w:p>
       <w:pPr>
         <w:pStyle w:val="Heading1"/>
         <w:rPr>
-          <w:ins w:author="Rinse Cramer" w:date="2025-12-13T10:41:00Z" w16du:dateUtc="2025-12-13T09:41:00Z" w:id="395"/>
+          <w:ins w:author="Rinse Cramer" w:date="2025-12-13T10:44:00Z" w16du:dateUtc="2025-12-13T09:44:00Z" w:id="413"/>
           <w:rFonts w:cs="Segoe UI Emoji"/>
         </w:rPr>
       </w:pPr>
-      <w:ins w:author="Rinse Cramer" w:date="2025-12-13T10:41:00Z" w16du:dateUtc="2025-12-13T09:41:00Z" w:id="396">
+      <w:ins w:author="Rinse Cramer" w:date="2025-12-13T10:44:00Z" w16du:dateUtc="2025-12-13T09:44:00Z" w:id="414">
         <w:r>
           <w:rPr>
             <w:rFonts w:ascii="Segoe UI Emoji" w:hAnsi="Segoe UI Emoji" w:cs="Segoe UI Emoji"/>
             <w:b/>
             <w:bCs/>
           </w:rPr>
-          <w:t>🫱🏻‍🫲🏻 606. Goedkeuring?</w:t>
+          <w:t>🫱</w:t>
         </w:r>
         <w:r>
           <w:rPr>
@@ -5461,7 +5127,7 @@
               <w16se:symEx w16se:font="Segoe UI Emoji" w16se:char="1F3FB"/>
             </mc:Choice>
             <mc:Fallback>
-              <w:t/>
+              <w:t>🏻</w:t>
             </mc:Fallback>
           </mc:AlternateContent>
         </w:r>
@@ -5471,7 +5137,7 @@
             <w:b/>
             <w:bCs/>
           </w:rPr>
-          <w:t/>
+          <w:t>‍</w:t>
         </w:r>
         <w:r>
           <w:rPr>
@@ -5479,7 +5145,7 @@
             <w:b/>
             <w:bCs/>
           </w:rPr>
-          <w:t/>
+          <w:t>🫲</w:t>
         </w:r>
         <w:r>
           <w:rPr>
@@ -5499,7 +5165,7 @@
               <w16se:symEx w16se:font="Segoe UI Emoji" w16se:char="1F3FB"/>
             </mc:Choice>
             <mc:Fallback>
-              <w:t/>
+              <w:t>🏻</w:t>
             </mc:Fallback>
           </mc:AlternateContent>
         </w:r>
@@ -5507,322 +5173,32 @@
           <w:rPr>
             <w:rFonts w:cs="Segoe UI Emoji"/>
           </w:rPr>
-          <w:t xml:space="preserve"/>
+          <w:t xml:space="preserve"> </w:t>
         </w:r>
         <w:r>
           <w:rPr>
             <w:rFonts w:cs="Segoe UI Emoji"/>
           </w:rPr>
-          <w:t/>
+          <w:t>H</w:t>
         </w:r>
         <w:r>
           <w:rPr>
             <w:rFonts w:cs="Segoe UI Emoji"/>
           </w:rPr>
-          <w:t xml:space="preserve"/>
+          <w:t xml:space="preserve">. </w:t>
         </w:r>
         <w:r>
           <w:rPr>
             <w:rFonts w:cs="Segoe UI Emoji"/>
           </w:rPr>
-          <w:t/>
-        </w:r>
-      </w:ins>
-    </w:p>
-    <w:p>
-      <w:pPr>
-        <w:pStyle w:val="ListParagraph"/>
-        <w:numPr>
-          <w:ilvl w:val="0"/>
-          <w:numId w:val="41"/>
-        </w:numPr>
-        <w:rPr>
-          <w:ins w:author="Rinse Cramer" w:date="2025-12-13T10:41:00Z" w16du:dateUtc="2025-12-13T09:41:00Z" w:id="397"/>
-        </w:rPr>
-      </w:pPr>
-      <w:ins w:author="Rinse Cramer" w:date="2025-12-13T10:44:00Z" w16du:dateUtc="2025-12-13T09:44:00Z" w:id="398">
-        <w:r>
-          <w:t>9</w:t>
-        </w:r>
-      </w:ins>
-      <w:ins w:author="Rinse Cramer" w:date="2025-12-13T10:41:00Z" w16du:dateUtc="2025-12-13T09:41:00Z" w:id="399">
-        <w:r>
-          <w:t xml:space="preserve">. </w:t>
-        </w:r>
-      </w:ins>
-      <w:ins w:author="Rinse Cramer" w:date="2025-12-13T10:42:00Z" w16du:dateUtc="2025-12-13T09:42:00Z" w:id="400">
-        <w:r>
-          <w:t>R</w:t>
-        </w:r>
-      </w:ins>
-      <w:ins w:author="Rinse Cramer" w:date="2025-12-13T10:41:00Z" w16du:dateUtc="2025-12-13T09:41:00Z" w:id="401">
-        <w:r>
-          <w:t xml:space="preserve">esultaten </w:t>
-        </w:r>
-      </w:ins>
-      <w:ins w:author="Rinse Cramer" w:date="2025-12-13T10:42:00Z" w16du:dateUtc="2025-12-13T09:42:00Z" w:id="402">
-        <w:r>
-          <w:t>zijn goedgekeurd?</w:t>
-        </w:r>
-      </w:ins>
-    </w:p>
-    <w:p>
-      <w:pPr>
-        <w:pStyle w:val="Heading1"/>
-        <w:rPr>
-          <w:ins w:author="Rinse Cramer" w:date="2025-12-13T10:42:00Z" w16du:dateUtc="2025-12-13T09:42:00Z" w:id="403"/>
+          <w:t xml:space="preserve">Volg de </w:t>
+        </w:r>
+      </w:ins>
+      <w:r>
+        <w:rPr>
           <w:rFonts w:cs="Segoe UI Emoji"/>
         </w:rPr>
-      </w:pPr>
-      <w:ins w:author="Rinse Cramer" w:date="2025-12-13T10:42:00Z" w16du:dateUtc="2025-12-13T09:42:00Z" w:id="404">
-        <w:r>
-          <w:rPr>
-            <w:rFonts w:ascii="Segoe UI Emoji" w:hAnsi="Segoe UI Emoji" w:cs="Segoe UI Emoji"/>
-            <w:b/>
-            <w:bCs/>
-          </w:rPr>
-          <w:t>🫱🏻‍🫲🏻 606F. De baas bepaald volgende status en verifieert effort per resterende fase</w:t>
-        </w:r>
-        <w:r>
-          <w:rPr>
-            <mc:AlternateContent>
-              <mc:Choice Requires="w16se">
-                <w:rFonts w:cs="Segoe UI Emoji"/>
-              </mc:Choice>
-              <mc:Fallback>
-                <w:rFonts w:ascii="Segoe UI Emoji" w:hAnsi="Segoe UI Emoji" w:eastAsia="Segoe UI Emoji" w:cs="Segoe UI Emoji"/>
-              </mc:Fallback>
-            </mc:AlternateContent>
-            <w:b/>
-            <w:bCs/>
-          </w:rPr>
-          <mc:AlternateContent>
-            <mc:Choice Requires="w16se">
-              <w16se:symEx w16se:font="Segoe UI Emoji" w16se:char="1F3FB"/>
-            </mc:Choice>
-            <mc:Fallback>
-              <w:t/>
-            </mc:Fallback>
-          </mc:AlternateContent>
-        </w:r>
-        <w:r>
-          <w:rPr>
-            <w:rFonts w:cs="Segoe UI Emoji"/>
-            <w:b/>
-            <w:bCs/>
-          </w:rPr>
-          <w:t/>
-        </w:r>
-        <w:r>
-          <w:rPr>
-            <w:rFonts w:ascii="Segoe UI Emoji" w:hAnsi="Segoe UI Emoji" w:cs="Segoe UI Emoji"/>
-            <w:b/>
-            <w:bCs/>
-          </w:rPr>
-          <w:t/>
-        </w:r>
-        <w:r>
-          <w:rPr>
-            <mc:AlternateContent>
-              <mc:Choice Requires="w16se">
-                <w:rFonts w:cs="Segoe UI Emoji"/>
-              </mc:Choice>
-              <mc:Fallback>
-                <w:rFonts w:ascii="Segoe UI Emoji" w:hAnsi="Segoe UI Emoji" w:eastAsia="Segoe UI Emoji" w:cs="Segoe UI Emoji"/>
-              </mc:Fallback>
-            </mc:AlternateContent>
-            <w:b/>
-            <w:bCs/>
-          </w:rPr>
-          <mc:AlternateContent>
-            <mc:Choice Requires="w16se">
-              <w16se:symEx w16se:font="Segoe UI Emoji" w16se:char="1F3FB"/>
-            </mc:Choice>
-            <mc:Fallback>
-              <w:t/>
-            </mc:Fallback>
-          </mc:AlternateContent>
-        </w:r>
-        <w:r>
-          <w:rPr>
-            <w:rFonts w:cs="Segoe UI Emoji"/>
-          </w:rPr>
-          <w:t xml:space="preserve"/>
-        </w:r>
-        <w:r>
-          <w:rPr>
-            <w:rFonts w:cs="Segoe UI Emoji"/>
-          </w:rPr>
-          <w:t/>
-        </w:r>
-        <w:r>
-          <w:rPr>
-            <w:rFonts w:cs="Segoe UI Emoji"/>
-          </w:rPr>
-          <w:t xml:space="preserve"/>
-        </w:r>
-        <w:r>
-          <w:rPr>
-            <w:rFonts w:cs="Segoe UI Emoji"/>
-          </w:rPr>
-          <w:t/>
-        </w:r>
-      </w:ins>
-    </w:p>
-    <w:p>
-      <w:pPr>
-        <w:pStyle w:val="ListParagraph"/>
-        <w:numPr>
-          <w:ilvl w:val="0"/>
-          <w:numId w:val="41"/>
-        </w:numPr>
-        <w:rPr>
-          <w:ins w:author="Rinse Cramer" w:date="2025-12-13T10:42:00Z" w16du:dateUtc="2025-12-13T09:42:00Z" w:id="405"/>
-        </w:rPr>
-      </w:pPr>
-      <w:ins w:author="Rinse Cramer" w:date="2025-12-13T10:43:00Z" w16du:dateUtc="2025-12-13T09:43:00Z" w:id="406">
-        <w:r>
-          <w:t>1</w:t>
-        </w:r>
-      </w:ins>
-      <w:ins w:author="Rinse Cramer" w:date="2025-12-13T10:44:00Z" w16du:dateUtc="2025-12-13T09:44:00Z" w:id="407">
-        <w:r>
-          <w:t>0</w:t>
-        </w:r>
-      </w:ins>
-      <w:ins w:author="Rinse Cramer" w:date="2025-12-13T10:42:00Z" w16du:dateUtc="2025-12-13T09:42:00Z" w:id="408">
-        <w:r>
-          <w:t xml:space="preserve">. </w:t>
-        </w:r>
-      </w:ins>
-      <w:ins w:author="Rinse Cramer" w:date="2025-12-13T10:45:00Z" w16du:dateUtc="2025-12-13T09:45:00Z" w:id="409">
-        <w:r>
-          <w:t>Terug n</w:t>
-        </w:r>
-      </w:ins>
-      <w:ins w:author="Rinse Cramer" w:date="2025-12-13T10:43:00Z" w16du:dateUtc="2025-12-13T09:43:00Z" w:id="410">
-        <w:r>
-          <w:t xml:space="preserve">aar </w:t>
-        </w:r>
-      </w:ins>
-      <w:ins w:author="Rinse Cramer" w:date="2025-12-13T10:45:00Z" w16du:dateUtc="2025-12-13T09:45:00Z" w:id="411">
-        <w:r>
-          <w:t>vorige</w:t>
-        </w:r>
-      </w:ins>
-      <w:ins w:author="Rinse Cramer" w:date="2025-12-13T10:43:00Z" w16du:dateUtc="2025-12-13T09:43:00Z" w:id="412">
-        <w:r>
-          <w:t xml:space="preserve"> flowchartpagina navigeren</w:t>
-        </w:r>
-      </w:ins>
-    </w:p>
-    <w:p>
-      <w:pPr>
-        <w:pStyle w:val="Heading1"/>
-        <w:rPr>
-          <w:ins w:author="Rinse Cramer" w:date="2025-12-13T10:44:00Z" w16du:dateUtc="2025-12-13T09:44:00Z" w:id="413"/>
-          <w:rFonts w:cs="Segoe UI Emoji"/>
-        </w:rPr>
-      </w:pPr>
-      <w:ins w:author="Rinse Cramer" w:date="2025-12-13T10:44:00Z" w16du:dateUtc="2025-12-13T09:44:00Z" w:id="414">
-        <w:r>
-          <w:rPr>
-            <w:rFonts w:ascii="Segoe UI Emoji" w:hAnsi="Segoe UI Emoji" w:cs="Segoe UI Emoji"/>
-            <w:b/>
-            <w:bCs/>
-          </w:rPr>
-          <w:t>🫱🏻‍🫲🏻 606T. Volg de implementatie</w:t>
-        </w:r>
-        <w:r>
-          <w:rPr>
-            <mc:AlternateContent>
-              <mc:Choice Requires="w16se">
-                <w:rFonts w:cs="Segoe UI Emoji"/>
-              </mc:Choice>
-              <mc:Fallback>
-                <w:rFonts w:ascii="Segoe UI Emoji" w:hAnsi="Segoe UI Emoji" w:eastAsia="Segoe UI Emoji" w:cs="Segoe UI Emoji"/>
-              </mc:Fallback>
-            </mc:AlternateContent>
-            <w:b/>
-            <w:bCs/>
-          </w:rPr>
-          <mc:AlternateContent>
-            <mc:Choice Requires="w16se">
-              <w16se:symEx w16se:font="Segoe UI Emoji" w16se:char="1F3FB"/>
-            </mc:Choice>
-            <mc:Fallback>
-              <w:t/>
-            </mc:Fallback>
-          </mc:AlternateContent>
-        </w:r>
-        <w:r>
-          <w:rPr>
-            <w:rFonts w:cs="Segoe UI Emoji"/>
-            <w:b/>
-            <w:bCs/>
-          </w:rPr>
-          <w:t/>
-        </w:r>
-        <w:r>
-          <w:rPr>
-            <w:rFonts w:ascii="Segoe UI Emoji" w:hAnsi="Segoe UI Emoji" w:cs="Segoe UI Emoji"/>
-            <w:b/>
-            <w:bCs/>
-          </w:rPr>
-          <w:t/>
-        </w:r>
-        <w:r>
-          <w:rPr>
-            <mc:AlternateContent>
-              <mc:Choice Requires="w16se">
-                <w:rFonts w:cs="Segoe UI Emoji"/>
-              </mc:Choice>
-              <mc:Fallback>
-                <w:rFonts w:ascii="Segoe UI Emoji" w:hAnsi="Segoe UI Emoji" w:eastAsia="Segoe UI Emoji" w:cs="Segoe UI Emoji"/>
-              </mc:Fallback>
-            </mc:AlternateContent>
-            <w:b/>
-            <w:bCs/>
-          </w:rPr>
-          <mc:AlternateContent>
-            <mc:Choice Requires="w16se">
-              <w16se:symEx w16se:font="Segoe UI Emoji" w16se:char="1F3FB"/>
-            </mc:Choice>
-            <mc:Fallback>
-              <w:t/>
-            </mc:Fallback>
-          </mc:AlternateContent>
-        </w:r>
-        <w:r>
-          <w:rPr>
-            <w:rFonts w:cs="Segoe UI Emoji"/>
-          </w:rPr>
-          <w:t xml:space="preserve"/>
-        </w:r>
-        <w:r>
-          <w:rPr>
-            <w:rFonts w:cs="Segoe UI Emoji"/>
-          </w:rPr>
-          <w:t/>
-        </w:r>
-        <w:r>
-          <w:rPr>
-            <w:rFonts w:cs="Segoe UI Emoji"/>
-          </w:rPr>
-          <w:t xml:space="preserve"/>
-        </w:r>
-        <w:r>
-          <w:rPr>
-            <w:rFonts w:cs="Segoe UI Emoji"/>
-          </w:rPr>
-          <w:t xml:space="preserve"/>
-        </w:r>
-      </w:ins>
-      <w:r>
-        <w:rPr>
-          <w:rFonts w:cs="Segoe UI Emoji"/>
-        </w:rPr>
-        <w:t/>
+        <w:t>implementatie</w:t>
       </w:r>
     </w:p>
     <w:p>

</xml_diff>

<commit_message>
refactor(generator): vereenvoudig fase-parsing en verwijder fallback templates
- Gebruik actienummers (101, 201, ..., 1201) in ParseActielijst voor het dynamisch bepalen van de actieve fase
- Verwijder de verouderde "Status =" en emoji string-matching logica
- Verwijder de "review" fallback/cloning logica volledig, zodat ontbrekende fasen strikt de waarschuwing tonen
- Voeg seenSpecialAction flag toe aan ParseChecklijst om 200-serie correct naar 'review special action' te mappen
</commit_message>
<xml_diff>
--- a/Actielijst.docx
+++ b/Actielijst.docx
@@ -53,16 +53,15 @@
         <w:rPr/>
         <w:t>101</w:t>
       </w:r>
-      <w:ins w:author="Rinse Cramer" w:date="2025-12-12T15:01:00Z" w16du:dateUtc="2025-12-12T14:01:00Z" w:id="1941351483">
+      <w:ins w:author="Rinse Cramer" w:date="2025-12-12T15:01:00Z" w16du:dateUtc="2025-12-12T14:01:00Z" w:id="1927747816">
         <w:r>
           <w:t xml:space="preserve">. </w:t>
         </w:r>
       </w:ins>
-      <w:ins w:author="Rinse Cramer" w:date="2025-12-12T14:43:00Z" w16du:dateUtc="2025-12-12T13:43:00Z" w:id="2051569623">
-        <w:r>
-          <w:t>Status = intake</w:t>
-        </w:r>
-      </w:ins>
+      <w:r>
+        <w:rPr/>
+        <w:t>Issue [nieuw]</w:t>
+      </w:r>
     </w:p>
     <w:p>
       <w:pPr>
@@ -972,7 +971,6 @@
             <w:b/>
             <w:bCs/>
           </w:rPr>
-          <w:lastRenderedPageBreak/>
           <w:delText>🫱🏻</w:delText>
         </w:r>
         <w:r>
@@ -1234,16 +1232,18 @@
       <w:pPr>
         <w:pStyle w:val="Heading1"/>
         <w:rPr>
-          <w:ins w:author="Rinse Cramer" w:date="2025-12-13T10:33:00Z" w16du:dateUtc="2025-12-13T09:33:00Z" w:id="135"/>
-          <w:rFonts w:cs="Segoe UI Emoji"/>
+          <w:ins w:author="Rinse Cramer" w:date="2025-12-13T10:33:00Z" w16du:dateUtc="2025-12-13T09:33:00Z" w:id="939167868"/>
+          <w:rFonts w:ascii="Segoe UI Emoji" w:hAnsi="Segoe UI Emoji" w:cs="Segoe UI Emoji"/>
+          <w:b w:val="1"/>
+          <w:bCs w:val="1"/>
           <w:lang w:val="en-US"/>
         </w:rPr>
       </w:pPr>
-      <w:del w:author="Rinse Cramer" w:date="2025-11-24T23:53:00Z" w16du:dateUtc="2025-11-24T22:53:00Z" w:id="136">
-        <w:r>
-          <w:rPr>
-            <w:b/>
-            <w:bCs/>
+      <w:del w:author="Rinse Cramer" w:date="2025-11-24T23:53:00Z" w16du:dateUtc="2025-11-24T22:53:00Z" w:id="585345118">
+        <w:r>
+          <w:rPr>
+            <w:b w:val="1"/>
+            <w:bCs w:val="1"/>
           </w:rPr>
           <w:delText>e. Oplossingsrichting (bij feat</w:delText>
         </w:r>
@@ -1251,11 +1251,20 @@
       <w:r>
         <w:rPr>
           <w:rFonts w:ascii="Segoe UI Emoji" w:hAnsi="Segoe UI Emoji" w:cs="Segoe UI Emoji"/>
-          <w:b/>
-          <w:bCs/>
+          <w:b w:val="1"/>
+          <w:bCs w:val="1"/>
           <w:lang w:val="en-US"/>
         </w:rPr>
-        <w:t>🫱🏻‍🫲🏻 201. Status = review aanpak</w:t>
+        <w:t xml:space="preserve">🫱🏻‍🫲🏻 201. </w:t>
+      </w:r>
+      <w:r>
+        <w:rPr>
+          <w:rFonts w:ascii="Segoe UI Emoji" w:hAnsi="Segoe UI Emoji" w:cs="Segoe UI Emoji"/>
+          <w:b w:val="1"/>
+          <w:bCs w:val="1"/>
+          <w:lang w:val="en-US"/>
+        </w:rPr>
+        <w:t>Issue [intake voltooid]</w:t>
       </w:r>
       <w:r>
         <w:rPr>
@@ -1275,9 +1284,7 @@
           <mc:Choice Requires="w16se">
             <w16se:symEx w16se:font="Segoe UI Emoji" w16se:char="1F3FB"/>
           </mc:Choice>
-          <mc:Fallback>
-            <w:t/>
-          </mc:Fallback>
+          <mc:Fallback/>
         </mc:AlternateContent>
       </w:r>
       <w:r>
@@ -1287,7 +1294,6 @@
           <w:bCs/>
           <w:lang w:val="en-US"/>
         </w:rPr>
-        <w:t/>
       </w:r>
       <w:r>
         <w:rPr>
@@ -1307,9 +1313,7 @@
           <mc:Choice Requires="w16se">
             <w16se:symEx w16se:font="Segoe UI Emoji" w16se:char="1F3FB"/>
           </mc:Choice>
-          <mc:Fallback>
-            <w:t/>
-          </mc:Fallback>
+          <mc:Fallback/>
         </mc:AlternateContent>
       </w:r>
       <w:ins w:author="Rinse Cramer" w:date="2025-12-13T10:31:00Z" w16du:dateUtc="2025-12-13T09:31:00Z" w:id="137">
@@ -1323,7 +1327,6 @@
               </w:rPr>
             </w:rPrChange>
           </w:rPr>
-          <w:t xml:space="preserve"/>
         </w:r>
         <w:r>
           <w:rPr>
@@ -1336,7 +1339,6 @@
               </w:rPr>
             </w:rPrChange>
           </w:rPr>
-          <w:t/>
         </w:r>
       </w:ins>
     </w:p>
@@ -1902,11 +1904,135 @@
       <w:pPr>
         <w:pStyle w:val="Heading1"/>
         <w:rPr>
-          <w:ins w:author="Rinse Cramer" w:date="2025-12-13T10:42:00Z" w16du:dateUtc="2025-12-13T09:42:00Z" w:id="187"/>
+          <w:ins w:author="Rinse Cramer" w:date="2025-12-13T10:42:00Z" w16du:dateUtc="2025-12-13T09:42:00Z" w:id="2126673051"/>
           <w:rFonts w:cs="Segoe UI Emoji"/>
         </w:rPr>
       </w:pPr>
-      <w:ins w:author="Rinse Cramer" w:date="2025-12-13T10:42:00Z" w16du:dateUtc="2025-12-13T09:42:00Z" w:id="188">
+      <w:ins w:author="Rinse Cramer" w:date="2025-12-13T10:42:00Z" w16du:dateUtc="2025-12-13T09:42:00Z" w:id="124453450">
+        <w:r>
+          <w:rPr>
+            <w:rFonts w:ascii="Segoe UI Emoji" w:hAnsi="Segoe UI Emoji" w:cs="Segoe UI Emoji"/>
+            <w:b w:val="1"/>
+            <w:bCs w:val="1"/>
+          </w:rPr>
+          <w:t>🫱</w:t>
+        </w:r>
+        <w:r>
+          <w:rPr>
+            <w:rFonts w:ascii="Segoe UI Emoji" w:hAnsi="Segoe UI Emoji" w:eastAsia="Segoe UI Emoji" w:cs="Segoe UI Emoji"/>
+          </w:rPr>
+          <w:t>🏻</w:t>
+        </w:r>
+        <w:r>
+          <w:rPr>
+            <w:rFonts w:cs="Segoe UI Emoji"/>
+            <w:b w:val="1"/>
+            <w:bCs w:val="1"/>
+          </w:rPr>
+          <w:t>‍</w:t>
+        </w:r>
+        <w:r>
+          <w:rPr>
+            <w:rFonts w:ascii="Segoe UI Emoji" w:hAnsi="Segoe UI Emoji" w:cs="Segoe UI Emoji"/>
+            <w:b w:val="1"/>
+            <w:bCs w:val="1"/>
+          </w:rPr>
+          <w:t>🫲</w:t>
+        </w:r>
+        <w:r>
+          <w:rPr>
+            <w:rFonts w:ascii="Segoe UI Emoji" w:hAnsi="Segoe UI Emoji" w:eastAsia="Segoe UI Emoji" w:cs="Segoe UI Emoji"/>
+          </w:rPr>
+          <w:t>🏻</w:t>
+        </w:r>
+        <w:r>
+          <w:rPr>
+            <w:rFonts w:cs="Segoe UI Emoji"/>
+          </w:rPr>
+          <w:t xml:space="preserve"> </w:t>
+        </w:r>
+        <w:r>
+          <w:rPr>
+            <w:rFonts w:cs="Segoe UI Emoji"/>
+          </w:rPr>
+          <w:t>G</w:t>
+        </w:r>
+        <w:r>
+          <w:rPr>
+            <w:rFonts w:cs="Segoe UI Emoji"/>
+          </w:rPr>
+          <w:t xml:space="preserve">. </w:t>
+        </w:r>
+      </w:ins>
+      <w:r>
+        <w:rPr>
+          <w:rFonts w:cs="Segoe UI Emoji"/>
+        </w:rPr>
+        <w:t>Volg de intake</w:t>
+      </w:r>
+    </w:p>
+    <w:p>
+      <w:pPr>
+        <w:pStyle w:val="ListParagraph"/>
+        <w:numPr>
+          <w:ilvl w:val="0"/>
+          <w:numId w:val="41"/>
+        </w:numPr>
+        <w:rPr>
+          <w:ins w:author="Rinse Cramer" w:date="2025-12-13T10:42:00Z" w16du:dateUtc="2025-12-13T09:42:00Z" w:id="189"/>
+        </w:rPr>
+      </w:pPr>
+      <w:ins w:author="Rinse Cramer" w:date="2025-12-13T10:43:00Z" w16du:dateUtc="2025-12-13T09:43:00Z" w:id="190">
+        <w:r>
+          <w:t>1</w:t>
+        </w:r>
+      </w:ins>
+      <w:ins w:author="Rinse Cramer" w:date="2025-12-13T10:44:00Z" w16du:dateUtc="2025-12-13T09:44:00Z" w:id="191">
+        <w:r>
+          <w:t>0</w:t>
+        </w:r>
+      </w:ins>
+      <w:ins w:author="Rinse Cramer" w:date="2025-12-13T10:42:00Z" w16du:dateUtc="2025-12-13T09:42:00Z" w:id="192">
+        <w:r>
+          <w:t xml:space="preserve">. </w:t>
+        </w:r>
+      </w:ins>
+      <w:ins w:author="Rinse Cramer" w:date="2025-12-13T10:45:00Z" w16du:dateUtc="2025-12-13T09:45:00Z" w:id="193">
+        <w:r>
+          <w:t>Terug n</w:t>
+        </w:r>
+      </w:ins>
+      <w:ins w:author="Rinse Cramer" w:date="2025-12-13T10:43:00Z" w16du:dateUtc="2025-12-13T09:43:00Z" w:id="194">
+        <w:r>
+          <w:t>a</w:t>
+        </w:r>
+        <w:r>
+          <w:t>ar</w:t>
+        </w:r>
+        <w:r>
+          <w:t xml:space="preserve"> </w:t>
+        </w:r>
+      </w:ins>
+      <w:ins w:author="Rinse Cramer" w:date="2025-12-13T10:45:00Z" w16du:dateUtc="2025-12-13T09:45:00Z" w:id="195">
+        <w:r>
+          <w:t>vorige</w:t>
+        </w:r>
+      </w:ins>
+      <w:ins w:author="Rinse Cramer" w:date="2025-12-13T10:43:00Z" w16du:dateUtc="2025-12-13T09:43:00Z" w:id="196">
+        <w:r>
+          <w:t xml:space="preserve"> flowchartpagina navigeren</w:t>
+        </w:r>
+      </w:ins>
+    </w:p>
+    <w:p>
+      <w:pPr>
+        <w:pStyle w:val="Heading1"/>
+        <w:rPr>
+          <w:ins w:author="Rinse Cramer" w:date="2025-12-13T10:44:00Z" w16du:dateUtc="2025-12-13T09:44:00Z" w:id="197"/>
+          <w:rFonts w:cs="Segoe UI Emoji"/>
+        </w:rPr>
+      </w:pPr>
+      <w:ins w:author="Rinse Cramer" w:date="2025-12-13T10:44:00Z" w16du:dateUtc="2025-12-13T09:44:00Z" w:id="198">
         <w:r>
           <w:rPr>
             <w:rFonts w:ascii="Segoe UI Emoji" w:hAnsi="Segoe UI Emoji" w:cs="Segoe UI Emoji"/>
@@ -1985,162 +2111,6 @@
           <w:rPr>
             <w:rFonts w:cs="Segoe UI Emoji"/>
           </w:rPr>
-          <w:t>G</w:t>
-        </w:r>
-        <w:r>
-          <w:rPr>
-            <w:rFonts w:cs="Segoe UI Emoji"/>
-          </w:rPr>
-          <w:t xml:space="preserve">. </w:t>
-        </w:r>
-        <w:r>
-          <w:rPr>
-            <w:rFonts w:cs="Segoe UI Emoji"/>
-          </w:rPr>
-          <w:t>De baas bepaald volgende status</w:t>
-        </w:r>
-      </w:ins>
-    </w:p>
-    <w:p>
-      <w:pPr>
-        <w:pStyle w:val="ListParagraph"/>
-        <w:numPr>
-          <w:ilvl w:val="0"/>
-          <w:numId w:val="41"/>
-        </w:numPr>
-        <w:rPr>
-          <w:ins w:author="Rinse Cramer" w:date="2025-12-13T10:42:00Z" w16du:dateUtc="2025-12-13T09:42:00Z" w:id="189"/>
-        </w:rPr>
-      </w:pPr>
-      <w:ins w:author="Rinse Cramer" w:date="2025-12-13T10:43:00Z" w16du:dateUtc="2025-12-13T09:43:00Z" w:id="190">
-        <w:r>
-          <w:t>1</w:t>
-        </w:r>
-      </w:ins>
-      <w:ins w:author="Rinse Cramer" w:date="2025-12-13T10:44:00Z" w16du:dateUtc="2025-12-13T09:44:00Z" w:id="191">
-        <w:r>
-          <w:t>0</w:t>
-        </w:r>
-      </w:ins>
-      <w:ins w:author="Rinse Cramer" w:date="2025-12-13T10:42:00Z" w16du:dateUtc="2025-12-13T09:42:00Z" w:id="192">
-        <w:r>
-          <w:t xml:space="preserve">. </w:t>
-        </w:r>
-      </w:ins>
-      <w:ins w:author="Rinse Cramer" w:date="2025-12-13T10:45:00Z" w16du:dateUtc="2025-12-13T09:45:00Z" w:id="193">
-        <w:r>
-          <w:t>Terug n</w:t>
-        </w:r>
-      </w:ins>
-      <w:ins w:author="Rinse Cramer" w:date="2025-12-13T10:43:00Z" w16du:dateUtc="2025-12-13T09:43:00Z" w:id="194">
-        <w:r>
-          <w:t>a</w:t>
-        </w:r>
-        <w:r>
-          <w:t>ar</w:t>
-        </w:r>
-        <w:r>
-          <w:t xml:space="preserve"> </w:t>
-        </w:r>
-      </w:ins>
-      <w:ins w:author="Rinse Cramer" w:date="2025-12-13T10:45:00Z" w16du:dateUtc="2025-12-13T09:45:00Z" w:id="195">
-        <w:r>
-          <w:t>vorige</w:t>
-        </w:r>
-      </w:ins>
-      <w:ins w:author="Rinse Cramer" w:date="2025-12-13T10:43:00Z" w16du:dateUtc="2025-12-13T09:43:00Z" w:id="196">
-        <w:r>
-          <w:t xml:space="preserve"> flowchartpagina navigeren</w:t>
-        </w:r>
-      </w:ins>
-    </w:p>
-    <w:p>
-      <w:pPr>
-        <w:pStyle w:val="Heading1"/>
-        <w:rPr>
-          <w:ins w:author="Rinse Cramer" w:date="2025-12-13T10:44:00Z" w16du:dateUtc="2025-12-13T09:44:00Z" w:id="197"/>
-          <w:rFonts w:cs="Segoe UI Emoji"/>
-        </w:rPr>
-      </w:pPr>
-      <w:ins w:author="Rinse Cramer" w:date="2025-12-13T10:44:00Z" w16du:dateUtc="2025-12-13T09:44:00Z" w:id="198">
-        <w:r>
-          <w:rPr>
-            <w:rFonts w:ascii="Segoe UI Emoji" w:hAnsi="Segoe UI Emoji" w:cs="Segoe UI Emoji"/>
-            <w:b/>
-            <w:bCs/>
-          </w:rPr>
-          <w:t>🫱</w:t>
-        </w:r>
-        <w:r>
-          <w:rPr>
-            <mc:AlternateContent>
-              <mc:Choice Requires="w16se">
-                <w:rFonts w:cs="Segoe UI Emoji"/>
-              </mc:Choice>
-              <mc:Fallback>
-                <w:rFonts w:ascii="Segoe UI Emoji" w:hAnsi="Segoe UI Emoji" w:eastAsia="Segoe UI Emoji" w:cs="Segoe UI Emoji"/>
-              </mc:Fallback>
-            </mc:AlternateContent>
-            <w:b/>
-            <w:bCs/>
-          </w:rPr>
-          <mc:AlternateContent>
-            <mc:Choice Requires="w16se">
-              <w16se:symEx w16se:font="Segoe UI Emoji" w16se:char="1F3FB"/>
-            </mc:Choice>
-            <mc:Fallback>
-              <w:t>🏻</w:t>
-            </mc:Fallback>
-          </mc:AlternateContent>
-        </w:r>
-        <w:r>
-          <w:rPr>
-            <w:rFonts w:cs="Segoe UI Emoji"/>
-            <w:b/>
-            <w:bCs/>
-          </w:rPr>
-          <w:t>‍</w:t>
-        </w:r>
-        <w:r>
-          <w:rPr>
-            <w:rFonts w:ascii="Segoe UI Emoji" w:hAnsi="Segoe UI Emoji" w:cs="Segoe UI Emoji"/>
-            <w:b/>
-            <w:bCs/>
-          </w:rPr>
-          <w:t>🫲</w:t>
-        </w:r>
-        <w:r>
-          <w:rPr>
-            <mc:AlternateContent>
-              <mc:Choice Requires="w16se">
-                <w:rFonts w:cs="Segoe UI Emoji"/>
-              </mc:Choice>
-              <mc:Fallback>
-                <w:rFonts w:ascii="Segoe UI Emoji" w:hAnsi="Segoe UI Emoji" w:eastAsia="Segoe UI Emoji" w:cs="Segoe UI Emoji"/>
-              </mc:Fallback>
-            </mc:AlternateContent>
-            <w:b/>
-            <w:bCs/>
-          </w:rPr>
-          <mc:AlternateContent>
-            <mc:Choice Requires="w16se">
-              <w16se:symEx w16se:font="Segoe UI Emoji" w16se:char="1F3FB"/>
-            </mc:Choice>
-            <mc:Fallback>
-              <w:t>🏻</w:t>
-            </mc:Fallback>
-          </mc:AlternateContent>
-        </w:r>
-        <w:r>
-          <w:rPr>
-            <w:rFonts w:cs="Segoe UI Emoji"/>
-          </w:rPr>
-          <w:t xml:space="preserve"> </w:t>
-        </w:r>
-        <w:r>
-          <w:rPr>
-            <w:rFonts w:cs="Segoe UI Emoji"/>
-          </w:rPr>
           <w:t>H</w:t>
         </w:r>
         <w:r>
@@ -2219,7 +2189,7 @@
         <w:pStyle w:val="Heading1"/>
         <w:rPr>
           <w:lang w:val="en-US"/>
-          <w:rPrChange w:author="Rinse Cramer" w:date="2025-12-13T10:31:00Z" w16du:dateUtc="2025-12-13T09:31:00Z" w:id="208">
+          <w:rPrChange w:author="Rinse Cramer" w:date="2025-12-13T10:31:00Z" w16du:dateUtc="2025-12-13T09:31:00Z" w:id="283373282">
             <w:rPr/>
           </w:rPrChange>
         </w:rPr>
@@ -2228,8 +2198,13 @@
         <w:rPr>
           <w:rFonts w:ascii="Segoe UI Emoji" w:hAnsi="Segoe UI Emoji" w:cs="Segoe UI Emoji"/>
         </w:rPr>
-        <w:lastRenderedPageBreak/>
-        <w:t>🔬 301. Status = analyse</w:t>
+        <w:t xml:space="preserve">🔬 301. </w:t>
+      </w:r>
+      <w:r>
+        <w:rPr>
+          <w:rFonts w:ascii="Segoe UI Emoji" w:hAnsi="Segoe UI Emoji" w:cs="Segoe UI Emoji"/>
+        </w:rPr>
+        <w:t>Issue [aanpak goedgekeurd]</w:t>
       </w:r>
       <w:r>
         <w:rPr>
@@ -2238,15 +2213,12 @@
             <w:rPr/>
           </w:rPrChange>
         </w:rPr>
-        <w:t xml:space="preserve"/>
-      </w:r>
-      <w:del w:author="Rinse Cramer" w:date="2025-12-13T10:27:00Z" w16du:dateUtc="2025-12-13T09:27:00Z" w:id="210">
+      </w:r>
+      <w:del w:author="Rinse Cramer" w:date="2025-12-13T10:27:00Z" w16du:dateUtc="2025-12-13T09:27:00Z" w:id="1252789334">
         <w:r>
           <w:rPr>
             <w:lang w:val="en-US"/>
-            <w:rPrChange w:author="Rinse Cramer" w:date="2025-12-13T10:31:00Z" w16du:dateUtc="2025-12-13T09:31:00Z" w:id="211">
-              <w:rPr/>
-            </w:rPrChange>
+            <w:rPrChange w:author="Rinse Cramer" w:date="2025-12-13T10:31:00Z" w16du:dateUtc="2025-12-13T09:31:00Z" w:id="547722568"/>
           </w:rPr>
           <w:delText>Analyse</w:delText>
         </w:r>
@@ -2259,7 +2231,6 @@
               <w:rPr/>
             </w:rPrChange>
           </w:rPr>
-          <w:t/>
         </w:r>
       </w:ins>
     </w:p>
@@ -2275,9 +2246,7 @@
       <w:r>
         <w:t xml:space="preserve">🔬 302. Start timer (ETC)</w:t>
       </w:r>
-      <w:r>
-        <w:t/>
-      </w:r>
+      <w:r/>
       <w:commentRangeEnd w:id="214"/>
       <w:r>
         <w:rPr>
@@ -2299,9 +2268,7 @@
       <w:r>
         <w:t xml:space="preserve">🔬 303. Intake verwerken</w:t>
       </w:r>
-      <w:r>
-        <w:t/>
-      </w:r>
+      <w:r/>
     </w:p>
     <w:p>
       <w:pPr>
@@ -2314,9 +2281,7 @@
       <w:r>
         <w:t xml:space="preserve">🔬 304. Oplossing analyseren</w:t>
       </w:r>
-      <w:r>
-        <w:t/>
-      </w:r>
+      <w:r/>
     </w:p>
     <w:p>
       <w:pPr>
@@ -2329,9 +2294,7 @@
       <w:r>
         <w:t xml:space="preserve">🔬 305. Evalueer of de deliverables correct en volledig zijn afgerond</w:t>
       </w:r>
-      <w:r>
-        <w:t/>
-      </w:r>
+      <w:r/>
     </w:p>
     <w:p>
       <w:pPr>
@@ -2454,8 +2417,8 @@
               </w:drawing>
             </mc:Choice>
             <mc:Fallback>
-              <w:pict>
-                <v:line id="Straight Connector 1" style="position:absolute;z-index:251659264;visibility:visible;mso-wrap-style:square;mso-width-percent:0;mso-wrap-distance-left:9pt;mso-wrap-distance-top:0;mso-wrap-distance-right:9pt;mso-wrap-distance-bottom:0;mso-position-horizontal:absolute;mso-position-horizontal-relative:text;mso-position-vertical:absolute;mso-position-vertical-relative:text;mso-width-percent:0;mso-width-relative:margin" o:spid="_x0000_s1026" strokecolor="#156082 [3204]" strokeweight="1pt" o:gfxdata="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" from="14.2pt,7.1pt" to="445.05pt,7.1pt" w14:anchorId="7E87EDE5">
+              <w:pict w14:anchorId="24560AEE">
+                <v:line id="Straight Connector 1" style="position:absolute;z-index:251659264;visibility:visible;mso-wrap-style:square;mso-width-percent:0;mso-wrap-distance-left:9pt;mso-wrap-distance-top:0;mso-wrap-distance-right:9pt;mso-wrap-distance-bottom:0;mso-position-horizontal:absolute;mso-position-horizontal-relative:text;mso-position-vertical:absolute;mso-position-vertical-relative:text;mso-width-percent:0;mso-width-relative:margin" o:spid="_x0000_s1026" strokecolor="#156082 [3204]" strokeweight="1pt" from="14.2pt,7.1pt" to="445.05pt,7.1pt" o:gfxdata="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" w14:anchorId="7E87EDE5">
                   <v:stroke joinstyle="miter"/>
                 </v:line>
               </w:pict>
@@ -2487,12 +2450,8 @@
           <w:delText>.</w:delText>
         </w:r>
       </w:del>
-      <w:r>
-        <w:t xml:space="preserve"/>
-      </w:r>
-      <w:r>
-        <w:t/>
-      </w:r>
+      <w:r/>
+      <w:r/>
     </w:p>
     <w:p>
       <w:pPr>
@@ -2505,9 +2464,7 @@
       <w:r>
         <w:t xml:space="preserve">🔬 307. Bijzonderheden gezien?</w:t>
       </w:r>
-      <w:r>
-        <w:t/>
-      </w:r>
+      <w:r/>
     </w:p>
     <w:p>
       <w:pPr>
@@ -2520,9 +2477,7 @@
       <w:r>
         <w:t xml:space="preserve">🔬 307T. Volg de review analyse</w:t>
       </w:r>
-      <w:r>
-        <w:t/>
-      </w:r>
+      <w:r/>
     </w:p>
     <w:p>
       <w:pPr>
@@ -2547,12 +2502,8 @@
           <w:delText>.</w:delText>
         </w:r>
       </w:del>
-      <w:r>
-        <w:t xml:space="preserve"/>
-      </w:r>
-      <w:r>
-        <w:t/>
-      </w:r>
+      <w:r/>
+      <w:r/>
     </w:p>
     <w:p>
       <w:pPr>
@@ -2565,9 +2516,7 @@
       <w:r>
         <w:t xml:space="preserve">🔬 313. Hoe heeft het zo lang kunnen duren?</w:t>
       </w:r>
-      <w:r>
-        <w:t/>
-      </w:r>
+      <w:r/>
     </w:p>
     <w:p>
       <w:pPr>
@@ -2583,9 +2532,7 @@
       <w:r>
         <w:t xml:space="preserve">🔬 314. Stop timer (4 min)</w:t>
       </w:r>
-      <w:r>
-        <w:t/>
-      </w:r>
+      <w:r/>
     </w:p>
     <w:p>
       <w:pPr>
@@ -2601,9 +2548,7 @@
         </w:r>
       </w:ins>
       <w:ins w:author="Rinse Cramer" w:date="2025-11-24T23:57:00Z" w16du:dateUtc="2025-11-24T22:57:00Z" w:id="231">
-        <w:r>
-          <w:t/>
-        </w:r>
+        <w:r/>
       </w:ins>
     </w:p>
     <w:p>
@@ -2622,16 +2567,16 @@
       <w:pPr>
         <w:pStyle w:val="Heading1"/>
         <w:rPr>
-          <w:ins w:author="Rinse Cramer" w:date="2025-12-13T10:33:00Z" w16du:dateUtc="2025-12-13T09:33:00Z" w:id="233"/>
+          <w:ins w:author="Rinse Cramer" w:date="2025-12-13T10:33:00Z" w16du:dateUtc="2025-12-13T09:33:00Z" w:id="639636241"/>
           <w:rFonts w:cs="Segoe UI Emoji"/>
           <w:lang w:val="en-US"/>
         </w:rPr>
       </w:pPr>
-      <w:del w:author="Rinse Cramer" w:date="2025-11-24T23:53:00Z" w16du:dateUtc="2025-11-24T22:53:00Z" w:id="234">
-        <w:r>
-          <w:rPr>
-            <w:b/>
-            <w:bCs/>
+      <w:del w:author="Rinse Cramer" w:date="2025-11-24T23:53:00Z" w16du:dateUtc="2025-11-24T22:53:00Z" w:id="444686872">
+        <w:r>
+          <w:rPr>
+            <w:b w:val="1"/>
+            <w:bCs w:val="1"/>
             <w:lang w:val="en-US"/>
           </w:rPr>
           <w:delText>e. Oplossingsrichting (bij feat</w:delText>
@@ -2640,11 +2585,20 @@
       <w:r>
         <w:rPr>
           <w:rFonts w:ascii="Segoe UI Emoji" w:hAnsi="Segoe UI Emoji" w:cs="Segoe UI Emoji"/>
-          <w:b/>
-          <w:bCs/>
+          <w:b w:val="1"/>
+          <w:bCs w:val="1"/>
           <w:lang w:val="en-US"/>
         </w:rPr>
-        <w:t>🫱🏻‍🫲🏻 401. Status = review analyse</w:t>
+        <w:t xml:space="preserve">🫱🏻‍🫲🏻 401. </w:t>
+      </w:r>
+      <w:r>
+        <w:rPr>
+          <w:rFonts w:ascii="Segoe UI Emoji" w:hAnsi="Segoe UI Emoji" w:cs="Segoe UI Emoji"/>
+          <w:b w:val="1"/>
+          <w:bCs w:val="1"/>
+          <w:lang w:val="en-US"/>
+        </w:rPr>
+        <w:t>Issue [geanalyseerd]</w:t>
       </w:r>
       <w:r>
         <w:rPr>
@@ -2664,9 +2618,7 @@
           <mc:Choice Requires="w16se">
             <w16se:symEx w16se:font="Segoe UI Emoji" w16se:char="1F3FB"/>
           </mc:Choice>
-          <mc:Fallback>
-            <w:t/>
-          </mc:Fallback>
+          <mc:Fallback/>
         </mc:AlternateContent>
       </w:r>
       <w:r>
@@ -2676,7 +2628,6 @@
           <w:bCs/>
           <w:lang w:val="en-US"/>
         </w:rPr>
-        <w:t/>
       </w:r>
       <w:r>
         <w:rPr>
@@ -2696,9 +2647,7 @@
           <mc:Choice Requires="w16se">
             <w16se:symEx w16se:font="Segoe UI Emoji" w16se:char="1F3FB"/>
           </mc:Choice>
-          <mc:Fallback>
-            <w:t/>
-          </mc:Fallback>
+          <mc:Fallback/>
         </mc:AlternateContent>
       </w:r>
       <w:ins w:author="Rinse Cramer" w:date="2025-12-13T10:31:00Z" w16du:dateUtc="2025-12-13T09:31:00Z" w:id="235">
@@ -2712,7 +2661,6 @@
               </w:rPr>
             </w:rPrChange>
           </w:rPr>
-          <w:t xml:space="preserve"/>
         </w:r>
         <w:r>
           <w:rPr>
@@ -2725,7 +2673,6 @@
               </w:rPr>
             </w:rPrChange>
           </w:rPr>
-          <w:t xml:space="preserve"/>
         </w:r>
       </w:ins>
       <w:r>
@@ -2733,7 +2680,6 @@
           <w:rFonts w:cs="Segoe UI Emoji"/>
           <w:lang w:val="en-US"/>
         </w:rPr>
-        <w:t/>
       </w:r>
     </w:p>
     <w:p>
@@ -3631,7 +3577,6 @@
           <w:rPr>
             <w:rFonts w:ascii="Segoe UI Emoji" w:hAnsi="Segoe UI Emoji" w:cs="Segoe UI Emoji"/>
           </w:rPr>
-          <w:lastRenderedPageBreak/>
           <w:delText>🫱🏻</w:delText>
         </w:r>
         <w:r>
@@ -3852,7 +3797,7 @@
       <w:pPr>
         <w:pStyle w:val="Heading1"/>
       </w:pPr>
-      <w:del w:author="Rinse Cramer" w:date="2025-11-04T23:08:00Z" w16du:dateUtc="2025-11-04T22:08:00Z" w:id="332">
+      <w:del w:author="Rinse Cramer" w:date="2025-11-04T23:08:00Z" w16du:dateUtc="2025-11-04T22:08:00Z" w:id="1036693141">
         <w:r>
           <w:delText xml:space="preserve">I. </w:delText>
         </w:r>
@@ -3864,11 +3809,15 @@
         <w:rPr>
           <w:rFonts w:ascii="Segoe UI Emoji" w:hAnsi="Segoe UI Emoji" w:cs="Segoe UI Emoji"/>
         </w:rPr>
-        <w:t>✏️ 501. Status = ontwerp</w:t>
-      </w:r>
-      <w:r>
-        <w:t xml:space="preserve"/>
-      </w:r>
+        <w:t xml:space="preserve">✏️ 501. </w:t>
+      </w:r>
+      <w:r>
+        <w:rPr>
+          <w:rFonts w:ascii="Segoe UI Emoji" w:hAnsi="Segoe UI Emoji" w:cs="Segoe UI Emoji"/>
+        </w:rPr>
+        <w:t>Issue [analyse goedgekeurd]</w:t>
+      </w:r>
+      <w:r/>
     </w:p>
     <w:p>
       <w:pPr>
@@ -3890,9 +3839,7 @@
       <w:r>
         <w:t xml:space="preserve">✏️ 502. Start timer (ETC)</w:t>
       </w:r>
-      <w:r>
-        <w:t/>
-      </w:r>
+      <w:r/>
       <w:del w:author="Rinse Cramer" w:date="2025-11-10T23:01:00Z" w16du:dateUtc="2025-11-10T22:01:00Z" w:id="334">
         <w:r>
           <w:delText xml:space="preserve">B. </w:delText>
@@ -3920,12 +3867,8 @@
           <w:delText>C</w:delText>
         </w:r>
       </w:del>
-      <w:r>
-        <w:t xml:space="preserve"/>
-      </w:r>
-      <w:r>
-        <w:t/>
-      </w:r>
+      <w:r/>
+      <w:r/>
     </w:p>
     <w:p>
       <w:pPr>
@@ -3945,12 +3888,8 @@
           <w:delText>D</w:delText>
         </w:r>
       </w:del>
-      <w:r>
-        <w:t xml:space="preserve"/>
-      </w:r>
-      <w:r>
-        <w:t/>
-      </w:r>
+      <w:r/>
+      <w:r/>
     </w:p>
     <w:p>
       <w:pPr>
@@ -3970,12 +3909,8 @@
           <w:delText>E</w:delText>
         </w:r>
       </w:del>
-      <w:r>
-        <w:t xml:space="preserve"/>
-      </w:r>
-      <w:r>
-        <w:t/>
-      </w:r>
+      <w:r/>
+      <w:r/>
     </w:p>
     <w:p>
       <w:pPr>
@@ -3995,12 +3930,8 @@
           <w:delText>F</w:delText>
         </w:r>
       </w:del>
-      <w:r>
-        <w:t xml:space="preserve"/>
-      </w:r>
-      <w:r>
-        <w:t/>
-      </w:r>
+      <w:r/>
+      <w:r/>
       <w:del w:author="Rinse Cramer" w:date="2025-11-07T18:08:00Z" w16du:dateUtc="2025-11-07T17:08:00Z" w:id="343">
         <w:r>
           <w:delText>G</w:delText>
@@ -4027,9 +3958,7 @@
       <w:r>
         <w:t xml:space="preserve">✏️ 507. Bijzonderheden gezien?</w:t>
       </w:r>
-      <w:r>
-        <w:t/>
-      </w:r>
+      <w:r/>
     </w:p>
     <w:p>
       <w:pPr>
@@ -4102,8 +4031,8 @@
               </w:drawing>
             </mc:Choice>
             <mc:Fallback>
-              <w:pict>
-                <v:line id="Straight Connector 1" style="position:absolute;z-index:251661312;visibility:visible;mso-wrap-style:square;mso-width-percent:0;mso-wrap-distance-left:9pt;mso-wrap-distance-top:0;mso-wrap-distance-right:9pt;mso-wrap-distance-bottom:0;mso-position-horizontal:absolute;mso-position-horizontal-relative:text;mso-position-vertical:absolute;mso-position-vertical-relative:text;mso-width-percent:0;mso-width-relative:margin" o:spid="_x0000_s1026" strokecolor="#156082 [3204]" strokeweight="1pt" o:gfxdata="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" from="14.2pt,7.1pt" to="445.05pt,7.1pt" w14:anchorId="2D3C1747">
+              <w:pict w14:anchorId="48F82C97">
+                <v:line id="Straight Connector 1" style="position:absolute;z-index:251661312;visibility:visible;mso-wrap-style:square;mso-width-percent:0;mso-wrap-distance-left:9pt;mso-wrap-distance-top:0;mso-wrap-distance-right:9pt;mso-wrap-distance-bottom:0;mso-position-horizontal:absolute;mso-position-horizontal-relative:text;mso-position-vertical:absolute;mso-position-vertical-relative:text;mso-width-percent:0;mso-width-relative:margin" o:spid="_x0000_s1026" strokecolor="#156082 [3204]" strokeweight="1pt" from="14.2pt,7.1pt" to="445.05pt,7.1pt" o:gfxdata="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" w14:anchorId="2D3C1747">
                   <v:stroke joinstyle="miter"/>
                 </v:line>
               </w:pict>
@@ -4128,15 +4057,9 @@
           <w:delText>H</w:delText>
         </w:r>
       </w:del>
-      <w:r>
-        <w:t/>
-      </w:r>
-      <w:r>
-        <w:t xml:space="preserve"/>
-      </w:r>
-      <w:r>
-        <w:t/>
-      </w:r>
+      <w:r/>
+      <w:r/>
+      <w:r/>
     </w:p>
     <w:p>
       <w:pPr>
@@ -4149,9 +4072,7 @@
       <w:r>
         <w:t xml:space="preserve">✏️ 509. Start timer (1 min)</w:t>
       </w:r>
-      <w:r>
-        <w:t/>
-      </w:r>
+      <w:r/>
     </w:p>
     <w:p>
       <w:pPr>
@@ -4164,9 +4085,7 @@
       <w:r>
         <w:t xml:space="preserve">✏️ 510. Hoe lang denk je nog nodig te hebben?</w:t>
       </w:r>
-      <w:r>
-        <w:t/>
-      </w:r>
+      <w:r/>
     </w:p>
     <w:p>
       <w:pPr>
@@ -4184,12 +4103,8 @@
           <w:delText>I</w:delText>
         </w:r>
       </w:del>
-      <w:r>
-        <w:t xml:space="preserve"/>
-      </w:r>
-      <w:r>
-        <w:t/>
-      </w:r>
+      <w:r/>
+      <w:r/>
     </w:p>
     <w:p>
       <w:pPr>
@@ -4202,9 +4117,7 @@
       <w:r>
         <w:t xml:space="preserve">✏️ 513. Hoe heeft het zo lang kunnen duren?</w:t>
       </w:r>
-      <w:r>
-        <w:t/>
-      </w:r>
+      <w:r/>
     </w:p>
     <w:p>
       <w:pPr>
@@ -4220,9 +4133,7 @@
       <w:r>
         <w:t xml:space="preserve">✏️ 514. Stop timer (4 min)</w:t>
       </w:r>
-      <w:r>
-        <w:t/>
-      </w:r>
+      <w:r/>
     </w:p>
     <w:p>
       <w:pPr>
@@ -4247,30 +4158,38 @@
       <w:pPr>
         <w:pStyle w:val="Heading1"/>
         <w:rPr>
-          <w:ins w:author="Rinse Cramer" w:date="2025-12-13T10:33:00Z" w16du:dateUtc="2025-12-13T09:33:00Z" w:id="351"/>
+          <w:ins w:author="Rinse Cramer" w:date="2025-12-13T10:33:00Z" w16du:dateUtc="2025-12-13T09:33:00Z" w:id="1692848698"/>
           <w:rFonts w:cs="Segoe UI Emoji"/>
           <w:lang w:val="en-US"/>
         </w:rPr>
       </w:pPr>
-      <w:del w:author="Rinse Cramer" w:date="2025-11-24T23:53:00Z" w16du:dateUtc="2025-11-24T22:53:00Z" w:id="352">
-        <w:r>
-          <w:rPr>
-            <w:b/>
-            <w:bCs/>
+      <w:del w:author="Rinse Cramer" w:date="2025-11-24T23:53:00Z" w16du:dateUtc="2025-11-24T22:53:00Z" w:id="1134791927">
+        <w:r>
+          <w:rPr>
+            <w:b w:val="1"/>
+            <w:bCs w:val="1"/>
             <w:lang w:val="en-US"/>
           </w:rPr>
-          <w:lastRenderedPageBreak/>
           <w:delText>e. Oplossingsrichting (bij feat</w:delText>
         </w:r>
       </w:del>
       <w:r>
         <w:rPr>
           <w:rFonts w:ascii="Segoe UI Emoji" w:hAnsi="Segoe UI Emoji" w:cs="Segoe UI Emoji"/>
-          <w:b/>
-          <w:bCs/>
+          <w:b w:val="1"/>
+          <w:bCs w:val="1"/>
           <w:lang w:val="en-US"/>
         </w:rPr>
-        <w:t>🫱🏻‍🫲🏻 601. Status = review ontwerp</w:t>
+        <w:t xml:space="preserve">🫱🏻‍🫲🏻 601. </w:t>
+      </w:r>
+      <w:r>
+        <w:rPr>
+          <w:rFonts w:ascii="Segoe UI Emoji" w:hAnsi="Segoe UI Emoji" w:cs="Segoe UI Emoji"/>
+          <w:b w:val="1"/>
+          <w:bCs w:val="1"/>
+          <w:lang w:val="en-US"/>
+        </w:rPr>
+        <w:t>Issue [ontworpen]</w:t>
       </w:r>
       <w:r>
         <w:rPr>
@@ -4290,9 +4209,7 @@
           <mc:Choice Requires="w16se">
             <w16se:symEx w16se:font="Segoe UI Emoji" w16se:char="1F3FB"/>
           </mc:Choice>
-          <mc:Fallback>
-            <w:t/>
-          </mc:Fallback>
+          <mc:Fallback/>
         </mc:AlternateContent>
       </w:r>
       <w:r>
@@ -4302,7 +4219,6 @@
           <w:bCs/>
           <w:lang w:val="en-US"/>
         </w:rPr>
-        <w:t/>
       </w:r>
       <w:r>
         <w:rPr>
@@ -4322,9 +4238,7 @@
           <mc:Choice Requires="w16se">
             <w16se:symEx w16se:font="Segoe UI Emoji" w16se:char="1F3FB"/>
           </mc:Choice>
-          <mc:Fallback>
-            <w:t/>
-          </mc:Fallback>
+          <mc:Fallback/>
         </mc:AlternateContent>
       </w:r>
       <w:ins w:author="Rinse Cramer" w:date="2025-12-13T10:31:00Z" w16du:dateUtc="2025-12-13T09:31:00Z" w:id="353">
@@ -4338,7 +4252,6 @@
               </w:rPr>
             </w:rPrChange>
           </w:rPr>
-          <w:t xml:space="preserve"/>
         </w:r>
         <w:r>
           <w:rPr>
@@ -4351,7 +4264,6 @@
               </w:rPr>
             </w:rPrChange>
           </w:rPr>
-          <w:t xml:space="preserve"/>
         </w:r>
       </w:ins>
       <w:r>
@@ -4359,7 +4271,6 @@
           <w:rFonts w:cs="Segoe UI Emoji"/>
           <w:lang w:val="en-US"/>
         </w:rPr>
-        <w:t/>
       </w:r>
     </w:p>
     <w:p>
@@ -5268,7 +5179,6 @@
           <w:rPr>
             <w:rFonts w:ascii="Segoe UI Emoji" w:hAnsi="Segoe UI Emoji" w:cs="Segoe UI Emoji"/>
           </w:rPr>
-          <w:lastRenderedPageBreak/>
           <w:delText>🫱🏻</w:delText>
         </w:r>
         <w:r>
@@ -5336,16 +5246,23 @@
     <w:p>
       <w:pPr>
         <w:pStyle w:val="Heading1"/>
-      </w:pPr>
-      <w:r>
         <w:rPr>
           <w:rFonts w:ascii="Segoe UI Emoji" w:hAnsi="Segoe UI Emoji" w:cs="Segoe UI Emoji"/>
         </w:rPr>
-        <w:t>⌨️ 701. Status = implementatie</w:t>
-      </w:r>
-      <w:r>
-        <w:t xml:space="preserve"/>
-      </w:r>
+      </w:pPr>
+      <w:r>
+        <w:rPr>
+          <w:rFonts w:ascii="Segoe UI Emoji" w:hAnsi="Segoe UI Emoji" w:cs="Segoe UI Emoji"/>
+        </w:rPr>
+        <w:t xml:space="preserve">⌨️ 701. </w:t>
+      </w:r>
+      <w:r>
+        <w:rPr>
+          <w:rFonts w:ascii="Segoe UI Emoji" w:hAnsi="Segoe UI Emoji" w:cs="Segoe UI Emoji"/>
+        </w:rPr>
+        <w:t>Issue [ontwerp goedgekeurd]</w:t>
+      </w:r>
+      <w:r/>
     </w:p>
     <w:p>
       <w:pPr>
@@ -5358,9 +5275,7 @@
       <w:r>
         <w:t xml:space="preserve">⌨️ 702. Start timer (ETC)</w:t>
       </w:r>
-      <w:r>
-        <w:t/>
-      </w:r>
+      <w:r/>
     </w:p>
     <w:p>
       <w:pPr>
@@ -5373,9 +5288,7 @@
       <w:r>
         <w:t xml:space="preserve">⌨️ 703. Ontwerp verwerken</w:t>
       </w:r>
-      <w:r>
-        <w:t/>
-      </w:r>
+      <w:r/>
     </w:p>
     <w:p>
       <w:pPr>
@@ -5388,9 +5301,7 @@
       <w:r>
         <w:t xml:space="preserve">⌨️ 704. Oplossing implementeren</w:t>
       </w:r>
-      <w:r>
-        <w:t/>
-      </w:r>
+      <w:r/>
     </w:p>
     <w:p>
       <w:pPr>
@@ -5403,9 +5314,7 @@
       <w:r>
         <w:t xml:space="preserve">⌨️ 705. Evalueer of de deliverables correct en volledig zijn afgerond</w:t>
       </w:r>
-      <w:r>
-        <w:t/>
-      </w:r>
+      <w:r/>
     </w:p>
     <w:p>
       <w:pPr>
@@ -5418,12 +5327,8 @@
       <w:r>
         <w:t>⌨️ 706. Stop timer (ETC)</w:t>
       </w:r>
-      <w:r>
-        <w:t xml:space="preserve"/>
-      </w:r>
-      <w:r>
-        <w:t/>
-      </w:r>
+      <w:r/>
+      <w:r/>
     </w:p>
     <w:p>
       <w:pPr>
@@ -5436,12 +5341,8 @@
       <w:r>
         <w:t>⌨️ 707. Bijzonderheden gezien?</w:t>
       </w:r>
-      <w:r>
-        <w:t xml:space="preserve"/>
-      </w:r>
-      <w:r>
-        <w:t/>
-      </w:r>
+      <w:r/>
+      <w:r/>
     </w:p>
     <w:p>
       <w:pPr>
@@ -5541,8 +5442,8 @@
               </w:drawing>
             </mc:Choice>
             <mc:Fallback>
-              <w:pict>
-                <v:line id="Straight Connector 1" style="position:absolute;z-index:251663360;visibility:visible;mso-wrap-style:square;mso-width-percent:0;mso-wrap-distance-left:9pt;mso-wrap-distance-top:0;mso-wrap-distance-right:9pt;mso-wrap-distance-bottom:0;mso-position-horizontal:absolute;mso-position-horizontal-relative:text;mso-position-vertical:absolute;mso-position-vertical-relative:text;mso-width-percent:0;mso-width-relative:margin" o:spid="_x0000_s1026" strokecolor="#156082 [3204]" strokeweight="1pt" o:gfxdata="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" from="14.2pt,7.1pt" to="445.05pt,7.1pt" w14:anchorId="397A8FD0">
+              <w:pict w14:anchorId="33DFDCB5">
+                <v:line id="Straight Connector 1" style="position:absolute;z-index:251663360;visibility:visible;mso-wrap-style:square;mso-width-percent:0;mso-wrap-distance-left:9pt;mso-wrap-distance-top:0;mso-wrap-distance-right:9pt;mso-wrap-distance-bottom:0;mso-position-horizontal:absolute;mso-position-horizontal-relative:text;mso-position-vertical:absolute;mso-position-vertical-relative:text;mso-width-percent:0;mso-width-relative:margin" o:spid="_x0000_s1026" strokecolor="#156082 [3204]" strokeweight="1pt" from="14.2pt,7.1pt" to="445.05pt,7.1pt" o:gfxdata="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" w14:anchorId="397A8FD0">
                   <v:stroke joinstyle="miter"/>
                 </v:line>
               </w:pict>
@@ -5569,15 +5470,9 @@
           <w:delText>H</w:delText>
         </w:r>
       </w:del>
-      <w:r>
-        <w:t/>
-      </w:r>
-      <w:r>
-        <w:t xml:space="preserve"/>
-      </w:r>
-      <w:r>
-        <w:t/>
-      </w:r>
+      <w:r/>
+      <w:r/>
+      <w:r/>
     </w:p>
     <w:p>
       <w:pPr>
@@ -5590,9 +5485,7 @@
       <w:r>
         <w:t xml:space="preserve">⌨️ 709. Start timer (1 min)</w:t>
       </w:r>
-      <w:r>
-        <w:t/>
-      </w:r>
+      <w:r/>
     </w:p>
     <w:p>
       <w:pPr>
@@ -5605,9 +5498,7 @@
       <w:r>
         <w:t xml:space="preserve">⌨️ 710. Hoe lang denk je nog nodig te hebben?</w:t>
       </w:r>
-      <w:r>
-        <w:t/>
-      </w:r>
+      <w:r/>
     </w:p>
     <w:p>
       <w:pPr>
@@ -5627,12 +5518,8 @@
           <w:delText>I</w:delText>
         </w:r>
       </w:del>
-      <w:r>
-        <w:t xml:space="preserve"/>
-      </w:r>
-      <w:r>
-        <w:t/>
-      </w:r>
+      <w:r/>
+      <w:r/>
     </w:p>
     <w:p>
       <w:pPr>
@@ -5645,9 +5532,7 @@
       <w:r>
         <w:t xml:space="preserve">⌨️ 713. Hoe heeft het zo lang kunnen duren?</w:t>
       </w:r>
-      <w:r>
-        <w:t/>
-      </w:r>
+      <w:r/>
     </w:p>
     <w:p>
       <w:pPr>
@@ -5663,9 +5548,7 @@
       <w:r>
         <w:t xml:space="preserve">⌨️ 714. Stop timer (4 min)</w:t>
       </w:r>
-      <w:r>
-        <w:t/>
-      </w:r>
+      <w:r/>
     </w:p>
     <w:p>
       <w:pPr>
@@ -5681,24 +5564,55 @@
         </w:r>
       </w:ins>
       <w:ins w:author="Rinse Cramer" w:date="2025-11-25T00:04:00Z" w16du:dateUtc="2025-11-24T23:04:00Z" w:id="441">
-        <w:r>
-          <w:t/>
-        </w:r>
-      </w:ins>
-    </w:p>
-    <w:p>
-      <w:pPr>
-        <w:pStyle w:val="Heading1"/>
-      </w:pPr>
-      <w:r>
+        <w:r/>
+      </w:ins>
+    </w:p>
+    <w:p>
+      <w:pPr>
+        <w:pStyle w:val="Normal"/>
         <w:rPr>
           <w:rFonts w:ascii="Segoe UI Emoji" w:hAnsi="Segoe UI Emoji" w:cs="Segoe UI Emoji"/>
-        </w:rPr>
-        <w:t>🔎 801. Status = test</w:t>
-      </w:r>
-      <w:r>
-        <w:t xml:space="preserve"/>
-      </w:r>
+          <w:b w:val="0"/>
+          <w:bCs w:val="0"/>
+          <w:i w:val="0"/>
+          <w:iCs w:val="0"/>
+          <w:caps w:val="0"/>
+          <w:smallCaps w:val="0"/>
+          <w:noProof w:val="0"/>
+          <w:color w:val="0F4761" w:themeColor="accent1" w:themeTint="FF" w:themeShade="BF"/>
+          <w:sz w:val="40"/>
+          <w:szCs w:val="40"/>
+          <w:lang w:val="nl-NL"/>
+        </w:rPr>
+      </w:pPr>
+      <w:r>
+        <w:rPr>
+          <w:rFonts w:ascii="Segoe UI Emoji" w:hAnsi="Segoe UI Emoji" w:eastAsia="" w:cs="Segoe UI Emoji" w:asciiTheme="majorAscii" w:hAnsiTheme="majorAscii" w:eastAsiaTheme="majorEastAsia" w:cstheme="majorBidi"/>
+          <w:color w:val="0F4761" w:themeColor="accent1" w:themeTint="FF" w:themeShade="BF"/>
+          <w:sz w:val="40"/>
+          <w:szCs w:val="40"/>
+          <w:lang w:eastAsia="en-US" w:bidi="ar-SA"/>
+        </w:rPr>
+        <w:t xml:space="preserve">🔎 801. </w:t>
+      </w:r>
+      <w:r>
+        <w:rPr>
+          <w:rFonts w:ascii="Segoe UI Emoji" w:hAnsi="Segoe UI Emoji" w:cs="Segoe UI Emoji"/>
+          <w:b w:val="0"/>
+          <w:bCs w:val="0"/>
+          <w:i w:val="0"/>
+          <w:iCs w:val="0"/>
+          <w:caps w:val="0"/>
+          <w:smallCaps w:val="0"/>
+          <w:noProof w:val="0"/>
+          <w:color w:val="0F4761" w:themeColor="accent1" w:themeTint="FF" w:themeShade="BF"/>
+          <w:sz w:val="40"/>
+          <w:szCs w:val="40"/>
+          <w:lang w:val="nl-NL"/>
+        </w:rPr>
+        <w:t>Issue [geïmplementeerd]</w:t>
+      </w:r>
+      <w:r/>
     </w:p>
     <w:p>
       <w:pPr>
@@ -5711,9 +5625,7 @@
       <w:r>
         <w:t xml:space="preserve">🔎 802. Start timer (ETC)</w:t>
       </w:r>
-      <w:r>
-        <w:t/>
-      </w:r>
+      <w:r/>
     </w:p>
     <w:p>
       <w:pPr>
@@ -5726,9 +5638,7 @@
       <w:r>
         <w:t xml:space="preserve">🔎 803. Implementatie verwerken</w:t>
       </w:r>
-      <w:r>
-        <w:t/>
-      </w:r>
+      <w:r/>
     </w:p>
     <w:p>
       <w:pPr>
@@ -5741,9 +5651,7 @@
       <w:r>
         <w:t xml:space="preserve">🔎 804. Oplossing testen</w:t>
       </w:r>
-      <w:r>
-        <w:t/>
-      </w:r>
+      <w:r/>
     </w:p>
     <w:p>
       <w:pPr>
@@ -5756,9 +5664,7 @@
       <w:r>
         <w:t xml:space="preserve">🔎 805. Evalueer of de deliverables correct en volledig zijn afgerond</w:t>
       </w:r>
-      <w:r>
-        <w:t/>
-      </w:r>
+      <w:r/>
     </w:p>
     <w:p>
       <w:pPr>
@@ -5771,9 +5677,7 @@
       <w:r>
         <w:t xml:space="preserve">🔎 806. Stop timer (ETC)</w:t>
       </w:r>
-      <w:r>
-        <w:t/>
-      </w:r>
+      <w:r/>
     </w:p>
     <w:p>
       <w:pPr>
@@ -5786,9 +5690,7 @@
       <w:r>
         <w:t xml:space="preserve">🔎 807. Bijzonderheden gezien?</w:t>
       </w:r>
-      <w:r>
-        <w:t/>
-      </w:r>
+      <w:r/>
     </w:p>
     <w:p>
       <w:pPr>
@@ -5957,8 +5859,8 @@
               </w:drawing>
             </mc:Choice>
             <mc:Fallback>
-              <w:pict>
-                <v:line id="Straight Connector 1" style="position:absolute;z-index:251665408;visibility:visible;mso-wrap-style:square;mso-width-percent:0;mso-wrap-distance-left:9pt;mso-wrap-distance-top:0;mso-wrap-distance-right:9pt;mso-wrap-distance-bottom:0;mso-position-horizontal:absolute;mso-position-horizontal-relative:text;mso-position-vertical:absolute;mso-position-vertical-relative:text;mso-width-percent:0;mso-width-relative:margin" o:spid="_x0000_s1026" strokecolor="#156082 [3204]" strokeweight="1pt" o:gfxdata="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" from="14.2pt,7.1pt" to="445.05pt,7.1pt" w14:anchorId="054CF88C">
+              <w:pict w14:anchorId="1B29A2C0">
+                <v:line id="Straight Connector 1" style="position:absolute;z-index:251665408;visibility:visible;mso-wrap-style:square;mso-width-percent:0;mso-wrap-distance-left:9pt;mso-wrap-distance-top:0;mso-wrap-distance-right:9pt;mso-wrap-distance-bottom:0;mso-position-horizontal:absolute;mso-position-horizontal-relative:text;mso-position-vertical:absolute;mso-position-vertical-relative:text;mso-width-percent:0;mso-width-relative:margin" o:spid="_x0000_s1026" strokecolor="#156082 [3204]" strokeweight="1pt" from="14.2pt,7.1pt" to="445.05pt,7.1pt" o:gfxdata="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" w14:anchorId="054CF88C">
                   <v:stroke joinstyle="miter"/>
                 </v:line>
               </w:pict>
@@ -6008,9 +5910,7 @@
       <w:r>
         <w:t xml:space="preserve">🔎 809. Start timer (1 min)</w:t>
       </w:r>
-      <w:r>
-        <w:t/>
-      </w:r>
+      <w:r/>
     </w:p>
     <w:p>
       <w:pPr>
@@ -6023,9 +5923,7 @@
       <w:r>
         <w:t xml:space="preserve">🔎 810. Hoe lang denk je nog nodig te hebben?</w:t>
       </w:r>
-      <w:r>
-        <w:t/>
-      </w:r>
+      <w:r/>
     </w:p>
     <w:p>
       <w:pPr>
@@ -6050,12 +5948,8 @@
           <w:delText>.</w:delText>
         </w:r>
       </w:del>
-      <w:r>
-        <w:t xml:space="preserve"/>
-      </w:r>
-      <w:r>
-        <w:t/>
-      </w:r>
+      <w:r/>
+      <w:r/>
     </w:p>
     <w:p>
       <w:pPr>
@@ -6068,9 +5962,7 @@
       <w:r>
         <w:t xml:space="preserve">🔎 813. Hoe heeft het zo lang kunnen duren?</w:t>
       </w:r>
-      <w:r>
-        <w:t/>
-      </w:r>
+      <w:r/>
     </w:p>
     <w:p>
       <w:pPr>
@@ -6086,9 +5978,7 @@
       <w:r>
         <w:t xml:space="preserve">🔎 814. Stop timer (4 min)</w:t>
       </w:r>
-      <w:r>
-        <w:t/>
-      </w:r>
+      <w:r/>
     </w:p>
     <w:p>
       <w:pPr>
@@ -6175,21 +6065,21 @@
         <w:rPr>
           <w:rFonts w:ascii="Segoe UI Emoji" w:hAnsi="Segoe UI Emoji" w:cs="Segoe UI Emoji"/>
         </w:rPr>
-        <w:lastRenderedPageBreak/>
-        <w:t>🫱🏻‍🫲🏻 1001. Status = review final</w:t>
-      </w:r>
-      <w:r>
-        <w:t/>
+        <w:t xml:space="preserve">🫱🏻‍🫲🏻 1001. </w:t>
       </w:r>
       <w:r>
         <w:rPr>
           <w:rFonts w:ascii="Segoe UI Emoji" w:hAnsi="Segoe UI Emoji" w:cs="Segoe UI Emoji"/>
         </w:rPr>
-        <w:t/>
-      </w:r>
-      <w:r>
-        <w:t xml:space="preserve"/>
-      </w:r>
+        <w:t>Issue [getest]</w:t>
+      </w:r>
+      <w:r/>
+      <w:r>
+        <w:rPr>
+          <w:rFonts w:ascii="Segoe UI Emoji" w:hAnsi="Segoe UI Emoji" w:cs="Segoe UI Emoji"/>
+        </w:rPr>
+      </w:r>
+      <w:r/>
     </w:p>
     <w:p>
       <w:pPr>
@@ -6202,9 +6092,7 @@
       <w:r>
         <w:t xml:space="preserve">🫱🏻‍🫲🏻 1003. Demonstratie van de oplossing geven</w:t>
       </w:r>
-      <w:r>
-        <w:t/>
-      </w:r>
+      <w:r/>
     </w:p>
     <w:p>
       <w:pPr>
@@ -6220,9 +6108,7 @@
       <w:r>
         <w:t xml:space="preserve">🫱🏻‍🫲🏻 1005. Review met Jeroen uitvoeren</w:t>
       </w:r>
-      <w:r>
-        <w:t/>
-      </w:r>
+      <w:r/>
     </w:p>
     <w:p>
       <w:pPr>
@@ -11105,7 +10991,7 @@
 </file>
 
 <file path=word/styles.xml><?xml version="1.0" encoding="utf-8"?>
-<w:styles xmlns:mc="http://schemas.openxmlformats.org/markup-compatibility/2006" xmlns:r="http://schemas.openxmlformats.org/officeDocument/2006/relationships" xmlns:w="http://schemas.openxmlformats.org/wordprocessingml/2006/main" xmlns:w14="http://schemas.microsoft.com/office/word/2010/wordml" xmlns:w15="http://schemas.microsoft.com/office/word/2012/wordml" xmlns:w16cex="http://schemas.microsoft.com/office/word/2018/wordml/cex" xmlns:w16cid="http://schemas.microsoft.com/office/word/2016/wordml/cid" xmlns:w16="http://schemas.microsoft.com/office/word/2018/wordml" xmlns:w16du="http://schemas.microsoft.com/office/word/2023/wordml/word16du" xmlns:w16sdtdh="http://schemas.microsoft.com/office/word/2020/wordml/sdtdatahash" xmlns:w16sdtfl="http://schemas.microsoft.com/office/word/2024/wordml/sdtformatlock" xmlns:w16se="http://schemas.microsoft.com/office/word/2015/wordml/symex" mc:Ignorable="w14 w15 w16se w16cid w16 w16cex w16sdtdh w16sdtfl w16du">
+<w:styles xmlns:wp14="http://schemas.microsoft.com/office/word/2010/wordprocessingDrawing" xmlns:mc="http://schemas.openxmlformats.org/markup-compatibility/2006" xmlns:r="http://schemas.openxmlformats.org/officeDocument/2006/relationships" xmlns:w="http://schemas.openxmlformats.org/wordprocessingml/2006/main" xmlns:w14="http://schemas.microsoft.com/office/word/2010/wordml" xmlns:w15="http://schemas.microsoft.com/office/word/2012/wordml" xmlns:w16cex="http://schemas.microsoft.com/office/word/2018/wordml/cex" xmlns:w16cid="http://schemas.microsoft.com/office/word/2016/wordml/cid" xmlns:w16="http://schemas.microsoft.com/office/word/2018/wordml" xmlns:w16du="http://schemas.microsoft.com/office/word/2023/wordml/word16du" xmlns:w16sdtdh="http://schemas.microsoft.com/office/word/2020/wordml/sdtdatahash" xmlns:w16sdtfl="http://schemas.microsoft.com/office/word/2024/wordml/sdtformatlock" xmlns:w16se="http://schemas.microsoft.com/office/word/2015/wordml/symex" mc:Ignorable="w14 w15 w16se w16cid w16 w16cex w16sdtdh w16sdtfl w16du wp14">
   <w:docDefaults>
     <w:rPrDefault>
       <w:rPr>
@@ -12032,7 +11918,7 @@
     </w:pPr>
   </w:style>
   <w:style w:type="character" w:styleId="CommentReference">
-    <w:name w:val="annotation reference"/>
+    <w:name w:val="Comment Reference"/>
     <w:basedOn w:val="DefaultParagraphFont"/>
     <w:uiPriority w:val="99"/>
     <w:semiHidden/>
@@ -12044,7 +11930,7 @@
     </w:rPr>
   </w:style>
   <w:style w:type="paragraph" w:styleId="CommentText">
-    <w:name w:val="annotation text"/>
+    <w:name w:val="Comment Text"/>
     <w:basedOn w:val="Normal"/>
     <w:link w:val="CommentTextChar"/>
     <w:uiPriority w:val="99"/>
@@ -12070,7 +11956,7 @@
     </w:rPr>
   </w:style>
   <w:style w:type="paragraph" w:styleId="CommentSubject">
-    <w:name w:val="annotation subject"/>
+    <w:name w:val="Comment Subject"/>
     <w:basedOn w:val="CommentText"/>
     <w:next w:val="CommentText"/>
     <w:link w:val="CommentSubjectChar"/>

</xml_diff>

<commit_message>
style(generator): robuustere bold-opmaak voor acties met emoji's
- Normaliseer en strip variation selectors (\uFE0F) en leading spaces van acties voordat wordt gecontroleerd of het een sub-header is (isSubHeader)

- Garandeert dat álle acties met emoji's correct in Segoe UI Bold worden opgemaakt
</commit_message>
<xml_diff>
--- a/Actielijst.docx
+++ b/Actielijst.docx
@@ -3653,7 +3653,17 @@
         <w:rPr/>
         <w:t>⌨ 707T. Volg de meldplicht</w:t>
       </w:r>
-      <w:del w:author="Rinse Cramer" w:date="2025-11-07T18:09:00Z" w16du:dateUtc="2025-11-07T17:09:00Z" w:id="1717869644">
+    </w:p>
+    <w:p>
+      <w:pPr>
+        <w:pStyle w:val="ListParagraph"/>
+        <w:numPr>
+          <w:ilvl w:val="0"/>
+          <w:numId w:val="35"/>
+        </w:numPr>
+        <w:rPr/>
+      </w:pPr>
+      <w:del w:author="Rinse Cramer" w:date="2025-11-07T18:09:00Z" w16du:dateUtc="2025-11-07T17:09:00Z" w:id="1076795188">
         <w:r>
           <w:delText>G</w:delText>
         </w:r>
@@ -3664,21 +3674,16 @@
           <w:delText>Actiepunten uit Excel verwerkt en Jira geüpdated</w:delText>
         </w:r>
       </w:del>
-      <w:r/>
-      <w:r/>
-      <w:ins w:author="Rinse Cramer" w:date="2025-11-07T18:09:00Z" w16du:dateUtc="2025-11-07T17:09:00Z" w:id="1268676949">
+      <w:ins w:author="Rinse Cramer" w:date="2025-11-07T18:09:00Z" w16du:dateUtc="2025-11-07T17:09:00Z" w:id="1227444328">
         <w:r>
           <w:t>⌨️ 708. Na 2/3 ETC Na 100% ETC Na 150% ETC</w:t>
         </w:r>
       </w:ins>
-      <w:del w:author="Rinse Cramer" w:date="2025-11-07T18:09:00Z" w16du:dateUtc="2025-11-07T17:09:00Z" w:id="1485722634">
+      <w:del w:author="Rinse Cramer" w:date="2025-11-07T18:09:00Z" w16du:dateUtc="2025-11-07T17:09:00Z" w:id="655176086">
         <w:r>
           <w:delText>H</w:delText>
         </w:r>
       </w:del>
-      <w:r/>
-      <w:r/>
-      <w:r/>
     </w:p>
     <w:p>
       <w:pPr>

</xml_diff>

<commit_message>
style(generator): integreer laatste handmatige document-aanpassingen en hergenereer stappenplan
- Voeg de laatste handmatige emoji- en checklist-wijzigingen in Actielijst.docx en Checklijst.docx toe aan Git

- Herbouw en vernieuw 'IssueTracker_Stappenplan.docx' met de allernieuwste document-definities (0 waarschuwingen)
</commit_message>
<xml_diff>
--- a/Actielijst.docx
+++ b/Actielijst.docx
@@ -1729,22 +1729,54 @@
           <w:ilvl w:val="0"/>
           <w:numId w:val="31"/>
         </w:numPr>
-      </w:pPr>
-      <w:ins w:author="Rinse Cramer" w:date="2025-11-07T18:08:00Z" w16du:dateUtc="2025-11-07T17:08:00Z" w:id="226">
-        <w:r>
-          <w:t>🔬 312. Haal ik het?</w:t>
-        </w:r>
-      </w:ins>
-      <w:del w:author="Rinse Cramer" w:date="2025-11-04T23:06:00Z" w16du:dateUtc="2025-11-04T22:06:00Z" w:id="227">
+        <w:rPr/>
+      </w:pPr>
+      <w:ins w:author="Rinse Cramer" w:date="2025-11-07T18:08:00Z" w16du:dateUtc="2025-11-07T17:08:00Z" w:id="1413536179">
+        <w:r>
+          <w:t xml:space="preserve">🔬 312. </w:t>
+        </w:r>
+        <w:r>
+          <w:t>Haal ik het?</w:t>
+        </w:r>
+      </w:ins>
+      <w:del w:author="Rinse Cramer" w:date="2025-11-04T23:06:00Z" w16du:dateUtc="2025-11-04T22:06:00Z" w:id="2110716467">
         <w:r>
           <w:delText>H</w:delText>
         </w:r>
       </w:del>
-      <w:del w:author="Rinse Cramer" w:date="2025-11-07T18:10:00Z" w16du:dateUtc="2025-11-07T17:10:00Z" w:id="228">
+      <w:del w:author="Rinse Cramer" w:date="2025-11-07T18:10:00Z" w16du:dateUtc="2025-11-07T17:10:00Z" w:id="817438657">
         <w:r>
           <w:delText>.</w:delText>
         </w:r>
       </w:del>
+    </w:p>
+    <w:p>
+      <w:pPr>
+        <w:pStyle w:val="ListParagraph"/>
+        <w:numPr>
+          <w:ilvl w:val="0"/>
+          <w:numId w:val="31"/>
+        </w:numPr>
+        <w:rPr/>
+      </w:pPr>
+      <w:r>
+        <w:rPr/>
+        <w:t>🔬 312F. Stop timer (1 min) Start timer (4 min)</w:t>
+      </w:r>
+    </w:p>
+    <w:p>
+      <w:pPr>
+        <w:pStyle w:val="ListParagraph"/>
+        <w:numPr>
+          <w:ilvl w:val="0"/>
+          <w:numId w:val="31"/>
+        </w:numPr>
+        <w:rPr/>
+      </w:pPr>
+      <w:r>
+        <w:rPr/>
+        <w:t>🔬 312T. Stop timer (1 min)</w:t>
+      </w:r>
       <w:r/>
       <w:r/>
     </w:p>
@@ -2830,15 +2862,49 @@
           <w:ilvl w:val="0"/>
           <w:numId w:val="33"/>
         </w:numPr>
-      </w:pPr>
-      <w:r>
-        <w:t>✏️ 512. Haal ik het?</w:t>
-      </w:r>
-      <w:del w:author="Rinse Cramer" w:date="2025-11-07T18:09:00Z" w16du:dateUtc="2025-11-07T17:09:00Z" w:id="348">
+        <w:rPr/>
+      </w:pPr>
+      <w:r>
+        <w:rPr/>
+        <w:t xml:space="preserve">✏️ 512. </w:t>
+      </w:r>
+      <w:r>
+        <w:rPr/>
+        <w:t>Haal ik het?</w:t>
+      </w:r>
+      <w:del w:author="Rinse Cramer" w:date="2025-11-07T18:09:00Z" w16du:dateUtc="2025-11-07T17:09:00Z" w:id="92138923">
         <w:r>
           <w:delText>I</w:delText>
         </w:r>
       </w:del>
+    </w:p>
+    <w:p>
+      <w:pPr>
+        <w:pStyle w:val="ListParagraph"/>
+        <w:numPr>
+          <w:ilvl w:val="0"/>
+          <w:numId w:val="33"/>
+        </w:numPr>
+        <w:rPr/>
+      </w:pPr>
+      <w:r>
+        <w:rPr/>
+        <w:t>✏️ 512F. Stop timer (1 min) Start timer (4 min)</w:t>
+      </w:r>
+    </w:p>
+    <w:p>
+      <w:pPr>
+        <w:pStyle w:val="ListParagraph"/>
+        <w:numPr>
+          <w:ilvl w:val="0"/>
+          <w:numId w:val="33"/>
+        </w:numPr>
+        <w:rPr/>
+      </w:pPr>
+      <w:r>
+        <w:rPr/>
+        <w:t>✏️ 512T. Stop timer (1 min)</w:t>
+      </w:r>
       <w:r/>
       <w:r/>
     </w:p>
@@ -3718,17 +3784,49 @@
           <w:ilvl w:val="0"/>
           <w:numId w:val="36"/>
         </w:numPr>
-      </w:pPr>
-      <w:ins w:author="Rinse Cramer" w:date="2025-11-07T18:09:00Z" w16du:dateUtc="2025-11-07T17:09:00Z" w:id="437">
-        <w:r>
-          <w:t>⌨️ 712. Haal ik het?</w:t>
-        </w:r>
-      </w:ins>
-      <w:del w:author="Rinse Cramer" w:date="2025-11-07T18:09:00Z" w16du:dateUtc="2025-11-07T17:09:00Z" w:id="438">
+        <w:rPr/>
+      </w:pPr>
+      <w:ins w:author="Rinse Cramer" w:date="2025-11-07T18:09:00Z" w16du:dateUtc="2025-11-07T17:09:00Z" w:id="1050401915">
+        <w:r>
+          <w:t xml:space="preserve">⌨️ 712. </w:t>
+        </w:r>
+        <w:r>
+          <w:t>Haal ik het?</w:t>
+        </w:r>
+      </w:ins>
+      <w:del w:author="Rinse Cramer" w:date="2025-11-07T18:09:00Z" w16du:dateUtc="2025-11-07T17:09:00Z" w:id="919337576">
         <w:r>
           <w:delText>I</w:delText>
         </w:r>
       </w:del>
+    </w:p>
+    <w:p>
+      <w:pPr>
+        <w:pStyle w:val="ListParagraph"/>
+        <w:numPr>
+          <w:ilvl w:val="0"/>
+          <w:numId w:val="36"/>
+        </w:numPr>
+        <w:rPr/>
+      </w:pPr>
+      <w:r>
+        <w:rPr/>
+        <w:t>⌨ 712F. Stop timer (1 min) Start timer (4 min)</w:t>
+      </w:r>
+    </w:p>
+    <w:p>
+      <w:pPr>
+        <w:pStyle w:val="ListParagraph"/>
+        <w:numPr>
+          <w:ilvl w:val="0"/>
+          <w:numId w:val="36"/>
+        </w:numPr>
+        <w:rPr/>
+      </w:pPr>
+      <w:r>
+        <w:rPr/>
+        <w:t>⌨ 712T. Stop timer (1 min)</w:t>
+      </w:r>
       <w:r/>
       <w:r/>
     </w:p>
@@ -4009,22 +4107,54 @@
           <w:ilvl w:val="0"/>
           <w:numId w:val="38"/>
         </w:numPr>
-      </w:pPr>
-      <w:ins w:author="Rinse Cramer" w:date="2025-11-07T18:09:00Z" w16du:dateUtc="2025-11-07T17:09:00Z" w:id="453">
-        <w:r>
-          <w:t>🔎 812. Haal ik het?</w:t>
-        </w:r>
-      </w:ins>
-      <w:del w:author="Rinse Cramer" w:date="2025-11-03T23:43:00Z" w16du:dateUtc="2025-11-03T22:43:00Z" w:id="454">
+        <w:rPr/>
+      </w:pPr>
+      <w:ins w:author="Rinse Cramer" w:date="2025-11-07T18:09:00Z" w16du:dateUtc="2025-11-07T17:09:00Z" w:id="446317700">
+        <w:r>
+          <w:t xml:space="preserve">🔎 812. </w:t>
+        </w:r>
+        <w:r>
+          <w:t>Haal ik het?</w:t>
+        </w:r>
+      </w:ins>
+      <w:del w:author="Rinse Cramer" w:date="2025-11-03T23:43:00Z" w16du:dateUtc="2025-11-03T22:43:00Z" w:id="628745279">
         <w:r>
           <w:delText>M</w:delText>
         </w:r>
       </w:del>
-      <w:del w:author="Rinse Cramer" w:date="2025-11-07T18:10:00Z" w16du:dateUtc="2025-11-07T17:10:00Z" w:id="455">
+      <w:del w:author="Rinse Cramer" w:date="2025-11-07T18:10:00Z" w16du:dateUtc="2025-11-07T17:10:00Z" w:id="1799746297">
         <w:r>
           <w:delText>.</w:delText>
         </w:r>
       </w:del>
+    </w:p>
+    <w:p>
+      <w:pPr>
+        <w:pStyle w:val="ListParagraph"/>
+        <w:numPr>
+          <w:ilvl w:val="0"/>
+          <w:numId w:val="38"/>
+        </w:numPr>
+        <w:rPr/>
+      </w:pPr>
+      <w:r>
+        <w:rPr/>
+        <w:t>🔎 812F. Stop timer (1 min) Start timer (4 min)</w:t>
+      </w:r>
+    </w:p>
+    <w:p>
+      <w:pPr>
+        <w:pStyle w:val="ListParagraph"/>
+        <w:numPr>
+          <w:ilvl w:val="0"/>
+          <w:numId w:val="38"/>
+        </w:numPr>
+        <w:rPr/>
+      </w:pPr>
+      <w:r>
+        <w:rPr/>
+        <w:t>🔎 812T. Stop timer (1 min)</w:t>
+      </w:r>
       <w:r/>
       <w:r/>
     </w:p>
@@ -4775,6 +4905,34 @@
       </w:pPr>
       <w:r>
         <w:rPr/>
+        <w:t>⚙ 1112F. Stop timer (1 min) Start timer (4 min)</w:t>
+      </w:r>
+    </w:p>
+    <w:p>
+      <w:pPr>
+        <w:pStyle w:val="ListParagraph"/>
+        <w:numPr>
+          <w:ilvl w:val="0"/>
+          <w:numId w:val="36"/>
+        </w:numPr>
+        <w:rPr/>
+      </w:pPr>
+      <w:r>
+        <w:rPr/>
+        <w:t>⚙ 1112T. Stop timer (1 min)</w:t>
+      </w:r>
+    </w:p>
+    <w:p>
+      <w:pPr>
+        <w:pStyle w:val="ListParagraph"/>
+        <w:numPr>
+          <w:ilvl w:val="0"/>
+          <w:numId w:val="36"/>
+        </w:numPr>
+        <w:rPr/>
+      </w:pPr>
+      <w:r>
+        <w:rPr/>
         <w:t xml:space="preserve">⚙️ </w:t>
       </w:r>
       <w:r>
@@ -4904,7 +5062,11 @@
       </w:pPr>
       <w:r>
         <w:rPr/>
-        <w:t>4. Baas is mondeling beschikbaar?</w:t>
+        <w:t>3</w:t>
+      </w:r>
+      <w:r>
+        <w:rPr/>
+        <w:t>. Baas is mondeling beschikbaar?</w:t>
       </w:r>
     </w:p>
     <w:p>
@@ -4918,7 +5080,11 @@
       </w:pPr>
       <w:r>
         <w:rPr/>
-        <w:t>5. Baas is schriftelijk beschikbaar</w:t>
+        <w:t>4</w:t>
+      </w:r>
+      <w:r>
+        <w:rPr/>
+        <w:t>. Baas is schriftelijk beschikbaar</w:t>
       </w:r>
     </w:p>
     <w:p>
@@ -4932,7 +5098,11 @@
       </w:pPr>
       <w:r>
         <w:rPr/>
-        <w:t>6. Aanwezigheid monitoren</w:t>
+        <w:t>5</w:t>
+      </w:r>
+      <w:r>
+        <w:rPr/>
+        <w:t>. Aanwezigheid monitoren</w:t>
       </w:r>
     </w:p>
     <w:p>
@@ -4946,7 +5116,11 @@
       </w:pPr>
       <w:r>
         <w:rPr/>
-        <w:t>7. Baas is mondeling beschikbaar</w:t>
+        <w:t>6</w:t>
+      </w:r>
+      <w:r>
+        <w:rPr/>
+        <w:t>. Baas is mondeling beschikbaar</w:t>
       </w:r>
     </w:p>
     <w:p>
@@ -4984,7 +5158,11 @@
       </w:pPr>
       <w:r>
         <w:rPr/>
-        <w:t>8. Ik mail naar baas</w:t>
+        <w:t>7</w:t>
+      </w:r>
+      <w:r>
+        <w:rPr/>
+        <w:t>. Ik mail naar baas</w:t>
       </w:r>
     </w:p>
     <w:p>
@@ -5028,7 +5206,11 @@
       </w:pPr>
       <w:r>
         <w:rPr/>
-        <w:t>9. Resultaten zijn goedgekeurd?</w:t>
+        <w:t>8</w:t>
+      </w:r>
+      <w:r>
+        <w:rPr/>
+        <w:t>. Resultaten zijn goedgekeurd?</w:t>
       </w:r>
     </w:p>
     <w:p>
@@ -5072,7 +5254,11 @@
       </w:pPr>
       <w:r>
         <w:rPr/>
-        <w:t>10. Terug naar vorige flowchartpagina navigeren</w:t>
+        <w:t>9</w:t>
+      </w:r>
+      <w:r>
+        <w:rPr/>
+        <w:t>. Terug naar vorige flowchartpagina navigeren</w:t>
       </w:r>
     </w:p>
     <w:p>
@@ -5137,12 +5323,24 @@
           <w:numId w:val="41"/>
         </w:numPr>
         <w:rPr>
-          <w:rPrChange w:author="" w16du:dateUtc="2025-12-13T09:33:00Z" w:id="1445565471"/>
-        </w:rPr>
-      </w:pPr>
-      <w:r>
-        <w:rPr/>
-        <w:t>11. Naar volgende flowchartpagina navigeren</w:t>
+          <w:rPrChange w:author="" w16du:dateUtc="2025-12-13T09:33:00Z" w:id="1484441246"/>
+        </w:rPr>
+      </w:pPr>
+      <w:r>
+        <w:rPr/>
+        <w:t>1</w:t>
+      </w:r>
+      <w:r>
+        <w:rPr/>
+        <w:t>0</w:t>
+      </w:r>
+      <w:r>
+        <w:rPr/>
+        <w:t xml:space="preserve">. </w:t>
+      </w:r>
+      <w:r>
+        <w:rPr/>
+        <w:t>Jira-uitvoerder wordt de baas</w:t>
       </w:r>
     </w:p>
     <w:p>

</xml_diff>

<commit_message>
style(generator): synchroniseer laatste actie- en checklijst updates en hergenereer stappenplan
- Voeg de nieuwste actie- en checklijst-aanpassingen toe aan Git

- Hergenereer 'IssueTracker_Stappenplan.docx' (0 waarschuwingen)
</commit_message>
<xml_diff>
--- a/Actielijst.docx
+++ b/Actielijst.docx
@@ -727,29 +727,32 @@
           <w:ilvl w:val="0"/>
           <w:numId w:val="41"/>
         </w:numPr>
-      </w:pPr>
-      <w:r>
+        <w:rPr/>
+      </w:pPr>
+      <w:r>
+        <w:rPr/>
         <w:t>12</w:t>
       </w:r>
-      <w:ins w:author="Rinse Cramer" w:date="2025-12-13T10:41:00Z" w16du:dateUtc="2025-12-13T09:41:00Z" w:id="92">
+      <w:ins w:author="Rinse Cramer" w:date="2025-12-13T10:41:00Z" w16du:dateUtc="2025-12-13T09:41:00Z" w:id="318659350">
         <w:r>
           <w:t xml:space="preserve">. </w:t>
         </w:r>
       </w:ins>
       <w:r>
+        <w:rPr/>
         <w:t xml:space="preserve">Ik heb de </w:t>
       </w:r>
       <w:r>
+        <w:rPr/>
         <w:t>bijzonderheden</w:t>
       </w:r>
       <w:r>
+        <w:rPr/>
         <w:t xml:space="preserve"> </w:t>
       </w:r>
       <w:r>
-        <w:t>in de Jira-opmerking met de Intake-</w:t>
-      </w:r>
-      <w:r>
-        <w:t>header geschreven</w:t>
+        <w:rPr/>
+        <w:t>geschreven</w:t>
       </w:r>
     </w:p>
     <w:p>
@@ -1496,33 +1499,88 @@
       <w:pPr>
         <w:pStyle w:val="Heading1"/>
         <w:rPr>
-          <w:rPrChange w:author="" w16du:dateUtc="2025-12-13T09:31:00Z" w:id="1421535866"/>
-        </w:rPr>
-      </w:pPr>
-      <w:r>
-        <w:rPr>
-          <w:rFonts w:ascii="Segoe UI Emoji" w:hAnsi="Segoe UI Emoji" w:cs="Segoe UI Emoji"/>
-        </w:rPr>
+          <w:rStyle w:val="Heading1Char"/>
+          <w:rPrChange w:author="" w16du:dateUtc="2025-12-13T09:31:00Z" w:id="755381447"/>
+        </w:rPr>
+      </w:pPr>
+      <w:r>
+        <w:rPr/>
         <w:t xml:space="preserve">🔬 301. </w:t>
       </w:r>
       <w:r>
-        <w:rPr>
-          <w:rFonts w:ascii="Segoe UI Emoji" w:hAnsi="Segoe UI Emoji" w:cs="Segoe UI Emoji"/>
-        </w:rPr>
+        <w:rPr/>
         <w:t>Issue [aanpak goedgekeurd]</w:t>
       </w:r>
     </w:p>
     <w:p>
       <w:pPr>
         <w:pStyle w:val="ListParagraph"/>
-        <w:numPr>
-          <w:ilvl w:val="0"/>
-          <w:numId w:val="30"/>
-        </w:numPr>
-        <w:rPr/>
-      </w:pPr>
-      <w:r>
-        <w:rPr/>
+        <w:keepNext w:val="1"/>
+        <w:numPr>
+          <w:ilvl w:val="0"/>
+          <w:numId w:val="15"/>
+        </w:numPr>
+        <w:spacing w:after="0" w:line="240" w:lineRule="auto"/>
+        <w:rPr/>
+      </w:pPr>
+      <w:r>
+        <w:rPr/>
+        <w:t>1. Jira-uitvoerder is medewerker</w:t>
+      </w:r>
+    </w:p>
+    <w:p>
+      <w:pPr>
+        <w:pStyle w:val="ListParagraph"/>
+        <w:numPr>
+          <w:ilvl w:val="0"/>
+          <w:numId w:val="15"/>
+        </w:numPr>
+        <w:rPr/>
+      </w:pPr>
+      <w:r>
+        <w:rPr/>
+        <w:t xml:space="preserve">2. </w:t>
+      </w:r>
+      <w:r>
+        <w:rPr/>
+        <w:t>Jira</w:t>
+      </w:r>
+      <w:r>
+        <w:rPr/>
+        <w:t>-status is Review aanpak</w:t>
+      </w:r>
+    </w:p>
+    <w:p>
+      <w:pPr>
+        <w:pStyle w:val="ListParagraph"/>
+        <w:numPr>
+          <w:ilvl w:val="0"/>
+          <w:numId w:val="15"/>
+        </w:numPr>
+        <w:rPr/>
+      </w:pPr>
+      <w:r>
+        <w:rPr/>
+        <w:t xml:space="preserve">3. </w:t>
+      </w:r>
+      <w:r>
+        <w:rPr/>
+        <w:t>Jira</w:t>
+      </w:r>
+      <w:r>
+        <w:rPr/>
+        <w:t>-status wordt Analyse</w:t>
+      </w:r>
+    </w:p>
+    <w:p>
+      <w:pPr>
+        <w:pStyle w:val="Normal"/>
+        <w:ind w:left="0"/>
+      </w:pPr>
+      <w:r>
+        <w:rPr>
+          <w:rStyle w:val="Heading1Char"/>
+        </w:rPr>
         <w:t>🔬 302. Start timer (ETC)</w:t>
       </w:r>
       <w:r>
@@ -1550,26 +1608,221 @@
         <w:pStyle w:val="ListParagraph"/>
         <w:numPr>
           <w:ilvl w:val="0"/>
+          <w:numId w:val="41"/>
+        </w:numPr>
+        <w:rPr/>
+      </w:pPr>
+      <w:r>
+        <w:rPr/>
+        <w:t>4. Start &gt; Klok &gt; menu &gt; Timer</w:t>
+      </w:r>
+    </w:p>
+    <w:p>
+      <w:pPr>
+        <w:pStyle w:val="ListParagraph"/>
+        <w:numPr>
+          <w:ilvl w:val="0"/>
+          <w:numId w:val="41"/>
+        </w:numPr>
+        <w:rPr/>
+      </w:pPr>
+      <w:r>
+        <w:rPr/>
+        <w:t>5. Effort tijd instellen &gt; Start &gt; Op voorgrond behouden</w:t>
+      </w:r>
+    </w:p>
+    <w:p>
+      <w:pPr>
+        <w:pStyle w:val="ListParagraph"/>
+        <w:numPr>
+          <w:ilvl w:val="0"/>
+          <w:numId w:val="41"/>
+        </w:numPr>
+        <w:rPr/>
+      </w:pPr>
+      <w:r>
+        <w:rPr/>
+        <w:t xml:space="preserve">6. </w:t>
+      </w:r>
+      <w:r>
+        <w:rPr/>
+        <w:t>Jira</w:t>
+      </w:r>
+      <w:r>
+        <w:rPr/>
+        <w:t>-stopwatch wordt gestart</w:t>
+      </w:r>
+    </w:p>
+    <w:p>
+      <w:pPr>
+        <w:pStyle w:val="Normal"/>
+        <w:ind w:left="0"/>
+      </w:pPr>
+      <w:r>
+        <w:rPr>
+          <w:rStyle w:val="Heading1Char"/>
+        </w:rPr>
+        <w:t xml:space="preserve">🔬 303. Intake verwerken</w:t>
+      </w:r>
+      <w:r/>
+    </w:p>
+    <w:p>
+      <w:pPr>
+        <w:pStyle w:val="Heading1"/>
+      </w:pPr>
+      <w:r>
+        <w:rPr/>
+        <w:t>🔬 304. Oplossing analyseren</w:t>
+      </w:r>
+    </w:p>
+    <w:p>
+      <w:pPr>
+        <w:pStyle w:val="ListParagraph"/>
+        <w:numPr>
+          <w:ilvl w:val="0"/>
           <w:numId w:val="30"/>
         </w:numPr>
         <w:rPr/>
       </w:pPr>
       <w:r>
         <w:rPr/>
-        <w:t xml:space="preserve">🔬 303. Intake verwerken</w:t>
+        <w:t>7</w:t>
+      </w:r>
+      <w:r>
+        <w:rPr/>
+        <w:t>. Aanleiding of probleem</w:t>
+      </w:r>
+      <w:r>
+        <w:rPr/>
+        <w:t xml:space="preserve"> (BUGS) helder?</w:t>
+      </w:r>
+    </w:p>
+    <w:p>
+      <w:pPr>
+        <w:pStyle w:val="ListParagraph"/>
+        <w:numPr>
+          <w:ilvl w:val="0"/>
+          <w:numId w:val="30"/>
+        </w:numPr>
+        <w:rPr/>
+      </w:pPr>
+      <w:r>
+        <w:rPr/>
+        <w:t>8. Is het issue een Bug? (Bug(s) reproduceren!)</w:t>
+      </w:r>
+    </w:p>
+    <w:p>
+      <w:pPr>
+        <w:pStyle w:val="ListParagraph"/>
+        <w:numPr>
+          <w:ilvl w:val="0"/>
+          <w:numId w:val="30"/>
+        </w:numPr>
+        <w:rPr/>
+      </w:pPr>
+      <w:r>
+        <w:rPr/>
+        <w:t>9. Mogelijke oplossingen bedenken (minimaal 2, bestaande templates gebruiken!)</w:t>
+      </w:r>
+    </w:p>
+    <w:p>
+      <w:pPr>
+        <w:pStyle w:val="ListParagraph"/>
+        <w:numPr>
+          <w:ilvl w:val="0"/>
+          <w:numId w:val="30"/>
+        </w:numPr>
+        <w:rPr/>
+      </w:pPr>
+      <w:r>
+        <w:rPr/>
+        <w:t>10. Beste oplossing kiezen (KISS), onderbouwen waarom deze de voorkeur heeft</w:t>
+      </w:r>
+    </w:p>
+    <w:p>
+      <w:pPr>
+        <w:pStyle w:val="Heading1"/>
+      </w:pPr>
+      <w:r>
+        <w:rPr/>
+        <w:t xml:space="preserve">🔬 305. Evalueer of de deliverables correct en volledig zijn afgerond</w:t>
       </w:r>
       <w:r/>
     </w:p>
     <w:p>
       <w:pPr>
-        <w:pStyle w:val="ListParagraph"/>
-        <w:numPr>
-          <w:ilvl w:val="0"/>
-          <w:numId w:val="30"/>
-        </w:numPr>
-      </w:pPr>
-      <w:r>
-        <w:t xml:space="preserve">🔬 304. Oplossing analyseren</w:t>
+        <w:pStyle w:val="Heading1"/>
+      </w:pPr>
+      <w:del w:author="Rinse Cramer" w:date="2025-11-04T23:06:00Z" w16du:dateUtc="2025-11-04T22:06:00Z" w:id="1779593026">
+        <w:r>
+          <w:delText xml:space="preserve">E. </w:delText>
+        </w:r>
+        <w:r>
+          <w:delText>Expliciete referentie bij gekozen oplossing vermeld?</w:delText>
+        </w:r>
+        <w:r>
+          <w:delText>F</w:delText>
+        </w:r>
+      </w:del>
+      <w:del w:author="Rinse Cramer" w:date="2025-11-07T18:07:00Z" w16du:dateUtc="2025-11-07T17:07:00Z" w:id="91497479">
+        <w:r>
+          <w:delText xml:space="preserve">. </w:delText>
+        </w:r>
+        <w:r>
+          <w:delText>Actiepunten uit Excel verwerkt en Jira geüpdated</w:delText>
+        </w:r>
+      </w:del>
+      <w:ins w:author="Rinse Cramer" w:date="2025-11-07T18:08:00Z" w16du:dateUtc="2025-11-07T17:08:00Z" w:id="1830409562">
+        <w:r>
+          <w:t>🔬 306. Stop timer (ETC)</w:t>
+        </w:r>
+      </w:ins>
+      <w:del w:author="Rinse Cramer" w:date="2025-11-04T23:06:00Z" w16du:dateUtc="2025-11-04T22:06:00Z" w:id="1170063263">
+        <w:r>
+          <w:delText>G</w:delText>
+        </w:r>
+      </w:del>
+      <w:del w:author="Rinse Cramer" w:date="2025-11-07T18:08:00Z" w16du:dateUtc="2025-11-07T17:08:00Z" w:id="1278594603">
+        <w:r>
+          <w:delText>.</w:delText>
+        </w:r>
+      </w:del>
+    </w:p>
+    <w:p>
+      <w:pPr>
+        <w:pStyle w:val="ListParagraph"/>
+        <w:numPr>
+          <w:ilvl w:val="0"/>
+          <w:numId w:val="41"/>
+        </w:numPr>
+        <w:rPr/>
+      </w:pPr>
+      <w:r>
+        <w:rPr/>
+        <w:t>11. Pauze &gt; Opnieuw instellen &gt; Terug naar volledige weergave</w:t>
+      </w:r>
+    </w:p>
+    <w:p>
+      <w:pPr>
+        <w:pStyle w:val="ListParagraph"/>
+        <w:numPr>
+          <w:ilvl w:val="0"/>
+          <w:numId w:val="41"/>
+        </w:numPr>
+        <w:rPr/>
+      </w:pPr>
+      <w:r>
+        <w:rPr/>
+        <w:t>12. Klok minimaliseren</w:t>
+      </w:r>
+    </w:p>
+    <w:p>
+      <w:pPr>
+        <w:pStyle w:val="Heading1"/>
+      </w:pPr>
+      <w:r>
+        <w:rPr/>
+        <w:t xml:space="preserve">🔬 307. Bijzonderheden gezien?</w:t>
       </w:r>
       <w:r/>
     </w:p>
@@ -1578,11 +1831,26 @@
         <w:pStyle w:val="ListParagraph"/>
         <w:numPr>
           <w:ilvl w:val="0"/>
-          <w:numId w:val="30"/>
-        </w:numPr>
-      </w:pPr>
-      <w:r>
-        <w:t xml:space="preserve">🔬 305. Evalueer of de deliverables correct en volledig zijn afgerond</w:t>
+          <w:numId w:val="41"/>
+        </w:numPr>
+        <w:rPr/>
+      </w:pPr>
+      <w:r>
+        <w:rPr/>
+        <w:t>13. Ik heb de bijzonderheden geschreven</w:t>
+      </w:r>
+    </w:p>
+    <w:p>
+      <w:pPr>
+        <w:pStyle w:val="Heading1"/>
+      </w:pPr>
+      <w:r>
+        <w:rPr/>
+        <w:t xml:space="preserve">🔬 307T. Volg de </w:t>
+      </w:r>
+      <w:r>
+        <w:rPr/>
+        <w:t xml:space="preserve">meldplicht</w:t>
       </w:r>
       <w:r/>
     </w:p>
@@ -1591,173 +1859,221 @@
         <w:pStyle w:val="ListParagraph"/>
         <w:numPr>
           <w:ilvl w:val="0"/>
-          <w:numId w:val="30"/>
-        </w:numPr>
-        <w:rPr/>
-      </w:pPr>
-      <w:del w:author="Rinse Cramer" w:date="2025-11-04T23:06:00Z" w16du:dateUtc="2025-11-04T22:06:00Z" w:id="1379580766">
-        <w:r>
-          <w:delText xml:space="preserve">E. </w:delText>
-        </w:r>
-        <w:r>
-          <w:delText>Expliciete referentie bij gekozen oplossing vermeld?</w:delText>
-        </w:r>
-        <w:r>
-          <w:delText>F</w:delText>
+          <w:numId w:val="41"/>
+        </w:numPr>
+        <w:rPr/>
+      </w:pPr>
+      <w:r>
+        <w:rPr/>
+        <w:t>14. Naar flowchartpagina van meldplicht navigeren</w:t>
+      </w:r>
+    </w:p>
+    <w:p>
+      <w:pPr>
+        <w:pStyle w:val="Heading1"/>
+      </w:pPr>
+      <w:r>
+        <w:rPr/>
+        <w:t xml:space="preserve">🔬 307F. Volg de </w:t>
+      </w:r>
+      <w:r>
+        <w:rPr/>
+        <w:t>review analyse</w:t>
+      </w:r>
+    </w:p>
+    <w:p>
+      <w:pPr>
+        <w:pStyle w:val="ListParagraph"/>
+        <w:numPr>
+          <w:ilvl w:val="0"/>
+          <w:numId w:val="41"/>
+        </w:numPr>
+        <w:rPr/>
+      </w:pPr>
+      <w:r>
+        <w:rPr>
+          <w:lang w:val="en-US"/>
+        </w:rPr>
+        <w:t xml:space="preserve">15. </w:t>
+      </w:r>
+      <w:r>
+        <w:rPr/>
+        <w:t>Naar volgende flowchartpagina navigeren</w:t>
+      </w:r>
+    </w:p>
+    <w:p>
+      <w:pPr>
+        <w:pStyle w:val="Heading1"/>
+      </w:pPr>
+      <w:r>
+        <w:rPr/>
+        <w:t xml:space="preserve">🔬 308. </w:t>
+      </w:r>
+      <w:r>
+        <w:rPr/>
+        <w:t xml:space="preserve">Na </w:t>
+      </w:r>
+      <w:r>
+        <w:rPr/>
+        <w:t>2/3 ETC Na 100% ETC Na 150% ETC</w:t>
+      </w:r>
+    </w:p>
+    <w:p>
+      <w:pPr>
+        <w:pStyle w:val="Normal"/>
+      </w:pPr>
+      <w:r>
+        <w:rPr>
+          <w:rStyle w:val="Heading1Char"/>
+        </w:rPr>
+        <w:t xml:space="preserve">🔬 309. </w:t>
+      </w:r>
+      <w:r>
+        <w:rPr>
+          <w:rStyle w:val="Heading1Char"/>
+        </w:rPr>
+        <w:t>Start timer</w:t>
+      </w:r>
+      <w:r>
+        <w:rPr>
+          <w:rStyle w:val="Heading1Char"/>
+        </w:rPr>
+        <w:t xml:space="preserve"> (1 min)</w:t>
+      </w:r>
+    </w:p>
+    <w:p>
+      <w:pPr>
+        <w:pStyle w:val="ListParagraph"/>
+        <w:numPr>
+          <w:ilvl w:val="0"/>
+          <w:numId w:val="41"/>
+        </w:numPr>
+        <w:rPr/>
+      </w:pPr>
+      <w:r>
+        <w:rPr/>
+        <w:t>16</w:t>
+      </w:r>
+      <w:r>
+        <w:rPr/>
+        <w:t>. Start &gt; Klok &gt; menu &gt; Timer</w:t>
+      </w:r>
+    </w:p>
+    <w:p>
+      <w:pPr>
+        <w:pStyle w:val="ListParagraph"/>
+        <w:numPr>
+          <w:ilvl w:val="0"/>
+          <w:numId w:val="41"/>
+        </w:numPr>
+        <w:rPr/>
+      </w:pPr>
+      <w:r>
+        <w:rPr/>
+        <w:t>17</w:t>
+      </w:r>
+      <w:r>
+        <w:rPr/>
+        <w:t>. Effort tijd instellen &gt; Start &gt; Op voorgrond behouden</w:t>
+      </w:r>
+    </w:p>
+    <w:p>
+      <w:pPr>
+        <w:pStyle w:val="ListParagraph"/>
+        <w:numPr>
+          <w:ilvl w:val="0"/>
+          <w:numId w:val="41"/>
+        </w:numPr>
+        <w:rPr/>
+      </w:pPr>
+      <w:r>
+        <w:rPr/>
+        <w:t>18</w:t>
+      </w:r>
+      <w:r>
+        <w:rPr/>
+        <w:t xml:space="preserve">. </w:t>
+      </w:r>
+      <w:r>
+        <w:rPr/>
+        <w:t>Jira</w:t>
+      </w:r>
+      <w:r>
+        <w:rPr/>
+        <w:t>-stopwatch wordt gestart</w:t>
+      </w:r>
+    </w:p>
+    <w:p>
+      <w:pPr>
+        <w:pStyle w:val="Heading1"/>
+      </w:pPr>
+      <w:r>
+        <w:rPr/>
+        <w:t>🔬 310. Hoe lang denk je nog nodig te hebben?</w:t>
+      </w:r>
+    </w:p>
+    <w:p>
+      <w:pPr>
+        <w:pStyle w:val="ListParagraph"/>
+        <w:numPr>
+          <w:ilvl w:val="0"/>
+          <w:numId w:val="41"/>
+        </w:numPr>
+        <w:rPr/>
+      </w:pPr>
+      <w:r>
+        <w:rPr/>
+        <w:t>19. Hoe lang denk je nog nodig te hebben?</w:t>
+      </w:r>
+    </w:p>
+    <w:p>
+      <w:pPr>
+        <w:pStyle w:val="ListParagraph"/>
+        <w:numPr>
+          <w:ilvl w:val="0"/>
+          <w:numId w:val="41"/>
+        </w:numPr>
+        <w:rPr/>
+      </w:pPr>
+      <w:r>
+        <w:rPr/>
+        <w:t xml:space="preserve">20. Past het binnen de 150%? </w:t>
+      </w:r>
+      <w:r>
+        <w:rPr/>
+        <w:t>Tijdtrigger gehaald</w:t>
+      </w:r>
+      <w:r>
+        <w:rPr/>
+        <w:t>?</w:t>
+      </w:r>
+    </w:p>
+    <w:p>
+      <w:pPr>
+        <w:pStyle w:val="Heading1"/>
+      </w:pPr>
+      <w:ins w:author="Rinse Cramer" w:date="2025-11-07T18:08:00Z" w16du:dateUtc="2025-11-07T17:08:00Z" w:id="1699839949">
+        <w:r>
+          <w:t xml:space="preserve">🔬 312. </w:t>
+        </w:r>
+        <w:r>
+          <w:t>Haal ik het?</w:t>
+        </w:r>
+      </w:ins>
+      <w:del w:author="Rinse Cramer" w:date="2025-11-04T23:06:00Z" w16du:dateUtc="2025-11-04T22:06:00Z" w:id="1425229297">
+        <w:r>
+          <w:delText>H</w:delText>
         </w:r>
       </w:del>
-      <w:del w:author="Rinse Cramer" w:date="2025-11-07T18:07:00Z" w16du:dateUtc="2025-11-07T17:07:00Z" w:id="1182558633">
-        <w:r>
-          <w:delText xml:space="preserve">. </w:delText>
-        </w:r>
-        <w:r>
-          <w:delText>Actiepunten uit Excel verwerkt en Jira geüpdated</w:delText>
+      <w:del w:author="Rinse Cramer" w:date="2025-11-07T18:10:00Z" w16du:dateUtc="2025-11-07T17:10:00Z" w:id="1391856155">
+        <w:r>
+          <w:delText>.</w:delText>
         </w:r>
       </w:del>
-      <w:ins w:author="Rinse Cramer" w:date="2025-11-07T18:08:00Z" w16du:dateUtc="2025-11-07T17:08:00Z" w:id="728276615">
-        <w:r>
-          <w:t>🔬 306. Stop timer (ETC)</w:t>
-        </w:r>
-      </w:ins>
-      <w:del w:author="Rinse Cramer" w:date="2025-11-04T23:06:00Z" w16du:dateUtc="2025-11-04T22:06:00Z" w:id="610049957">
-        <w:r>
-          <w:delText>G</w:delText>
-        </w:r>
-      </w:del>
-      <w:del w:author="Rinse Cramer" w:date="2025-11-07T18:08:00Z" w16du:dateUtc="2025-11-07T17:08:00Z" w:id="1210450167">
-        <w:r>
-          <w:delText>.</w:delText>
-        </w:r>
-      </w:del>
-    </w:p>
-    <w:p>
-      <w:pPr>
-        <w:pStyle w:val="ListParagraph"/>
-        <w:numPr>
-          <w:ilvl w:val="0"/>
-          <w:numId w:val="30"/>
-        </w:numPr>
-      </w:pPr>
-      <w:r>
-        <w:t xml:space="preserve">🔬 307. Bijzonderheden gezien?</w:t>
-      </w:r>
-      <w:r/>
-    </w:p>
-    <w:p>
-      <w:pPr>
-        <w:pStyle w:val="ListParagraph"/>
-        <w:numPr>
-          <w:ilvl w:val="0"/>
-          <w:numId w:val="30"/>
-        </w:numPr>
-        <w:rPr/>
-      </w:pPr>
-      <w:r>
-        <w:rPr/>
-        <w:t xml:space="preserve">🔬 307T. Volg de review analyse</w:t>
-      </w:r>
-      <w:r/>
-    </w:p>
-    <w:p>
-      <w:pPr>
-        <w:pStyle w:val="ListParagraph"/>
-        <w:numPr>
-          <w:ilvl w:val="0"/>
-          <w:numId w:val="30"/>
-        </w:numPr>
-        <w:rPr/>
-      </w:pPr>
-      <w:r>
-        <w:rPr/>
-        <w:t>🔬 307F. Volg de meldplicht</w:t>
-      </w:r>
-    </w:p>
-    <w:p>
-      <w:pPr>
-        <w:pStyle w:val="ListParagraph"/>
-        <w:numPr>
-          <w:ilvl w:val="0"/>
-          <w:numId w:val="30"/>
-        </w:numPr>
-        <w:rPr/>
-      </w:pPr>
-      <w:r>
-        <w:rPr/>
-        <w:t xml:space="preserve">🔬 308. </w:t>
-      </w:r>
-      <w:r>
-        <w:rPr/>
-        <w:t xml:space="preserve">Na </w:t>
-      </w:r>
-      <w:r>
-        <w:rPr/>
-        <w:t>2/3 ETC Na 100% ETC Na 150% ETC</w:t>
-      </w:r>
-    </w:p>
-    <w:p>
-      <w:pPr>
-        <w:pStyle w:val="ListParagraph"/>
-        <w:numPr>
-          <w:ilvl w:val="0"/>
-          <w:numId w:val="30"/>
-        </w:numPr>
-        <w:rPr/>
-      </w:pPr>
-      <w:r>
-        <w:rPr/>
-        <w:t>🔬 309. Start timer (1 min)</w:t>
-      </w:r>
-    </w:p>
-    <w:p>
-      <w:pPr>
-        <w:pStyle w:val="ListParagraph"/>
-        <w:numPr>
-          <w:ilvl w:val="0"/>
-          <w:numId w:val="30"/>
-        </w:numPr>
-        <w:rPr/>
-      </w:pPr>
-      <w:r>
-        <w:rPr/>
-        <w:t>🔬 310. Hoe lang denk je nog nodig te hebben?</w:t>
-      </w:r>
-    </w:p>
-    <w:p>
-      <w:pPr>
-        <w:pStyle w:val="ListParagraph"/>
-        <w:numPr>
-          <w:ilvl w:val="0"/>
-          <w:numId w:val="31"/>
-        </w:numPr>
-        <w:rPr/>
-      </w:pPr>
-      <w:ins w:author="Rinse Cramer" w:date="2025-11-07T18:08:00Z" w16du:dateUtc="2025-11-07T17:08:00Z" w:id="1413536179">
-        <w:r>
-          <w:t xml:space="preserve">🔬 312. </w:t>
-        </w:r>
-        <w:r>
-          <w:t>Haal ik het?</w:t>
-        </w:r>
-      </w:ins>
-      <w:del w:author="Rinse Cramer" w:date="2025-11-04T23:06:00Z" w16du:dateUtc="2025-11-04T22:06:00Z" w:id="2110716467">
-        <w:r>
-          <w:delText>H</w:delText>
-        </w:r>
-      </w:del>
-      <w:del w:author="Rinse Cramer" w:date="2025-11-07T18:10:00Z" w16du:dateUtc="2025-11-07T17:10:00Z" w:id="817438657">
-        <w:r>
-          <w:delText>.</w:delText>
-        </w:r>
-      </w:del>
-    </w:p>
-    <w:p>
-      <w:pPr>
-        <w:pStyle w:val="ListParagraph"/>
-        <w:numPr>
-          <w:ilvl w:val="0"/>
-          <w:numId w:val="31"/>
-        </w:numPr>
-        <w:rPr/>
+    </w:p>
+    <w:p>
+      <w:pPr>
+        <w:pStyle w:val="Heading1"/>
       </w:pPr>
       <w:r>
         <w:rPr/>
@@ -1769,9 +2085,54 @@
         <w:pStyle w:val="ListParagraph"/>
         <w:numPr>
           <w:ilvl w:val="0"/>
-          <w:numId w:val="31"/>
-        </w:numPr>
-        <w:rPr/>
+          <w:numId w:val="41"/>
+        </w:numPr>
+        <w:rPr/>
+      </w:pPr>
+      <w:r>
+        <w:rPr/>
+        <w:t>21. Pauze &gt; Opnieuw instellen &gt; Terug naar volledige weergave</w:t>
+      </w:r>
+    </w:p>
+    <w:p>
+      <w:pPr>
+        <w:pStyle w:val="ListParagraph"/>
+        <w:numPr>
+          <w:ilvl w:val="0"/>
+          <w:numId w:val="41"/>
+        </w:numPr>
+        <w:rPr/>
+      </w:pPr>
+      <w:r>
+        <w:rPr/>
+        <w:t>22. Effort tijd instellen &gt; Start &gt; Op voorgrond behouden</w:t>
+      </w:r>
+    </w:p>
+    <w:p>
+      <w:pPr>
+        <w:pStyle w:val="ListParagraph"/>
+        <w:numPr>
+          <w:ilvl w:val="0"/>
+          <w:numId w:val="41"/>
+        </w:numPr>
+        <w:rPr/>
+      </w:pPr>
+      <w:r>
+        <w:rPr/>
+        <w:t xml:space="preserve">23. </w:t>
+      </w:r>
+      <w:r>
+        <w:rPr/>
+        <w:t>Jira</w:t>
+      </w:r>
+      <w:r>
+        <w:rPr/>
+        <w:t>-stopwatch wordt gestart</w:t>
+      </w:r>
+    </w:p>
+    <w:p>
+      <w:pPr>
+        <w:pStyle w:val="Heading1"/>
       </w:pPr>
       <w:r>
         <w:rPr/>
@@ -1785,10 +2146,35 @@
         <w:pStyle w:val="ListParagraph"/>
         <w:numPr>
           <w:ilvl w:val="0"/>
-          <w:numId w:val="31"/>
-        </w:numPr>
-      </w:pPr>
-      <w:r>
+          <w:numId w:val="41"/>
+        </w:numPr>
+        <w:rPr/>
+      </w:pPr>
+      <w:r>
+        <w:rPr/>
+        <w:t>24. Pauze &gt; Opnieuw instellen &gt; Terug naar volledige weergave</w:t>
+      </w:r>
+    </w:p>
+    <w:p>
+      <w:pPr>
+        <w:pStyle w:val="ListParagraph"/>
+        <w:numPr>
+          <w:ilvl w:val="0"/>
+          <w:numId w:val="41"/>
+        </w:numPr>
+        <w:rPr/>
+      </w:pPr>
+      <w:r>
+        <w:rPr/>
+        <w:t>25. Klok minimaliseren</w:t>
+      </w:r>
+    </w:p>
+    <w:p>
+      <w:pPr>
+        <w:pStyle w:val="Heading1"/>
+      </w:pPr>
+      <w:r>
+        <w:rPr/>
         <w:t xml:space="preserve">🔬 313. Hoe heeft het zo lang kunnen duren?</w:t>
       </w:r>
       <w:r/>
@@ -1798,13 +2184,73 @@
         <w:pStyle w:val="ListParagraph"/>
         <w:numPr>
           <w:ilvl w:val="0"/>
-          <w:numId w:val="31"/>
-        </w:numPr>
-        <w:rPr>
-          <w:ins w:author="Rinse Cramer" w:date="2025-11-24T23:55:00Z" w16du:dateUtc="2025-11-24T22:55:00Z" w:id="229"/>
-        </w:rPr>
-      </w:pPr>
-      <w:r>
+          <w:numId w:val="41"/>
+        </w:numPr>
+        <w:rPr/>
+      </w:pPr>
+      <w:r>
+        <w:rPr/>
+        <w:t>2</w:t>
+      </w:r>
+      <w:r>
+        <w:rPr/>
+        <w:t>6</w:t>
+      </w:r>
+      <w:r>
+        <w:rPr/>
+        <w:t>. Hoe heeft het zo lang kunnen duren?</w:t>
+      </w:r>
+    </w:p>
+    <w:p>
+      <w:pPr>
+        <w:pStyle w:val="ListParagraph"/>
+        <w:numPr>
+          <w:ilvl w:val="0"/>
+          <w:numId w:val="41"/>
+        </w:numPr>
+        <w:rPr/>
+      </w:pPr>
+      <w:r>
+        <w:rPr/>
+        <w:t>2</w:t>
+      </w:r>
+      <w:r>
+        <w:rPr/>
+        <w:t>7</w:t>
+      </w:r>
+      <w:r>
+        <w:rPr/>
+        <w:t>. Zijn er snellere methodieken mogelijk?</w:t>
+      </w:r>
+    </w:p>
+    <w:p>
+      <w:pPr>
+        <w:pStyle w:val="ListParagraph"/>
+        <w:numPr>
+          <w:ilvl w:val="0"/>
+          <w:numId w:val="41"/>
+        </w:numPr>
+        <w:rPr/>
+      </w:pPr>
+      <w:r>
+        <w:rPr/>
+        <w:t>2</w:t>
+      </w:r>
+      <w:r>
+        <w:rPr/>
+        <w:t>8</w:t>
+      </w:r>
+      <w:r>
+        <w:rPr/>
+        <w:t>. Heb ik mijn antwoorden getest voordat ik JW spreek?</w:t>
+      </w:r>
+    </w:p>
+    <w:p>
+      <w:pPr>
+        <w:pStyle w:val="Heading1"/>
+      </w:pPr>
+      <w:r>
+        <w:rPr/>
         <w:t xml:space="preserve">🔬 314. Stop timer (4 min)</w:t>
       </w:r>
       <w:r/>
@@ -1814,11 +2260,44 @@
         <w:pStyle w:val="ListParagraph"/>
         <w:numPr>
           <w:ilvl w:val="0"/>
-          <w:numId w:val="31"/>
-        </w:numPr>
-        <w:rPr/>
-      </w:pPr>
-      <w:ins w:author="Rinse Cramer" w:date="2025-11-24T23:55:00Z" w16du:dateUtc="2025-11-24T22:55:00Z" w:id="2124781499">
+          <w:numId w:val="41"/>
+        </w:numPr>
+        <w:rPr/>
+      </w:pPr>
+      <w:r>
+        <w:rPr/>
+        <w:t>29</w:t>
+      </w:r>
+      <w:r>
+        <w:rPr/>
+        <w:t>. Pauze &gt; Opnieuw instellen &gt; Terug naar volledige weergave</w:t>
+      </w:r>
+    </w:p>
+    <w:p>
+      <w:pPr>
+        <w:pStyle w:val="ListParagraph"/>
+        <w:numPr>
+          <w:ilvl w:val="0"/>
+          <w:numId w:val="41"/>
+        </w:numPr>
+        <w:rPr>
+          <w:ins w:author="Rinse Cramer" w:date="2025-11-24T23:55:00Z" w16du:dateUtc="2025-11-24T22:55:00Z" w:id="2108463928"/>
+        </w:rPr>
+      </w:pPr>
+      <w:r>
+        <w:rPr/>
+        <w:t>30</w:t>
+      </w:r>
+      <w:r>
+        <w:rPr/>
+        <w:t>. Klok minimaliseren</w:t>
+      </w:r>
+    </w:p>
+    <w:p>
+      <w:pPr>
+        <w:pStyle w:val="Heading1"/>
+      </w:pPr>
+      <w:ins w:author="Rinse Cramer" w:date="2025-11-24T23:55:00Z" w16du:dateUtc="2025-11-24T22:55:00Z" w:id="1973591740">
         <w:r>
           <w:t>🔬 315. Significant inzicht gekregen</w:t>
         </w:r>
@@ -2415,538 +2894,852 @@
     </w:p>
     <w:p>
       <w:pPr>
+        <w:pStyle w:val="ListParagraph"/>
+        <w:keepNext w:val="1"/>
+        <w:numPr>
+          <w:ilvl w:val="0"/>
+          <w:numId w:val="15"/>
+        </w:numPr>
+        <w:spacing w:after="0" w:line="240" w:lineRule="auto"/>
+        <w:rPr/>
+      </w:pPr>
+      <w:r>
+        <w:rPr/>
+        <w:t>1. Jira-uitvoerder is medewerker</w:t>
+      </w:r>
+    </w:p>
+    <w:p>
+      <w:pPr>
+        <w:pStyle w:val="ListParagraph"/>
+        <w:numPr>
+          <w:ilvl w:val="0"/>
+          <w:numId w:val="15"/>
+        </w:numPr>
+        <w:rPr/>
+      </w:pPr>
+      <w:r>
+        <w:rPr/>
+        <w:t xml:space="preserve">2. </w:t>
+      </w:r>
+      <w:r>
+        <w:rPr/>
+        <w:t>Jira</w:t>
+      </w:r>
+      <w:r>
+        <w:rPr/>
+        <w:t>-status is Review analyse</w:t>
+      </w:r>
+    </w:p>
+    <w:p>
+      <w:pPr>
+        <w:pStyle w:val="ListParagraph"/>
+        <w:numPr>
+          <w:ilvl w:val="0"/>
+          <w:numId w:val="15"/>
+        </w:numPr>
+        <w:rPr/>
+      </w:pPr>
+      <w:r>
+        <w:rPr/>
+        <w:t xml:space="preserve">3. </w:t>
+      </w:r>
+      <w:r>
+        <w:rPr/>
+        <w:t>Jira</w:t>
+      </w:r>
+      <w:r>
+        <w:rPr/>
+        <w:t>-status wordt Ontwerp</w:t>
+      </w:r>
+    </w:p>
+    <w:p>
+      <w:pPr>
+        <w:pStyle w:val="Normal"/>
+        <w:ind w:left="0"/>
+      </w:pPr>
+      <w:del w:author="Rinse Cramer" w:date="2025-11-24T23:54:00Z" w16du:dateUtc="2025-11-24T22:54:00Z" w:id="850610966">
+        <w:r>
+          <w:rPr>
+            <w:rStyle w:val="Heading1Char"/>
+          </w:rPr>
+          <w:delText xml:space="preserve">H. </w:delText>
+        </w:r>
+        <w:r>
+          <w:rPr>
+            <w:rStyle w:val="Heading1Char"/>
+          </w:rPr>
+          <w:delText>Verwachte effort schatting afgestemd?</w:delText>
+        </w:r>
+      </w:del>
+      <w:r>
+        <w:rPr>
+          <w:rStyle w:val="Heading1Char"/>
+        </w:rPr>
+        <w:t xml:space="preserve">✏️ 502. </w:t>
+      </w:r>
+      <w:r>
+        <w:rPr>
+          <w:rStyle w:val="Heading1Char"/>
+        </w:rPr>
+        <w:t xml:space="preserve">Start timer</w:t>
+      </w:r>
+      <w:r>
+        <w:rPr>
+          <w:rStyle w:val="Heading1Char"/>
+        </w:rPr>
+        <w:t xml:space="preserve"> (ETC)</w:t>
+      </w:r>
+    </w:p>
+    <w:p>
+      <w:pPr>
+        <w:pStyle w:val="ListParagraph"/>
+        <w:numPr>
+          <w:ilvl w:val="0"/>
+          <w:numId w:val="41"/>
+        </w:numPr>
+        <w:rPr/>
+      </w:pPr>
+      <w:r>
+        <w:rPr/>
+        <w:t>4. Start &gt; Klok &gt; menu &gt; Timer</w:t>
+      </w:r>
+    </w:p>
+    <w:p>
+      <w:pPr>
+        <w:pStyle w:val="ListParagraph"/>
+        <w:numPr>
+          <w:ilvl w:val="0"/>
+          <w:numId w:val="41"/>
+        </w:numPr>
+        <w:rPr/>
+      </w:pPr>
+      <w:r>
+        <w:rPr/>
+        <w:t>5. Effort tijd instellen &gt; Start &gt; Op voorgrond behouden</w:t>
+      </w:r>
+    </w:p>
+    <w:p>
+      <w:pPr>
+        <w:pStyle w:val="ListParagraph"/>
+        <w:numPr>
+          <w:ilvl w:val="0"/>
+          <w:numId w:val="41"/>
+        </w:numPr>
+        <w:rPr/>
+      </w:pPr>
+      <w:r>
+        <w:rPr/>
+        <w:t xml:space="preserve">6. </w:t>
+      </w:r>
+      <w:r>
+        <w:rPr/>
+        <w:t>Jira</w:t>
+      </w:r>
+      <w:r>
+        <w:rPr/>
+        <w:t>-stopwatch wordt gestart</w:t>
+      </w:r>
+    </w:p>
+    <w:p>
+      <w:pPr>
+        <w:pStyle w:val="Normal"/>
+        <w:ind w:left="0"/>
+        <w:rPr>
+          <w:rStyle w:val="Heading1Char"/>
+        </w:rPr>
+      </w:pPr>
+      <w:del w:author="Rinse Cramer" w:date="2025-11-10T23:01:00Z" w16du:dateUtc="2025-11-10T22:01:00Z" w:id="1546328192">
+        <w:r>
+          <w:rPr>
+            <w:rStyle w:val="Heading1Char"/>
+          </w:rPr>
+          <w:delText xml:space="preserve">. </w:delText>
+        </w:r>
+        <w:r>
+          <w:rPr>
+            <w:rStyle w:val="Heading1Char"/>
+          </w:rPr>
+          <w:delText>Referentie bepaald</w:delText>
+        </w:r>
+      </w:del>
+      <w:ins w:author="Rinse Cramer" w:date="2025-11-10T23:01:00Z" w16du:dateUtc="2025-11-10T22:01:00Z" w:id="264584487">
+        <w:r>
+          <w:rPr>
+            <w:rStyle w:val="Heading1Char"/>
+          </w:rPr>
+          <w:t>✏️ 503. Analyse verwerken</w:t>
+        </w:r>
+      </w:ins>
+    </w:p>
+    <w:p>
+      <w:pPr>
+        <w:pStyle w:val="Normal"/>
+        <w:ind w:left="0"/>
+        <w:rPr>
+          <w:rStyle w:val="Heading1Char"/>
+        </w:rPr>
+      </w:pPr>
+      <w:ins w:author="Rinse Cramer" w:date="2025-11-10T23:01:00Z" w16du:dateUtc="2025-11-10T22:01:00Z" w:id="1438032993">
+        <w:r>
+          <w:rPr>
+            <w:rStyle w:val="Heading1Char"/>
+          </w:rPr>
+          <w:t>✏️ 504. Oplossing ontwerpen</w:t>
+        </w:r>
+      </w:ins>
+    </w:p>
+    <w:p>
+      <w:pPr>
+        <w:pStyle w:val="ListParagraph"/>
+        <w:numPr>
+          <w:ilvl w:val="0"/>
+          <w:numId w:val="42"/>
+        </w:numPr>
+        <w:rPr/>
+      </w:pPr>
+      <w:r>
+        <w:rPr/>
+        <w:t>7. Concept gekozen, eventueel met pseudocode of direct implementatie</w:t>
+      </w:r>
+    </w:p>
+    <w:p>
+      <w:pPr>
+        <w:pStyle w:val="ListParagraph"/>
+        <w:numPr>
+          <w:ilvl w:val="0"/>
+          <w:numId w:val="42"/>
+        </w:numPr>
+        <w:rPr/>
+      </w:pPr>
+      <w:r>
+        <w:rPr/>
+        <w:t>8. Implementatie van het gekozen template (op de kop af?)</w:t>
+      </w:r>
+    </w:p>
+    <w:p>
+      <w:pPr>
+        <w:pStyle w:val="ListParagraph"/>
+        <w:numPr>
+          <w:ilvl w:val="0"/>
+          <w:numId w:val="42"/>
+        </w:numPr>
+        <w:rPr/>
+      </w:pPr>
+      <w:r>
+        <w:rPr/>
+        <w:t>9. Confidence level vastgesteld</w:t>
+      </w:r>
+    </w:p>
+    <w:p>
+      <w:pPr>
+        <w:pStyle w:val="ListParagraph"/>
+        <w:numPr>
+          <w:ilvl w:val="0"/>
+          <w:numId w:val="42"/>
+        </w:numPr>
+        <w:rPr/>
+      </w:pPr>
+      <w:r>
+        <w:rPr/>
+        <w:t>10. Is de pseudocode juist?</w:t>
+      </w:r>
+    </w:p>
+    <w:p>
+      <w:pPr>
+        <w:pStyle w:val="ListParagraph"/>
+        <w:numPr>
+          <w:ilvl w:val="0"/>
+          <w:numId w:val="42"/>
+        </w:numPr>
+        <w:rPr/>
+      </w:pPr>
+      <w:r>
+        <w:rPr/>
+        <w:t>11. Zit alles op de juiste plek? Zo niet, bespreken en terug!</w:t>
+      </w:r>
+    </w:p>
+    <w:p>
+      <w:pPr>
+        <w:pStyle w:val="Normal"/>
+        <w:ind w:left="0"/>
+        <w:rPr>
+          <w:rStyle w:val="Heading1Char"/>
+        </w:rPr>
+      </w:pPr>
+      <w:del w:author="Rinse Cramer" w:date="2025-11-10T23:01:00Z" w16du:dateUtc="2025-11-10T22:01:00Z" w:id="1755855884">
+        <w:r>
+          <w:rPr>
+            <w:rStyle w:val="Heading1Char"/>
+          </w:rPr>
+          <w:delText>D</w:delText>
+        </w:r>
+      </w:del>
+      <w:ins w:author="Rinse Cramer" w:date="2025-11-10T23:01:00Z" w16du:dateUtc="2025-11-10T22:01:00Z" w:id="2131490136">
+        <w:r>
+          <w:rPr>
+            <w:rStyle w:val="Heading1Char"/>
+          </w:rPr>
+          <w:t>✏️ 505. Evalueer of de deliverables correct en volledig zijn afgerond</w:t>
+        </w:r>
+      </w:ins>
+    </w:p>
+    <w:p>
+      <w:pPr>
+        <w:pStyle w:val="Normal"/>
+        <w:ind w:left="0"/>
+        <w:rPr>
+          <w:rStyle w:val="Heading1Char"/>
+        </w:rPr>
+      </w:pPr>
+      <w:del w:author="Rinse Cramer" w:date="2025-11-10T23:01:00Z" w16du:dateUtc="2025-11-10T22:01:00Z" w:id="1140074101">
+        <w:r>
+          <w:rPr>
+            <w:rStyle w:val="Heading1Char"/>
+          </w:rPr>
+          <w:delText>E</w:delText>
+        </w:r>
+      </w:del>
+      <w:ins w:author="Rinse Cramer" w:date="2025-11-10T23:01:00Z" w16du:dateUtc="2025-11-10T22:01:00Z" w:id="398147024">
+        <w:r>
+          <w:rPr>
+            <w:rStyle w:val="Heading1Char"/>
+          </w:rPr>
+          <w:t>✏️ 506. Stop timer (ETC)</w:t>
+        </w:r>
+      </w:ins>
+    </w:p>
+    <w:p>
+      <w:pPr>
+        <w:pStyle w:val="ListParagraph"/>
+        <w:numPr>
+          <w:ilvl w:val="0"/>
+          <w:numId w:val="41"/>
+        </w:numPr>
+        <w:rPr/>
+      </w:pPr>
+      <w:r>
+        <w:rPr/>
+        <w:t>12. Pauze &gt; Opnieuw instellen &gt; Terug naar volledige weergave</w:t>
+      </w:r>
+    </w:p>
+    <w:p>
+      <w:pPr>
+        <w:pStyle w:val="ListParagraph"/>
+        <w:numPr>
+          <w:ilvl w:val="0"/>
+          <w:numId w:val="41"/>
+        </w:numPr>
+        <w:rPr/>
+      </w:pPr>
+      <w:r>
+        <w:rPr/>
+        <w:t>13. Klok minimaliseren</w:t>
+      </w:r>
+    </w:p>
+    <w:p>
+      <w:pPr>
+        <w:pStyle w:val="Normal"/>
+        <w:ind w:left="0"/>
+        <w:rPr>
+          <w:rStyle w:val="Heading1Char"/>
+        </w:rPr>
+      </w:pPr>
+      <w:del w:author="Rinse Cramer" w:date="2025-11-10T23:01:00Z" w16du:dateUtc="2025-11-10T22:01:00Z" w:id="1583005125">
+        <w:r>
+          <w:rPr>
+            <w:rStyle w:val="Heading1Char"/>
+          </w:rPr>
+          <w:delText>F</w:delText>
+        </w:r>
+      </w:del>
+      <w:del w:author="Rinse Cramer" w:date="2025-11-07T18:08:00Z" w16du:dateUtc="2025-11-07T17:08:00Z" w:id="410937101">
+        <w:r>
+          <w:rPr>
+            <w:rStyle w:val="Heading1Char"/>
+          </w:rPr>
+          <w:delText>G</w:delText>
+        </w:r>
+        <w:r>
+          <w:rPr>
+            <w:rStyle w:val="Heading1Char"/>
+          </w:rPr>
+          <w:delText xml:space="preserve">. </w:delText>
+        </w:r>
+        <w:r>
+          <w:rPr>
+            <w:rStyle w:val="Heading1Char"/>
+          </w:rPr>
+          <w:delText>Actiepunten uit Excel verwerkt en Jira geüpdated</w:delText>
+        </w:r>
+      </w:del>
+      <w:r>
+        <w:rPr>
+          <w:rStyle w:val="Heading1Char"/>
+        </w:rPr>
+        <w:t>✏️ 507. Bijzonderheden gezien?</w:t>
+      </w:r>
+    </w:p>
+    <w:p>
+      <w:pPr>
+        <w:pStyle w:val="ListParagraph"/>
+        <w:numPr>
+          <w:ilvl w:val="0"/>
+          <w:numId w:val="41"/>
+        </w:numPr>
+        <w:rPr/>
+      </w:pPr>
+      <w:r>
+        <w:rPr/>
+        <w:t>14. Ik heb de bijzonderheden geschreven</w:t>
+      </w:r>
+    </w:p>
+    <w:p>
+      <w:pPr>
+        <w:pStyle w:val="Normal"/>
+        <w:ind w:left="0"/>
+        <w:rPr>
+          <w:rStyle w:val="Heading1Char"/>
+        </w:rPr>
+      </w:pPr>
+      <w:r>
+        <w:rPr>
+          <w:rStyle w:val="Heading1Char"/>
+        </w:rPr>
+        <w:t xml:space="preserve">✏ 507F. Volg de </w:t>
+      </w:r>
+      <w:r>
+        <w:rPr>
+          <w:rStyle w:val="Heading1Char"/>
+        </w:rPr>
+        <w:t>meldplicht</w:t>
+      </w:r>
+    </w:p>
+    <w:p>
+      <w:pPr>
+        <w:pStyle w:val="ListParagraph"/>
+        <w:numPr>
+          <w:ilvl w:val="0"/>
+          <w:numId w:val="41"/>
+        </w:numPr>
+        <w:rPr/>
+      </w:pPr>
+      <w:r>
+        <w:rPr/>
+        <w:t>15. Naar flowchartpagina van meldplicht navigeren</w:t>
+      </w:r>
+    </w:p>
+    <w:p>
+      <w:pPr>
+        <w:pStyle w:val="Normal"/>
+        <w:ind w:left="0"/>
+        <w:rPr>
+          <w:rStyle w:val="Heading1Char"/>
+          <w:highlight w:val="yellow"/>
+        </w:rPr>
+        <w:rPr/>
+      </w:pPr>
+      <w:r>
+        <w:rPr>
+          <w:rStyle w:val="Heading1Char"/>
+        </w:rPr>
+        <w:t xml:space="preserve">✏ 507T. Volg de </w:t>
+      </w:r>
+      <w:r>
+        <w:rPr>
+          <w:rStyle w:val="Heading1Char"/>
+        </w:rPr>
+        <w:t>review ontwerp</w:t>
+      </w:r>
+    </w:p>
+    <w:p>
+      <w:pPr>
+        <w:pStyle w:val="ListParagraph"/>
+        <w:numPr>
+          <w:ilvl w:val="0"/>
+          <w:numId w:val="41"/>
+        </w:numPr>
+        <w:rPr/>
+      </w:pPr>
+      <w:r>
+        <w:rPr>
+          <w:lang w:val="en-US"/>
+        </w:rPr>
+        <w:t xml:space="preserve">16. </w:t>
+      </w:r>
+      <w:r>
+        <w:rPr/>
+        <w:t>Naar volgende flowchartpagina navigeren</w:t>
+      </w:r>
+      <w:r/>
+    </w:p>
+    <w:p>
+      <w:pPr>
+        <w:pStyle w:val="Normal"/>
+        <w:ind w:left="0"/>
+        <w:rPr>
+          <w:rStyle w:val="Heading1Char"/>
+        </w:rPr>
+        <w:rPr/>
+      </w:pPr>
+      <w:r>
+        <w:rPr>
+          <w:rStyle w:val="Heading1Char"/>
+        </w:rPr>
+        <w:t>✏️ 508. Na 2/3 ETC Na 100% ETC Na 150% ETC</w:t>
+      </w:r>
+    </w:p>
+    <w:p>
+      <w:pPr>
         <w:pStyle w:val="Heading1"/>
         <w:rPr>
-          <w:del w:author="Rinse Cramer" w:date="2025-11-24T23:54:00Z" w16du:dateUtc="2025-11-24T22:54:00Z" w:id="306"/>
-        </w:rPr>
-      </w:pPr>
-      <w:del w:author="Rinse Cramer" w:date="2025-11-24T23:54:00Z" w16du:dateUtc="2025-11-24T22:54:00Z" w:id="307">
-        <w:r>
-          <w:rPr>
-            <w:rFonts w:ascii="Segoe UI Emoji" w:hAnsi="Segoe UI Emoji" w:cs="Segoe UI Emoji"/>
-          </w:rPr>
-          <w:delText>🫱🏻</w:delText>
-        </w:r>
-        <w:r>
-          <w:delText>‍</w:delText>
-        </w:r>
-        <w:r>
-          <w:rPr>
-            <w:rFonts w:ascii="Segoe UI Emoji" w:hAnsi="Segoe UI Emoji" w:cs="Segoe UI Emoji"/>
-          </w:rPr>
-          <w:delText>🫲🏻</w:delText>
-        </w:r>
-        <w:r>
-          <w:delText xml:space="preserve"> Review Analyse</w:delText>
+          <w:rStyle w:val="Heading1Char"/>
+        </w:rPr>
+      </w:pPr>
+      <w:del w:author="Rinse Cramer" w:date="2025-11-07T18:09:00Z" w16du:dateUtc="2025-11-07T17:09:00Z" w:id="872063031">
+        <w:r>
+          <w:delText>H</w:delText>
         </w:r>
       </w:del>
+      <w:r>
+        <w:rPr/>
+        <w:t xml:space="preserve">✏️ 509. </w:t>
+      </w:r>
+      <w:r>
+        <w:rPr/>
+        <w:t xml:space="preserve">Start timer</w:t>
+      </w:r>
+      <w:r>
+        <w:rPr/>
+        <w:t xml:space="preserve"> (1 min)</w:t>
+      </w:r>
+    </w:p>
+    <w:p>
+      <w:pPr>
+        <w:pStyle w:val="ListParagraph"/>
+        <w:numPr>
+          <w:ilvl w:val="0"/>
+          <w:numId w:val="41"/>
+        </w:numPr>
+        <w:rPr/>
+      </w:pPr>
+      <w:r>
+        <w:rPr/>
+        <w:t>17. Start &gt; Klok &gt; menu &gt; Timer</w:t>
+      </w:r>
+    </w:p>
+    <w:p>
+      <w:pPr>
+        <w:pStyle w:val="ListParagraph"/>
+        <w:numPr>
+          <w:ilvl w:val="0"/>
+          <w:numId w:val="41"/>
+        </w:numPr>
+        <w:rPr/>
+      </w:pPr>
+      <w:r>
+        <w:rPr/>
+        <w:t>18. Effort tijd instellen &gt; Start &gt; Op voorgrond behouden</w:t>
+      </w:r>
+    </w:p>
+    <w:p>
+      <w:pPr>
+        <w:pStyle w:val="ListParagraph"/>
+        <w:numPr>
+          <w:ilvl w:val="0"/>
+          <w:numId w:val="41"/>
+        </w:numPr>
+        <w:rPr/>
+      </w:pPr>
+      <w:r>
+        <w:rPr/>
+        <w:t xml:space="preserve">19. </w:t>
+      </w:r>
+      <w:r>
+        <w:rPr/>
+        <w:t>Jira</w:t>
+      </w:r>
+      <w:r>
+        <w:rPr/>
+        <w:t>-stopwatch wordt gestart</w:t>
+      </w:r>
+      <w:r/>
+    </w:p>
+    <w:p>
+      <w:pPr>
+        <w:pStyle w:val="Normal"/>
+        <w:ind w:left="0"/>
+        <w:rPr>
+          <w:rStyle w:val="Heading1Char"/>
+        </w:rPr>
+        <w:rPr/>
+      </w:pPr>
+      <w:r>
+        <w:rPr>
+          <w:rStyle w:val="Heading1Char"/>
+        </w:rPr>
+        <w:t xml:space="preserve">✏️ 510. Hoe lang denk je nog nodig te hebben?</w:t>
+      </w:r>
+    </w:p>
+    <w:p>
+      <w:pPr>
+        <w:pStyle w:val="ListParagraph"/>
+        <w:numPr>
+          <w:ilvl w:val="0"/>
+          <w:numId w:val="41"/>
+        </w:numPr>
+        <w:rPr/>
+      </w:pPr>
+      <w:r>
+        <w:rPr/>
+        <w:t>20. Hoe lang denk je nog nodig te hebben?</w:t>
+      </w:r>
+    </w:p>
+    <w:p>
+      <w:pPr>
+        <w:pStyle w:val="ListParagraph"/>
+        <w:numPr>
+          <w:ilvl w:val="0"/>
+          <w:numId w:val="41"/>
+        </w:numPr>
+        <w:rPr/>
+      </w:pPr>
+      <w:r>
+        <w:rPr/>
+        <w:t>21. Past het binnen de 150%? Tijdtrigger gehaald?</w:t>
+      </w:r>
     </w:p>
     <w:p>
       <w:pPr>
         <w:pStyle w:val="Heading1"/>
         <w:rPr>
-          <w:del w:author="Rinse Cramer" w:date="2025-11-24T23:54:00Z" w16du:dateUtc="2025-11-24T22:54:00Z" w:id="308"/>
-        </w:rPr>
-        <w:pPrChange w:author="Rinse Cramer" w:date="2025-11-24T23:54:00Z" w16du:dateUtc="2025-11-24T22:54:00Z" w:id="309">
-          <w:pPr>
-            <w:pStyle w:val="ListParagraph"/>
-            <w:numPr>
-              <w:numId w:val="32"/>
-            </w:numPr>
-            <w:ind w:hanging="360"/>
-          </w:pPr>
-        </w:pPrChange>
-      </w:pPr>
-      <w:del w:author="Rinse Cramer" w:date="2025-11-24T23:54:00Z" w16du:dateUtc="2025-11-24T22:54:00Z" w:id="310">
-        <w:r>
-          <w:delText xml:space="preserve">A. </w:delText>
-        </w:r>
-        <w:r>
-          <w:delText>Waarom heeft de opdrachtgever deze keuze gemaakt?</w:delText>
+          <w:rStyle w:val="Heading1Char"/>
+        </w:rPr>
+      </w:pPr>
+      <w:r>
+        <w:rPr/>
+        <w:t xml:space="preserve">✏️ 512. </w:t>
+      </w:r>
+      <w:r>
+        <w:rPr/>
+        <w:t>Haal ik het?</w:t>
+      </w:r>
+    </w:p>
+    <w:p>
+      <w:pPr>
+        <w:pStyle w:val="Heading1"/>
+        <w:rPr>
+          <w:rStyle w:val="Heading1Char"/>
+        </w:rPr>
+      </w:pPr>
+      <w:del w:author="Rinse Cramer" w:date="2025-11-07T18:09:00Z" w16du:dateUtc="2025-11-07T17:09:00Z" w:id="106546911">
+        <w:r>
+          <w:delText>I</w:delText>
         </w:r>
       </w:del>
+      <w:r>
+        <w:rPr/>
+        <w:t>✏️ 512F. Stop timer (1 min) Start timer (4 min)</w:t>
+      </w:r>
+    </w:p>
+    <w:p>
+      <w:pPr>
+        <w:pStyle w:val="ListParagraph"/>
+        <w:numPr>
+          <w:ilvl w:val="0"/>
+          <w:numId w:val="41"/>
+        </w:numPr>
+        <w:rPr/>
+      </w:pPr>
+      <w:r>
+        <w:rPr/>
+        <w:t>22. Pauze &gt; Opnieuw instellen &gt; Terug naar volledige weergave</w:t>
+      </w:r>
+    </w:p>
+    <w:p>
+      <w:pPr>
+        <w:pStyle w:val="ListParagraph"/>
+        <w:numPr>
+          <w:ilvl w:val="0"/>
+          <w:numId w:val="41"/>
+        </w:numPr>
+        <w:rPr/>
+      </w:pPr>
+      <w:r>
+        <w:rPr/>
+        <w:t>23. Effort tijd instellen &gt; Start &gt; Op voorgrond behouden</w:t>
+      </w:r>
+    </w:p>
+    <w:p>
+      <w:pPr>
+        <w:pStyle w:val="ListParagraph"/>
+        <w:numPr>
+          <w:ilvl w:val="0"/>
+          <w:numId w:val="41"/>
+        </w:numPr>
+        <w:rPr/>
+      </w:pPr>
+      <w:r>
+        <w:rPr/>
+        <w:t xml:space="preserve">24. </w:t>
+      </w:r>
+      <w:r>
+        <w:rPr/>
+        <w:t>Jira</w:t>
+      </w:r>
+      <w:r>
+        <w:rPr/>
+        <w:t>-stopwatch wordt gestart</w:t>
+      </w:r>
+      <w:r/>
     </w:p>
     <w:p>
       <w:pPr>
         <w:pStyle w:val="Heading1"/>
         <w:rPr>
-          <w:del w:author="Rinse Cramer" w:date="2025-11-24T23:54:00Z" w16du:dateUtc="2025-11-24T22:54:00Z" w:id="311"/>
-        </w:rPr>
-        <w:pPrChange w:author="Rinse Cramer" w:date="2025-11-24T23:54:00Z" w16du:dateUtc="2025-11-24T22:54:00Z" w:id="312">
-          <w:pPr>
-            <w:pStyle w:val="ListParagraph"/>
-            <w:numPr>
-              <w:numId w:val="32"/>
-            </w:numPr>
-            <w:ind w:hanging="360"/>
-          </w:pPr>
-        </w:pPrChange>
-      </w:pPr>
-      <w:del w:author="Rinse Cramer" w:date="2025-11-24T23:54:00Z" w16du:dateUtc="2025-11-24T22:54:00Z" w:id="313">
-        <w:r>
-          <w:delText xml:space="preserve">B. </w:delText>
-        </w:r>
-        <w:r>
-          <w:delText>Waarom is dit nodig?</w:delText>
-        </w:r>
-      </w:del>
-    </w:p>
-    <w:p>
-      <w:pPr>
-        <w:pStyle w:val="Heading1"/>
-        <w:rPr>
-          <w:del w:author="Rinse Cramer" w:date="2025-11-24T23:54:00Z" w16du:dateUtc="2025-11-24T22:54:00Z" w:id="314"/>
-        </w:rPr>
-        <w:pPrChange w:author="Rinse Cramer" w:date="2025-11-24T23:54:00Z" w16du:dateUtc="2025-11-24T22:54:00Z" w:id="315">
-          <w:pPr>
-            <w:pStyle w:val="ListParagraph"/>
-            <w:numPr>
-              <w:numId w:val="32"/>
-            </w:numPr>
-            <w:ind w:hanging="360"/>
-          </w:pPr>
-        </w:pPrChange>
-      </w:pPr>
-      <w:del w:author="Rinse Cramer" w:date="2025-11-24T23:54:00Z" w16du:dateUtc="2025-11-24T22:54:00Z" w:id="316">
-        <w:r>
-          <w:delText xml:space="preserve">C. </w:delText>
-        </w:r>
-        <w:r>
-          <w:delText>Hoe werkt het?</w:delText>
-        </w:r>
-      </w:del>
-    </w:p>
-    <w:p>
-      <w:pPr>
-        <w:pStyle w:val="Heading1"/>
-        <w:rPr>
-          <w:del w:author="Rinse Cramer" w:date="2025-11-24T23:54:00Z" w16du:dateUtc="2025-11-24T22:54:00Z" w:id="317"/>
-        </w:rPr>
-        <w:pPrChange w:author="Rinse Cramer" w:date="2025-11-24T23:54:00Z" w16du:dateUtc="2025-11-24T22:54:00Z" w:id="318">
-          <w:pPr>
-            <w:pStyle w:val="ListParagraph"/>
-            <w:numPr>
-              <w:numId w:val="32"/>
-            </w:numPr>
-            <w:ind w:hanging="360"/>
-          </w:pPr>
-        </w:pPrChange>
-      </w:pPr>
-      <w:del w:author="Rinse Cramer" w:date="2025-11-24T23:54:00Z" w16du:dateUtc="2025-11-24T22:54:00Z" w:id="319">
-        <w:r>
-          <w:delText xml:space="preserve">D. </w:delText>
-        </w:r>
-        <w:r>
-          <w:delText>Zijn de requirements opgeschreven?</w:delText>
-        </w:r>
-      </w:del>
-    </w:p>
-    <w:p>
-      <w:pPr>
-        <w:pStyle w:val="Heading1"/>
-        <w:rPr>
-          <w:del w:author="Rinse Cramer" w:date="2025-11-24T23:54:00Z" w16du:dateUtc="2025-11-24T22:54:00Z" w:id="320"/>
-        </w:rPr>
-        <w:pPrChange w:author="Rinse Cramer" w:date="2025-11-24T23:54:00Z" w16du:dateUtc="2025-11-24T22:54:00Z" w:id="321">
-          <w:pPr>
-            <w:pStyle w:val="ListParagraph"/>
-            <w:numPr>
-              <w:numId w:val="32"/>
-            </w:numPr>
-            <w:ind w:hanging="360"/>
-          </w:pPr>
-        </w:pPrChange>
-      </w:pPr>
-      <w:del w:author="Rinse Cramer" w:date="2025-11-24T23:54:00Z" w16du:dateUtc="2025-11-24T22:54:00Z" w:id="322">
-        <w:r>
-          <w:delText xml:space="preserve">E. </w:delText>
-        </w:r>
-        <w:r>
-          <w:delText>Bijzondere afhandelingen voor oudere systemen genoteerd?</w:delText>
-        </w:r>
-      </w:del>
-    </w:p>
-    <w:p>
-      <w:pPr>
-        <w:pStyle w:val="Heading1"/>
-        <w:rPr>
-          <w:del w:author="Rinse Cramer" w:date="2025-11-24T23:54:00Z" w16du:dateUtc="2025-11-24T22:54:00Z" w:id="323"/>
-        </w:rPr>
-        <w:pPrChange w:author="Rinse Cramer" w:date="2025-11-24T23:54:00Z" w16du:dateUtc="2025-11-24T22:54:00Z" w:id="324">
-          <w:pPr>
-            <w:pStyle w:val="ListParagraph"/>
-            <w:numPr>
-              <w:numId w:val="32"/>
-            </w:numPr>
-            <w:ind w:hanging="360"/>
-          </w:pPr>
-        </w:pPrChange>
-      </w:pPr>
-      <w:del w:author="Rinse Cramer" w:date="2025-11-24T23:54:00Z" w16du:dateUtc="2025-11-24T22:54:00Z" w:id="325">
-        <w:r>
-          <w:delText xml:space="preserve">F. </w:delText>
-        </w:r>
-        <w:r>
-          <w:delText>Is de implementatie altijd zo geweest?</w:delText>
-        </w:r>
-      </w:del>
-    </w:p>
-    <w:p>
-      <w:pPr>
-        <w:pStyle w:val="Heading1"/>
-        <w:rPr>
-          <w:del w:author="Rinse Cramer" w:date="2025-11-24T23:54:00Z" w16du:dateUtc="2025-11-24T22:54:00Z" w:id="326"/>
-        </w:rPr>
-        <w:pPrChange w:author="Rinse Cramer" w:date="2025-11-24T23:54:00Z" w16du:dateUtc="2025-11-24T22:54:00Z" w:id="327">
-          <w:pPr>
-            <w:pStyle w:val="ListParagraph"/>
-            <w:numPr>
-              <w:numId w:val="32"/>
-            </w:numPr>
-            <w:ind w:hanging="360"/>
-          </w:pPr>
-        </w:pPrChange>
-      </w:pPr>
-      <w:del w:author="Rinse Cramer" w:date="2025-11-24T23:54:00Z" w16du:dateUtc="2025-11-24T22:54:00Z" w:id="328">
-        <w:r>
-          <w:delText xml:space="preserve">G. </w:delText>
-        </w:r>
-        <w:r>
-          <w:delText>Is dit de meest eenvoudige oplossing?</w:delText>
-        </w:r>
-      </w:del>
-    </w:p>
-    <w:p>
-      <w:pPr>
-        <w:pStyle w:val="Heading1"/>
-        <w:rPr>
-          <w:del w:author="Rinse Cramer" w:date="2025-11-04T23:08:00Z" w16du:dateUtc="2025-11-04T22:08:00Z" w:id="329"/>
-        </w:rPr>
-        <w:pPrChange w:author="Rinse Cramer" w:date="2025-11-24T23:54:00Z" w16du:dateUtc="2025-11-24T22:54:00Z" w:id="330">
-          <w:pPr>
-            <w:pStyle w:val="ListParagraph"/>
-            <w:numPr>
-              <w:numId w:val="32"/>
-            </w:numPr>
-            <w:ind w:hanging="360"/>
-          </w:pPr>
-        </w:pPrChange>
-      </w:pPr>
-      <w:del w:author="Rinse Cramer" w:date="2025-11-24T23:54:00Z" w16du:dateUtc="2025-11-24T22:54:00Z" w:id="1697751689">
-        <w:r>
-          <w:delText xml:space="preserve">H. </w:delText>
-        </w:r>
-        <w:r>
-          <w:delText>Verwachte effort schatting afgestemd?</w:delText>
-        </w:r>
-      </w:del>
-    </w:p>
-    <w:p>
-      <w:pPr>
-        <w:pStyle w:val="ListParagraph"/>
-        <w:numPr>
-          <w:ilvl w:val="0"/>
-          <w:numId w:val="33"/>
-        </w:numPr>
-        <w:pPrChange w:author="Rinse Cramer" w:date="2025-11-10T23:01:00Z" w16du:dateUtc="2025-11-10T22:01:00Z" w:id="333">
-          <w:pPr>
-            <w:pStyle w:val="ListParagraph"/>
-            <w:numPr>
-              <w:numId w:val="33"/>
-            </w:numPr>
-            <w:ind w:hanging="360"/>
-          </w:pPr>
-        </w:pPrChange>
-      </w:pPr>
-      <w:r>
-        <w:t xml:space="preserve">✏️ 502. Start timer (ETC)</w:t>
-      </w:r>
-      <w:r/>
-      <w:del w:author="Rinse Cramer" w:date="2025-11-10T23:01:00Z" w16du:dateUtc="2025-11-10T22:01:00Z" w:id="334">
-        <w:r>
-          <w:delText xml:space="preserve">B. </w:delText>
-        </w:r>
-        <w:r>
-          <w:delText>Referentie bepaald</w:delText>
-        </w:r>
-      </w:del>
-    </w:p>
-    <w:p>
-      <w:pPr>
-        <w:pStyle w:val="ListParagraph"/>
-        <w:numPr>
-          <w:ilvl w:val="0"/>
-          <w:numId w:val="33"/>
-        </w:numPr>
-      </w:pPr>
-      <w:ins w:author="Rinse Cramer" w:date="2025-11-10T23:01:00Z" w16du:dateUtc="2025-11-10T22:01:00Z" w:id="335">
-        <w:r>
-          <w:t>✏️ 503. Analyse verwerken</w:t>
-        </w:r>
-      </w:ins>
-      <w:del w:author="Rinse Cramer" w:date="2025-11-10T23:01:00Z" w16du:dateUtc="2025-11-10T22:01:00Z" w:id="336">
-        <w:r>
-          <w:delText>C</w:delText>
-        </w:r>
-      </w:del>
+          <w:rStyle w:val="Heading1Char"/>
+        </w:rPr>
+      </w:pPr>
+      <w:r>
+        <w:rPr/>
+        <w:t>✏️ 512T. Stop timer (1 min)</w:t>
+      </w:r>
+    </w:p>
+    <w:p>
+      <w:pPr>
+        <w:pStyle w:val="ListParagraph"/>
+        <w:numPr>
+          <w:ilvl w:val="0"/>
+          <w:numId w:val="41"/>
+        </w:numPr>
+        <w:rPr/>
+      </w:pPr>
+      <w:r>
+        <w:rPr/>
+        <w:t>25. Pauze &gt; Opnieuw instellen &gt; Terug naar volledige weergave</w:t>
+      </w:r>
+    </w:p>
+    <w:p>
+      <w:pPr>
+        <w:pStyle w:val="ListParagraph"/>
+        <w:numPr>
+          <w:ilvl w:val="0"/>
+          <w:numId w:val="41"/>
+        </w:numPr>
+        <w:rPr/>
+      </w:pPr>
+      <w:r>
+        <w:rPr/>
+        <w:t>26. Klok minimaliseren</w:t>
+      </w:r>
       <w:r/>
       <w:r/>
     </w:p>
     <w:p>
       <w:pPr>
-        <w:pStyle w:val="ListParagraph"/>
-        <w:numPr>
-          <w:ilvl w:val="0"/>
-          <w:numId w:val="33"/>
-        </w:numPr>
-      </w:pPr>
-      <w:ins w:author="Rinse Cramer" w:date="2025-11-10T23:01:00Z" w16du:dateUtc="2025-11-10T22:01:00Z" w:id="337">
-        <w:r>
-          <w:t>✏️ 504. Oplossing ontwerpen</w:t>
-        </w:r>
-      </w:ins>
-      <w:del w:author="Rinse Cramer" w:date="2025-11-10T23:01:00Z" w16du:dateUtc="2025-11-10T22:01:00Z" w:id="338">
-        <w:r>
-          <w:delText>D</w:delText>
-        </w:r>
-      </w:del>
+        <w:pStyle w:val="Heading1"/>
+        <w:rPr>
+          <w:rStyle w:val="Heading1Char"/>
+        </w:rPr>
+      </w:pPr>
+      <w:r>
+        <w:rPr/>
+        <w:t xml:space="preserve">✏️ 513. Hoe heeft het zo lang kunnen duren?</w:t>
+      </w:r>
+    </w:p>
+    <w:p>
+      <w:pPr>
+        <w:pStyle w:val="ListParagraph"/>
+        <w:numPr>
+          <w:ilvl w:val="0"/>
+          <w:numId w:val="41"/>
+        </w:numPr>
+        <w:rPr/>
+      </w:pPr>
+      <w:r>
+        <w:rPr/>
+        <w:t>27. Hoe heeft het zo lang kunnen duren?</w:t>
+      </w:r>
+    </w:p>
+    <w:p>
+      <w:pPr>
+        <w:pStyle w:val="ListParagraph"/>
+        <w:numPr>
+          <w:ilvl w:val="0"/>
+          <w:numId w:val="41"/>
+        </w:numPr>
+        <w:rPr/>
+      </w:pPr>
+      <w:r>
+        <w:rPr/>
+        <w:t>28. Zijn er snellere methodieken mogelijk?</w:t>
+      </w:r>
+    </w:p>
+    <w:p>
+      <w:pPr>
+        <w:pStyle w:val="ListParagraph"/>
+        <w:numPr>
+          <w:ilvl w:val="0"/>
+          <w:numId w:val="41"/>
+        </w:numPr>
+        <w:rPr/>
+        <w:rPr/>
+      </w:pPr>
+      <w:r>
+        <w:rPr/>
+        <w:t>29. Heb ik mijn antwoorden getest voordat ik JW spreek?</w:t>
+      </w:r>
       <w:r/>
-      <w:r/>
-    </w:p>
-    <w:p>
-      <w:pPr>
-        <w:pStyle w:val="ListParagraph"/>
-        <w:numPr>
-          <w:ilvl w:val="0"/>
-          <w:numId w:val="33"/>
-        </w:numPr>
-      </w:pPr>
-      <w:ins w:author="Rinse Cramer" w:date="2025-11-10T23:01:00Z" w16du:dateUtc="2025-11-10T22:01:00Z" w:id="339">
-        <w:r>
-          <w:t>✏️ 505. Evalueer of de deliverables correct en volledig zijn afgerond</w:t>
-        </w:r>
-      </w:ins>
-      <w:del w:author="Rinse Cramer" w:date="2025-11-10T23:01:00Z" w16du:dateUtc="2025-11-10T22:01:00Z" w:id="340">
-        <w:r>
-          <w:delText>E</w:delText>
-        </w:r>
-      </w:del>
-      <w:r/>
-      <w:r/>
-    </w:p>
-    <w:p>
-      <w:pPr>
-        <w:pStyle w:val="ListParagraph"/>
-        <w:numPr>
-          <w:ilvl w:val="0"/>
-          <w:numId w:val="33"/>
-        </w:numPr>
-      </w:pPr>
-      <w:ins w:author="Rinse Cramer" w:date="2025-11-10T23:01:00Z" w16du:dateUtc="2025-11-10T22:01:00Z" w:id="341">
-        <w:r>
-          <w:t>✏️ 506. Stop timer (ETC)</w:t>
-        </w:r>
-      </w:ins>
-      <w:del w:author="Rinse Cramer" w:date="2025-11-10T23:01:00Z" w16du:dateUtc="2025-11-10T22:01:00Z" w:id="342">
-        <w:r>
-          <w:delText>F</w:delText>
-        </w:r>
-      </w:del>
-      <w:r/>
-      <w:r/>
-      <w:del w:author="Rinse Cramer" w:date="2025-11-07T18:08:00Z" w16du:dateUtc="2025-11-07T17:08:00Z" w:id="343">
-        <w:r>
-          <w:delText>G</w:delText>
-        </w:r>
-        <w:r>
-          <w:delText xml:space="preserve">. </w:delText>
-        </w:r>
-        <w:r>
-          <w:delText>Actiepunten uit Excel verwerkt en Jira geüpdated</w:delText>
-        </w:r>
-      </w:del>
-    </w:p>
-    <w:p>
-      <w:pPr>
-        <w:pStyle w:val="ListParagraph"/>
-        <w:numPr>
-          <w:ilvl w:val="0"/>
-          <w:numId w:val="33"/>
-        </w:numPr>
-        <w:rPr/>
-      </w:pPr>
-      <w:r>
-        <w:rPr/>
-        <w:t xml:space="preserve">✏️ 507. Bijzonderheden gezien?</w:t>
-      </w:r>
-    </w:p>
-    <w:p>
-      <w:pPr>
-        <w:pStyle w:val="ListParagraph"/>
-        <w:numPr>
-          <w:ilvl w:val="0"/>
-          <w:numId w:val="33"/>
-        </w:numPr>
-        <w:rPr/>
-      </w:pPr>
-      <w:r>
-        <w:rPr/>
-        <w:t>✏ 507F. Volg de review ontwerp</w:t>
-      </w:r>
-    </w:p>
-    <w:p>
-      <w:pPr>
-        <w:pStyle w:val="ListParagraph"/>
-        <w:numPr>
-          <w:ilvl w:val="0"/>
-          <w:numId w:val="33"/>
-        </w:numPr>
-        <w:rPr/>
-      </w:pPr>
-      <w:r>
-        <w:rPr/>
-        <w:t>✏ 507T. Volg de meldplicht</w:t>
-      </w:r>
-      <w:r/>
-    </w:p>
-    <w:p>
-      <w:pPr>
-        <w:pStyle w:val="ListParagraph"/>
-        <w:numPr>
-          <w:ilvl w:val="0"/>
-          <w:numId w:val="33"/>
-        </w:numPr>
-      </w:pPr>
-      <w:r>
-        <w:t>✏️ 508. Na 2/3 ETC Na 100% ETC Na 150% ETC</w:t>
-      </w:r>
-      <w:del w:author="Rinse Cramer" w:date="2025-11-07T18:09:00Z" w16du:dateUtc="2025-11-07T17:09:00Z" w:id="347">
-        <w:r>
-          <w:delText>H</w:delText>
-        </w:r>
-      </w:del>
-      <w:r/>
-      <w:r/>
-      <w:r/>
-    </w:p>
-    <w:p>
-      <w:pPr>
-        <w:pStyle w:val="ListParagraph"/>
-        <w:numPr>
-          <w:ilvl w:val="0"/>
-          <w:numId w:val="33"/>
-        </w:numPr>
-      </w:pPr>
-      <w:r>
-        <w:t xml:space="preserve">✏️ 509. Start timer (1 min)</w:t>
-      </w:r>
-      <w:r/>
-    </w:p>
-    <w:p>
-      <w:pPr>
-        <w:pStyle w:val="ListParagraph"/>
-        <w:numPr>
-          <w:ilvl w:val="0"/>
-          <w:numId w:val="33"/>
-        </w:numPr>
-      </w:pPr>
-      <w:r>
-        <w:t xml:space="preserve">✏️ 510. Hoe lang denk je nog nodig te hebben?</w:t>
-      </w:r>
-      <w:r/>
-    </w:p>
-    <w:p>
-      <w:pPr>
-        <w:pStyle w:val="ListParagraph"/>
-        <w:numPr>
-          <w:ilvl w:val="0"/>
-          <w:numId w:val="33"/>
-        </w:numPr>
-        <w:rPr/>
-      </w:pPr>
-      <w:r>
-        <w:rPr/>
-        <w:t xml:space="preserve">✏️ 512. </w:t>
-      </w:r>
-      <w:r>
-        <w:rPr/>
-        <w:t>Haal ik het?</w:t>
-      </w:r>
-      <w:del w:author="Rinse Cramer" w:date="2025-11-07T18:09:00Z" w16du:dateUtc="2025-11-07T17:09:00Z" w:id="92138923">
-        <w:r>
-          <w:delText>I</w:delText>
-        </w:r>
-      </w:del>
-    </w:p>
-    <w:p>
-      <w:pPr>
-        <w:pStyle w:val="ListParagraph"/>
-        <w:numPr>
-          <w:ilvl w:val="0"/>
-          <w:numId w:val="33"/>
-        </w:numPr>
-        <w:rPr/>
-      </w:pPr>
-      <w:r>
-        <w:rPr/>
-        <w:t>✏️ 512F. Stop timer (1 min) Start timer (4 min)</w:t>
-      </w:r>
-    </w:p>
-    <w:p>
-      <w:pPr>
-        <w:pStyle w:val="ListParagraph"/>
-        <w:numPr>
-          <w:ilvl w:val="0"/>
-          <w:numId w:val="33"/>
-        </w:numPr>
-        <w:rPr/>
-      </w:pPr>
-      <w:r>
-        <w:rPr/>
-        <w:t>✏️ 512T. Stop timer (1 min)</w:t>
-      </w:r>
-      <w:r/>
-      <w:r/>
-    </w:p>
-    <w:p>
-      <w:pPr>
-        <w:pStyle w:val="ListParagraph"/>
-        <w:numPr>
-          <w:ilvl w:val="0"/>
-          <w:numId w:val="33"/>
-        </w:numPr>
-      </w:pPr>
-      <w:r>
-        <w:t xml:space="preserve">✏️ 513. Hoe heeft het zo lang kunnen duren?</w:t>
-      </w:r>
-      <w:r/>
-    </w:p>
-    <w:p>
-      <w:pPr>
-        <w:pStyle w:val="ListParagraph"/>
-        <w:numPr>
-          <w:ilvl w:val="0"/>
-          <w:numId w:val="33"/>
-        </w:numPr>
-        <w:rPr>
-          <w:ins w:author="Rinse Cramer" w:date="2025-11-24T23:59:00Z" w16du:dateUtc="2025-11-24T22:59:00Z" w:id="349"/>
-        </w:rPr>
-      </w:pPr>
-      <w:r>
+    </w:p>
+    <w:p>
+      <w:pPr>
+        <w:pStyle w:val="Heading1"/>
+        <w:rPr>
+          <w:rStyle w:val="Heading1Char"/>
+        </w:rPr>
+      </w:pPr>
+      <w:r>
+        <w:rPr/>
         <w:t xml:space="preserve">✏️ 514. Stop timer (4 min)</w:t>
       </w:r>
-      <w:r/>
-    </w:p>
-    <w:p>
-      <w:pPr>
-        <w:pStyle w:val="ListParagraph"/>
-        <w:numPr>
-          <w:ilvl w:val="0"/>
-          <w:numId w:val="33"/>
-        </w:numPr>
-        <w:rPr/>
-      </w:pPr>
-      <w:ins w:author="Rinse Cramer" w:date="2025-11-24T23:59:00Z" w16du:dateUtc="2025-11-24T22:59:00Z" w:id="180862617">
+    </w:p>
+    <w:p>
+      <w:pPr>
+        <w:pStyle w:val="ListParagraph"/>
+        <w:numPr>
+          <w:ilvl w:val="0"/>
+          <w:numId w:val="41"/>
+        </w:numPr>
+        <w:rPr/>
+        <w:rPr/>
+      </w:pPr>
+      <w:r>
+        <w:rPr/>
+        <w:t>30. Pauze &gt; Opnieuw instellen &gt; Terug naar volledige weergave</w:t>
+      </w:r>
+    </w:p>
+    <w:p>
+      <w:pPr>
+        <w:pStyle w:val="ListParagraph"/>
+        <w:numPr>
+          <w:ilvl w:val="0"/>
+          <w:numId w:val="41"/>
+        </w:numPr>
+        <w:rPr/>
+        <w:rPr/>
+      </w:pPr>
+      <w:r>
+        <w:rPr/>
+        <w:t>31. Klok minimaliseren</w:t>
+      </w:r>
+    </w:p>
+    <w:p>
+      <w:pPr>
+        <w:pStyle w:val="Heading1"/>
+        <w:rPr>
+          <w:rStyle w:val="Heading1Char"/>
+        </w:rPr>
+      </w:pPr>
+      <w:ins w:author="Rinse Cramer" w:date="2025-11-24T23:59:00Z" w16du:dateUtc="2025-11-24T22:59:00Z" w:id="345862971">
         <w:r>
           <w:t>✏️ 515. Significant inzicht gekregen</w:t>
         </w:r>
@@ -3582,7 +4375,7 @@
           </w:pPr>
         </w:pPrChange>
       </w:pPr>
-      <w:del w:author="Rinse Cramer" w:date="2025-11-25T00:03:00Z" w16du:dateUtc="2025-11-24T23:03:00Z" w:id="429">
+      <w:del w:author="Rinse Cramer" w:date="2025-11-25T00:03:00Z" w16du:dateUtc="2025-11-24T23:03:00Z" w:id="1283598298">
         <w:r>
           <w:delText xml:space="preserve">B. </w:delText>
         </w:r>
@@ -3594,19 +4387,36 @@
     <w:p>
       <w:pPr>
         <w:pStyle w:val="Heading1"/>
+      </w:pPr>
+      <w:r>
+        <w:rPr>
+          <w:rStyle w:val="Heading1Char"/>
+        </w:rPr>
+        <w:t>⌨</w:t>
+      </w:r>
+      <w:r>
         <w:rPr>
           <w:rFonts w:ascii="Segoe UI Emoji" w:hAnsi="Segoe UI Emoji" w:cs="Segoe UI Emoji"/>
         </w:rPr>
-      </w:pPr>
-      <w:r>
-        <w:rPr>
-          <w:rFonts w:ascii="Segoe UI Emoji" w:hAnsi="Segoe UI Emoji" w:cs="Segoe UI Emoji"/>
-        </w:rPr>
-        <w:t xml:space="preserve">⌨️ 701. </w:t>
-      </w:r>
-      <w:r>
-        <w:rPr>
-          <w:rFonts w:ascii="Segoe UI Emoji" w:hAnsi="Segoe UI Emoji" w:cs="Segoe UI Emoji"/>
+        <w:t xml:space="preserve"> </w:t>
+      </w:r>
+      <w:r>
+        <w:rPr>
+          <w:rFonts w:ascii="Aptos Display" w:hAnsi="Aptos Display" w:eastAsia="" w:cs="" w:asciiTheme="majorAscii" w:hAnsiTheme="majorAscii" w:eastAsiaTheme="majorEastAsia" w:cstheme="majorBidi"/>
+          <w:color w:val="0F4761" w:themeColor="accent1" w:themeTint="FF" w:themeShade="BF"/>
+          <w:sz w:val="40"/>
+          <w:szCs w:val="40"/>
+          <w:lang w:eastAsia="en-US" w:bidi="ar-SA"/>
+        </w:rPr>
+        <w:t xml:space="preserve">701. </w:t>
+      </w:r>
+      <w:r>
+        <w:rPr>
+          <w:rFonts w:ascii="Aptos Display" w:hAnsi="Aptos Display" w:eastAsia="" w:cs="" w:asciiTheme="majorAscii" w:hAnsiTheme="majorAscii" w:eastAsiaTheme="majorEastAsia" w:cstheme="majorBidi"/>
+          <w:color w:val="0F4761" w:themeColor="accent1" w:themeTint="FF" w:themeShade="BF"/>
+          <w:sz w:val="40"/>
+          <w:szCs w:val="40"/>
+          <w:lang w:eastAsia="en-US" w:bidi="ar-SA"/>
         </w:rPr>
         <w:t>Issue [ontwerp goedgekeurd]</w:t>
       </w:r>
@@ -3615,12 +4425,69 @@
     <w:p>
       <w:pPr>
         <w:pStyle w:val="ListParagraph"/>
-        <w:numPr>
-          <w:ilvl w:val="0"/>
-          <w:numId w:val="35"/>
-        </w:numPr>
-      </w:pPr>
-      <w:r>
+        <w:keepNext w:val="1"/>
+        <w:numPr>
+          <w:ilvl w:val="0"/>
+          <w:numId w:val="15"/>
+        </w:numPr>
+        <w:spacing w:after="0" w:line="240" w:lineRule="auto"/>
+        <w:rPr/>
+      </w:pPr>
+      <w:r>
+        <w:rPr/>
+        <w:t>1. Jira-uitvoerder is medewerker</w:t>
+      </w:r>
+    </w:p>
+    <w:p>
+      <w:pPr>
+        <w:pStyle w:val="ListParagraph"/>
+        <w:numPr>
+          <w:ilvl w:val="0"/>
+          <w:numId w:val="15"/>
+        </w:numPr>
+        <w:rPr/>
+      </w:pPr>
+      <w:r>
+        <w:rPr/>
+        <w:t xml:space="preserve">2. </w:t>
+      </w:r>
+      <w:r>
+        <w:rPr/>
+        <w:t>Jira</w:t>
+      </w:r>
+      <w:r>
+        <w:rPr/>
+        <w:t>-status is Review ontwerp</w:t>
+      </w:r>
+    </w:p>
+    <w:p>
+      <w:pPr>
+        <w:pStyle w:val="ListParagraph"/>
+        <w:numPr>
+          <w:ilvl w:val="0"/>
+          <w:numId w:val="15"/>
+        </w:numPr>
+        <w:rPr/>
+      </w:pPr>
+      <w:r>
+        <w:rPr/>
+        <w:t xml:space="preserve">3. </w:t>
+      </w:r>
+      <w:r>
+        <w:rPr/>
+        <w:t>Jira</w:t>
+      </w:r>
+      <w:r>
+        <w:rPr/>
+        <w:t>-status wordt Implementatie</w:t>
+      </w:r>
+    </w:p>
+    <w:p>
+      <w:pPr>
+        <w:pStyle w:val="Heading1"/>
+      </w:pPr>
+      <w:r>
+        <w:rPr/>
         <w:t xml:space="preserve">⌨️ 702. Start timer (ETC)</w:t>
       </w:r>
       <w:r/>
@@ -3630,23 +4497,73 @@
         <w:pStyle w:val="ListParagraph"/>
         <w:numPr>
           <w:ilvl w:val="0"/>
-          <w:numId w:val="35"/>
-        </w:numPr>
-      </w:pPr>
-      <w:r>
+          <w:numId w:val="41"/>
+        </w:numPr>
+        <w:rPr/>
+      </w:pPr>
+      <w:r>
+        <w:rPr/>
+        <w:t>4. Start &gt; Klok &gt; menu &gt; Timer</w:t>
+      </w:r>
+    </w:p>
+    <w:p>
+      <w:pPr>
+        <w:pStyle w:val="ListParagraph"/>
+        <w:numPr>
+          <w:ilvl w:val="0"/>
+          <w:numId w:val="41"/>
+        </w:numPr>
+        <w:rPr/>
+      </w:pPr>
+      <w:r>
+        <w:rPr/>
+        <w:t>5. Effort tijd instellen &gt; Start &gt; Op voorgrond behouden</w:t>
+      </w:r>
+    </w:p>
+    <w:p>
+      <w:pPr>
+        <w:pStyle w:val="ListParagraph"/>
+        <w:numPr>
+          <w:ilvl w:val="0"/>
+          <w:numId w:val="41"/>
+        </w:numPr>
+        <w:rPr/>
+      </w:pPr>
+      <w:r>
+        <w:rPr/>
+        <w:t xml:space="preserve">6. </w:t>
+      </w:r>
+      <w:r>
+        <w:rPr/>
+        <w:t>Jira</w:t>
+      </w:r>
+      <w:r>
+        <w:rPr/>
+        <w:t>-stopwatch wordt gestart</w:t>
+      </w:r>
+    </w:p>
+    <w:p>
+      <w:pPr>
+        <w:pStyle w:val="Normal"/>
+        <w:ind w:left="0"/>
+      </w:pPr>
+      <w:r>
+        <w:rPr>
+          <w:rStyle w:val="Heading1Char"/>
+        </w:rPr>
         <w:t xml:space="preserve">⌨️ 703. Ontwerp verwerken</w:t>
       </w:r>
       <w:r/>
     </w:p>
     <w:p>
       <w:pPr>
-        <w:pStyle w:val="ListParagraph"/>
-        <w:numPr>
-          <w:ilvl w:val="0"/>
-          <w:numId w:val="35"/>
-        </w:numPr>
-      </w:pPr>
-      <w:r>
+        <w:pStyle w:val="Normal"/>
+        <w:ind w:left="0"/>
+      </w:pPr>
+      <w:r>
+        <w:rPr>
+          <w:rStyle w:val="Heading1Char"/>
+        </w:rPr>
         <w:t xml:space="preserve">⌨️ 704. Oplossing implementeren</w:t>
       </w:r>
       <w:r/>
@@ -3656,23 +4573,107 @@
         <w:pStyle w:val="ListParagraph"/>
         <w:numPr>
           <w:ilvl w:val="0"/>
-          <w:numId w:val="35"/>
-        </w:numPr>
-      </w:pPr>
-      <w:r>
+          <w:numId w:val="42"/>
+        </w:numPr>
+        <w:rPr/>
+      </w:pPr>
+      <w:r>
+        <w:rPr/>
+        <w:t>7. Na afronding van elke functie testen (steppend debuggen, check op werking en dekking)</w:t>
+      </w:r>
+    </w:p>
+    <w:p>
+      <w:pPr>
+        <w:pStyle w:val="ListParagraph"/>
+        <w:numPr>
+          <w:ilvl w:val="0"/>
+          <w:numId w:val="42"/>
+        </w:numPr>
+        <w:rPr/>
+      </w:pPr>
+      <w:r>
+        <w:rPr/>
+        <w:t>8. Houd ik me aan de eenvoudigste oplossing?</w:t>
+      </w:r>
+    </w:p>
+    <w:p>
+      <w:pPr>
+        <w:pStyle w:val="ListParagraph"/>
+        <w:numPr>
+          <w:ilvl w:val="0"/>
+          <w:numId w:val="42"/>
+        </w:numPr>
+        <w:rPr/>
+      </w:pPr>
+      <w:r>
+        <w:rPr/>
+        <w:t>9. Houd ik me aan de code conventie?</w:t>
+      </w:r>
+    </w:p>
+    <w:p>
+      <w:pPr>
+        <w:pStyle w:val="ListParagraph"/>
+        <w:numPr>
+          <w:ilvl w:val="0"/>
+          <w:numId w:val="42"/>
+        </w:numPr>
+        <w:rPr/>
+      </w:pPr>
+      <w:r>
+        <w:rPr/>
+        <w:t>10. Alle IF en ELSE paden getest?</w:t>
+      </w:r>
+    </w:p>
+    <w:p>
+      <w:pPr>
+        <w:pStyle w:val="ListParagraph"/>
+        <w:numPr>
+          <w:ilvl w:val="0"/>
+          <w:numId w:val="42"/>
+        </w:numPr>
+        <w:rPr/>
+      </w:pPr>
+      <w:r>
+        <w:rPr/>
+        <w:t>11. Confidence level vastgesteld</w:t>
+      </w:r>
+    </w:p>
+    <w:p>
+      <w:pPr>
+        <w:pStyle w:val="ListParagraph"/>
+        <w:numPr>
+          <w:ilvl w:val="0"/>
+          <w:numId w:val="42"/>
+        </w:numPr>
+        <w:rPr/>
+      </w:pPr>
+      <w:r>
+        <w:rPr/>
+        <w:t>12. Vragen stellen bij onduidelijkheden!</w:t>
+      </w:r>
+    </w:p>
+    <w:p>
+      <w:pPr>
+        <w:pStyle w:val="Normal"/>
+        <w:ind w:left="0"/>
+      </w:pPr>
+      <w:r>
+        <w:rPr>
+          <w:rStyle w:val="Heading1Char"/>
+        </w:rPr>
         <w:t xml:space="preserve">⌨️ 705. Evalueer of de deliverables correct en volledig zijn afgerond</w:t>
       </w:r>
       <w:r/>
     </w:p>
     <w:p>
       <w:pPr>
-        <w:pStyle w:val="ListParagraph"/>
-        <w:numPr>
-          <w:ilvl w:val="0"/>
-          <w:numId w:val="35"/>
-        </w:numPr>
-      </w:pPr>
-      <w:r>
+        <w:pStyle w:val="Normal"/>
+        <w:ind w:left="0"/>
+      </w:pPr>
+      <w:r>
+        <w:rPr>
+          <w:rStyle w:val="Heading1Char"/>
+        </w:rPr>
         <w:t>⌨️ 706. Stop timer (ETC)</w:t>
       </w:r>
       <w:r/>
@@ -3683,12 +4684,38 @@
         <w:pStyle w:val="ListParagraph"/>
         <w:numPr>
           <w:ilvl w:val="0"/>
-          <w:numId w:val="35"/>
-        </w:numPr>
-        <w:rPr/>
-      </w:pPr>
-      <w:r>
-        <w:rPr/>
+          <w:numId w:val="41"/>
+        </w:numPr>
+        <w:rPr/>
+      </w:pPr>
+      <w:r>
+        <w:rPr/>
+        <w:t>13. Pauze &gt; Opnieuw instellen &gt; Terug naar volledige weergave</w:t>
+      </w:r>
+    </w:p>
+    <w:p>
+      <w:pPr>
+        <w:pStyle w:val="ListParagraph"/>
+        <w:numPr>
+          <w:ilvl w:val="0"/>
+          <w:numId w:val="41"/>
+        </w:numPr>
+        <w:rPr/>
+      </w:pPr>
+      <w:r>
+        <w:rPr/>
+        <w:t>14. Klok minimaliseren</w:t>
+      </w:r>
+    </w:p>
+    <w:p>
+      <w:pPr>
+        <w:pStyle w:val="Normal"/>
+        <w:ind w:left="0"/>
+      </w:pPr>
+      <w:r>
+        <w:rPr>
+          <w:rStyle w:val="Heading1Char"/>
+        </w:rPr>
         <w:t>⌨️ 707. Bijzonderheden gezien?</w:t>
       </w:r>
     </w:p>
@@ -3697,69 +4724,148 @@
         <w:pStyle w:val="ListParagraph"/>
         <w:numPr>
           <w:ilvl w:val="0"/>
-          <w:numId w:val="35"/>
-        </w:numPr>
-        <w:rPr/>
-      </w:pPr>
-      <w:r>
-        <w:rPr/>
-        <w:t>⌨ 707F. Volg de test</w:t>
-      </w:r>
-    </w:p>
-    <w:p>
-      <w:pPr>
-        <w:pStyle w:val="ListParagraph"/>
-        <w:numPr>
-          <w:ilvl w:val="0"/>
-          <w:numId w:val="35"/>
-        </w:numPr>
-        <w:rPr/>
-      </w:pPr>
-      <w:r>
-        <w:rPr/>
-        <w:t>⌨ 707T. Volg de meldplicht</w:t>
-      </w:r>
-    </w:p>
-    <w:p>
-      <w:pPr>
-        <w:pStyle w:val="ListParagraph"/>
-        <w:numPr>
-          <w:ilvl w:val="0"/>
-          <w:numId w:val="35"/>
-        </w:numPr>
-        <w:rPr/>
-      </w:pPr>
-      <w:del w:author="Rinse Cramer" w:date="2025-11-07T18:09:00Z" w16du:dateUtc="2025-11-07T17:09:00Z" w:id="1076795188">
-        <w:r>
+          <w:numId w:val="41"/>
+        </w:numPr>
+        <w:rPr/>
+      </w:pPr>
+      <w:r>
+        <w:rPr/>
+        <w:t>15. Ik heb de bijzonderheden geschreven</w:t>
+      </w:r>
+    </w:p>
+    <w:p>
+      <w:pPr>
+        <w:pStyle w:val="Normal"/>
+        <w:ind w:left="0"/>
+      </w:pPr>
+      <w:r>
+        <w:rPr>
+          <w:rStyle w:val="Heading1Char"/>
+        </w:rPr>
+        <w:t xml:space="preserve">⌨ 707F. Volg de </w:t>
+      </w:r>
+      <w:r>
+        <w:rPr>
+          <w:rStyle w:val="Heading1Char"/>
+        </w:rPr>
+        <w:t>meldplich</w:t>
+      </w:r>
+      <w:r>
+        <w:rPr>
+          <w:rStyle w:val="Heading1Char"/>
+        </w:rPr>
+        <w:t>t</w:t>
+      </w:r>
+    </w:p>
+    <w:p>
+      <w:pPr>
+        <w:pStyle w:val="ListParagraph"/>
+        <w:numPr>
+          <w:ilvl w:val="0"/>
+          <w:numId w:val="41"/>
+        </w:numPr>
+        <w:rPr/>
+      </w:pPr>
+      <w:r>
+        <w:rPr/>
+        <w:t>16. Naar flowchartpagina van meldplicht navigeren</w:t>
+      </w:r>
+    </w:p>
+    <w:p>
+      <w:pPr>
+        <w:pStyle w:val="Normal"/>
+        <w:ind w:left="0"/>
+      </w:pPr>
+      <w:r>
+        <w:rPr>
+          <w:rStyle w:val="Heading1Char"/>
+        </w:rPr>
+        <w:t xml:space="preserve">⌨ 707T. Volg de </w:t>
+      </w:r>
+      <w:r>
+        <w:rPr>
+          <w:rStyle w:val="Heading1Char"/>
+        </w:rPr>
+        <w:t>test</w:t>
+      </w:r>
+    </w:p>
+    <w:p>
+      <w:pPr>
+        <w:pStyle w:val="ListParagraph"/>
+        <w:numPr>
+          <w:ilvl w:val="0"/>
+          <w:numId w:val="41"/>
+        </w:numPr>
+        <w:rPr/>
+      </w:pPr>
+      <w:r>
+        <w:rPr>
+          <w:lang w:val="en-US"/>
+        </w:rPr>
+        <w:t xml:space="preserve">17. </w:t>
+      </w:r>
+      <w:r>
+        <w:rPr/>
+        <w:t>Naar volgende flowchartpagina navigeren</w:t>
+      </w:r>
+    </w:p>
+    <w:p>
+      <w:pPr>
+        <w:pStyle w:val="Normal"/>
+        <w:ind w:left="0"/>
+      </w:pPr>
+      <w:del w:author="Rinse Cramer" w:date="2025-11-07T18:09:00Z" w16du:dateUtc="2025-11-07T17:09:00Z" w:id="1578133743">
+        <w:r>
+          <w:rPr>
+            <w:rStyle w:val="Heading1Char"/>
+          </w:rPr>
           <w:delText>G</w:delText>
         </w:r>
         <w:r>
+          <w:rPr>
+            <w:rStyle w:val="Heading1Char"/>
+          </w:rPr>
           <w:delText xml:space="preserve">. </w:delText>
         </w:r>
         <w:r>
+          <w:rPr>
+            <w:rStyle w:val="Heading1Char"/>
+          </w:rPr>
           <w:delText>Actiepunten uit Excel verwerkt en Jira geüpdated</w:delText>
         </w:r>
       </w:del>
-      <w:ins w:author="Rinse Cramer" w:date="2025-11-07T18:09:00Z" w16du:dateUtc="2025-11-07T17:09:00Z" w:id="1227444328">
-        <w:r>
-          <w:t>⌨️ 708. Na 2/3 ETC Na 100% ETC Na 150% ETC</w:t>
-        </w:r>
-      </w:ins>
-      <w:del w:author="Rinse Cramer" w:date="2025-11-07T18:09:00Z" w16du:dateUtc="2025-11-07T17:09:00Z" w:id="655176086">
-        <w:r>
+      <w:ins w:author="Rinse Cramer" w:date="2025-11-07T18:09:00Z" w16du:dateUtc="2025-11-07T17:09:00Z" w:id="158637631">
+        <w:r>
+          <w:rPr>
+            <w:rStyle w:val="Heading1Char"/>
+          </w:rPr>
+          <w:t xml:space="preserve">⌨️ 708. Na 2/3 ETC Na 100% ETC Na </w:t>
+        </w:r>
+        <w:r>
+          <w:rPr>
+            <w:rStyle w:val="Heading1Char"/>
+          </w:rPr>
+          <w:t>150% ETC</w:t>
+        </w:r>
+      </w:ins>
+      <w:del w:author="Rinse Cramer" w:date="2025-11-07T18:09:00Z" w16du:dateUtc="2025-11-07T17:09:00Z" w:id="1245779409">
+        <w:r>
+          <w:rPr>
+            <w:rStyle w:val="Heading1Char"/>
+          </w:rPr>
           <w:delText>H</w:delText>
         </w:r>
       </w:del>
     </w:p>
     <w:p>
       <w:pPr>
-        <w:pStyle w:val="ListParagraph"/>
-        <w:numPr>
-          <w:ilvl w:val="0"/>
-          <w:numId w:val="35"/>
-        </w:numPr>
-      </w:pPr>
-      <w:r>
+        <w:pStyle w:val="Normal"/>
+        <w:ind w:left="0"/>
+      </w:pPr>
+      <w:r>
+        <w:rPr>
+          <w:rStyle w:val="Heading1Char"/>
+        </w:rPr>
         <w:t xml:space="preserve">⌨️ 709. Start timer (1 min)</w:t>
       </w:r>
       <w:r/>
@@ -3769,10 +4875,60 @@
         <w:pStyle w:val="ListParagraph"/>
         <w:numPr>
           <w:ilvl w:val="0"/>
-          <w:numId w:val="35"/>
-        </w:numPr>
-      </w:pPr>
-      <w:r>
+          <w:numId w:val="41"/>
+        </w:numPr>
+        <w:rPr/>
+      </w:pPr>
+      <w:r>
+        <w:rPr/>
+        <w:t>18. Start &gt; Klok &gt; menu &gt; Timer</w:t>
+      </w:r>
+    </w:p>
+    <w:p>
+      <w:pPr>
+        <w:pStyle w:val="ListParagraph"/>
+        <w:numPr>
+          <w:ilvl w:val="0"/>
+          <w:numId w:val="41"/>
+        </w:numPr>
+        <w:rPr/>
+      </w:pPr>
+      <w:r>
+        <w:rPr/>
+        <w:t>19. Effort tijd instellen &gt; Start &gt; Op voorgrond behouden</w:t>
+      </w:r>
+    </w:p>
+    <w:p>
+      <w:pPr>
+        <w:pStyle w:val="ListParagraph"/>
+        <w:numPr>
+          <w:ilvl w:val="0"/>
+          <w:numId w:val="41"/>
+        </w:numPr>
+        <w:rPr/>
+      </w:pPr>
+      <w:r>
+        <w:rPr/>
+        <w:t xml:space="preserve">20. </w:t>
+      </w:r>
+      <w:r>
+        <w:rPr/>
+        <w:t>Jira</w:t>
+      </w:r>
+      <w:r>
+        <w:rPr/>
+        <w:t>-stopwatch wordt gestart</w:t>
+      </w:r>
+    </w:p>
+    <w:p>
+      <w:pPr>
+        <w:pStyle w:val="Normal"/>
+        <w:ind w:left="0"/>
+      </w:pPr>
+      <w:r>
+        <w:rPr>
+          <w:rStyle w:val="Heading1Char"/>
+        </w:rPr>
         <w:t xml:space="preserve">⌨️ 710. Hoe lang denk je nog nodig te hebben?</w:t>
       </w:r>
       <w:r/>
@@ -3782,32 +4938,60 @@
         <w:pStyle w:val="ListParagraph"/>
         <w:numPr>
           <w:ilvl w:val="0"/>
-          <w:numId w:val="36"/>
-        </w:numPr>
-        <w:rPr/>
-      </w:pPr>
-      <w:ins w:author="Rinse Cramer" w:date="2025-11-07T18:09:00Z" w16du:dateUtc="2025-11-07T17:09:00Z" w:id="1050401915">
-        <w:r>
+          <w:numId w:val="41"/>
+        </w:numPr>
+        <w:rPr/>
+      </w:pPr>
+      <w:r>
+        <w:rPr/>
+        <w:t>21. Hoe lang denk je nog nodig te hebben?</w:t>
+      </w:r>
+    </w:p>
+    <w:p>
+      <w:pPr>
+        <w:pStyle w:val="ListParagraph"/>
+        <w:numPr>
+          <w:ilvl w:val="0"/>
+          <w:numId w:val="41"/>
+        </w:numPr>
+        <w:rPr/>
+      </w:pPr>
+      <w:r>
+        <w:rPr/>
+        <w:t>22. Past het binnen de 150%? Tijdtrigger gehaald?</w:t>
+      </w:r>
+    </w:p>
+    <w:p>
+      <w:pPr>
+        <w:pStyle w:val="Normal"/>
+        <w:ind w:left="0"/>
+      </w:pPr>
+      <w:ins w:author="Rinse Cramer" w:date="2025-11-07T18:09:00Z" w16du:dateUtc="2025-11-07T17:09:00Z" w:id="2083695613">
+        <w:r>
+          <w:rPr>
+            <w:rStyle w:val="Heading1Char"/>
+          </w:rPr>
           <w:t xml:space="preserve">⌨️ 712. </w:t>
         </w:r>
         <w:r>
+          <w:rPr>
+            <w:rStyle w:val="Heading1Char"/>
+          </w:rPr>
           <w:t>Haal ik het?</w:t>
         </w:r>
       </w:ins>
-      <w:del w:author="Rinse Cramer" w:date="2025-11-07T18:09:00Z" w16du:dateUtc="2025-11-07T17:09:00Z" w:id="919337576">
-        <w:r>
+      <w:del w:author="Rinse Cramer" w:date="2025-11-07T18:09:00Z" w16du:dateUtc="2025-11-07T17:09:00Z" w:id="1348619790">
+        <w:r>
+          <w:rPr>
+            <w:rStyle w:val="Heading1Char"/>
+          </w:rPr>
           <w:delText>I</w:delText>
         </w:r>
       </w:del>
     </w:p>
     <w:p>
       <w:pPr>
-        <w:pStyle w:val="ListParagraph"/>
-        <w:numPr>
-          <w:ilvl w:val="0"/>
-          <w:numId w:val="36"/>
-        </w:numPr>
-        <w:rPr/>
+        <w:pStyle w:val="Heading1"/>
       </w:pPr>
       <w:r>
         <w:rPr/>
@@ -3819,12 +5003,60 @@
         <w:pStyle w:val="ListParagraph"/>
         <w:numPr>
           <w:ilvl w:val="0"/>
-          <w:numId w:val="36"/>
-        </w:numPr>
-        <w:rPr/>
-      </w:pPr>
-      <w:r>
-        <w:rPr/>
+          <w:numId w:val="41"/>
+        </w:numPr>
+        <w:rPr/>
+      </w:pPr>
+      <w:r>
+        <w:rPr/>
+        <w:t>23. Pauze &gt; Opnieuw instellen &gt; Terug naar volledige weergave</w:t>
+      </w:r>
+    </w:p>
+    <w:p>
+      <w:pPr>
+        <w:pStyle w:val="ListParagraph"/>
+        <w:numPr>
+          <w:ilvl w:val="0"/>
+          <w:numId w:val="41"/>
+        </w:numPr>
+        <w:rPr/>
+      </w:pPr>
+      <w:r>
+        <w:rPr/>
+        <w:t>24. Effort tijd instellen &gt; Start &gt; Op voorgrond behouden</w:t>
+      </w:r>
+    </w:p>
+    <w:p>
+      <w:pPr>
+        <w:pStyle w:val="ListParagraph"/>
+        <w:numPr>
+          <w:ilvl w:val="0"/>
+          <w:numId w:val="41"/>
+        </w:numPr>
+        <w:rPr/>
+      </w:pPr>
+      <w:r>
+        <w:rPr/>
+        <w:t xml:space="preserve">25. </w:t>
+      </w:r>
+      <w:r>
+        <w:rPr/>
+        <w:t>Jira</w:t>
+      </w:r>
+      <w:r>
+        <w:rPr/>
+        <w:t>-stopwatch wordt gestart</w:t>
+      </w:r>
+    </w:p>
+    <w:p>
+      <w:pPr>
+        <w:pStyle w:val="Normal"/>
+        <w:ind w:left="0"/>
+      </w:pPr>
+      <w:r>
+        <w:rPr>
+          <w:rStyle w:val="Heading1Char"/>
+        </w:rPr>
         <w:t>⌨ 712T. Stop timer (1 min)</w:t>
       </w:r>
       <w:r/>
@@ -3835,10 +5067,38 @@
         <w:pStyle w:val="ListParagraph"/>
         <w:numPr>
           <w:ilvl w:val="0"/>
-          <w:numId w:val="36"/>
-        </w:numPr>
-      </w:pPr>
-      <w:r>
+          <w:numId w:val="41"/>
+        </w:numPr>
+        <w:rPr/>
+      </w:pPr>
+      <w:r>
+        <w:rPr/>
+        <w:t>26. Pauze &gt; Opnieuw instellen &gt; Terug naar volledige weergave</w:t>
+      </w:r>
+    </w:p>
+    <w:p>
+      <w:pPr>
+        <w:pStyle w:val="ListParagraph"/>
+        <w:numPr>
+          <w:ilvl w:val="0"/>
+          <w:numId w:val="41"/>
+        </w:numPr>
+        <w:rPr/>
+      </w:pPr>
+      <w:r>
+        <w:rPr/>
+        <w:t>27. Klok minimaliseren</w:t>
+      </w:r>
+    </w:p>
+    <w:p>
+      <w:pPr>
+        <w:pStyle w:val="Normal"/>
+        <w:ind w:left="0"/>
+      </w:pPr>
+      <w:r>
+        <w:rPr>
+          <w:rStyle w:val="Heading1Char"/>
+        </w:rPr>
         <w:t xml:space="preserve">⌨️ 713. Hoe heeft het zo lang kunnen duren?</w:t>
       </w:r>
       <w:r/>
@@ -3848,13 +5108,52 @@
         <w:pStyle w:val="ListParagraph"/>
         <w:numPr>
           <w:ilvl w:val="0"/>
-          <w:numId w:val="36"/>
-        </w:numPr>
-        <w:rPr>
-          <w:ins w:author="Rinse Cramer" w:date="2025-11-25T00:03:00Z" w16du:dateUtc="2025-11-24T23:03:00Z" w:id="439"/>
-        </w:rPr>
-      </w:pPr>
-      <w:r>
+          <w:numId w:val="41"/>
+        </w:numPr>
+        <w:rPr/>
+      </w:pPr>
+      <w:r>
+        <w:rPr/>
+        <w:t>28. Hoe heeft het zo lang kunnen duren?</w:t>
+      </w:r>
+    </w:p>
+    <w:p>
+      <w:pPr>
+        <w:pStyle w:val="ListParagraph"/>
+        <w:numPr>
+          <w:ilvl w:val="0"/>
+          <w:numId w:val="41"/>
+        </w:numPr>
+        <w:rPr/>
+      </w:pPr>
+      <w:r>
+        <w:rPr/>
+        <w:t>29. Zijn er snellere methodieken mogelijk?</w:t>
+      </w:r>
+    </w:p>
+    <w:p>
+      <w:pPr>
+        <w:pStyle w:val="ListParagraph"/>
+        <w:numPr>
+          <w:ilvl w:val="0"/>
+          <w:numId w:val="41"/>
+        </w:numPr>
+        <w:rPr/>
+      </w:pPr>
+      <w:r>
+        <w:rPr/>
+        <w:t>30. Heb ik mijn antwoorden getest voordat ik JW spreek?</w:t>
+      </w:r>
+    </w:p>
+    <w:p>
+      <w:pPr>
+        <w:pStyle w:val="Normal"/>
+        <w:ind w:left="0"/>
+      </w:pPr>
+      <w:r>
+        <w:rPr>
+          <w:rStyle w:val="Heading1Char"/>
+        </w:rPr>
         <w:t xml:space="preserve">⌨️ 714. Stop timer (4 min)</w:t>
       </w:r>
       <w:r/>
@@ -3864,12 +5163,42 @@
         <w:pStyle w:val="ListParagraph"/>
         <w:numPr>
           <w:ilvl w:val="0"/>
-          <w:numId w:val="36"/>
-        </w:numPr>
-      </w:pPr>
-      <w:ins w:author="Rinse Cramer" w:date="2025-11-25T00:03:00Z" w16du:dateUtc="2025-11-24T23:03:00Z" w:id="440">
-        <w:r>
-          <w:t xml:space="preserve">⌨️ 715. Significant inzicht gekregen</w:t>
+          <w:numId w:val="41"/>
+        </w:numPr>
+        <w:rPr/>
+      </w:pPr>
+      <w:r>
+        <w:rPr/>
+        <w:t>30. Pauze &gt; Opnieuw instellen &gt; Terug naar volledige weergave</w:t>
+      </w:r>
+    </w:p>
+    <w:p>
+      <w:pPr>
+        <w:pStyle w:val="ListParagraph"/>
+        <w:numPr>
+          <w:ilvl w:val="0"/>
+          <w:numId w:val="41"/>
+        </w:numPr>
+        <w:rPr>
+          <w:ins w:author="Rinse Cramer" w:date="2025-11-25T00:03:00Z" w16du:dateUtc="2025-11-24T23:03:00Z" w:id="1251339153"/>
+        </w:rPr>
+      </w:pPr>
+      <w:r>
+        <w:rPr/>
+        <w:t>31. Klok minimaliseren</w:t>
+      </w:r>
+    </w:p>
+    <w:p>
+      <w:pPr>
+        <w:pStyle w:val="Normal"/>
+        <w:ind w:left="0"/>
+      </w:pPr>
+      <w:ins w:author="Rinse Cramer" w:date="2025-11-25T00:03:00Z" w16du:dateUtc="2025-11-24T23:03:00Z" w:id="1718286132">
+        <w:r>
+          <w:rPr>
+            <w:rStyle w:val="Heading1Char"/>
+          </w:rPr>
+          <w:t>⌨️ 715. Significant inzicht gekregen</w:t>
         </w:r>
       </w:ins>
       <w:ins w:author="Rinse Cramer" w:date="2025-11-25T00:04:00Z" w16du:dateUtc="2025-11-24T23:04:00Z" w:id="441">
@@ -5399,6 +6728,118 @@
       </v:shape>
     </w:pict>
   </w:numPicBullet>
+  <w:abstractNum xmlns:w="http://schemas.openxmlformats.org/wordprocessingml/2006/main" w:abstractNumId="41">
+    <w:nsid w:val="7c5b543"/>
+    <w:multiLevelType xmlns:w="http://schemas.openxmlformats.org/wordprocessingml/2006/main" w:val="hybridMultilevel"/>
+    <w:lvl xmlns:w="http://schemas.openxmlformats.org/wordprocessingml/2006/main" w:ilvl="0">
+      <w:start w:val="1"/>
+      <w:numFmt w:val="bullet"/>
+      <w:lvlText w:val="☐"/>
+      <w:lvlJc w:val="left"/>
+      <w:pPr>
+        <w:ind w:left="720" w:hanging="360"/>
+      </w:pPr>
+      <w:rPr>
+        <w:rFonts w:hint="default" w:ascii="Aptos" w:hAnsi="Aptos"/>
+      </w:rPr>
+    </w:lvl>
+    <w:lvl xmlns:w="http://schemas.openxmlformats.org/wordprocessingml/2006/main" w:ilvl="1">
+      <w:start w:val="1"/>
+      <w:numFmt w:val="bullet"/>
+      <w:lvlText w:val="o"/>
+      <w:lvlJc w:val="left"/>
+      <w:pPr>
+        <w:ind w:left="1440" w:hanging="360"/>
+      </w:pPr>
+      <w:rPr>
+        <w:rFonts w:hint="default" w:ascii="Courier New" w:hAnsi="Courier New"/>
+      </w:rPr>
+    </w:lvl>
+    <w:lvl xmlns:w="http://schemas.openxmlformats.org/wordprocessingml/2006/main" w:ilvl="2">
+      <w:start w:val="1"/>
+      <w:numFmt w:val="bullet"/>
+      <w:lvlText w:val=""/>
+      <w:lvlJc w:val="left"/>
+      <w:pPr>
+        <w:ind w:left="2160" w:hanging="360"/>
+      </w:pPr>
+      <w:rPr>
+        <w:rFonts w:hint="default" w:ascii="Wingdings" w:hAnsi="Wingdings"/>
+      </w:rPr>
+    </w:lvl>
+    <w:lvl xmlns:w="http://schemas.openxmlformats.org/wordprocessingml/2006/main" w:ilvl="3">
+      <w:start w:val="1"/>
+      <w:numFmt w:val="bullet"/>
+      <w:lvlText w:val=""/>
+      <w:lvlJc w:val="left"/>
+      <w:pPr>
+        <w:ind w:left="2880" w:hanging="360"/>
+      </w:pPr>
+      <w:rPr>
+        <w:rFonts w:hint="default" w:ascii="Symbol" w:hAnsi="Symbol"/>
+      </w:rPr>
+    </w:lvl>
+    <w:lvl xmlns:w="http://schemas.openxmlformats.org/wordprocessingml/2006/main" w:ilvl="4">
+      <w:start w:val="1"/>
+      <w:numFmt w:val="bullet"/>
+      <w:lvlText w:val="o"/>
+      <w:lvlJc w:val="left"/>
+      <w:pPr>
+        <w:ind w:left="3600" w:hanging="360"/>
+      </w:pPr>
+      <w:rPr>
+        <w:rFonts w:hint="default" w:ascii="Courier New" w:hAnsi="Courier New"/>
+      </w:rPr>
+    </w:lvl>
+    <w:lvl xmlns:w="http://schemas.openxmlformats.org/wordprocessingml/2006/main" w:ilvl="5">
+      <w:start w:val="1"/>
+      <w:numFmt w:val="bullet"/>
+      <w:lvlText w:val=""/>
+      <w:lvlJc w:val="left"/>
+      <w:pPr>
+        <w:ind w:left="4320" w:hanging="360"/>
+      </w:pPr>
+      <w:rPr>
+        <w:rFonts w:hint="default" w:ascii="Wingdings" w:hAnsi="Wingdings"/>
+      </w:rPr>
+    </w:lvl>
+    <w:lvl xmlns:w="http://schemas.openxmlformats.org/wordprocessingml/2006/main" w:ilvl="6">
+      <w:start w:val="1"/>
+      <w:numFmt w:val="bullet"/>
+      <w:lvlText w:val=""/>
+      <w:lvlJc w:val="left"/>
+      <w:pPr>
+        <w:ind w:left="5040" w:hanging="360"/>
+      </w:pPr>
+      <w:rPr>
+        <w:rFonts w:hint="default" w:ascii="Symbol" w:hAnsi="Symbol"/>
+      </w:rPr>
+    </w:lvl>
+    <w:lvl xmlns:w="http://schemas.openxmlformats.org/wordprocessingml/2006/main" w:ilvl="7">
+      <w:start w:val="1"/>
+      <w:numFmt w:val="bullet"/>
+      <w:lvlText w:val="o"/>
+      <w:lvlJc w:val="left"/>
+      <w:pPr>
+        <w:ind w:left="5760" w:hanging="360"/>
+      </w:pPr>
+      <w:rPr>
+        <w:rFonts w:hint="default" w:ascii="Courier New" w:hAnsi="Courier New"/>
+      </w:rPr>
+    </w:lvl>
+    <w:lvl xmlns:w="http://schemas.openxmlformats.org/wordprocessingml/2006/main" w:ilvl="8">
+      <w:start w:val="1"/>
+      <w:numFmt w:val="bullet"/>
+      <w:lvlText w:val=""/>
+      <w:lvlJc w:val="left"/>
+      <w:pPr>
+        <w:ind w:left="6480" w:hanging="360"/>
+      </w:pPr>
+      <w:rPr>
+        <w:rFonts w:hint="default" w:ascii="Wingdings" w:hAnsi="Wingdings"/>
+      </w:rPr>
+    </w:lvl>
+  </w:abstractNum>
   <w:abstractNum w:abstractNumId="0" w15:restartNumberingAfterBreak="0">
     <w:nsid w:val="02F928C7"/>
     <w:multiLevelType w:val="hybridMultilevel"/>
@@ -7553,7 +8994,7 @@
     <w:nsid w:val="3FFC5629"/>
     <w:multiLevelType w:val="hybridMultilevel"/>
     <w:tmpl w:val="7780FED2"/>
-    <w:lvl w:ilvl="0" w:tplc="13EC95AC">
+    <w:lvl w:ilvl="0">
       <w:start w:val="1"/>
       <w:numFmt w:val="bullet"/>
       <w:lvlText w:val="☐"/>
@@ -10036,6 +11477,9 @@
       </w:rPr>
     </w:lvl>
   </w:abstractNum>
+  <w:num w:numId="42">
+    <w:abstractNumId w:val="41"/>
+  </w:num>
   <w:num w:numId="1" w16cid:durableId="283390749">
     <w:abstractNumId w:val="6"/>
   </w:num>
@@ -11163,6 +12607,15 @@
       <w:szCs w:val="20"/>
     </w:rPr>
   </w:style>
+  <w:style w:type="paragraph" w:styleId="NoSpacing">
+    <w:uiPriority w:val="1"/>
+    <w:name w:val="No Spacing"/>
+    <w:qFormat/>
+    <w:rsid w:val="061C602C"/>
+    <w:pPr>
+      <w:spacing w:after="0"/>
+    </w:pPr>
+  </w:style>
 </w:styles>
 </file>
 

</xml_diff>

<commit_message>
fix(generator): voorkom dat de fase-koptekst (heading) als actie wordt toegevoegd in ParseActielijst
- Introduceer een isHeading vlag die op true wordt gezet bij num % 100 == 1 (de fase-start)

- Voegt de koptekst toe aan de sectie, maar sluit deze uit van de Actions-lijst

- Lost de dubbele opname van fase-koppen (bijv. 101, 201) in de uiteindelijke actielijst op
</commit_message>
<xml_diff>
--- a/Actielijst.docx
+++ b/Actielijst.docx
@@ -18,18 +18,19 @@
     <w:p>
       <w:pPr>
         <w:pStyle w:val="Subtitle"/>
-      </w:pPr>
-      <w:del w:author="Rinse Cramer" w:date="2025-12-31T16:30:00Z" w16du:dateUtc="2025-12-31T15:30:00Z" w:id="1">
+        <w:rPr/>
+      </w:pPr>
+      <w:del w:author="Rinse Cramer" w:date="2025-12-31T16:30:00Z" w16du:dateUtc="2025-12-31T15:30:00Z" w:id="1489662975">
         <w:r>
           <w:delText xml:space="preserve">Afvinkbare acties voor </w:delText>
         </w:r>
       </w:del>
-      <w:del w:author="Rinse Cramer" w:date="2025-12-12T14:37:00Z" w16du:dateUtc="2025-12-12T13:37:00Z" w:id="2">
+      <w:del w:author="Rinse Cramer" w:date="2025-12-12T14:37:00Z" w16du:dateUtc="2025-12-12T13:37:00Z" w:id="748184138">
         <w:r>
           <w:delText>iedere projectfase</w:delText>
         </w:r>
       </w:del>
-      <w:ins w:author="Rinse Cramer" w:date="2025-12-31T16:30:00Z" w16du:dateUtc="2025-12-31T15:30:00Z" w:id="3">
+      <w:ins w:author="Rinse Cramer" w:date="2025-12-31T16:30:00Z" w16du:dateUtc="2025-12-31T15:30:00Z" w:id="1908598615">
         <w:r>
           <w:t>In iedere actie de checklijst afvinken voordat je doorgaat</w:t>
         </w:r>
@@ -38,146 +39,11 @@
     <w:p>
       <w:pPr>
         <w:pStyle w:val="Heading1"/>
-      </w:pPr>
-      <w:r>
-        <w:rPr>
-          <w:rFonts w:ascii="Segoe UI Emoji" w:hAnsi="Segoe UI Emoji" w:cs="Segoe UI Emoji"/>
-        </w:rPr>
-        <w:t>⏱️</w:t>
-      </w:r>
-      <w:r>
-        <w:rPr/>
-        <w:t xml:space="preserve"> </w:t>
-      </w:r>
-      <w:r>
-        <w:rPr/>
-        <w:t>101</w:t>
-      </w:r>
-      <w:ins w:author="Rinse Cramer" w:date="2025-12-12T15:01:00Z" w16du:dateUtc="2025-12-12T14:01:00Z" w:id="1927747816">
-        <w:r>
-          <w:t xml:space="preserve">. </w:t>
-        </w:r>
-      </w:ins>
-      <w:r>
-        <w:rPr/>
-        <w:t>Issue [nieuw]</w:t>
-      </w:r>
-    </w:p>
-    <w:p>
-      <w:pPr>
-        <w:pStyle w:val="ListParagraph"/>
-        <w:keepNext/>
-        <w:numPr>
-          <w:ilvl w:val="0"/>
-          <w:numId w:val="15"/>
-        </w:numPr>
-        <w:spacing w:after="0" w:line="240" w:lineRule="auto"/>
-      </w:pPr>
-      <w:del w:author="Rinse Cramer" w:date="2025-12-12T15:01:00Z" w16du:dateUtc="2025-12-12T14:01:00Z" w:id="7">
-        <w:r>
-          <w:delText>A</w:delText>
-        </w:r>
-      </w:del>
-      <w:ins w:author="Rinse Cramer" w:date="2025-12-12T15:01:00Z" w16du:dateUtc="2025-12-12T14:01:00Z" w:id="8">
-        <w:r>
-          <w:t>1</w:t>
-        </w:r>
-      </w:ins>
-      <w:r>
-        <w:t xml:space="preserve">. </w:t>
-      </w:r>
-      <w:del w:author="Rinse Cramer" w:date="2025-12-12T14:44:00Z" w16du:dateUtc="2025-12-12T13:44:00Z" w:id="9">
-        <w:r>
-          <w:delText>Oplossingsrichting bepaald</w:delText>
-        </w:r>
-      </w:del>
-      <w:ins w:author="Rinse Cramer" w:date="2025-12-12T14:47:00Z" w16du:dateUtc="2025-12-12T13:47:00Z" w:id="10">
-        <w:r>
-          <w:t>Jira-uitvoerder is medewerker</w:t>
-        </w:r>
-      </w:ins>
-    </w:p>
-    <w:p>
-      <w:pPr>
-        <w:pStyle w:val="ListParagraph"/>
-        <w:numPr>
-          <w:ilvl w:val="0"/>
-          <w:numId w:val="15"/>
-        </w:numPr>
-      </w:pPr>
-      <w:del w:author="Rinse Cramer" w:date="2025-12-12T15:01:00Z" w16du:dateUtc="2025-12-12T14:01:00Z" w:id="11">
-        <w:r>
-          <w:delText>B</w:delText>
-        </w:r>
-      </w:del>
-      <w:ins w:author="Rinse Cramer" w:date="2025-12-12T15:01:00Z" w16du:dateUtc="2025-12-12T14:01:00Z" w:id="12">
-        <w:r>
-          <w:t>2</w:t>
-        </w:r>
-      </w:ins>
-      <w:r>
-        <w:t xml:space="preserve">. </w:t>
-      </w:r>
-      <w:del w:author="Rinse Cramer" w:date="2025-12-12T14:44:00Z" w16du:dateUtc="2025-12-12T13:44:00Z" w:id="13">
-        <w:r>
-          <w:delText>Deliverable specificatie opgesteld</w:delText>
-        </w:r>
-      </w:del>
-      <w:ins w:author="Rinse Cramer" w:date="2025-12-12T14:47:00Z" w16du:dateUtc="2025-12-12T13:47:00Z" w:id="14">
-        <w:r>
-          <w:t>Jira-status is Toegewezen</w:t>
-        </w:r>
-      </w:ins>
-      <w:r>
-        <w:t xml:space="preserve"> of Review aanpak</w:t>
-      </w:r>
-    </w:p>
-    <w:p>
-      <w:pPr>
-        <w:pStyle w:val="ListParagraph"/>
-        <w:numPr>
-          <w:ilvl w:val="0"/>
-          <w:numId w:val="15"/>
-        </w:numPr>
-        <w:rPr>
-          <w:ins w:author="Rinse Cramer" w:date="2025-12-12T14:56:00Z" w16du:dateUtc="2025-12-12T13:56:00Z" w:id="15"/>
-        </w:rPr>
-      </w:pPr>
-      <w:del w:author="Rinse Cramer" w:date="2025-12-12T15:01:00Z" w16du:dateUtc="2025-12-12T14:01:00Z" w:id="16">
-        <w:r>
-          <w:delText>C</w:delText>
-        </w:r>
-      </w:del>
-      <w:ins w:author="Rinse Cramer" w:date="2025-12-12T15:01:00Z" w16du:dateUtc="2025-12-12T14:01:00Z" w:id="17">
-        <w:r>
-          <w:t>3</w:t>
-        </w:r>
-      </w:ins>
-      <w:r>
-        <w:t xml:space="preserve">. </w:t>
-      </w:r>
-      <w:del w:author="Rinse Cramer" w:date="2025-12-12T14:45:00Z" w16du:dateUtc="2025-12-12T13:45:00Z" w:id="18">
-        <w:r>
-          <w:delText>Initiële schatting gemaakt</w:delText>
-        </w:r>
-      </w:del>
-      <w:ins w:author="Rinse Cramer" w:date="2025-12-12T14:45:00Z" w16du:dateUtc="2025-12-12T13:45:00Z" w:id="19">
-        <w:r>
-          <w:t xml:space="preserve">Jira-status wordt </w:t>
-        </w:r>
-        <w:r>
-          <w:t>Intake</w:t>
-        </w:r>
-      </w:ins>
-    </w:p>
-    <w:p>
-      <w:pPr>
-        <w:pStyle w:val="Heading1"/>
-        <w:rPr>
-          <w:ins w:author="Rinse Cramer" w:date="2025-12-12T14:56:00Z" w16du:dateUtc="2025-12-12T13:56:00Z" w:id="903736532"/>
-        </w:rPr>
-      </w:pPr>
-      <w:ins w:author="Rinse Cramer" w:date="2025-12-12T14:56:00Z" w16du:dateUtc="2025-12-12T13:56:00Z" w:id="255664288">
+        <w:rPr>
+          <w:ins w:author="Rinse Cramer" w:date="2025-12-12T14:56:00Z" w16du:dateUtc="2025-12-12T13:56:00Z" w:id="1565679017"/>
+        </w:rPr>
+      </w:pPr>
+      <w:ins w:author="Rinse Cramer" w:date="2025-12-12T14:56:00Z" w16du:dateUtc="2025-12-12T13:56:00Z" w:id="1771925288">
         <w:r>
           <w:rPr>
             <w:rFonts w:ascii="Segoe UI Emoji" w:hAnsi="Segoe UI Emoji" w:cs="Segoe UI Emoji"/>
@@ -189,12 +55,18 @@
         <w:rPr>
           <w:rFonts w:ascii="Segoe UI Emoji" w:hAnsi="Segoe UI Emoji" w:cs="Segoe UI Emoji"/>
         </w:rPr>
-        <w:t>102</w:t>
-      </w:r>
-      <w:ins w:author="Rinse Cramer" w:date="2025-12-12T15:01:00Z" w16du:dateUtc="2025-12-12T14:01:00Z" w:id="1700685578">
+        <w:t>10</w:t>
+      </w:r>
+      <w:r>
+        <w:rPr>
+          <w:rFonts w:ascii="Segoe UI Emoji" w:hAnsi="Segoe UI Emoji" w:cs="Segoe UI Emoji"/>
+        </w:rPr>
+        <w:t>1</w:t>
+      </w:r>
+      <w:ins w:author="Rinse Cramer" w:date="2025-12-12T15:01:00Z" w16du:dateUtc="2025-12-12T14:01:00Z" w:id="327262843">
         <w:r>
           <w:rPr>
-            <w:rPrChange w:author="Rinse Cramer" w:date="2025-12-12T15:01:00Z" w16du:dateUtc="2025-12-12T14:01:00Z" w:id="913540555">
+            <w:rPrChange w:author="Rinse Cramer" w:date="2025-12-12T15:01:00Z" w16du:dateUtc="2025-12-12T14:01:00Z" w:id="1694664295">
               <w:rPr>
                 <w:rFonts w:ascii="Segoe UI Emoji" w:hAnsi="Segoe UI Emoji" w:cs="Segoe UI Emoji"/>
               </w:rPr>
@@ -209,7 +81,7 @@
           <w:t xml:space="preserve"> </w:t>
         </w:r>
       </w:ins>
-      <w:ins w:author="Rinse Cramer" w:date="2025-12-12T14:56:00Z" w16du:dateUtc="2025-12-12T13:56:00Z" w:id="2041555254">
+      <w:ins w:author="Rinse Cramer" w:date="2025-12-12T14:56:00Z" w16du:dateUtc="2025-12-12T13:56:00Z" w:id="1562775684">
         <w:r>
           <w:t>Start timer</w:t>
         </w:r>
@@ -222,16 +94,66 @@
           <w:ilvl w:val="0"/>
           <w:numId w:val="41"/>
         </w:numPr>
-        <w:rPr>
-          <w:ins w:author="Rinse Cramer" w:date="2025-12-12T14:57:00Z" w16du:dateUtc="2025-12-12T13:57:00Z" w:id="25"/>
-        </w:rPr>
-      </w:pPr>
-      <w:ins w:author="Rinse Cramer" w:date="2025-12-12T15:02:00Z" w16du:dateUtc="2025-12-12T14:02:00Z" w:id="26">
+        <w:rPr/>
+      </w:pPr>
+      <w:r>
+        <w:rPr/>
+        <w:t>1. Jira-uitvoerder is medewerker</w:t>
+      </w:r>
+    </w:p>
+    <w:p>
+      <w:pPr>
+        <w:pStyle w:val="ListParagraph"/>
+        <w:numPr>
+          <w:ilvl w:val="0"/>
+          <w:numId w:val="41"/>
+        </w:numPr>
+        <w:rPr/>
+      </w:pPr>
+      <w:r>
+        <w:rPr/>
+        <w:t>2. Jira-status is Toegewezen of Review aanpak</w:t>
+      </w:r>
+    </w:p>
+    <w:p>
+      <w:pPr>
+        <w:pStyle w:val="ListParagraph"/>
+        <w:numPr>
+          <w:ilvl w:val="0"/>
+          <w:numId w:val="41"/>
+        </w:numPr>
+        <w:rPr/>
+      </w:pPr>
+      <w:r>
+        <w:rPr/>
+        <w:t xml:space="preserve">3. </w:t>
+      </w:r>
+      <w:r>
+        <w:rPr/>
+        <w:t>Jira</w:t>
+      </w:r>
+      <w:r>
+        <w:rPr/>
+        <w:t>-status wordt Intake</w:t>
+      </w:r>
+    </w:p>
+    <w:p>
+      <w:pPr>
+        <w:pStyle w:val="ListParagraph"/>
+        <w:numPr>
+          <w:ilvl w:val="0"/>
+          <w:numId w:val="41"/>
+        </w:numPr>
+        <w:rPr>
+          <w:ins w:author="Rinse Cramer" w:date="2025-12-12T14:57:00Z" w16du:dateUtc="2025-12-12T13:57:00Z" w:id="660401149"/>
+        </w:rPr>
+      </w:pPr>
+      <w:ins w:author="Rinse Cramer" w:date="2025-12-12T15:02:00Z" w16du:dateUtc="2025-12-12T14:02:00Z" w:id="973316374">
         <w:r>
           <w:t>4</w:t>
         </w:r>
       </w:ins>
-      <w:ins w:author="Rinse Cramer" w:date="2025-12-12T14:57:00Z" w16du:dateUtc="2025-12-12T13:57:00Z" w:id="27">
+      <w:ins w:author="Rinse Cramer" w:date="2025-12-12T14:57:00Z" w16du:dateUtc="2025-12-12T13:57:00Z" w:id="1685961240">
         <w:r>
           <w:t xml:space="preserve">. </w:t>
         </w:r>
@@ -242,7 +164,7 @@
           <w:t xml:space="preserve"> &gt; </w:t>
         </w:r>
       </w:ins>
-      <w:ins w:author="Rinse Cramer" w:date="2025-12-12T14:58:00Z" w16du:dateUtc="2025-12-12T13:58:00Z" w:id="28">
+      <w:ins w:author="Rinse Cramer" w:date="2025-12-12T14:58:00Z" w16du:dateUtc="2025-12-12T13:58:00Z" w:id="1836708893">
         <w:r>
           <w:t>menu &gt; Timer</w:t>
         </w:r>
@@ -317,10 +239,10 @@
       <w:pPr>
         <w:pStyle w:val="Heading1"/>
         <w:rPr>
-          <w:ins w:author="Rinse Cramer" w:date="2025-12-12T15:47:00Z" w16du:dateUtc="2025-12-12T14:47:00Z" w:id="304397433"/>
-        </w:rPr>
-      </w:pPr>
-      <w:ins w:author="Rinse Cramer" w:date="2025-12-12T15:47:00Z" w16du:dateUtc="2025-12-12T14:47:00Z" w:id="1822368906">
+          <w:ins w:author="Rinse Cramer" w:date="2025-12-12T15:47:00Z" w16du:dateUtc="2025-12-12T14:47:00Z" w:id="155445795"/>
+        </w:rPr>
+      </w:pPr>
+      <w:ins w:author="Rinse Cramer" w:date="2025-12-12T15:47:00Z" w16du:dateUtc="2025-12-12T14:47:00Z" w:id="9929748">
         <w:r>
           <w:rPr>
             <w:rFonts w:ascii="Segoe UI Emoji" w:hAnsi="Segoe UI Emoji" w:cs="Segoe UI Emoji"/>
@@ -332,9 +254,15 @@
         <w:rPr>
           <w:rFonts w:ascii="Segoe UI Emoji" w:hAnsi="Segoe UI Emoji" w:cs="Segoe UI Emoji"/>
         </w:rPr>
-        <w:t>103</w:t>
-      </w:r>
-      <w:ins w:author="Rinse Cramer" w:date="2025-12-12T15:47:00Z" w16du:dateUtc="2025-12-12T14:47:00Z" w:id="679672771">
+        <w:t>10</w:t>
+      </w:r>
+      <w:r>
+        <w:rPr>
+          <w:rFonts w:ascii="Segoe UI Emoji" w:hAnsi="Segoe UI Emoji" w:cs="Segoe UI Emoji"/>
+        </w:rPr>
+        <w:t>2</w:t>
+      </w:r>
+      <w:ins w:author="Rinse Cramer" w:date="2025-12-12T15:47:00Z" w16du:dateUtc="2025-12-12T14:47:00Z" w:id="1764607164">
         <w:r>
           <w:t>.</w:t>
         </w:r>
@@ -394,10 +322,10 @@
       <w:pPr>
         <w:pStyle w:val="Heading1"/>
         <w:rPr>
-          <w:ins w:author="Rinse Cramer" w:date="2025-12-12T15:50:00Z" w16du:dateUtc="2025-12-12T14:50:00Z" w:id="67542946"/>
-        </w:rPr>
-      </w:pPr>
-      <w:ins w:author="Rinse Cramer" w:date="2025-12-12T15:50:00Z" w16du:dateUtc="2025-12-12T14:50:00Z" w:id="1874681355">
+          <w:ins w:author="Rinse Cramer" w:date="2025-12-12T15:50:00Z" w16du:dateUtc="2025-12-12T14:50:00Z" w:id="973264656"/>
+        </w:rPr>
+      </w:pPr>
+      <w:ins w:author="Rinse Cramer" w:date="2025-12-12T15:50:00Z" w16du:dateUtc="2025-12-12T14:50:00Z" w:id="2088993571">
         <w:r>
           <w:rPr>
             <w:rFonts w:ascii="Segoe UI Emoji" w:hAnsi="Segoe UI Emoji" w:cs="Segoe UI Emoji"/>
@@ -409,9 +337,15 @@
         <w:rPr>
           <w:rFonts w:ascii="Segoe UI Emoji" w:hAnsi="Segoe UI Emoji" w:cs="Segoe UI Emoji"/>
         </w:rPr>
-        <w:t>104</w:t>
-      </w:r>
-      <w:ins w:author="Rinse Cramer" w:date="2025-12-12T15:50:00Z" w16du:dateUtc="2025-12-12T14:50:00Z" w:id="1599396030">
+        <w:t>10</w:t>
+      </w:r>
+      <w:r>
+        <w:rPr>
+          <w:rFonts w:ascii="Segoe UI Emoji" w:hAnsi="Segoe UI Emoji" w:cs="Segoe UI Emoji"/>
+        </w:rPr>
+        <w:t>3</w:t>
+      </w:r>
+      <w:ins w:author="Rinse Cramer" w:date="2025-12-12T15:50:00Z" w16du:dateUtc="2025-12-12T14:50:00Z" w:id="1110916925">
         <w:r>
           <w:t>.</w:t>
         </w:r>
@@ -425,12 +359,12 @@
           <w:t>Deliverab</w:t>
         </w:r>
       </w:ins>
-      <w:ins w:author="Rinse Cramer" w:date="2025-12-12T15:51:00Z" w16du:dateUtc="2025-12-12T14:51:00Z" w:id="123456949">
+      <w:ins w:author="Rinse Cramer" w:date="2025-12-12T15:51:00Z" w16du:dateUtc="2025-12-12T14:51:00Z" w:id="1967411785">
         <w:r>
           <w:t>le specificatie</w:t>
         </w:r>
       </w:ins>
-      <w:ins w:author="Rinse Cramer" w:date="2025-12-12T15:50:00Z" w16du:dateUtc="2025-12-12T14:50:00Z" w:id="1219538507">
+      <w:ins w:author="Rinse Cramer" w:date="2025-12-12T15:50:00Z" w16du:dateUtc="2025-12-12T14:50:00Z" w:id="2088034926">
         <w:r>
           <w:t>:</w:t>
         </w:r>
@@ -481,10 +415,10 @@
       <w:pPr>
         <w:pStyle w:val="Heading1"/>
         <w:rPr>
-          <w:ins w:author="Rinse Cramer" w:date="2025-12-12T15:54:00Z" w16du:dateUtc="2025-12-12T14:54:00Z" w:id="1146705402"/>
-        </w:rPr>
-      </w:pPr>
-      <w:ins w:author="Rinse Cramer" w:date="2025-12-12T15:54:00Z" w16du:dateUtc="2025-12-12T14:54:00Z" w:id="490584167">
+          <w:ins w:author="Rinse Cramer" w:date="2025-12-12T15:54:00Z" w16du:dateUtc="2025-12-12T14:54:00Z" w:id="931601798"/>
+        </w:rPr>
+      </w:pPr>
+      <w:ins w:author="Rinse Cramer" w:date="2025-12-12T15:54:00Z" w16du:dateUtc="2025-12-12T14:54:00Z" w:id="1861334062">
         <w:r>
           <w:rPr>
             <w:rFonts w:ascii="Segoe UI Emoji" w:hAnsi="Segoe UI Emoji" w:cs="Segoe UI Emoji"/>
@@ -496,9 +430,15 @@
         <w:rPr>
           <w:rFonts w:ascii="Segoe UI Emoji" w:hAnsi="Segoe UI Emoji" w:cs="Segoe UI Emoji"/>
         </w:rPr>
-        <w:t>105</w:t>
-      </w:r>
-      <w:ins w:author="Rinse Cramer" w:date="2025-12-12T15:54:00Z" w16du:dateUtc="2025-12-12T14:54:00Z" w:id="996979080">
+        <w:t>10</w:t>
+      </w:r>
+      <w:r>
+        <w:rPr>
+          <w:rFonts w:ascii="Segoe UI Emoji" w:hAnsi="Segoe UI Emoji" w:cs="Segoe UI Emoji"/>
+        </w:rPr>
+        <w:t>4</w:t>
+      </w:r>
+      <w:ins w:author="Rinse Cramer" w:date="2025-12-12T15:54:00Z" w16du:dateUtc="2025-12-12T14:54:00Z" w:id="2078067194">
         <w:r>
           <w:t>.</w:t>
         </w:r>
@@ -566,10 +506,10 @@
       <w:pPr>
         <w:pStyle w:val="Heading1"/>
         <w:rPr>
-          <w:ins w:author="Rinse Cramer" w:date="2025-12-12T15:59:00Z" w16du:dateUtc="2025-12-12T14:59:00Z" w:id="1577621866"/>
-        </w:rPr>
-      </w:pPr>
-      <w:ins w:author="Rinse Cramer" w:date="2025-12-12T15:59:00Z" w16du:dateUtc="2025-12-12T14:59:00Z" w:id="754867864">
+          <w:ins w:author="Rinse Cramer" w:date="2025-12-12T15:59:00Z" w16du:dateUtc="2025-12-12T14:59:00Z" w:id="950891234"/>
+        </w:rPr>
+      </w:pPr>
+      <w:ins w:author="Rinse Cramer" w:date="2025-12-12T15:59:00Z" w16du:dateUtc="2025-12-12T14:59:00Z" w:id="601437446">
         <w:r>
           <w:rPr>
             <w:rFonts w:ascii="Segoe UI Emoji" w:hAnsi="Segoe UI Emoji" w:cs="Segoe UI Emoji"/>
@@ -581,9 +521,15 @@
         <w:rPr>
           <w:rFonts w:ascii="Segoe UI Emoji" w:hAnsi="Segoe UI Emoji" w:cs="Segoe UI Emoji"/>
         </w:rPr>
-        <w:t>106</w:t>
-      </w:r>
-      <w:ins w:author="Rinse Cramer" w:date="2025-12-12T15:59:00Z" w16du:dateUtc="2025-12-12T14:59:00Z" w:id="2077691272">
+        <w:t>10</w:t>
+      </w:r>
+      <w:r>
+        <w:rPr>
+          <w:rFonts w:ascii="Segoe UI Emoji" w:hAnsi="Segoe UI Emoji" w:cs="Segoe UI Emoji"/>
+        </w:rPr>
+        <w:t>5</w:t>
+      </w:r>
+      <w:ins w:author="Rinse Cramer" w:date="2025-12-12T15:59:00Z" w16du:dateUtc="2025-12-12T14:59:00Z" w:id="2037601846">
         <w:r>
           <w:t>.</w:t>
         </w:r>
@@ -671,11 +617,11 @@
       <w:pPr>
         <w:pStyle w:val="Heading1"/>
         <w:rPr>
-          <w:ins w:author="Rinse Cramer" w:date="2025-12-13T10:41:00Z" w16du:dateUtc="2025-12-13T09:41:00Z" w:id="485689805"/>
+          <w:ins w:author="Rinse Cramer" w:date="2025-12-13T10:41:00Z" w16du:dateUtc="2025-12-13T09:41:00Z" w:id="1493075720"/>
           <w:rFonts w:cs="Segoe UI Emoji"/>
         </w:rPr>
       </w:pPr>
-      <w:ins w:author="Rinse Cramer" w:date="2025-12-12T15:59:00Z" w16du:dateUtc="2025-12-12T14:59:00Z" w:id="1728359377">
+      <w:ins w:author="Rinse Cramer" w:date="2025-12-12T15:59:00Z" w16du:dateUtc="2025-12-12T14:59:00Z" w:id="447676862">
         <w:r>
           <w:rPr>
             <w:rFonts w:ascii="Segoe UI Emoji" w:hAnsi="Segoe UI Emoji" w:cs="Segoe UI Emoji"/>
@@ -683,7 +629,7 @@
           <w:t>⏱️</w:t>
         </w:r>
       </w:ins>
-      <w:ins w:author="Rinse Cramer" w:date="2025-12-13T10:41:00Z" w16du:dateUtc="2025-12-13T09:41:00Z" w:id="1994455934">
+      <w:ins w:author="Rinse Cramer" w:date="2025-12-13T10:41:00Z" w16du:dateUtc="2025-12-13T09:41:00Z" w:id="1211584859">
         <w:r>
           <w:rPr>
             <w:rFonts w:cs="Segoe UI Emoji"/>
@@ -695,9 +641,15 @@
         <w:rPr>
           <w:rFonts w:cs="Segoe UI Emoji"/>
         </w:rPr>
-        <w:t>107</w:t>
-      </w:r>
-      <w:ins w:author="Rinse Cramer" w:date="2025-12-13T10:41:00Z" w16du:dateUtc="2025-12-13T09:41:00Z" w:id="1259323753">
+        <w:t>10</w:t>
+      </w:r>
+      <w:r>
+        <w:rPr>
+          <w:rFonts w:cs="Segoe UI Emoji"/>
+        </w:rPr>
+        <w:t>6</w:t>
+      </w:r>
+      <w:ins w:author="Rinse Cramer" w:date="2025-12-13T10:41:00Z" w16du:dateUtc="2025-12-13T09:41:00Z" w:id="1267681824">
         <w:r>
           <w:rPr>
             <w:rFonts w:cs="Segoe UI Emoji"/>
@@ -711,7 +663,7 @@
         </w:rPr>
         <w:t>Bijzonderheden gezien</w:t>
       </w:r>
-      <w:ins w:author="Rinse Cramer" w:date="2025-12-13T10:41:00Z" w16du:dateUtc="2025-12-13T09:41:00Z" w:id="287525138">
+      <w:ins w:author="Rinse Cramer" w:date="2025-12-13T10:41:00Z" w16du:dateUtc="2025-12-13T09:41:00Z" w:id="1534872363">
         <w:r>
           <w:rPr>
             <w:rFonts w:cs="Segoe UI Emoji"/>
@@ -759,11 +711,11 @@
       <w:pPr>
         <w:pStyle w:val="Heading1"/>
         <w:rPr>
-          <w:ins w:author="Rinse Cramer" w:date="2025-12-13T10:42:00Z" w16du:dateUtc="2025-12-13T09:42:00Z" w:id="985375171"/>
+          <w:ins w:author="Rinse Cramer" w:date="2025-12-13T10:42:00Z" w16du:dateUtc="2025-12-13T09:42:00Z" w:id="1508207732"/>
           <w:rFonts w:cs="Segoe UI Emoji"/>
         </w:rPr>
       </w:pPr>
-      <w:ins w:author="Rinse Cramer" w:date="2025-12-12T15:59:00Z" w16du:dateUtc="2025-12-12T14:59:00Z" w:id="1689948066">
+      <w:ins w:author="Rinse Cramer" w:date="2025-12-12T15:59:00Z" w16du:dateUtc="2025-12-12T14:59:00Z" w:id="779844275">
         <w:r>
           <w:rPr>
             <w:rFonts w:ascii="Segoe UI Emoji" w:hAnsi="Segoe UI Emoji" w:cs="Segoe UI Emoji"/>
@@ -771,7 +723,7 @@
           <w:t>⏱️</w:t>
         </w:r>
       </w:ins>
-      <w:ins w:author="Rinse Cramer" w:date="2025-12-13T10:42:00Z" w16du:dateUtc="2025-12-13T09:42:00Z" w:id="1906288925">
+      <w:ins w:author="Rinse Cramer" w:date="2025-12-13T10:42:00Z" w16du:dateUtc="2025-12-13T09:42:00Z" w:id="1502889812">
         <w:r>
           <w:rPr>
             <w:rFonts w:cs="Segoe UI Emoji"/>
@@ -783,9 +735,21 @@
         <w:rPr>
           <w:rFonts w:cs="Segoe UI Emoji"/>
         </w:rPr>
-        <w:t>107T</w:t>
-      </w:r>
-      <w:ins w:author="Rinse Cramer" w:date="2025-12-13T10:42:00Z" w16du:dateUtc="2025-12-13T09:42:00Z" w:id="1105513460">
+        <w:t>10</w:t>
+      </w:r>
+      <w:r>
+        <w:rPr>
+          <w:rFonts w:cs="Segoe UI Emoji"/>
+        </w:rPr>
+        <w:t>6</w:t>
+      </w:r>
+      <w:r>
+        <w:rPr>
+          <w:rFonts w:cs="Segoe UI Emoji"/>
+        </w:rPr>
+        <w:t>T</w:t>
+      </w:r>
+      <w:ins w:author="Rinse Cramer" w:date="2025-12-13T10:42:00Z" w16du:dateUtc="2025-12-13T09:42:00Z" w:id="339001995">
         <w:r>
           <w:rPr>
             <w:rFonts w:cs="Segoe UI Emoji"/>
@@ -845,10 +809,10 @@
       <w:pPr>
         <w:pStyle w:val="Heading1"/>
         <w:rPr>
-          <w:ins w:author="Rinse Cramer" w:date="2025-12-12T16:04:00Z" w16du:dateUtc="2025-12-12T15:04:00Z" w:id="1739631860"/>
-        </w:rPr>
-      </w:pPr>
-      <w:ins w:author="Rinse Cramer" w:date="2025-12-12T16:04:00Z" w16du:dateUtc="2025-12-12T15:04:00Z" w:id="1658970261">
+          <w:ins w:author="Rinse Cramer" w:date="2025-12-12T16:04:00Z" w16du:dateUtc="2025-12-12T15:04:00Z" w:id="2128375689"/>
+        </w:rPr>
+      </w:pPr>
+      <w:ins w:author="Rinse Cramer" w:date="2025-12-12T16:04:00Z" w16du:dateUtc="2025-12-12T15:04:00Z" w:id="955906759">
         <w:r>
           <w:rPr>
             <w:rFonts w:ascii="Segoe UI Emoji" w:hAnsi="Segoe UI Emoji" w:cs="Segoe UI Emoji"/>
@@ -872,9 +836,21 @@
         <w:rPr>
           <w:rFonts w:ascii="Segoe UI Emoji" w:hAnsi="Segoe UI Emoji" w:cs="Segoe UI Emoji"/>
         </w:rPr>
-        <w:t>107F</w:t>
-      </w:r>
-      <w:ins w:author="Rinse Cramer" w:date="2025-12-12T16:04:00Z" w16du:dateUtc="2025-12-12T15:04:00Z" w:id="587520839">
+        <w:t>10</w:t>
+      </w:r>
+      <w:r>
+        <w:rPr>
+          <w:rFonts w:ascii="Segoe UI Emoji" w:hAnsi="Segoe UI Emoji" w:cs="Segoe UI Emoji"/>
+        </w:rPr>
+        <w:t>6</w:t>
+      </w:r>
+      <w:r>
+        <w:rPr>
+          <w:rFonts w:ascii="Segoe UI Emoji" w:hAnsi="Segoe UI Emoji" w:cs="Segoe UI Emoji"/>
+        </w:rPr>
+        <w:t>F</w:t>
+      </w:r>
+      <w:ins w:author="Rinse Cramer" w:date="2025-12-12T16:04:00Z" w16du:dateUtc="2025-12-12T15:04:00Z" w:id="922480674">
         <w:r>
           <w:t>.</w:t>
         </w:r>
@@ -889,7 +865,7 @@
         </w:r>
         <w:r>
           <w:rPr>
-            <w:rPrChange w:author="Rinse Cramer" w:date="2025-12-12T16:04:00Z" w16du:dateUtc="2025-12-12T15:04:00Z" w:id="785577047">
+            <w:rPrChange w:author="Rinse Cramer" w:date="2025-12-12T16:04:00Z" w16du:dateUtc="2025-12-12T15:04:00Z" w:id="424009191">
               <w:rPr>
                 <w:lang w:val="en-US"/>
               </w:rPr>
@@ -908,7 +884,7 @@
         </w:numPr>
         <w:rPr/>
       </w:pPr>
-      <w:ins w:author="Rinse Cramer" w:date="2025-12-13T10:24:00Z" w16du:dateUtc="2025-12-13T09:24:00Z" w:id="374561932">
+      <w:ins w:author="Rinse Cramer" w:date="2025-12-13T10:24:00Z" w16du:dateUtc="2025-12-13T09:24:00Z" w:id="420432222">
         <w:r>
           <w:rPr>
             <w:lang w:val="en-US"/>
@@ -922,7 +898,7 @@
         </w:rPr>
         <w:t>4</w:t>
       </w:r>
-      <w:ins w:author="Rinse Cramer" w:date="2025-12-12T16:04:00Z" w16du:dateUtc="2025-12-12T15:04:00Z" w:id="640708671">
+      <w:ins w:author="Rinse Cramer" w:date="2025-12-12T16:04:00Z" w16du:dateUtc="2025-12-12T15:04:00Z" w:id="1390081310">
         <w:r>
           <w:rPr>
             <w:lang w:val="en-US"/>
@@ -936,106 +912,26 @@
           <w:t>pagina</w:t>
         </w:r>
         <w:r>
-          <w:t xml:space="preserve"> navigeren</w:t>
+          <w:t xml:space="preserve"> nav</w:t>
+        </w:r>
+        <w:r>
+          <w:t>igeren</w:t>
         </w:r>
       </w:ins>
     </w:p>
     <w:p>
       <w:pPr>
         <w:pStyle w:val="Heading1"/>
+        <w:rPr>
+          <w:ins w:author="Rinse Cramer" w:date="2025-12-13T10:34:00Z" w16du:dateUtc="2025-12-13T09:34:00Z" w:id="1091435869"/>
+          <w:rFonts w:cs="Segoe UI Emoji"/>
+        </w:rPr>
       </w:pPr>
       <w:r>
         <w:rPr/>
         <w:t>🤝🏻</w:t>
       </w:r>
-      <w:r>
-        <w:rPr>
-          <w:lang w:val="en-US"/>
-        </w:rPr>
-        <w:t xml:space="preserve"> 201. Issue [intake </w:t>
-      </w:r>
-      <w:r>
-        <w:rPr>
-          <w:lang w:val="en-US"/>
-        </w:rPr>
-        <w:t>voltooid</w:t>
-      </w:r>
-      <w:r>
-        <w:rPr>
-          <w:lang w:val="en-US"/>
-        </w:rPr>
-        <w:t>]</w:t>
-      </w:r>
-    </w:p>
-    <w:p>
-      <w:pPr>
-        <w:pStyle w:val="ListParagraph"/>
-        <w:numPr>
-          <w:ilvl w:val="0"/>
-          <w:numId w:val="41"/>
-        </w:numPr>
-        <w:rPr/>
-      </w:pPr>
-      <w:r>
-        <w:rPr/>
-        <w:t>1. Jira-uitvoerder is medewerken</w:t>
-      </w:r>
-    </w:p>
-    <w:p>
-      <w:pPr>
-        <w:pStyle w:val="ListParagraph"/>
-        <w:numPr>
-          <w:ilvl w:val="0"/>
-          <w:numId w:val="41"/>
-        </w:numPr>
-        <w:rPr>
-          <w:ins w:author="Rinse Cramer" w:date="2025-12-13T10:33:00Z" w16du:dateUtc="2025-12-13T09:33:00Z" w:id="1691636752"/>
-        </w:rPr>
-      </w:pPr>
-      <w:ins w:author="Rinse Cramer" w:date="2025-12-13T10:33:00Z" w16du:dateUtc="2025-12-13T09:33:00Z" w:id="1283526933">
-        <w:r>
-          <w:t xml:space="preserve">2. </w:t>
-        </w:r>
-        <w:r>
-          <w:t>Jira-status is Intake</w:t>
-        </w:r>
-      </w:ins>
-    </w:p>
-    <w:p>
-      <w:pPr>
-        <w:pStyle w:val="ListParagraph"/>
-        <w:numPr>
-          <w:ilvl w:val="0"/>
-          <w:numId w:val="41"/>
-        </w:numPr>
-        <w:rPr>
-          <w:ins w:author="Rinse Cramer" w:date="2025-12-13T10:34:00Z" w16du:dateUtc="2025-12-13T09:34:00Z" w:id="144"/>
-        </w:rPr>
-      </w:pPr>
-      <w:ins w:author="Rinse Cramer" w:date="2025-12-13T10:33:00Z" w16du:dateUtc="2025-12-13T09:33:00Z" w:id="347886086">
-        <w:r>
-          <w:t xml:space="preserve">3. </w:t>
-        </w:r>
-      </w:ins>
-      <w:ins w:author="Rinse Cramer" w:date="2025-12-13T10:34:00Z" w16du:dateUtc="2025-12-13T09:34:00Z" w:id="1413428256">
-        <w:r>
-          <w:t>Jira-status wordt Review aanpak</w:t>
-        </w:r>
-      </w:ins>
-    </w:p>
-    <w:p>
-      <w:pPr>
-        <w:pStyle w:val="Heading1"/>
-        <w:rPr>
-          <w:ins w:author="Rinse Cramer" w:date="2025-12-13T10:34:00Z" w16du:dateUtc="2025-12-13T09:34:00Z" w:id="504509543"/>
-          <w:rFonts w:cs="Segoe UI Emoji"/>
-        </w:rPr>
-      </w:pPr>
-      <w:r>
-        <w:rPr/>
-        <w:t>🤝🏻</w:t>
-      </w:r>
-      <w:ins w:author="Rinse Cramer" w:date="2025-12-13T10:34:00Z" w16du:dateUtc="2025-12-13T09:34:00Z" w:id="1575137439">
+      <w:ins w:author="Rinse Cramer" w:date="2025-12-13T10:34:00Z" w16du:dateUtc="2025-12-13T09:34:00Z" w:id="1486455748">
         <w:r>
           <w:rPr>
             <w:rFonts w:cs="Segoe UI Emoji"/>
@@ -1047,9 +943,15 @@
         <w:rPr>
           <w:rFonts w:cs="Segoe UI Emoji"/>
         </w:rPr>
-        <w:t>202</w:t>
-      </w:r>
-      <w:ins w:author="Rinse Cramer" w:date="2025-12-13T10:34:00Z" w16du:dateUtc="2025-12-13T09:34:00Z" w:id="1277300960">
+        <w:t>20</w:t>
+      </w:r>
+      <w:r>
+        <w:rPr>
+          <w:rFonts w:cs="Segoe UI Emoji"/>
+        </w:rPr>
+        <w:t>1</w:t>
+      </w:r>
+      <w:ins w:author="Rinse Cramer" w:date="2025-12-13T10:34:00Z" w16du:dateUtc="2025-12-13T09:34:00Z" w:id="1137250088">
         <w:r>
           <w:rPr>
             <w:rFonts w:cs="Segoe UI Emoji"/>
@@ -1057,11 +959,11 @@
           <w:t xml:space="preserve">. </w:t>
         </w:r>
       </w:ins>
-      <w:ins w:author="Rinse Cramer" w:date="2025-12-13T10:35:00Z" w16du:dateUtc="2025-12-13T09:35:00Z" w:id="856038226">
+      <w:ins w:author="Rinse Cramer" w:date="2025-12-13T10:35:00Z" w16du:dateUtc="2025-12-13T09:35:00Z" w:id="104577039">
         <w:r>
           <w:rPr>
             <w:rFonts w:cs="Segoe UI Emoji"/>
-            <w:rPrChange w:author="Rinse Cramer" w:date="2025-12-13T10:35:00Z" w16du:dateUtc="2025-12-13T09:35:00Z" w:id="1956437832">
+            <w:rPrChange w:author="Rinse Cramer" w:date="2025-12-13T10:35:00Z" w16du:dateUtc="2025-12-13T09:35:00Z" w:id="1054651853">
               <w:rPr>
                 <w:rFonts w:cs="Segoe UI Emoji"/>
                 <w:lang w:val="en-US"/>
@@ -1079,36 +981,78 @@
           <w:ilvl w:val="0"/>
           <w:numId w:val="41"/>
         </w:numPr>
-        <w:rPr>
-          <w:ins w:author="Rinse Cramer" w:date="2025-12-13T10:34:00Z" w16du:dateUtc="2025-12-13T09:34:00Z" w:id="151"/>
-        </w:rPr>
-      </w:pPr>
-      <w:ins w:author="Rinse Cramer" w:date="2025-12-13T10:43:00Z" w16du:dateUtc="2025-12-13T09:43:00Z" w:id="152">
+        <w:rPr/>
+      </w:pPr>
+      <w:r>
+        <w:rPr/>
+        <w:t>1. Jira-uitvoerder is medewerker</w:t>
+      </w:r>
+    </w:p>
+    <w:p>
+      <w:pPr>
+        <w:pStyle w:val="ListParagraph"/>
+        <w:numPr>
+          <w:ilvl w:val="0"/>
+          <w:numId w:val="41"/>
+        </w:numPr>
+        <w:rPr/>
+      </w:pPr>
+      <w:r>
+        <w:rPr/>
+        <w:t>2. Jira-status is Intake</w:t>
+      </w:r>
+    </w:p>
+    <w:p>
+      <w:pPr>
+        <w:pStyle w:val="ListParagraph"/>
+        <w:numPr>
+          <w:ilvl w:val="0"/>
+          <w:numId w:val="41"/>
+        </w:numPr>
+        <w:rPr/>
+      </w:pPr>
+      <w:r>
+        <w:rPr/>
+        <w:t>3. Jira-status wordt Review aanpak</w:t>
+      </w:r>
+    </w:p>
+    <w:p>
+      <w:pPr>
+        <w:pStyle w:val="ListParagraph"/>
+        <w:numPr>
+          <w:ilvl w:val="0"/>
+          <w:numId w:val="41"/>
+        </w:numPr>
+        <w:rPr>
+          <w:ins w:author="Rinse Cramer" w:date="2025-12-13T10:34:00Z" w16du:dateUtc="2025-12-13T09:34:00Z" w:id="1756747090"/>
+        </w:rPr>
+      </w:pPr>
+      <w:ins w:author="Rinse Cramer" w:date="2025-12-13T10:43:00Z" w16du:dateUtc="2025-12-13T09:43:00Z" w:id="99644789">
         <w:r>
           <w:t>4</w:t>
         </w:r>
       </w:ins>
-      <w:ins w:author="Rinse Cramer" w:date="2025-12-13T10:34:00Z" w16du:dateUtc="2025-12-13T09:34:00Z" w:id="153">
+      <w:ins w:author="Rinse Cramer" w:date="2025-12-13T10:34:00Z" w16du:dateUtc="2025-12-13T09:34:00Z" w:id="2020523209">
         <w:r>
           <w:t xml:space="preserve">. </w:t>
         </w:r>
       </w:ins>
-      <w:ins w:author="Rinse Cramer" w:date="2025-12-13T10:35:00Z" w16du:dateUtc="2025-12-13T09:35:00Z" w:id="154">
+      <w:ins w:author="Rinse Cramer" w:date="2025-12-13T10:35:00Z" w16du:dateUtc="2025-12-13T09:35:00Z" w:id="1299488522">
         <w:r>
           <w:t>Baas</w:t>
         </w:r>
       </w:ins>
-      <w:ins w:author="Rinse Cramer" w:date="2025-12-13T10:34:00Z" w16du:dateUtc="2025-12-13T09:34:00Z" w:id="155">
+      <w:ins w:author="Rinse Cramer" w:date="2025-12-13T10:34:00Z" w16du:dateUtc="2025-12-13T09:34:00Z" w:id="762691753">
         <w:r>
           <w:t xml:space="preserve"> is </w:t>
         </w:r>
       </w:ins>
-      <w:ins w:author="Rinse Cramer" w:date="2025-12-13T10:35:00Z" w16du:dateUtc="2025-12-13T09:35:00Z" w:id="156">
+      <w:ins w:author="Rinse Cramer" w:date="2025-12-13T10:35:00Z" w16du:dateUtc="2025-12-13T09:35:00Z" w:id="1408071234">
         <w:r>
           <w:t>mondeling beschikbaar</w:t>
         </w:r>
       </w:ins>
-      <w:ins w:author="Rinse Cramer" w:date="2025-12-13T10:36:00Z" w16du:dateUtc="2025-12-13T09:36:00Z" w:id="157">
+      <w:ins w:author="Rinse Cramer" w:date="2025-12-13T10:36:00Z" w16du:dateUtc="2025-12-13T09:36:00Z" w:id="513438299">
         <w:r>
           <w:t>?</w:t>
         </w:r>
@@ -1202,7 +1146,7 @@
       <w:pPr>
         <w:pStyle w:val="Heading1"/>
         <w:rPr>
-          <w:ins w:author="Rinse Cramer" w:date="2025-12-13T10:40:00Z" w16du:dateUtc="2025-12-13T09:40:00Z" w:id="1163286472"/>
+          <w:ins w:author="Rinse Cramer" w:date="2025-12-13T10:40:00Z" w16du:dateUtc="2025-12-13T09:40:00Z" w:id="1598204147"/>
           <w:rFonts w:cs="Segoe UI Emoji"/>
         </w:rPr>
       </w:pPr>
@@ -1214,9 +1158,15 @@
         <w:rPr>
           <w:rFonts w:cs="Segoe UI Emoji"/>
         </w:rPr>
-        <w:t xml:space="preserve"> 203</w:t>
-      </w:r>
-      <w:ins w:author="Rinse Cramer" w:date="2025-12-13T10:40:00Z" w16du:dateUtc="2025-12-13T09:40:00Z" w:id="1787601302">
+        <w:t xml:space="preserve"> 20</w:t>
+      </w:r>
+      <w:r>
+        <w:rPr>
+          <w:rFonts w:cs="Segoe UI Emoji"/>
+        </w:rPr>
+        <w:t>2</w:t>
+      </w:r>
+      <w:ins w:author="Rinse Cramer" w:date="2025-12-13T10:40:00Z" w16du:dateUtc="2025-12-13T09:40:00Z" w:id="110164577">
         <w:r>
           <w:rPr>
             <w:rFonts w:cs="Segoe UI Emoji"/>
@@ -1273,7 +1223,7 @@
       <w:pPr>
         <w:pStyle w:val="Heading1"/>
         <w:rPr>
-          <w:ins w:author="Rinse Cramer" w:date="2025-12-13T10:41:00Z" w16du:dateUtc="2025-12-13T09:41:00Z" w:id="1868913703"/>
+          <w:ins w:author="Rinse Cramer" w:date="2025-12-13T10:41:00Z" w16du:dateUtc="2025-12-13T09:41:00Z" w:id="1950436604"/>
           <w:rFonts w:cs="Segoe UI Emoji"/>
         </w:rPr>
       </w:pPr>
@@ -1285,9 +1235,21 @@
         <w:rPr>
           <w:rFonts w:cs="Segoe UI Emoji"/>
         </w:rPr>
-        <w:t xml:space="preserve"> 204. </w:t>
-      </w:r>
-      <w:ins w:author="Rinse Cramer" w:date="2025-12-13T10:41:00Z" w16du:dateUtc="2025-12-13T09:41:00Z" w:id="672245695">
+        <w:t xml:space="preserve"> 2</w:t>
+      </w:r>
+      <w:r>
+        <w:rPr>
+          <w:rFonts w:cs="Segoe UI Emoji"/>
+        </w:rPr>
+        <w:t>03</w:t>
+      </w:r>
+      <w:r>
+        <w:rPr>
+          <w:rFonts w:cs="Segoe UI Emoji"/>
+        </w:rPr>
+        <w:t xml:space="preserve">. </w:t>
+      </w:r>
+      <w:ins w:author="Rinse Cramer" w:date="2025-12-13T10:41:00Z" w16du:dateUtc="2025-12-13T09:41:00Z" w:id="2077923167">
         <w:r>
           <w:rPr>
             <w:rFonts w:cs="Segoe UI Emoji"/>
@@ -1337,7 +1299,7 @@
       <w:pPr>
         <w:pStyle w:val="Heading1"/>
         <w:rPr>
-          <w:ins w:author="Rinse Cramer" w:date="2025-12-13T10:42:00Z" w16du:dateUtc="2025-12-13T09:42:00Z" w:id="1599200984"/>
+          <w:ins w:author="Rinse Cramer" w:date="2025-12-13T10:42:00Z" w16du:dateUtc="2025-12-13T09:42:00Z" w:id="1149163331"/>
           <w:rFonts w:cs="Segoe UI Emoji"/>
         </w:rPr>
       </w:pPr>
@@ -1349,12 +1311,24 @@
         <w:rPr>
           <w:rFonts w:cs="Segoe UI Emoji"/>
         </w:rPr>
-        <w:t xml:space="preserve"> 204F. </w:t>
+        <w:t xml:space="preserve"> 20</w:t>
       </w:r>
       <w:r>
         <w:rPr>
           <w:rFonts w:cs="Segoe UI Emoji"/>
         </w:rPr>
+        <w:t>3</w:t>
+      </w:r>
+      <w:r>
+        <w:rPr>
+          <w:rFonts w:cs="Segoe UI Emoji"/>
+        </w:rPr>
+        <w:t xml:space="preserve">F. </w:t>
+      </w:r>
+      <w:r>
+        <w:rPr>
+          <w:rFonts w:cs="Segoe UI Emoji"/>
+        </w:rPr>
         <w:t>Volg de intake</w:t>
       </w:r>
     </w:p>
@@ -1415,7 +1389,7 @@
       <w:pPr>
         <w:pStyle w:val="Heading1"/>
         <w:rPr>
-          <w:ins w:author="Rinse Cramer" w:date="2025-12-13T10:44:00Z" w16du:dateUtc="2025-12-13T09:44:00Z" w:id="2001355156"/>
+          <w:ins w:author="Rinse Cramer" w:date="2025-12-13T10:44:00Z" w16du:dateUtc="2025-12-13T09:44:00Z" w:id="406546723"/>
           <w:rFonts w:cs="Segoe UI Emoji"/>
         </w:rPr>
       </w:pPr>
@@ -1427,9 +1401,21 @@
         <w:rPr>
           <w:rFonts w:cs="Segoe UI Emoji"/>
         </w:rPr>
-        <w:t xml:space="preserve"> 204T. </w:t>
-      </w:r>
-      <w:ins w:author="Rinse Cramer" w:date="2025-12-13T10:44:00Z" w16du:dateUtc="2025-12-13T09:44:00Z" w:id="706757145">
+        <w:t xml:space="preserve"> 20</w:t>
+      </w:r>
+      <w:r>
+        <w:rPr>
+          <w:rFonts w:cs="Segoe UI Emoji"/>
+        </w:rPr>
+        <w:t>3</w:t>
+      </w:r>
+      <w:r>
+        <w:rPr>
+          <w:rFonts w:cs="Segoe UI Emoji"/>
+        </w:rPr>
+        <w:t xml:space="preserve">T. </w:t>
+      </w:r>
+      <w:ins w:author="Rinse Cramer" w:date="2025-12-13T10:44:00Z" w16du:dateUtc="2025-12-13T09:44:00Z" w:id="1932957993">
         <w:r>
           <w:rPr>
             <w:rFonts w:cs="Segoe UI Emoji"/>
@@ -1446,131 +1432,30 @@
           <w:numId w:val="41"/>
         </w:numPr>
         <w:rPr>
-          <w:ins w:author="Rinse Cramer" w:date="2025-12-13T10:29:00Z" w16du:dateUtc="2025-12-13T09:29:00Z" w:id="199"/>
-          <w:rPrChange w:author="Rinse Cramer" w:date="2025-12-13T10:33:00Z" w16du:dateUtc="2025-12-13T09:33:00Z" w:id="200">
-            <w:rPr>
-              <w:ins w:author="Rinse Cramer" w:date="2025-12-13T10:29:00Z" w16du:dateUtc="2025-12-13T09:29:00Z" w:id="201"/>
-              <w:rFonts w:ascii="Segoe UI Emoji" w:hAnsi="Segoe UI Emoji" w:cs="Segoe UI Emoji"/>
-            </w:rPr>
-          </w:rPrChange>
-        </w:rPr>
-        <w:pPrChange w:author="Rinse Cramer" w:date="2025-12-13T10:37:00Z" w16du:dateUtc="2025-12-13T09:37:00Z" w:id="202">
+          <w:ins w:author="Rinse Cramer" w:date="2025-12-13T11:04:00Z" w16du:dateUtc="2025-12-13T10:04:00Z" w:id="1811143483"/>
+          <w:rPrChange w:author="" w16du:dateUtc="2025-12-13T09:33:00Z" w:id="1298327452"/>
+        </w:rPr>
+        <w:pPrChange w:author="Rinse Cramer" w:date="2025-12-13T10:37:00Z">
           <w:pPr>
             <w:pStyle w:val="Heading1"/>
           </w:pPr>
         </w:pPrChange>
       </w:pPr>
-      <w:ins w:author="Rinse Cramer" w:date="2025-12-13T10:44:00Z" w16du:dateUtc="2025-12-13T09:44:00Z" w:id="203">
+      <w:ins w:author="Rinse Cramer" w:date="2025-12-13T10:44:00Z" w16du:dateUtc="2025-12-13T09:44:00Z" w:id="896264890">
         <w:r>
           <w:t>1</w:t>
         </w:r>
       </w:ins>
-      <w:ins w:author="Rinse Cramer" w:date="2025-12-13T10:45:00Z" w16du:dateUtc="2025-12-13T09:45:00Z" w:id="204">
+      <w:ins w:author="Rinse Cramer" w:date="2025-12-13T10:45:00Z" w16du:dateUtc="2025-12-13T09:45:00Z" w:id="558169040">
         <w:r>
           <w:t>1</w:t>
         </w:r>
       </w:ins>
-      <w:ins w:author="Rinse Cramer" w:date="2025-12-13T10:44:00Z" w16du:dateUtc="2025-12-13T09:44:00Z" w:id="205">
+      <w:ins w:author="Rinse Cramer" w:date="2025-12-13T10:44:00Z" w16du:dateUtc="2025-12-13T09:44:00Z" w:id="1576241477">
         <w:r>
           <w:t>. Naar volgende flowchartpagina navigeren</w:t>
         </w:r>
       </w:ins>
-    </w:p>
-    <w:p>
-      <w:pPr>
-        <w:rPr>
-          <w:ins w:author="Rinse Cramer" w:date="2025-12-13T11:04:00Z" w16du:dateUtc="2025-12-13T10:04:00Z" w:id="206"/>
-          <w:rFonts w:ascii="Segoe UI Emoji" w:hAnsi="Segoe UI Emoji" w:cs="Segoe UI Emoji" w:eastAsiaTheme="majorEastAsia"/>
-          <w:color w:val="0F4761" w:themeColor="accent1" w:themeShade="BF"/>
-          <w:sz w:val="40"/>
-          <w:szCs w:val="40"/>
-        </w:rPr>
-      </w:pPr>
-      <w:ins w:author="Rinse Cramer" w:date="2025-12-13T11:04:00Z" w16du:dateUtc="2025-12-13T10:04:00Z" w:id="207">
-        <w:r>
-          <w:rPr>
-            <w:rFonts w:ascii="Segoe UI Emoji" w:hAnsi="Segoe UI Emoji" w:cs="Segoe UI Emoji"/>
-          </w:rPr>
-          <w:br w:type="page"/>
-        </w:r>
-      </w:ins>
-    </w:p>
-    <w:p>
-      <w:pPr>
-        <w:pStyle w:val="Heading1"/>
-        <w:rPr>
-          <w:rStyle w:val="Heading1Char"/>
-          <w:rPrChange w:author="" w16du:dateUtc="2025-12-13T09:31:00Z" w:id="755381447"/>
-        </w:rPr>
-      </w:pPr>
-      <w:r>
-        <w:rPr/>
-        <w:t xml:space="preserve">🔬 301. </w:t>
-      </w:r>
-      <w:r>
-        <w:rPr/>
-        <w:t>Issue [aanpak goedgekeurd]</w:t>
-      </w:r>
-    </w:p>
-    <w:p>
-      <w:pPr>
-        <w:pStyle w:val="ListParagraph"/>
-        <w:keepNext w:val="1"/>
-        <w:numPr>
-          <w:ilvl w:val="0"/>
-          <w:numId w:val="15"/>
-        </w:numPr>
-        <w:spacing w:after="0" w:line="240" w:lineRule="auto"/>
-        <w:rPr/>
-      </w:pPr>
-      <w:r>
-        <w:rPr/>
-        <w:t>1. Jira-uitvoerder is medewerker</w:t>
-      </w:r>
-    </w:p>
-    <w:p>
-      <w:pPr>
-        <w:pStyle w:val="ListParagraph"/>
-        <w:numPr>
-          <w:ilvl w:val="0"/>
-          <w:numId w:val="15"/>
-        </w:numPr>
-        <w:rPr/>
-      </w:pPr>
-      <w:r>
-        <w:rPr/>
-        <w:t xml:space="preserve">2. </w:t>
-      </w:r>
-      <w:r>
-        <w:rPr/>
-        <w:t>Jira</w:t>
-      </w:r>
-      <w:r>
-        <w:rPr/>
-        <w:t>-status is Review aanpak</w:t>
-      </w:r>
-    </w:p>
-    <w:p>
-      <w:pPr>
-        <w:pStyle w:val="ListParagraph"/>
-        <w:numPr>
-          <w:ilvl w:val="0"/>
-          <w:numId w:val="15"/>
-        </w:numPr>
-        <w:rPr/>
-      </w:pPr>
-      <w:r>
-        <w:rPr/>
-        <w:t xml:space="preserve">3. </w:t>
-      </w:r>
-      <w:r>
-        <w:rPr/>
-        <w:t>Jira</w:t>
-      </w:r>
-      <w:r>
-        <w:rPr/>
-        <w:t>-status wordt Analyse</w:t>
-      </w:r>
     </w:p>
     <w:p>
       <w:pPr>
@@ -1581,7 +1466,31 @@
         <w:rPr>
           <w:rStyle w:val="Heading1Char"/>
         </w:rPr>
-        <w:t>🔬 302. Start timer (ETC)</w:t>
+        <w:t>🔬 30</w:t>
+      </w:r>
+      <w:r>
+        <w:rPr>
+          <w:rStyle w:val="Heading1Char"/>
+        </w:rPr>
+        <w:t>1</w:t>
+      </w:r>
+      <w:r>
+        <w:rPr>
+          <w:rStyle w:val="Heading1Char"/>
+        </w:rPr>
+        <w:t xml:space="preserve">. </w:t>
+      </w:r>
+      <w:r>
+        <w:rPr>
+          <w:rStyle w:val="Heading1Char"/>
+        </w:rPr>
+        <w:t>Start timer</w:t>
+      </w:r>
+      <w:r>
+        <w:rPr>
+          <w:rStyle w:val="Heading1Char"/>
+        </w:rPr>
+        <w:t xml:space="preserve"> (ETC)</w:t>
       </w:r>
       <w:r>
         <w:rPr>
@@ -1614,6 +1523,48 @@
       </w:pPr>
       <w:r>
         <w:rPr/>
+        <w:t>1. Jira-uitvoerder is medewerker</w:t>
+      </w:r>
+    </w:p>
+    <w:p>
+      <w:pPr>
+        <w:pStyle w:val="ListParagraph"/>
+        <w:numPr>
+          <w:ilvl w:val="0"/>
+          <w:numId w:val="41"/>
+        </w:numPr>
+        <w:rPr/>
+      </w:pPr>
+      <w:r>
+        <w:rPr/>
+        <w:t>2. Jira-status is Review aanpak</w:t>
+      </w:r>
+    </w:p>
+    <w:p>
+      <w:pPr>
+        <w:pStyle w:val="ListParagraph"/>
+        <w:numPr>
+          <w:ilvl w:val="0"/>
+          <w:numId w:val="41"/>
+        </w:numPr>
+        <w:rPr/>
+      </w:pPr>
+      <w:r>
+        <w:rPr/>
+        <w:t>3. Jira-status wordt Analyse</w:t>
+      </w:r>
+    </w:p>
+    <w:p>
+      <w:pPr>
+        <w:pStyle w:val="ListParagraph"/>
+        <w:numPr>
+          <w:ilvl w:val="0"/>
+          <w:numId w:val="41"/>
+        </w:numPr>
+        <w:rPr/>
+      </w:pPr>
+      <w:r>
+        <w:rPr/>
         <w:t>4. Start &gt; Klok &gt; menu &gt; Timer</w:t>
       </w:r>
     </w:p>
@@ -1662,7 +1613,19 @@
         <w:rPr>
           <w:rStyle w:val="Heading1Char"/>
         </w:rPr>
-        <w:t xml:space="preserve">🔬 303. Intake verwerken</w:t>
+        <w:t xml:space="preserve">🔬 30</w:t>
+      </w:r>
+      <w:r>
+        <w:rPr>
+          <w:rStyle w:val="Heading1Char"/>
+        </w:rPr>
+        <w:t xml:space="preserve">2</w:t>
+      </w:r>
+      <w:r>
+        <w:rPr>
+          <w:rStyle w:val="Heading1Char"/>
+        </w:rPr>
+        <w:t xml:space="preserve">. Intake verwerken</w:t>
       </w:r>
       <w:r/>
     </w:p>
@@ -1672,7 +1635,15 @@
       </w:pPr>
       <w:r>
         <w:rPr/>
-        <w:t>🔬 304. Oplossing analyseren</w:t>
+        <w:t>🔬 30</w:t>
+      </w:r>
+      <w:r>
+        <w:rPr/>
+        <w:t>3</w:t>
+      </w:r>
+      <w:r>
+        <w:rPr/>
+        <w:t>. Oplossing analyseren</w:t>
       </w:r>
     </w:p>
     <w:p>
@@ -1745,7 +1716,15 @@
       </w:pPr>
       <w:r>
         <w:rPr/>
-        <w:t xml:space="preserve">🔬 305. Evalueer of de deliverables correct en volledig zijn afgerond</w:t>
+        <w:t xml:space="preserve">🔬 30</w:t>
+      </w:r>
+      <w:r>
+        <w:rPr/>
+        <w:t xml:space="preserve">4</w:t>
+      </w:r>
+      <w:r>
+        <w:rPr/>
+        <w:t xml:space="preserve">. Evalueer of de deliverables correct en volledig zijn afgerond</w:t>
       </w:r>
       <w:r/>
     </w:p>
@@ -1753,7 +1732,7 @@
       <w:pPr>
         <w:pStyle w:val="Heading1"/>
       </w:pPr>
-      <w:del w:author="Rinse Cramer" w:date="2025-11-04T23:06:00Z" w16du:dateUtc="2025-11-04T22:06:00Z" w:id="1779593026">
+      <w:del w:author="Rinse Cramer" w:date="2025-11-04T23:06:00Z" w16du:dateUtc="2025-11-04T22:06:00Z" w:id="1144339863">
         <w:r>
           <w:delText xml:space="preserve">E. </w:delText>
         </w:r>
@@ -1764,7 +1743,7 @@
           <w:delText>F</w:delText>
         </w:r>
       </w:del>
-      <w:del w:author="Rinse Cramer" w:date="2025-11-07T18:07:00Z" w16du:dateUtc="2025-11-07T17:07:00Z" w:id="91497479">
+      <w:del w:author="Rinse Cramer" w:date="2025-11-07T18:07:00Z" w16du:dateUtc="2025-11-07T17:07:00Z" w:id="189673483">
         <w:r>
           <w:delText xml:space="preserve">. </w:delText>
         </w:r>
@@ -1772,17 +1751,26 @@
           <w:delText>Actiepunten uit Excel verwerkt en Jira geüpdated</w:delText>
         </w:r>
       </w:del>
-      <w:ins w:author="Rinse Cramer" w:date="2025-11-07T18:08:00Z" w16du:dateUtc="2025-11-07T17:08:00Z" w:id="1830409562">
-        <w:r>
-          <w:t>🔬 306. Stop timer (ETC)</w:t>
-        </w:r>
-      </w:ins>
-      <w:del w:author="Rinse Cramer" w:date="2025-11-04T23:06:00Z" w16du:dateUtc="2025-11-04T22:06:00Z" w:id="1170063263">
+      <w:ins w:author="Rinse Cramer" w:date="2025-11-07T18:08:00Z" w16du:dateUtc="2025-11-07T17:08:00Z" w:id="426439869">
+        <w:r>
+          <w:t>🔬 30</w:t>
+        </w:r>
+      </w:ins>
+      <w:r>
+        <w:rPr/>
+        <w:t>5</w:t>
+      </w:r>
+      <w:ins w:author="Rinse Cramer" w:date="2025-11-07T18:08:00Z" w16du:dateUtc="2025-11-07T17:08:00Z" w:id="493984377">
+        <w:r>
+          <w:t>. Stop timer (ETC)</w:t>
+        </w:r>
+      </w:ins>
+      <w:del w:author="Rinse Cramer" w:date="2025-11-04T23:06:00Z" w16du:dateUtc="2025-11-04T22:06:00Z" w:id="20208468">
         <w:r>
           <w:delText>G</w:delText>
         </w:r>
       </w:del>
-      <w:del w:author="Rinse Cramer" w:date="2025-11-07T18:08:00Z" w16du:dateUtc="2025-11-07T17:08:00Z" w:id="1278594603">
+      <w:del w:author="Rinse Cramer" w:date="2025-11-07T18:08:00Z" w16du:dateUtc="2025-11-07T17:08:00Z" w:id="780166716">
         <w:r>
           <w:delText>.</w:delText>
         </w:r>
@@ -1822,7 +1810,15 @@
       </w:pPr>
       <w:r>
         <w:rPr/>
-        <w:t xml:space="preserve">🔬 307. Bijzonderheden gezien?</w:t>
+        <w:t xml:space="preserve">🔬 30</w:t>
+      </w:r>
+      <w:r>
+        <w:rPr/>
+        <w:t xml:space="preserve">6</w:t>
+      </w:r>
+      <w:r>
+        <w:rPr/>
+        <w:t xml:space="preserve">. Bijzonderheden gezien?</w:t>
       </w:r>
       <w:r/>
     </w:p>
@@ -1846,7 +1842,15 @@
       </w:pPr>
       <w:r>
         <w:rPr/>
-        <w:t xml:space="preserve">🔬 307T. Volg de </w:t>
+        <w:t xml:space="preserve">🔬 30</w:t>
+      </w:r>
+      <w:r>
+        <w:rPr/>
+        <w:t xml:space="preserve">6</w:t>
+      </w:r>
+      <w:r>
+        <w:rPr/>
+        <w:t xml:space="preserve">T. Volg de </w:t>
       </w:r>
       <w:r>
         <w:rPr/>
@@ -1874,7 +1878,15 @@
       </w:pPr>
       <w:r>
         <w:rPr/>
-        <w:t xml:space="preserve">🔬 307F. Volg de </w:t>
+        <w:t>🔬 30</w:t>
+      </w:r>
+      <w:r>
+        <w:rPr/>
+        <w:t>6</w:t>
+      </w:r>
+      <w:r>
+        <w:rPr/>
+        <w:t xml:space="preserve">F. Volg de </w:t>
       </w:r>
       <w:r>
         <w:rPr/>
@@ -1903,42 +1915,120 @@
     </w:p>
     <w:p>
       <w:pPr>
+        <w:pStyle w:val="Normal"/>
+      </w:pPr>
+      <w:r>
+        <w:rPr>
+          <w:rStyle w:val="Heading1Char"/>
+        </w:rPr>
+        <w:t>🔬 30</w:t>
+      </w:r>
+      <w:r>
+        <w:rPr>
+          <w:rStyle w:val="Heading1Char"/>
+        </w:rPr>
+        <w:t>7</w:t>
+      </w:r>
+      <w:r>
+        <w:rPr>
+          <w:rStyle w:val="Heading1Char"/>
+        </w:rPr>
+        <w:t xml:space="preserve">. </w:t>
+      </w:r>
+      <w:r>
+        <w:rPr>
+          <w:rStyle w:val="Heading1Char"/>
+        </w:rPr>
+        <w:t>Start timer</w:t>
+      </w:r>
+      <w:r>
+        <w:rPr>
+          <w:rStyle w:val="Heading1Char"/>
+        </w:rPr>
+        <w:t xml:space="preserve"> (1 min)</w:t>
+      </w:r>
+    </w:p>
+    <w:p>
+      <w:pPr>
+        <w:pStyle w:val="ListParagraph"/>
+        <w:numPr>
+          <w:ilvl w:val="0"/>
+          <w:numId w:val="41"/>
+        </w:numPr>
+        <w:rPr/>
+      </w:pPr>
+      <w:r>
+        <w:rPr/>
+        <w:t>16</w:t>
+      </w:r>
+      <w:r>
+        <w:rPr/>
+        <w:t>. Start &gt; Klok &gt; menu &gt; Timer</w:t>
+      </w:r>
+    </w:p>
+    <w:p>
+      <w:pPr>
+        <w:pStyle w:val="ListParagraph"/>
+        <w:numPr>
+          <w:ilvl w:val="0"/>
+          <w:numId w:val="41"/>
+        </w:numPr>
+        <w:rPr/>
+      </w:pPr>
+      <w:r>
+        <w:rPr/>
+        <w:t>17</w:t>
+      </w:r>
+      <w:r>
+        <w:rPr/>
+        <w:t>. Effort tijd instellen &gt; Start &gt; Op voorgrond behouden</w:t>
+      </w:r>
+    </w:p>
+    <w:p>
+      <w:pPr>
+        <w:pStyle w:val="ListParagraph"/>
+        <w:numPr>
+          <w:ilvl w:val="0"/>
+          <w:numId w:val="41"/>
+        </w:numPr>
+        <w:rPr/>
+      </w:pPr>
+      <w:r>
+        <w:rPr/>
+        <w:t>18</w:t>
+      </w:r>
+      <w:r>
+        <w:rPr/>
+        <w:t xml:space="preserve">. </w:t>
+      </w:r>
+      <w:r>
+        <w:rPr/>
+        <w:t>Jira</w:t>
+      </w:r>
+      <w:r>
+        <w:rPr/>
+        <w:t>-stopwatch wordt gestart</w:t>
+      </w:r>
+    </w:p>
+    <w:p>
+      <w:pPr>
         <w:pStyle w:val="Heading1"/>
       </w:pPr>
       <w:r>
         <w:rPr/>
-        <w:t xml:space="preserve">🔬 308. </w:t>
-      </w:r>
-      <w:r>
-        <w:rPr/>
-        <w:t xml:space="preserve">Na </w:t>
-      </w:r>
-      <w:r>
-        <w:rPr/>
-        <w:t>2/3 ETC Na 100% ETC Na 150% ETC</w:t>
-      </w:r>
-    </w:p>
-    <w:p>
-      <w:pPr>
-        <w:pStyle w:val="Normal"/>
-      </w:pPr>
-      <w:r>
-        <w:rPr>
-          <w:rStyle w:val="Heading1Char"/>
-        </w:rPr>
-        <w:t xml:space="preserve">🔬 309. </w:t>
-      </w:r>
-      <w:r>
-        <w:rPr>
-          <w:rStyle w:val="Heading1Char"/>
-        </w:rPr>
-        <w:t>Start timer</w:t>
-      </w:r>
-      <w:r>
-        <w:rPr>
-          <w:rStyle w:val="Heading1Char"/>
-        </w:rPr>
-        <w:t xml:space="preserve"> (1 min)</w:t>
+        <w:t>🔬 3</w:t>
+      </w:r>
+      <w:r>
+        <w:rPr/>
+        <w:t>0</w:t>
+      </w:r>
+      <w:r>
+        <w:rPr/>
+        <w:t>8</w:t>
+      </w:r>
+      <w:r>
+        <w:rPr/>
+        <w:t>. Hoe lang denk je nog nodig te hebben?</w:t>
       </w:r>
     </w:p>
     <w:p>
@@ -1952,11 +2042,7 @@
       </w:pPr>
       <w:r>
         <w:rPr/>
-        <w:t>16</w:t>
-      </w:r>
-      <w:r>
-        <w:rPr/>
-        <w:t>. Start &gt; Klok &gt; menu &gt; Timer</w:t>
+        <w:t>19. Hoe lang denk je nog nodig te hebben?</w:t>
       </w:r>
     </w:p>
     <w:p>
@@ -1970,11 +2056,64 @@
       </w:pPr>
       <w:r>
         <w:rPr/>
-        <w:t>17</w:t>
-      </w:r>
-      <w:r>
-        <w:rPr/>
-        <w:t>. Effort tijd instellen &gt; Start &gt; Op voorgrond behouden</w:t>
+        <w:t xml:space="preserve">20. Past het binnen de 150%? </w:t>
+      </w:r>
+      <w:r>
+        <w:rPr/>
+        <w:t>Tijdtrigger gehaald</w:t>
+      </w:r>
+      <w:r>
+        <w:rPr/>
+        <w:t>?</w:t>
+      </w:r>
+    </w:p>
+    <w:p>
+      <w:pPr>
+        <w:pStyle w:val="Heading1"/>
+      </w:pPr>
+      <w:ins w:author="Rinse Cramer" w:date="2025-11-07T18:08:00Z" w16du:dateUtc="2025-11-07T17:08:00Z" w:id="2083250457">
+        <w:r>
+          <w:t>🔬 3</w:t>
+        </w:r>
+      </w:ins>
+      <w:r>
+        <w:rPr/>
+        <w:t>09</w:t>
+      </w:r>
+      <w:ins w:author="Rinse Cramer" w:date="2025-11-07T18:08:00Z" w16du:dateUtc="2025-11-07T17:08:00Z" w:id="244723113">
+        <w:r>
+          <w:t xml:space="preserve">. </w:t>
+        </w:r>
+        <w:r>
+          <w:t>Haal ik het?</w:t>
+        </w:r>
+      </w:ins>
+      <w:del w:author="Rinse Cramer" w:date="2025-11-04T23:06:00Z" w16du:dateUtc="2025-11-04T22:06:00Z" w:id="2132423608">
+        <w:r>
+          <w:delText>H</w:delText>
+        </w:r>
+      </w:del>
+      <w:del w:author="Rinse Cramer" w:date="2025-11-07T18:10:00Z" w16du:dateUtc="2025-11-07T17:10:00Z" w:id="1894755691">
+        <w:r>
+          <w:delText>.</w:delText>
+        </w:r>
+      </w:del>
+    </w:p>
+    <w:p>
+      <w:pPr>
+        <w:pStyle w:val="Heading1"/>
+      </w:pPr>
+      <w:r>
+        <w:rPr/>
+        <w:t>🔬 3</w:t>
+      </w:r>
+      <w:r>
+        <w:rPr/>
+        <w:t>09</w:t>
+      </w:r>
+      <w:r>
+        <w:rPr/>
+        <w:t>F. Stop timer (1 min) Start timer (4 min)</w:t>
       </w:r>
     </w:p>
     <w:p>
@@ -1988,11 +2127,35 @@
       </w:pPr>
       <w:r>
         <w:rPr/>
-        <w:t>18</w:t>
-      </w:r>
-      <w:r>
-        <w:rPr/>
-        <w:t xml:space="preserve">. </w:t>
+        <w:t>21. Pauze &gt; Opnieuw instellen &gt; Terug naar volledige weergave</w:t>
+      </w:r>
+    </w:p>
+    <w:p>
+      <w:pPr>
+        <w:pStyle w:val="ListParagraph"/>
+        <w:numPr>
+          <w:ilvl w:val="0"/>
+          <w:numId w:val="41"/>
+        </w:numPr>
+        <w:rPr/>
+      </w:pPr>
+      <w:r>
+        <w:rPr/>
+        <w:t>22. Effort tijd instellen &gt; Start &gt; Op voorgrond behouden</w:t>
+      </w:r>
+    </w:p>
+    <w:p>
+      <w:pPr>
+        <w:pStyle w:val="ListParagraph"/>
+        <w:numPr>
+          <w:ilvl w:val="0"/>
+          <w:numId w:val="41"/>
+        </w:numPr>
+        <w:rPr/>
+      </w:pPr>
+      <w:r>
+        <w:rPr/>
+        <w:t xml:space="preserve">23. </w:t>
       </w:r>
       <w:r>
         <w:rPr/>
@@ -2009,134 +2172,15 @@
       </w:pPr>
       <w:r>
         <w:rPr/>
-        <w:t>🔬 310. Hoe lang denk je nog nodig te hebben?</w:t>
-      </w:r>
-    </w:p>
-    <w:p>
-      <w:pPr>
-        <w:pStyle w:val="ListParagraph"/>
-        <w:numPr>
-          <w:ilvl w:val="0"/>
-          <w:numId w:val="41"/>
-        </w:numPr>
-        <w:rPr/>
-      </w:pPr>
-      <w:r>
-        <w:rPr/>
-        <w:t>19. Hoe lang denk je nog nodig te hebben?</w:t>
-      </w:r>
-    </w:p>
-    <w:p>
-      <w:pPr>
-        <w:pStyle w:val="ListParagraph"/>
-        <w:numPr>
-          <w:ilvl w:val="0"/>
-          <w:numId w:val="41"/>
-        </w:numPr>
-        <w:rPr/>
-      </w:pPr>
-      <w:r>
-        <w:rPr/>
-        <w:t xml:space="preserve">20. Past het binnen de 150%? </w:t>
-      </w:r>
-      <w:r>
-        <w:rPr/>
-        <w:t>Tijdtrigger gehaald</w:t>
-      </w:r>
-      <w:r>
-        <w:rPr/>
-        <w:t>?</w:t>
-      </w:r>
-    </w:p>
-    <w:p>
-      <w:pPr>
-        <w:pStyle w:val="Heading1"/>
-      </w:pPr>
-      <w:ins w:author="Rinse Cramer" w:date="2025-11-07T18:08:00Z" w16du:dateUtc="2025-11-07T17:08:00Z" w:id="1699839949">
-        <w:r>
-          <w:t xml:space="preserve">🔬 312. </w:t>
-        </w:r>
-        <w:r>
-          <w:t>Haal ik het?</w:t>
-        </w:r>
-      </w:ins>
-      <w:del w:author="Rinse Cramer" w:date="2025-11-04T23:06:00Z" w16du:dateUtc="2025-11-04T22:06:00Z" w:id="1425229297">
-        <w:r>
-          <w:delText>H</w:delText>
-        </w:r>
-      </w:del>
-      <w:del w:author="Rinse Cramer" w:date="2025-11-07T18:10:00Z" w16du:dateUtc="2025-11-07T17:10:00Z" w:id="1391856155">
-        <w:r>
-          <w:delText>.</w:delText>
-        </w:r>
-      </w:del>
-    </w:p>
-    <w:p>
-      <w:pPr>
-        <w:pStyle w:val="Heading1"/>
-      </w:pPr>
-      <w:r>
-        <w:rPr/>
-        <w:t>🔬 312F. Stop timer (1 min) Start timer (4 min)</w:t>
-      </w:r>
-    </w:p>
-    <w:p>
-      <w:pPr>
-        <w:pStyle w:val="ListParagraph"/>
-        <w:numPr>
-          <w:ilvl w:val="0"/>
-          <w:numId w:val="41"/>
-        </w:numPr>
-        <w:rPr/>
-      </w:pPr>
-      <w:r>
-        <w:rPr/>
-        <w:t>21. Pauze &gt; Opnieuw instellen &gt; Terug naar volledige weergave</w:t>
-      </w:r>
-    </w:p>
-    <w:p>
-      <w:pPr>
-        <w:pStyle w:val="ListParagraph"/>
-        <w:numPr>
-          <w:ilvl w:val="0"/>
-          <w:numId w:val="41"/>
-        </w:numPr>
-        <w:rPr/>
-      </w:pPr>
-      <w:r>
-        <w:rPr/>
-        <w:t>22. Effort tijd instellen &gt; Start &gt; Op voorgrond behouden</w:t>
-      </w:r>
-    </w:p>
-    <w:p>
-      <w:pPr>
-        <w:pStyle w:val="ListParagraph"/>
-        <w:numPr>
-          <w:ilvl w:val="0"/>
-          <w:numId w:val="41"/>
-        </w:numPr>
-        <w:rPr/>
-      </w:pPr>
-      <w:r>
-        <w:rPr/>
-        <w:t xml:space="preserve">23. </w:t>
-      </w:r>
-      <w:r>
-        <w:rPr/>
-        <w:t>Jira</w:t>
-      </w:r>
-      <w:r>
-        <w:rPr/>
-        <w:t>-stopwatch wordt gestart</w:t>
-      </w:r>
-    </w:p>
-    <w:p>
-      <w:pPr>
-        <w:pStyle w:val="Heading1"/>
-      </w:pPr>
-      <w:r>
-        <w:rPr/>
-        <w:t>🔬 312T. Stop timer (1 min)</w:t>
+        <w:t>🔬 3</w:t>
+      </w:r>
+      <w:r>
+        <w:rPr/>
+        <w:t>09</w:t>
+      </w:r>
+      <w:r>
+        <w:rPr/>
+        <w:t>T. Stop timer (1 min)</w:t>
       </w:r>
       <w:r/>
       <w:r/>
@@ -2175,7 +2219,15 @@
       </w:pPr>
       <w:r>
         <w:rPr/>
-        <w:t xml:space="preserve">🔬 313. Hoe heeft het zo lang kunnen duren?</w:t>
+        <w:t xml:space="preserve">🔬 31</w:t>
+      </w:r>
+      <w:r>
+        <w:rPr/>
+        <w:t xml:space="preserve">0</w:t>
+      </w:r>
+      <w:r>
+        <w:rPr/>
+        <w:t xml:space="preserve">. Hoe heeft het zo lang kunnen duren?</w:t>
       </w:r>
       <w:r/>
     </w:p>
@@ -2251,7 +2303,15 @@
       </w:pPr>
       <w:r>
         <w:rPr/>
-        <w:t xml:space="preserve">🔬 314. Stop timer (4 min)</w:t>
+        <w:t xml:space="preserve">🔬 31</w:t>
+      </w:r>
+      <w:r>
+        <w:rPr/>
+        <w:t xml:space="preserve">1</w:t>
+      </w:r>
+      <w:r>
+        <w:rPr/>
+        <w:t xml:space="preserve">. Stop timer (4 min)</w:t>
       </w:r>
       <w:r/>
     </w:p>
@@ -2280,9 +2340,7 @@
           <w:ilvl w:val="0"/>
           <w:numId w:val="41"/>
         </w:numPr>
-        <w:rPr>
-          <w:ins w:author="Rinse Cramer" w:date="2025-11-24T23:55:00Z" w16du:dateUtc="2025-11-24T22:55:00Z" w:id="2108463928"/>
-        </w:rPr>
+        <w:rPr/>
       </w:pPr>
       <w:r>
         <w:rPr/>
@@ -2292,16 +2350,6 @@
         <w:rPr/>
         <w:t>. Klok minimaliseren</w:t>
       </w:r>
-    </w:p>
-    <w:p>
-      <w:pPr>
-        <w:pStyle w:val="Heading1"/>
-      </w:pPr>
-      <w:ins w:author="Rinse Cramer" w:date="2025-11-24T23:55:00Z" w16du:dateUtc="2025-11-24T22:55:00Z" w:id="1973591740">
-        <w:r>
-          <w:t>🔬 315. Significant inzicht gekregen</w:t>
-        </w:r>
-      </w:ins>
       <w:ins w:author="Rinse Cramer" w:date="2025-11-24T23:57:00Z" w16du:dateUtc="2025-11-24T22:57:00Z" w:id="231">
         <w:r/>
       </w:ins>
@@ -2310,132 +2358,33 @@
       <w:pPr>
         <w:pStyle w:val="Heading1"/>
         <w:rPr>
-          <w:ins w:author="Rinse Cramer" w:date="2025-11-03T23:33:00Z" w16du:dateUtc="2025-11-03T22:33:00Z" w:id="1129263132"/>
+          <w:ins w:author="Rinse Cramer" w:date="2025-12-13T10:34:00Z" w16du:dateUtc="2025-12-13T09:34:00Z" w:id="240437188"/>
+          <w:rFonts w:cs="Segoe UI Emoji"/>
+        </w:rPr>
+      </w:pPr>
+      <w:r>
+        <w:rPr/>
+        <w:t>🤝🏻</w:t>
+      </w:r>
+      <w:r>
+        <w:rPr>
           <w:lang w:val="en-US"/>
         </w:rPr>
-      </w:pPr>
-      <w:r>
-        <w:rPr/>
-        <w:t>🤝🏻</w:t>
-      </w:r>
-      <w:r>
-        <w:rPr>
-          <w:lang w:val="en-US"/>
-        </w:rPr>
         <w:t xml:space="preserve"> </w:t>
       </w:r>
       <w:r>
-        <w:rPr/>
-        <w:t xml:space="preserve">401. </w:t>
-      </w:r>
-      <w:r>
-        <w:rPr/>
-        <w:t>Issue [geanalyseerd]</w:t>
-      </w:r>
-    </w:p>
-    <w:p>
-      <w:pPr>
-        <w:pStyle w:val="ListParagraph"/>
-        <w:numPr>
-          <w:ilvl w:val="0"/>
-          <w:numId w:val="41"/>
-        </w:numPr>
-        <w:rPr>
-          <w:ins w:author="Rinse Cramer" w:date="2025-12-13T10:33:00Z" w16du:dateUtc="2025-12-13T09:33:00Z" w:id="238"/>
-        </w:rPr>
-      </w:pPr>
-      <w:ins w:author="Rinse Cramer" w:date="2025-12-13T10:33:00Z" w16du:dateUtc="2025-12-13T09:33:00Z" w:id="239">
-        <w:r>
-          <w:t>1. Jira-uitvoerder is medewerker</w:t>
-        </w:r>
-      </w:ins>
-    </w:p>
-    <w:p>
-      <w:pPr>
-        <w:pStyle w:val="ListParagraph"/>
-        <w:numPr>
-          <w:ilvl w:val="0"/>
-          <w:numId w:val="41"/>
-        </w:numPr>
-        <w:rPr>
-          <w:ins w:author="Rinse Cramer" w:date="2025-12-13T10:33:00Z" w16du:dateUtc="2025-12-13T09:33:00Z" w:id="240"/>
-        </w:rPr>
-      </w:pPr>
-      <w:ins w:author="Rinse Cramer" w:date="2025-12-13T10:33:00Z" w16du:dateUtc="2025-12-13T09:33:00Z" w:id="241">
-        <w:r>
-          <w:t xml:space="preserve">2. Jira-status is </w:t>
-        </w:r>
-      </w:ins>
-      <w:r>
-        <w:t>Analyse</w:t>
-      </w:r>
-    </w:p>
-    <w:p>
-      <w:pPr>
-        <w:pStyle w:val="ListParagraph"/>
-        <w:numPr>
-          <w:ilvl w:val="0"/>
-          <w:numId w:val="41"/>
-        </w:numPr>
-        <w:rPr>
-          <w:ins w:author="Rinse Cramer" w:date="2025-12-13T10:34:00Z" w16du:dateUtc="2025-12-13T09:34:00Z" w:id="242"/>
-          <w:lang w:val="en-US"/>
-        </w:rPr>
-      </w:pPr>
-      <w:ins w:author="Rinse Cramer" w:date="2025-12-13T10:33:00Z" w16du:dateUtc="2025-12-13T09:33:00Z" w:id="392346874">
-        <w:r>
-          <w:rPr>
-            <w:lang w:val="en-US"/>
-          </w:rPr>
-          <w:t xml:space="preserve">3. </w:t>
-        </w:r>
-      </w:ins>
-      <w:ins w:author="Rinse Cramer" w:date="2025-12-13T10:34:00Z" w16du:dateUtc="2025-12-13T09:34:00Z" w:id="1110434723">
-        <w:r>
-          <w:rPr>
-            <w:lang w:val="en-US"/>
-          </w:rPr>
-          <w:t xml:space="preserve">Jira-status wordt Review </w:t>
-        </w:r>
-      </w:ins>
-      <w:r>
-        <w:rPr>
-          <w:lang w:val="en-US"/>
-        </w:rPr>
-        <w:t>a</w:t>
-      </w:r>
-      <w:r>
-        <w:rPr>
-          <w:lang w:val="en-US"/>
-        </w:rPr>
-        <w:t>nalyse</w:t>
-      </w:r>
-    </w:p>
-    <w:p>
-      <w:pPr>
-        <w:pStyle w:val="Heading1"/>
-        <w:rPr>
-          <w:ins w:author="Rinse Cramer" w:date="2025-12-13T10:34:00Z" w16du:dateUtc="2025-12-13T09:34:00Z" w:id="1115808976"/>
+        <w:rPr>
           <w:rFonts w:cs="Segoe UI Emoji"/>
         </w:rPr>
-      </w:pPr>
-      <w:r>
-        <w:rPr/>
-        <w:t>🤝🏻</w:t>
-      </w:r>
-      <w:r>
-        <w:rPr>
-          <w:lang w:val="en-US"/>
-        </w:rPr>
-        <w:t xml:space="preserve"> </w:t>
+        <w:t>40</w:t>
       </w:r>
       <w:r>
         <w:rPr>
           <w:rFonts w:cs="Segoe UI Emoji"/>
         </w:rPr>
-        <w:t>402</w:t>
-      </w:r>
-      <w:ins w:author="Rinse Cramer" w:date="2025-12-13T10:34:00Z" w16du:dateUtc="2025-12-13T09:34:00Z" w:id="385422337">
+        <w:t>1</w:t>
+      </w:r>
+      <w:ins w:author="Rinse Cramer" w:date="2025-12-13T10:34:00Z" w16du:dateUtc="2025-12-13T09:34:00Z" w:id="464272963">
         <w:r>
           <w:rPr>
             <w:rFonts w:cs="Segoe UI Emoji"/>
@@ -2443,11 +2392,11 @@
           <w:t xml:space="preserve">. </w:t>
         </w:r>
       </w:ins>
-      <w:ins w:author="Rinse Cramer" w:date="2025-12-13T10:35:00Z" w16du:dateUtc="2025-12-13T09:35:00Z" w:id="1118354656">
+      <w:ins w:author="Rinse Cramer" w:date="2025-12-13T10:35:00Z" w16du:dateUtc="2025-12-13T09:35:00Z" w:id="830402512">
         <w:r>
           <w:rPr>
             <w:rFonts w:cs="Segoe UI Emoji"/>
-            <w:rPrChange w:author="Rinse Cramer" w:date="2025-12-13T10:35:00Z" w16du:dateUtc="2025-12-13T09:35:00Z" w:id="470128103">
+            <w:rPrChange w:author="Rinse Cramer" w:date="2025-12-13T10:35:00Z" w16du:dateUtc="2025-12-13T09:35:00Z" w:id="1951502935">
               <w:rPr>
                 <w:rFonts w:cs="Segoe UI Emoji"/>
                 <w:lang w:val="en-US"/>
@@ -2465,36 +2414,82 @@
           <w:ilvl w:val="0"/>
           <w:numId w:val="41"/>
         </w:numPr>
-        <w:rPr>
-          <w:ins w:author="Rinse Cramer" w:date="2025-12-13T10:34:00Z" w16du:dateUtc="2025-12-13T09:34:00Z" w:id="249"/>
-        </w:rPr>
-      </w:pPr>
-      <w:ins w:author="Rinse Cramer" w:date="2025-12-13T10:43:00Z" w16du:dateUtc="2025-12-13T09:43:00Z" w:id="250">
+        <w:rPr/>
+      </w:pPr>
+      <w:r>
+        <w:rPr/>
+        <w:t>1. Jira-uitvoerder is medewerker</w:t>
+      </w:r>
+    </w:p>
+    <w:p>
+      <w:pPr>
+        <w:pStyle w:val="ListParagraph"/>
+        <w:numPr>
+          <w:ilvl w:val="0"/>
+          <w:numId w:val="41"/>
+        </w:numPr>
+        <w:rPr/>
+      </w:pPr>
+      <w:r>
+        <w:rPr/>
+        <w:t>2. Jira-status is Analyse</w:t>
+      </w:r>
+    </w:p>
+    <w:p>
+      <w:pPr>
+        <w:pStyle w:val="ListParagraph"/>
+        <w:numPr>
+          <w:ilvl w:val="0"/>
+          <w:numId w:val="41"/>
+        </w:numPr>
+        <w:rPr>
+          <w:lang w:val="en-US"/>
+        </w:rPr>
+      </w:pPr>
+      <w:r>
+        <w:rPr>
+          <w:lang w:val="en-US"/>
+        </w:rPr>
+        <w:t>3. Jira-status wordt Review analyse</w:t>
+      </w:r>
+    </w:p>
+    <w:p>
+      <w:pPr>
+        <w:pStyle w:val="ListParagraph"/>
+        <w:numPr>
+          <w:ilvl w:val="0"/>
+          <w:numId w:val="41"/>
+        </w:numPr>
+        <w:rPr>
+          <w:ins w:author="Rinse Cramer" w:date="2025-12-13T10:34:00Z" w16du:dateUtc="2025-12-13T09:34:00Z" w:id="2029710622"/>
+        </w:rPr>
+      </w:pPr>
+      <w:ins w:author="Rinse Cramer" w:date="2025-12-13T10:43:00Z" w16du:dateUtc="2025-12-13T09:43:00Z" w:id="1139054662">
         <w:r>
           <w:t>4</w:t>
         </w:r>
       </w:ins>
-      <w:ins w:author="Rinse Cramer" w:date="2025-12-13T10:34:00Z" w16du:dateUtc="2025-12-13T09:34:00Z" w:id="251">
+      <w:ins w:author="Rinse Cramer" w:date="2025-12-13T10:34:00Z" w16du:dateUtc="2025-12-13T09:34:00Z" w:id="130917514">
         <w:r>
           <w:t xml:space="preserve">. </w:t>
         </w:r>
       </w:ins>
-      <w:ins w:author="Rinse Cramer" w:date="2025-12-13T10:35:00Z" w16du:dateUtc="2025-12-13T09:35:00Z" w:id="252">
+      <w:ins w:author="Rinse Cramer" w:date="2025-12-13T10:35:00Z" w16du:dateUtc="2025-12-13T09:35:00Z" w:id="80520480">
         <w:r>
           <w:t>Baas</w:t>
         </w:r>
       </w:ins>
-      <w:ins w:author="Rinse Cramer" w:date="2025-12-13T10:34:00Z" w16du:dateUtc="2025-12-13T09:34:00Z" w:id="253">
+      <w:ins w:author="Rinse Cramer" w:date="2025-12-13T10:34:00Z" w16du:dateUtc="2025-12-13T09:34:00Z" w:id="1695677951">
         <w:r>
           <w:t xml:space="preserve"> is </w:t>
         </w:r>
       </w:ins>
-      <w:ins w:author="Rinse Cramer" w:date="2025-12-13T10:35:00Z" w16du:dateUtc="2025-12-13T09:35:00Z" w:id="254">
+      <w:ins w:author="Rinse Cramer" w:date="2025-12-13T10:35:00Z" w16du:dateUtc="2025-12-13T09:35:00Z" w:id="769819353">
         <w:r>
           <w:t>mondeling beschikbaar</w:t>
         </w:r>
       </w:ins>
-      <w:ins w:author="Rinse Cramer" w:date="2025-12-13T10:36:00Z" w16du:dateUtc="2025-12-13T09:36:00Z" w:id="255">
+      <w:ins w:author="Rinse Cramer" w:date="2025-12-13T10:36:00Z" w16du:dateUtc="2025-12-13T09:36:00Z" w:id="1315185519">
         <w:r>
           <w:t>?</w:t>
         </w:r>
@@ -2585,7 +2580,7 @@
       <w:pPr>
         <w:pStyle w:val="Heading1"/>
         <w:rPr>
-          <w:ins w:author="Rinse Cramer" w:date="2025-12-13T10:40:00Z" w16du:dateUtc="2025-12-13T09:40:00Z" w:id="93392337"/>
+          <w:ins w:author="Rinse Cramer" w:date="2025-12-13T10:40:00Z" w16du:dateUtc="2025-12-13T09:40:00Z" w:id="274479770"/>
           <w:rFonts w:cs="Segoe UI Emoji"/>
         </w:rPr>
       </w:pPr>
@@ -2597,9 +2592,15 @@
         <w:rPr>
           <w:lang w:val="en-US"/>
         </w:rPr>
-        <w:t xml:space="preserve"> 403</w:t>
-      </w:r>
-      <w:ins w:author="Rinse Cramer" w:date="2025-12-13T10:40:00Z" w16du:dateUtc="2025-12-13T09:40:00Z" w:id="778265264">
+        <w:t xml:space="preserve"> 40</w:t>
+      </w:r>
+      <w:r>
+        <w:rPr>
+          <w:lang w:val="en-US"/>
+        </w:rPr>
+        <w:t>2</w:t>
+      </w:r>
+      <w:ins w:author="Rinse Cramer" w:date="2025-12-13T10:40:00Z" w16du:dateUtc="2025-12-13T09:40:00Z" w:id="903340026">
         <w:r>
           <w:rPr>
             <w:rFonts w:cs="Segoe UI Emoji"/>
@@ -2644,7 +2645,7 @@
       <w:pPr>
         <w:pStyle w:val="Heading1"/>
         <w:rPr>
-          <w:ins w:author="Rinse Cramer" w:date="2025-12-13T10:41:00Z" w16du:dateUtc="2025-12-13T09:41:00Z" w:id="1895074639"/>
+          <w:ins w:author="Rinse Cramer" w:date="2025-12-13T10:41:00Z" w16du:dateUtc="2025-12-13T09:41:00Z" w:id="1347810153"/>
           <w:rFonts w:cs="Segoe UI Emoji"/>
         </w:rPr>
       </w:pPr>
@@ -2662,9 +2663,15 @@
         <w:rPr>
           <w:rFonts w:cs="Segoe UI Emoji"/>
         </w:rPr>
-        <w:t>404</w:t>
-      </w:r>
-      <w:ins w:author="Rinse Cramer" w:date="2025-12-13T10:41:00Z" w16du:dateUtc="2025-12-13T09:41:00Z" w:id="1337512097">
+        <w:t>40</w:t>
+      </w:r>
+      <w:r>
+        <w:rPr>
+          <w:rFonts w:cs="Segoe UI Emoji"/>
+        </w:rPr>
+        <w:t>3</w:t>
+      </w:r>
+      <w:ins w:author="Rinse Cramer" w:date="2025-12-13T10:41:00Z" w16du:dateUtc="2025-12-13T09:41:00Z" w:id="670337086">
         <w:r>
           <w:rPr>
             <w:rFonts w:cs="Segoe UI Emoji"/>
@@ -2720,7 +2727,7 @@
       <w:pPr>
         <w:pStyle w:val="Heading1"/>
         <w:rPr>
-          <w:ins w:author="Rinse Cramer" w:date="2025-12-13T10:42:00Z" w16du:dateUtc="2025-12-13T09:42:00Z" w:id="1191472656"/>
+          <w:ins w:author="Rinse Cramer" w:date="2025-12-13T10:42:00Z" w16du:dateUtc="2025-12-13T09:42:00Z" w:id="1152903453"/>
           <w:rFonts w:cs="Segoe UI Emoji"/>
         </w:rPr>
       </w:pPr>
@@ -2738,9 +2745,21 @@
         <w:rPr>
           <w:rFonts w:cs="Segoe UI Emoji"/>
         </w:rPr>
-        <w:t>404F</w:t>
-      </w:r>
-      <w:ins w:author="Rinse Cramer" w:date="2025-12-13T10:42:00Z" w16du:dateUtc="2025-12-13T09:42:00Z" w:id="1689007481">
+        <w:t>40</w:t>
+      </w:r>
+      <w:r>
+        <w:rPr>
+          <w:rFonts w:cs="Segoe UI Emoji"/>
+        </w:rPr>
+        <w:t>3</w:t>
+      </w:r>
+      <w:r>
+        <w:rPr>
+          <w:rFonts w:cs="Segoe UI Emoji"/>
+        </w:rPr>
+        <w:t>F</w:t>
+      </w:r>
+      <w:ins w:author="Rinse Cramer" w:date="2025-12-13T10:42:00Z" w16du:dateUtc="2025-12-13T09:42:00Z" w:id="596193110">
         <w:r>
           <w:rPr>
             <w:rFonts w:cs="Segoe UI Emoji"/>
@@ -2806,7 +2825,7 @@
       <w:pPr>
         <w:pStyle w:val="Heading1"/>
         <w:rPr>
-          <w:ins w:author="Rinse Cramer" w:date="2025-12-13T10:44:00Z" w16du:dateUtc="2025-12-13T09:44:00Z" w:id="976573350"/>
+          <w:ins w:author="Rinse Cramer" w:date="2025-12-13T10:44:00Z" w16du:dateUtc="2025-12-13T09:44:00Z" w:id="216568305"/>
           <w:rFonts w:cs="Segoe UI Emoji"/>
         </w:rPr>
       </w:pPr>
@@ -2824,9 +2843,21 @@
         <w:rPr>
           <w:rFonts w:cs="Segoe UI Emoji"/>
         </w:rPr>
-        <w:t>404T</w:t>
-      </w:r>
-      <w:ins w:author="Rinse Cramer" w:date="2025-12-13T10:44:00Z" w16du:dateUtc="2025-12-13T09:44:00Z" w:id="983970548">
+        <w:t>40</w:t>
+      </w:r>
+      <w:r>
+        <w:rPr>
+          <w:rFonts w:cs="Segoe UI Emoji"/>
+        </w:rPr>
+        <w:t>3</w:t>
+      </w:r>
+      <w:r>
+        <w:rPr>
+          <w:rFonts w:cs="Segoe UI Emoji"/>
+        </w:rPr>
+        <w:t>T</w:t>
+      </w:r>
+      <w:ins w:author="Rinse Cramer" w:date="2025-12-13T10:44:00Z" w16du:dateUtc="2025-12-13T09:44:00Z" w:id="37511189">
         <w:r>
           <w:rPr>
             <w:rFonts w:cs="Segoe UI Emoji"/>

</xml_diff>

<commit_message>
fix(actielijst): resolve Word document corruption by ensuring unique paragraph IDs
</commit_message>
<xml_diff>
--- a/Actielijst.docx
+++ b/Actielijst.docx
@@ -6728,7 +6728,7 @@
         </ns0:r>
       </ns0:ins>
     </ns0:p>
-    <ns0:p ns0:rsidR="00B6720F" ns0:rsidP="00B6720F" ns0:rsidRDefault="00B6720F" ns2:paraId="40585F91" ns2:textId="004881B5">
+    <ns0:p ns0:rsidR="00B6720F" ns0:rsidP="00B6720F" ns0:rsidRDefault="00B6720F">
       <ns0:pPr>
         <ns0:pStyle ns0:val="Heading1"/>
       </ns0:pPr>
@@ -6736,7 +6736,7 @@
         <ns0:t>⚠️ Meldplicht</ns0:t>
       </ns0:r>
     </ns0:p>
-    <ns0:p ns0:rsidR="00B6720F" ns0:rsidP="00B6720F" ns0:rsidRDefault="00CF1D9E" ns2:paraId="7059C77E" ns2:textId="26FC0269">
+    <ns0:p ns0:rsidR="00B6720F" ns0:rsidP="00B6720F" ns0:rsidRDefault="00CF1D9E">
       <ns0:pPr>
         <ns0:pStyle ns0:val="ListParagraph"/>
         <ns0:numPr>
@@ -6748,7 +6748,7 @@
         <ns0:t>⚠️ Status = meldplicht</ns0:t>
       </ns0:r>
     </ns0:p>
-    <ns0:p ns0:rsidR="00B6720F" ns0:rsidP="00B6720F" ns0:rsidRDefault="00CF1D9E" ns2:paraId="7059C77E" ns2:textId="26FC0269">
+    <ns0:p ns0:rsidR="00B6720F" ns0:rsidP="00B6720F" ns0:rsidRDefault="00CF1D9E">
       <ns0:pPr>
         <ns0:pStyle ns0:val="ListParagraph"/>
         <ns0:numPr>
@@ -6760,7 +6760,7 @@
         <ns0:t>1. Jira-uitvoerder is medewerker</ns0:t>
       </ns0:r>
     </ns0:p>
-    <ns0:p ns0:rsidR="00B6720F" ns0:rsidP="00B6720F" ns0:rsidRDefault="00CF1D9E" ns2:paraId="7059C77E" ns2:textId="26FC0269">
+    <ns0:p ns0:rsidR="00B6720F" ns0:rsidP="00B6720F" ns0:rsidRDefault="00CF1D9E">
       <ns0:pPr>
         <ns0:pStyle ns0:val="ListParagraph"/>
         <ns0:numPr>
@@ -6772,7 +6772,7 @@
         <ns0:t>2. Jira-status is Meldplicht</ns0:t>
       </ns0:r>
     </ns0:p>
-    <ns0:p ns0:rsidR="00B6720F" ns0:rsidP="00B6720F" ns0:rsidRDefault="00CF1D9E" ns2:paraId="7059C77E" ns2:textId="26FC0269">
+    <ns0:p ns0:rsidR="00B6720F" ns0:rsidP="00B6720F" ns0:rsidRDefault="00CF1D9E">
       <ns0:pPr>
         <ns0:pStyle ns0:val="ListParagraph"/>
         <ns0:numPr>
@@ -6784,7 +6784,7 @@
         <ns0:t>A. Start timer (1 min)</ns0:t>
       </ns0:r>
     </ns0:p>
-    <ns0:p ns0:rsidR="00B6720F" ns0:rsidP="00B6720F" ns0:rsidRDefault="00CF1D9E" ns2:paraId="7059C77E" ns2:textId="26FC0269">
+    <ns0:p ns0:rsidR="00B6720F" ns0:rsidP="00B6720F" ns0:rsidRDefault="00CF1D9E">
       <ns0:pPr>
         <ns0:pStyle ns0:val="ListParagraph"/>
         <ns0:numPr>
@@ -6796,7 +6796,7 @@
         <ns0:t>B. Stel vervolgplan op</ns0:t>
       </ns0:r>
     </ns0:p>
-    <ns0:p ns0:rsidR="00B6720F" ns0:rsidP="00B6720F" ns0:rsidRDefault="00CF1D9E" ns2:paraId="7059C77E" ns2:textId="26FC0269">
+    <ns0:p ns0:rsidR="00B6720F" ns0:rsidP="00B6720F" ns0:rsidRDefault="00CF1D9E">
       <ns0:pPr>
         <ns0:pStyle ns0:val="ListParagraph"/>
         <ns0:numPr>
@@ -6808,7 +6808,7 @@
         <ns0:t>C. Stop timer (1 min)</ns0:t>
       </ns0:r>
     </ns0:p>
-    <ns0:p ns0:rsidR="00B6720F" ns0:rsidP="00B6720F" ns0:rsidRDefault="00CF1D9E" ns2:paraId="7059C77E" ns2:textId="26FC0269">
+    <ns0:p ns0:rsidR="00B6720F" ns0:rsidP="00B6720F" ns0:rsidRDefault="00CF1D9E">
       <ns0:pPr>
         <ns0:pStyle ns0:val="ListParagraph"/>
         <ns0:numPr>
@@ -6820,7 +6820,7 @@
         <ns0:t>D. Is de baas aanwezig?</ns0:t>
       </ns0:r>
     </ns0:p>
-    <ns0:p ns0:rsidR="00B6720F" ns0:rsidP="00B6720F" ns0:rsidRDefault="00CF1D9E" ns2:paraId="7059C77E" ns2:textId="26FC0269">
+    <ns0:p ns0:rsidR="00B6720F" ns0:rsidP="00B6720F" ns0:rsidRDefault="00CF1D9E">
       <ns0:pPr>
         <ns0:pStyle ns0:val="ListParagraph"/>
         <ns0:numPr>
@@ -6832,7 +6832,7 @@
         <ns0:t>E. Meteen meldplicht wanneer de baas aanwezig is</ns0:t>
       </ns0:r>
     </ns0:p>
-    <ns0:p ns0:rsidR="00B6720F" ns0:rsidP="00B6720F" ns0:rsidRDefault="00CF1D9E" ns2:paraId="7059C77E" ns2:textId="26FC0269">
+    <ns0:p ns0:rsidR="00B6720F" ns0:rsidP="00B6720F" ns0:rsidRDefault="00CF1D9E">
       <ns0:pPr>
         <ns0:pStyle ns0:val="ListParagraph"/>
         <ns0:numPr>
@@ -6844,7 +6844,7 @@
         <ns0:t>1. Baas is schriftelijk bereikbaar</ns0:t>
       </ns0:r>
     </ns0:p>
-    <ns0:p ns0:rsidR="00B6720F" ns0:rsidP="00B6720F" ns0:rsidRDefault="00CF1D9E" ns2:paraId="7059C77E" ns2:textId="26FC0269">
+    <ns0:p ns0:rsidR="00B6720F" ns0:rsidP="00B6720F" ns0:rsidRDefault="00CF1D9E">
       <ns0:pPr>
         <ns0:pStyle ns0:val="ListParagraph"/>
         <ns0:numPr>
@@ -6856,7 +6856,7 @@
         <ns0:t>2. Aanwezigheid monitoren</ns0:t>
       </ns0:r>
     </ns0:p>
-    <ns0:p ns0:rsidR="00B6720F" ns0:rsidP="00B6720F" ns0:rsidRDefault="00CF1D9E" ns2:paraId="7059C77E" ns2:textId="26FC0269">
+    <ns0:p ns0:rsidR="00B6720F" ns0:rsidP="00B6720F" ns0:rsidRDefault="00CF1D9E">
       <ns0:pPr>
         <ns0:pStyle ns0:val="ListParagraph"/>
         <ns0:numPr>
@@ -6868,7 +6868,7 @@
         <ns0:t>F. Na dat de baas weer aanwezig is</ns0:t>
       </ns0:r>
     </ns0:p>
-    <ns0:p ns0:rsidR="00B6720F" ns0:rsidP="00B6720F" ns0:rsidRDefault="00CF1D9E" ns2:paraId="7059C77E" ns2:textId="26FC0269">
+    <ns0:p ns0:rsidR="00B6720F" ns0:rsidP="00B6720F" ns0:rsidRDefault="00CF1D9E">
       <ns0:pPr>
         <ns0:pStyle ns0:val="ListParagraph"/>
         <ns0:numPr>
@@ -6880,7 +6880,7 @@
         <ns0:t>1. Baas is mondeling bereikbaar</ns0:t>
       </ns0:r>
     </ns0:p>
-    <ns0:p ns0:rsidR="00B6720F" ns0:rsidP="00B6720F" ns0:rsidRDefault="00CF1D9E" ns2:paraId="7059C77E" ns2:textId="26FC0269">
+    <ns0:p ns0:rsidR="00B6720F" ns0:rsidP="00B6720F" ns0:rsidRDefault="00CF1D9E">
       <ns0:pPr>
         <ns0:pStyle ns0:val="ListParagraph"/>
         <ns0:numPr>
@@ -6892,7 +6892,7 @@
         <ns0:t>G. Overleg vervolgplan</ns0:t>
       </ns0:r>
     </ns0:p>
-    <ns0:p ns0:rsidR="00B6720F" ns0:rsidP="00B6720F" ns0:rsidRDefault="00CF1D9E" ns2:paraId="7059C77E" ns2:textId="26FC0269">
+    <ns0:p ns0:rsidR="00B6720F" ns0:rsidP="00B6720F" ns0:rsidRDefault="00CF1D9E">
       <ns0:pPr>
         <ns0:pStyle ns0:val="ListParagraph"/>
         <ns0:numPr>

</xml_diff>

<commit_message>
docs(actielijst): restore missing review final process steps to align with flowchart
</commit_message>
<xml_diff>
--- a/Actielijst.docx
+++ b/Actielijst.docx
@@ -6923,31 +6923,15 @@
         </ns0:r>
       </ns0:ins>
     </ns0:p>
-    <ns0:p ns0:rsidR="00B6720F" ns0:rsidP="00B6720F" ns0:rsidRDefault="00B6720F" ns2:paraId="40585F91" ns2:textId="004881B5">
+    <ns0:p ns0:rsidR="00B6720F" ns0:rsidP="00B6720F" ns0:rsidRDefault="00B6720F">
       <ns0:pPr>
         <ns0:pStyle ns0:val="Heading1"/>
       </ns0:pPr>
       <ns0:r>
-        <ns0:rPr>
-          <ns0:rFonts ns0:ascii="Segoe UI Emoji" ns0:hAnsi="Segoe UI Emoji" ns0:cs="Segoe UI Emoji"/>
-        </ns0:rPr>
-        <ns0:lastRenderedPageBreak/>
-        <ns0:t>🫱🏻‍🫲🏻 1001. Status = review final</ns0:t>
-      </ns0:r>
-      <ns0:r>
-        <ns0:t/>
-      </ns0:r>
-      <ns0:r>
-        <ns0:rPr>
-          <ns0:rFonts ns0:ascii="Segoe UI Emoji" ns0:hAnsi="Segoe UI Emoji" ns0:cs="Segoe UI Emoji"/>
-        </ns0:rPr>
-        <ns0:t/>
-      </ns0:r>
-      <ns0:r>
-        <ns0:t xml:space="preserve"/>
-      </ns0:r>
-    </ns0:p>
-    <ns0:p ns0:rsidR="00B6720F" ns0:rsidP="00B6720F" ns0:rsidRDefault="00CF1D9E" ns2:paraId="7059C77E" ns2:textId="26FC0269">
+        <ns0:t>🫱🏻‍🫲🏻 Review Final</ns0:t>
+      </ns0:r>
+    </ns0:p>
+    <ns0:p ns0:rsidR="00B6720F" ns0:rsidP="00B6720F" ns0:rsidRDefault="00CF1D9E">
       <ns0:pPr>
         <ns0:pStyle ns0:val="ListParagraph"/>
         <ns0:numPr>
@@ -6956,49 +6940,272 @@
         </ns0:numPr>
       </ns0:pPr>
       <ns0:r>
-        <ns0:t xml:space="preserve">🫱🏻‍🫲🏻 1004. Demonstratie van de oplossing geven</ns0:t>
-      </ns0:r>
-      <ns0:r ns0:rsidRPr="00B6720F" ns0:rsidR="00B6720F">
-        <ns0:t/>
-      </ns0:r>
-    </ns0:p>
-    <ns0:p ns0:rsidR="00B6720F" ns0:rsidDel="00C12619" ns0:rsidP="00C12619" ns0:rsidRDefault="00CF1D9E" ns2:paraId="2DA80D5B" ns2:textId="6635E84F">
+        <ns0:t>🫱🏻‍🫲🏻 1001. Status = review final</ns0:t>
+      </ns0:r>
+    </ns0:p>
+    <ns0:p ns0:rsidR="00B6720F" ns0:rsidP="00B6720F" ns0:rsidRDefault="00CF1D9E">
+      <ns0:pPr>
+        <ns0:pStyle ns0:val="ListParagraph"/>
+        <ns0:numPr>
+          <ns0:ilvl ns0:val="1"/>
+          <ns0:numId ns0:val="40"/>
+        </ns0:numPr>
+      </ns0:pPr>
+      <ns0:r>
+        <ns0:t>1. Jira-uitvoerder is medewerker</ns0:t>
+      </ns0:r>
+    </ns0:p>
+    <ns0:p ns0:rsidR="00B6720F" ns0:rsidP="00B6720F" ns0:rsidRDefault="00CF1D9E">
+      <ns0:pPr>
+        <ns0:pStyle ns0:val="ListParagraph"/>
+        <ns0:numPr>
+          <ns0:ilvl ns0:val="1"/>
+          <ns0:numId ns0:val="40"/>
+        </ns0:numPr>
+      </ns0:pPr>
+      <ns0:r>
+        <ns0:t>2. Jira-status is Test</ns0:t>
+      </ns0:r>
+    </ns0:p>
+    <ns0:p ns0:rsidR="00B6720F" ns0:rsidP="00B6720F" ns0:rsidRDefault="00CF1D9E">
+      <ns0:pPr>
+        <ns0:pStyle ns0:val="ListParagraph"/>
+        <ns0:numPr>
+          <ns0:ilvl ns0:val="1"/>
+          <ns0:numId ns0:val="40"/>
+        </ns0:numPr>
+      </ns0:pPr>
+      <ns0:r>
+        <ns0:t>3. Jira-status wordt Review final</ns0:t>
+      </ns0:r>
+    </ns0:p>
+    <ns0:p ns0:rsidR="00B6720F" ns0:rsidP="00B6720F" ns0:rsidRDefault="00CF1D9E">
       <ns0:pPr>
         <ns0:pStyle ns0:val="ListParagraph"/>
         <ns0:numPr>
           <ns0:ilvl ns0:val="0"/>
           <ns0:numId ns0:val="40"/>
         </ns0:numPr>
-        <ns0:rPr>
-          <ns0:del ns0:author="Rinse Cramer" ns0:date="2025-11-21T09:26:00Z" ns3:dateUtc="2025-11-21T08:26:00Z" ns0:id="465"/>
-        </ns0:rPr>
       </ns0:pPr>
       <ns0:r>
-        <ns0:t xml:space="preserve">🫱🏻‍🫲🏻 1005. Review met Jeroen uitvoeren</ns0:t>
-      </ns0:r>
-      <ns0:r ns0:rsidRPr="00B6720F" ns0:rsidR="00B6720F">
-        <ns0:t/>
-      </ns0:r>
-    </ns0:p>
-    <ns0:p ns0:rsidRPr="00B6720F" ns0:rsidR="00B6720F" ns0:rsidDel="00611532" ns0:rsidP="00C12619" ns0:rsidRDefault="00CF1D9E" ns2:paraId="2B538D2A" ns2:textId="42DD0BE8">
+        <ns0:t>🫱🏻‍🫲🏻 1002. Is de baas aanwezig?</ns0:t>
+      </ns0:r>
+    </ns0:p>
+    <ns0:p ns0:rsidR="00B6720F" ns0:rsidP="00B6720F" ns0:rsidRDefault="00CF1D9E">
+      <ns0:pPr>
+        <ns0:pStyle ns0:val="ListParagraph"/>
+        <ns0:numPr>
+          <ns0:ilvl ns0:val="1"/>
+          <ns0:numId ns0:val="40"/>
+        </ns0:numPr>
+      </ns0:pPr>
+      <ns0:r>
+        <ns0:t>4. Baas is mondeling beschikbaar?</ns0:t>
+      </ns0:r>
+    </ns0:p>
+    <ns0:p ns0:rsidR="00B6720F" ns0:rsidP="00B6720F" ns0:rsidRDefault="00CF1D9E">
       <ns0:pPr>
         <ns0:pStyle ns0:val="ListParagraph"/>
         <ns0:numPr>
           <ns0:ilvl ns0:val="0"/>
           <ns0:numId ns0:val="40"/>
         </ns0:numPr>
-        <ns0:rPr>
-          <ns0:del ns0:author="Rinse Cramer" ns0:date="2025-11-03T23:39:00Z" ns3:dateUtc="2025-11-03T22:39:00Z" ns0:id="466"/>
-        </ns0:rPr>
-      </ns0:pPr>
-      <ns0:del ns0:author="Rinse Cramer" ns0:date="2025-11-21T09:26:00Z" ns3:dateUtc="2025-11-21T08:26:00Z" ns0:id="467">
-        <ns0:r ns0:rsidDel="00C12619">
-          <ns0:delText xml:space="preserve">C. </ns0:delText>
-        </ns0:r>
-        <ns0:r ns0:rsidRPr="00B6720F" ns0:rsidDel="00C12619" ns0:rsidR="00B6720F">
-          <ns0:delText>Commit en push werk naar Git-archief</ns0:delText>
-        </ns0:r>
-      </ns0:del>
+      </ns0:pPr>
+      <ns0:r>
+        <ns0:t>🫱🏻‍🫲🏻 1002F. Meteen meldplicht wanneer de baas aanwezig is</ns0:t>
+      </ns0:r>
+    </ns0:p>
+    <ns0:p ns0:rsidR="00B6720F" ns0:rsidP="00B6720F" ns0:rsidRDefault="00CF1D9E">
+      <ns0:pPr>
+        <ns0:pStyle ns0:val="ListParagraph"/>
+        <ns0:numPr>
+          <ns0:ilvl ns0:val="1"/>
+          <ns0:numId ns0:val="40"/>
+        </ns0:numPr>
+      </ns0:pPr>
+      <ns0:r>
+        <ns0:t>5. Baas is schriftelijk beschikbaar</ns0:t>
+      </ns0:r>
+    </ns0:p>
+    <ns0:p ns0:rsidR="00B6720F" ns0:rsidP="00B6720F" ns0:rsidRDefault="00CF1D9E">
+      <ns0:pPr>
+        <ns0:pStyle ns0:val="ListParagraph"/>
+        <ns0:numPr>
+          <ns0:ilvl ns0:val="1"/>
+          <ns0:numId ns0:val="40"/>
+        </ns0:numPr>
+      </ns0:pPr>
+      <ns0:r>
+        <ns0:t>6. Aanwezigheid monitoren</ns0:t>
+      </ns0:r>
+    </ns0:p>
+    <ns0:p ns0:rsidR="00B6720F" ns0:rsidP="00B6720F" ns0:rsidRDefault="00CF1D9E">
+      <ns0:pPr>
+        <ns0:pStyle ns0:val="ListParagraph"/>
+        <ns0:numPr>
+          <ns0:ilvl ns0:val="0"/>
+          <ns0:numId ns0:val="40"/>
+        </ns0:numPr>
+      </ns0:pPr>
+      <ns0:r>
+        <ns0:t>🫱🏻‍🫲🏻 1002T. Na dat de baas weer aanwezig is</ns0:t>
+      </ns0:r>
+    </ns0:p>
+    <ns0:p ns0:rsidR="00B6720F" ns0:rsidP="00B6720F" ns0:rsidRDefault="00CF1D9E">
+      <ns0:pPr>
+        <ns0:pStyle ns0:val="ListParagraph"/>
+        <ns0:numPr>
+          <ns0:ilvl ns0:val="1"/>
+          <ns0:numId ns0:val="40"/>
+        </ns0:numPr>
+      </ns0:pPr>
+      <ns0:r>
+        <ns0:t>7. Baas is mondeling beschikbaar</ns0:t>
+      </ns0:r>
+    </ns0:p>
+    <ns0:p ns0:rsidR="00B6720F" ns0:rsidP="00B6720F" ns0:rsidRDefault="00CF1D9E">
+      <ns0:pPr>
+        <ns0:pStyle ns0:val="ListParagraph"/>
+        <ns0:numPr>
+          <ns0:ilvl ns0:val="0"/>
+          <ns0:numId ns0:val="40"/>
+        </ns0:numPr>
+      </ns0:pPr>
+      <ns0:r>
+        <ns0:t>🫱🏻‍🫲🏻 1004. Demonstratie van de oplossing geven</ns0:t>
+      </ns0:r>
+    </ns0:p>
+    <ns0:p ns0:rsidR="00B6720F" ns0:rsidP="00B6720F" ns0:rsidRDefault="00CF1D9E">
+      <ns0:pPr>
+        <ns0:pStyle ns0:val="ListParagraph"/>
+        <ns0:numPr>
+          <ns0:ilvl ns0:val="1"/>
+          <ns0:numId ns0:val="40"/>
+        </ns0:numPr>
+      </ns0:pPr>
+      <ns0:r>
+        <ns0:t>8. Ik geef een demonstratie van de oplossing aan de baas</ns0:t>
+      </ns0:r>
+    </ns0:p>
+    <ns0:p ns0:rsidR="00B6720F" ns0:rsidP="00B6720F" ns0:rsidRDefault="00CF1D9E">
+      <ns0:pPr>
+        <ns0:pStyle ns0:val="ListParagraph"/>
+        <ns0:numPr>
+          <ns0:ilvl ns0:val="0"/>
+          <ns0:numId ns0:val="40"/>
+        </ns0:numPr>
+      </ns0:pPr>
+      <ns0:r>
+        <ns0:t>🫱🏻‍🫲🏻 1005. Review met Jeroen uitvoeren</ns0:t>
+      </ns0:r>
+    </ns0:p>
+    <ns0:p ns0:rsidR="00B6720F" ns0:rsidP="00B6720F" ns0:rsidRDefault="00CF1D9E">
+      <ns0:pPr>
+        <ns0:pStyle ns0:val="ListParagraph"/>
+        <ns0:numPr>
+          <ns0:ilvl ns0:val="1"/>
+          <ns0:numId ns0:val="40"/>
+        </ns0:numPr>
+      </ns0:pPr>
+      <ns0:r>
+        <ns0:t>9. Ik loop de code en werking met Jeroen door</ns0:t>
+      </ns0:r>
+    </ns0:p>
+    <ns0:p ns0:rsidR="00B6720F" ns0:rsidP="00B6720F" ns0:rsidRDefault="00CF1D9E">
+      <ns0:pPr>
+        <ns0:pStyle ns0:val="ListParagraph"/>
+        <ns0:numPr>
+          <ns0:ilvl ns0:val="0"/>
+          <ns0:numId ns0:val="40"/>
+        </ns0:numPr>
+      </ns0:pPr>
+      <ns0:r>
+        <ns0:t>🫱🏻‍🫲🏻 1007. Goedkeuring?</ns0:t>
+      </ns0:r>
+    </ns0:p>
+    <ns0:p ns0:rsidR="00B6720F" ns0:rsidP="00B6720F" ns0:rsidRDefault="00CF1D9E">
+      <ns0:pPr>
+        <ns0:pStyle ns0:val="ListParagraph"/>
+        <ns0:numPr>
+          <ns0:ilvl ns0:val="1"/>
+          <ns0:numId ns0:val="40"/>
+        </ns0:numPr>
+      </ns0:pPr>
+      <ns0:r>
+        <ns0:t>10. Resultaten en oplossing zijn goedgekeurd?</ns0:t>
+      </ns0:r>
+    </ns0:p>
+    <ns0:p ns0:rsidR="00B6720F" ns0:rsidP="00B6720F" ns0:rsidRDefault="00CF1D9E">
+      <ns0:pPr>
+        <ns0:pStyle ns0:val="ListParagraph"/>
+        <ns0:numPr>
+          <ns0:ilvl ns0:val="0"/>
+          <ns0:numId ns0:val="40"/>
+        </ns0:numPr>
+      </ns0:pPr>
+      <ns0:r>
+        <ns0:t>🫱🏻‍🫲🏻 1007F. De baas bepaald volgende status en verifieert effort per resterende fase</ns0:t>
+      </ns0:r>
+    </ns0:p>
+    <ns0:p ns0:rsidR="00B6720F" ns0:rsidP="00B6720F" ns0:rsidRDefault="00CF1D9E">
+      <ns0:pPr>
+        <ns0:pStyle ns0:val="ListParagraph"/>
+        <ns0:numPr>
+          <ns0:ilvl ns0:val="1"/>
+          <ns0:numId ns0:val="40"/>
+        </ns0:numPr>
+      </ns0:pPr>
+      <ns0:r>
+        <ns0:t>11. Terug naar vorige flowchartpagina navigeren</ns0:t>
+      </ns0:r>
+    </ns0:p>
+    <ns0:p ns0:rsidR="00B6720F" ns0:rsidP="00B6720F" ns0:rsidRDefault="00CF1D9E">
+      <ns0:pPr>
+        <ns0:pStyle ns0:val="ListParagraph"/>
+        <ns0:numPr>
+          <ns0:ilvl ns0:val="0"/>
+          <ns0:numId ns0:val="40"/>
+        </ns0:numPr>
+      </ns0:pPr>
+      <ns0:r>
+        <ns0:t>🫱🏻‍🫲🏻 1007T. Beëindig tijdsregistratie</ns0:t>
+      </ns0:r>
+    </ns0:p>
+    <ns0:p ns0:rsidR="00B6720F" ns0:rsidP="00B6720F" ns0:rsidRDefault="00CF1D9E">
+      <ns0:pPr>
+        <ns0:pStyle ns0:val="ListParagraph"/>
+        <ns0:numPr>
+          <ns0:ilvl ns0:val="1"/>
+          <ns0:numId ns0:val="40"/>
+        </ns0:numPr>
+      </ns0:pPr>
+      <ns0:r>
+        <ns0:t>12. Beëindig tijdsregistratie</ns0:t>
+      </ns0:r>
+    </ns0:p>
+    <ns0:p ns0:rsidR="00B6720F" ns0:rsidP="00B6720F" ns0:rsidRDefault="00CF1D9E">
+      <ns0:pPr>
+        <ns0:pStyle ns0:val="ListParagraph"/>
+        <ns0:numPr>
+          <ns0:ilvl ns0:val="0"/>
+          <ns0:numId ns0:val="40"/>
+        </ns0:numPr>
+      </ns0:pPr>
+      <ns0:r>
+        <ns0:t>🫱🏻‍🫲🏻 1008. Zet Jira uitvoerder op de baas</ns0:t>
+      </ns0:r>
+    </ns0:p>
+    <ns0:p ns0:rsidR="00B6720F" ns0:rsidP="00B6720F" ns0:rsidRDefault="00CF1D9E">
+      <ns0:pPr>
+        <ns0:pStyle ns0:val="ListParagraph"/>
+        <ns0:numPr>
+          <ns0:ilvl ns0:val="1"/>
+          <ns0:numId ns0:val="40"/>
+        </ns0:numPr>
+      </ns0:pPr>
+      <ns0:r>
+        <ns0:t>13. Zet Jira-uitvoerder op de baas</ns0:t>
+      </ns0:r>
     </ns0:p>
     <ns0:p ns0:rsidRPr="00B6720F" ns0:rsidR="007E7B91" ns0:rsidRDefault="007E7B91" ns2:paraId="6BAB42B0" ns2:textId="4EB5B0FC">
       <ns0:pPr>

</xml_diff>

<commit_message>
docs(actielijst): restore missing special action and review special action steps to align with flowchart
</commit_message>
<xml_diff>
--- a/Actielijst.docx
+++ b/Actielijst.docx
@@ -7218,6 +7218,438 @@
           <ns0:pPr/>
         </ns0:pPrChange>
       </ns0:pPr>
+    </ns0:p>
+    <ns0:p ns0:rsidR="00B6720F" ns0:rsidP="00B6720F" ns0:rsidRDefault="00CF1D9E">
+      <ns0:pPr>
+        <ns0:pStyle ns0:val="ListParagraph"/>
+        <ns0:numPr>
+          <ns0:ilvl ns0:val="0"/>
+          <ns0:numId ns0:val="40"/>
+        </ns0:numPr>
+      </ns0:pPr>
+      <ns0:r>
+        <ns0:t>⚙️ Special action</ns0:t>
+      </ns0:r>
+    </ns0:p>
+    <ns0:p ns0:rsidR="00B6720F" ns0:rsidP="00B6720F" ns0:rsidRDefault="00CF1D9E">
+      <ns0:pPr>
+        <ns0:pStyle ns0:val="ListParagraph"/>
+        <ns0:numPr>
+          <ns0:ilvl ns0:val="0"/>
+          <ns0:numId ns0:val="41"/>
+        </ns0:numPr>
+      </ns0:pPr>
+      <ns0:r>
+        <ns0:t>⚙️ Status = special action</ns0:t>
+      </ns0:r>
+    </ns0:p>
+    <ns0:p ns0:rsidR="00B6720F" ns0:rsidP="00B6720F" ns0:rsidRDefault="00CF1D9E">
+      <ns0:pPr>
+        <ns0:pStyle ns0:val="ListParagraph"/>
+        <ns0:numPr>
+          <ns0:ilvl ns0:val="0"/>
+          <ns0:numId ns0:val="41"/>
+        </ns0:numPr>
+      </ns0:pPr>
+      <ns0:r>
+        <ns0:t>A. Start timer (ETC)</ns0:t>
+      </ns0:r>
+    </ns0:p>
+    <ns0:p ns0:rsidR="00B6720F" ns0:rsidP="00B6720F" ns0:rsidRDefault="00CF1D9E">
+      <ns0:pPr>
+        <ns0:pStyle ns0:val="ListParagraph"/>
+        <ns0:numPr>
+          <ns0:ilvl ns0:val="0"/>
+          <ns0:numId ns0:val="41"/>
+        </ns0:numPr>
+      </ns0:pPr>
+      <ns0:r>
+        <ns0:t>B. Intake verwerken</ns0:t>
+      </ns0:r>
+    </ns0:p>
+    <ns0:p ns0:rsidR="00B6720F" ns0:rsidP="00B6720F" ns0:rsidRDefault="00CF1D9E">
+      <ns0:pPr>
+        <ns0:pStyle ns0:val="ListParagraph"/>
+        <ns0:numPr>
+          <ns0:ilvl ns0:val="0"/>
+          <ns0:numId ns0:val="41"/>
+        </ns0:numPr>
+      </ns0:pPr>
+      <ns0:r>
+        <ns0:t>C. Oplossing implementeren</ns0:t>
+      </ns0:r>
+    </ns0:p>
+    <ns0:p ns0:rsidR="00B6720F" ns0:rsidP="00B6720F" ns0:rsidRDefault="00CF1D9E">
+      <ns0:pPr>
+        <ns0:pStyle ns0:val="ListParagraph"/>
+        <ns0:numPr>
+          <ns0:ilvl ns0:val="0"/>
+          <ns0:numId ns0:val="41"/>
+        </ns0:numPr>
+      </ns0:pPr>
+      <ns0:r>
+        <ns0:t>D. Evalueer of de deliverables correct en volledig zijn afgerond</ns0:t>
+      </ns0:r>
+    </ns0:p>
+    <ns0:p ns0:rsidR="00B6720F" ns0:rsidP="00B6720F" ns0:rsidRDefault="00CF1D9E">
+      <ns0:pPr>
+        <ns0:pStyle ns0:val="ListParagraph"/>
+        <ns0:numPr>
+          <ns0:ilvl ns0:val="0"/>
+          <ns0:numId ns0:val="41"/>
+        </ns0:numPr>
+      </ns0:pPr>
+      <ns0:r>
+        <ns0:t>E. Stop timer (ETC)</ns0:t>
+      </ns0:r>
+    </ns0:p>
+    <ns0:p ns0:rsidR="00B6720F" ns0:rsidP="00B6720F" ns0:rsidRDefault="00CF1D9E">
+      <ns0:pPr>
+        <ns0:pStyle ns0:val="ListParagraph"/>
+        <ns0:numPr>
+          <ns0:ilvl ns0:val="0"/>
+          <ns0:numId ns0:val="41"/>
+        </ns0:numPr>
+      </ns0:pPr>
+      <ns0:r>
+        <ns0:t>F. Bijzonderheden gezien?</ns0:t>
+      </ns0:r>
+    </ns0:p>
+    <ns0:p ns0:rsidR="00B6720F" ns0:rsidP="00B6720F" ns0:rsidRDefault="00CF1D9E">
+      <ns0:pPr>
+        <ns0:pStyle ns0:val="ListParagraph"/>
+        <ns0:numPr>
+          <ns0:ilvl ns0:val="0"/>
+          <ns0:numId ns0:val="41"/>
+        </ns0:numPr>
+      </ns0:pPr>
+      <ns0:r>
+        <ns0:t>G. Volg de meldplicht</ns0:t>
+      </ns0:r>
+    </ns0:p>
+    <ns0:p ns0:rsidR="00B6720F" ns0:rsidP="00B6720F" ns0:rsidRDefault="00CF1D9E">
+      <ns0:pPr>
+        <ns0:pStyle ns0:val="ListParagraph"/>
+        <ns0:numPr>
+          <ns0:ilvl ns0:val="0"/>
+          <ns0:numId ns0:val="41"/>
+        </ns0:numPr>
+      </ns0:pPr>
+      <ns0:r>
+        <ns0:t>H. Volg de review special action</ns0:t>
+      </ns0:r>
+    </ns0:p>
+    <ns0:p ns0:rsidR="00B6720F" ns0:rsidP="00B6720F" ns0:rsidRDefault="00CF1D9E">
+      <ns0:pPr>
+        <ns0:pStyle ns0:val="ListParagraph"/>
+        <ns0:numPr>
+          <ns0:ilvl ns0:val="0"/>
+          <ns0:numId ns0:val="41"/>
+        </ns0:numPr>
+      </ns0:pPr>
+      <ns0:r>
+        <ns0:t>I. Na 2/3 ETC Na 100% ETC Na 150% ETC</ns0:t>
+      </ns0:r>
+    </ns0:p>
+    <ns0:p ns0:rsidR="00B6720F" ns0:rsidP="00B6720F" ns0:rsidRDefault="00CF1D9E">
+      <ns0:pPr>
+        <ns0:pStyle ns0:val="ListParagraph"/>
+        <ns0:numPr>
+          <ns0:ilvl ns0:val="0"/>
+          <ns0:numId ns0:val="41"/>
+        </ns0:numPr>
+      </ns0:pPr>
+      <ns0:r>
+        <ns0:t>J. Start timer (1 min)</ns0:t>
+      </ns0:r>
+    </ns0:p>
+    <ns0:p ns0:rsidR="00B6720F" ns0:rsidP="00B6720F" ns0:rsidRDefault="00CF1D9E">
+      <ns0:pPr>
+        <ns0:pStyle ns0:val="ListParagraph"/>
+        <ns0:numPr>
+          <ns0:ilvl ns0:val="0"/>
+          <ns0:numId ns0:val="41"/>
+        </ns0:numPr>
+      </ns0:pPr>
+      <ns0:r>
+        <ns0:t>K. Hoe lang denk je nog nodig te hebben?</ns0:t>
+      </ns0:r>
+    </ns0:p>
+    <ns0:p ns0:rsidR="00B6720F" ns0:rsidP="00B6720F" ns0:rsidRDefault="00CF1D9E">
+      <ns0:pPr>
+        <ns0:pStyle ns0:val="ListParagraph"/>
+        <ns0:numPr>
+          <ns0:ilvl ns0:val="0"/>
+          <ns0:numId ns0:val="41"/>
+        </ns0:numPr>
+      </ns0:pPr>
+      <ns0:r>
+        <ns0:t>L. sa: m.</ns0:t>
+      </ns0:r>
+    </ns0:p>
+    <ns0:p ns0:rsidR="00B6720F" ns0:rsidP="00B6720F" ns0:rsidRDefault="00CF1D9E">
+      <ns0:pPr>
+        <ns0:pStyle ns0:val="ListParagraph"/>
+        <ns0:numPr>
+          <ns0:ilvl ns0:val="0"/>
+          <ns0:numId ns0:val="41"/>
+        </ns0:numPr>
+      </ns0:pPr>
+      <ns0:r>
+        <ns0:t>M. Haal ik het?</ns0:t>
+      </ns0:r>
+    </ns0:p>
+    <ns0:p ns0:rsidR="00B6720F" ns0:rsidP="00B6720F" ns0:rsidRDefault="00CF1D9E">
+      <ns0:pPr>
+        <ns0:pStyle ns0:val="ListParagraph"/>
+        <ns0:numPr>
+          <ns0:ilvl ns0:val="0"/>
+          <ns0:numId ns0:val="41"/>
+        </ns0:numPr>
+      </ns0:pPr>
+      <ns0:r>
+        <ns0:t>N. Stop timer (1 min)</ns0:t>
+      </ns0:r>
+    </ns0:p>
+    <ns0:p ns0:rsidR="00B6720F" ns0:rsidP="00B6720F" ns0:rsidRDefault="00CF1D9E">
+      <ns0:pPr>
+        <ns0:pStyle ns0:val="ListParagraph"/>
+        <ns0:numPr>
+          <ns0:ilvl ns0:val="0"/>
+          <ns0:numId ns0:val="41"/>
+        </ns0:numPr>
+      </ns0:pPr>
+      <ns0:r>
+        <ns0:t>O. Stop timer (1 min) Start timer (4 min)</ns0:t>
+      </ns0:r>
+    </ns0:p>
+    <ns0:p ns0:rsidR="00B6720F" ns0:rsidP="00B6720F" ns0:rsidRDefault="00CF1D9E">
+      <ns0:pPr>
+        <ns0:pStyle ns0:val="ListParagraph"/>
+        <ns0:numPr>
+          <ns0:ilvl ns0:val="0"/>
+          <ns0:numId ns0:val="41"/>
+        </ns0:numPr>
+      </ns0:pPr>
+      <ns0:r>
+        <ns0:t>P. Hoe heeft het zo lang kunnen duren?</ns0:t>
+      </ns0:r>
+    </ns0:p>
+    <ns0:p ns0:rsidR="00B6720F" ns0:rsidP="00B6720F" ns0:rsidRDefault="00CF1D9E">
+      <ns0:pPr>
+        <ns0:pStyle ns0:val="ListParagraph"/>
+        <ns0:numPr>
+          <ns0:ilvl ns0:val="0"/>
+          <ns0:numId ns0:val="41"/>
+        </ns0:numPr>
+      </ns0:pPr>
+      <ns0:r>
+        <ns0:t>Q. Stop timer (4 min)</ns0:t>
+      </ns0:r>
+    </ns0:p>
+    <ns0:p ns0:rsidR="00B6720F" ns0:rsidP="00B6720F" ns0:rsidRDefault="00CF1D9E">
+      <ns0:pPr>
+        <ns0:pStyle ns0:val="ListParagraph"/>
+        <ns0:numPr>
+          <ns0:ilvl ns0:val="0"/>
+          <ns0:numId ns0:val="41"/>
+        </ns0:numPr>
+      </ns0:pPr>
+      <ns0:r>
+        <ns0:t>R. Significant inzicht gekregen</ns0:t>
+      </ns0:r>
+    </ns0:p>
+    <ns0:p ns0:rsidR="00B6720F" ns0:rsidP="00B6720F" ns0:rsidRDefault="00CF1D9E">
+      <ns0:pPr>
+        <ns0:pStyle ns0:val="ListParagraph"/>
+        <ns0:numPr>
+          <ns0:ilvl ns0:val="0"/>
+          <ns0:numId ns0:val="40"/>
+        </ns0:numPr>
+      </ns0:pPr>
+      <ns0:r>
+        <ns0:t>🫱🏻‍🫲🏻 Review Special Action</ns0:t>
+      </ns0:r>
+    </ns0:p>
+    <ns0:p ns0:rsidR="00B6720F" ns0:rsidP="00B6720F" ns0:rsidRDefault="00CF1D9E">
+      <ns0:pPr>
+        <ns0:pStyle ns0:val="ListParagraph"/>
+        <ns0:numPr>
+          <ns0:ilvl ns0:val="0"/>
+          <ns0:numId ns0:val="42"/>
+        </ns0:numPr>
+      </ns0:pPr>
+      <ns0:r>
+        <ns0:t>🫱🏻‍🫲🏻 A. Status = review special action</ns0:t>
+      </ns0:r>
+    </ns0:p>
+    <ns0:p ns0:rsidR="00B6720F" ns0:rsidP="00B6720F" ns0:rsidRDefault="00CF1D9E">
+      <ns0:pPr>
+        <ns0:pStyle ns0:val="ListParagraph"/>
+        <ns0:numPr>
+          <ns0:ilvl ns0:val="1"/>
+          <ns0:numId ns0:val="42"/>
+        </ns0:numPr>
+      </ns0:pPr>
+      <ns0:r>
+        <ns0:t>1. Jira-uitvoerder is medewerker</ns0:t>
+      </ns0:r>
+    </ns0:p>
+    <ns0:p ns0:rsidR="00B6720F" ns0:rsidP="00B6720F" ns0:rsidRDefault="00CF1D9E">
+      <ns0:pPr>
+        <ns0:pStyle ns0:val="ListParagraph"/>
+        <ns0:numPr>
+          <ns0:ilvl ns0:val="1"/>
+          <ns0:numId ns0:val="42"/>
+        </ns0:numPr>
+      </ns0:pPr>
+      <ns0:r>
+        <ns0:t>2. Jira-status is Special action</ns0:t>
+      </ns0:r>
+    </ns0:p>
+    <ns0:p ns0:rsidR="00B6720F" ns0:rsidP="00B6720F" ns0:rsidRDefault="00CF1D9E">
+      <ns0:pPr>
+        <ns0:pStyle ns0:val="ListParagraph"/>
+        <ns0:numPr>
+          <ns0:ilvl ns0:val="1"/>
+          <ns0:numId ns0:val="42"/>
+        </ns0:numPr>
+      </ns0:pPr>
+      <ns0:r>
+        <ns0:t>3. Jira-status wordt Review special action</ns0:t>
+      </ns0:r>
+    </ns0:p>
+    <ns0:p ns0:rsidR="00B6720F" ns0:rsidP="00B6720F" ns0:rsidRDefault="00CF1D9E">
+      <ns0:pPr>
+        <ns0:pStyle ns0:val="ListParagraph"/>
+        <ns0:numPr>
+          <ns0:ilvl ns0:val="0"/>
+          <ns0:numId ns0:val="42"/>
+        </ns0:numPr>
+      </ns0:pPr>
+      <ns0:r>
+        <ns0:t>🫱🏻‍🫲🏻 B. Is de baas aanwezig?</ns0:t>
+      </ns0:r>
+    </ns0:p>
+    <ns0:p ns0:rsidR="00B6720F" ns0:rsidP="00B6720F" ns0:rsidRDefault="00CF1D9E">
+      <ns0:pPr>
+        <ns0:pStyle ns0:val="ListParagraph"/>
+        <ns0:numPr>
+          <ns0:ilvl ns0:val="1"/>
+          <ns0:numId ns0:val="42"/>
+        </ns0:numPr>
+      </ns0:pPr>
+      <ns0:r>
+        <ns0:t>4. Baas is mondeling beschikbaar?</ns0:t>
+      </ns0:r>
+    </ns0:p>
+    <ns0:p ns0:rsidR="00B6720F" ns0:rsidP="00B6720F" ns0:rsidRDefault="00CF1D9E">
+      <ns0:pPr>
+        <ns0:pStyle ns0:val="ListParagraph"/>
+        <ns0:numPr>
+          <ns0:ilvl ns0:val="0"/>
+          <ns0:numId ns0:val="42"/>
+        </ns0:numPr>
+      </ns0:pPr>
+      <ns0:r>
+        <ns0:t>🫱🏻‍🫲🏻 C. Meteen meldplicht wanneer de baas aanwezig is</ns0:t>
+      </ns0:r>
+    </ns0:p>
+    <ns0:p ns0:rsidR="00B6720F" ns0:rsidP="00B6720F" ns0:rsidRDefault="00CF1D9E">
+      <ns0:pPr>
+        <ns0:pStyle ns0:val="ListParagraph"/>
+        <ns0:numPr>
+          <ns0:ilvl ns0:val="1"/>
+          <ns0:numId ns0:val="42"/>
+        </ns0:numPr>
+      </ns0:pPr>
+      <ns0:r>
+        <ns0:t>5. Baas is schriftelijk bereikbaar</ns0:t>
+      </ns0:r>
+    </ns0:p>
+    <ns0:p ns0:rsidR="00B6720F" ns0:rsidP="00B6720F" ns0:rsidRDefault="00CF1D9E">
+      <ns0:pPr>
+        <ns0:pStyle ns0:val="ListParagraph"/>
+        <ns0:numPr>
+          <ns0:ilvl ns0:val="1"/>
+          <ns0:numId ns0:val="42"/>
+        </ns0:numPr>
+      </ns0:pPr>
+      <ns0:r>
+        <ns0:t>6. Aanwezigheid monitoren</ns0:t>
+      </ns0:r>
+    </ns0:p>
+    <ns0:p ns0:rsidR="00B6720F" ns0:rsidP="00B6720F" ns0:rsidRDefault="00CF1D9E">
+      <ns0:pPr>
+        <ns0:pStyle ns0:val="ListParagraph"/>
+        <ns0:numPr>
+          <ns0:ilvl ns0:val="0"/>
+          <ns0:numId ns0:val="42"/>
+        </ns0:numPr>
+      </ns0:pPr>
+      <ns0:r>
+        <ns0:t>🫱🏻‍🫲🏻 D. Na dat de baas weer aanwezig is</ns0:t>
+      </ns0:r>
+    </ns0:p>
+    <ns0:p ns0:rsidR="00B6720F" ns0:rsidP="00B6720F" ns0:rsidRDefault="00CF1D9E">
+      <ns0:pPr>
+        <ns0:pStyle ns0:val="ListParagraph"/>
+        <ns0:numPr>
+          <ns0:ilvl ns0:val="1"/>
+          <ns0:numId ns0:val="42"/>
+        </ns0:numPr>
+      </ns0:pPr>
+      <ns0:r>
+        <ns0:t>7. Baas is mondeling beschikbaar</ns0:t>
+      </ns0:r>
+    </ns0:p>
+    <ns0:p ns0:rsidR="00B6720F" ns0:rsidP="00B6720F" ns0:rsidRDefault="00CF1D9E">
+      <ns0:pPr>
+        <ns0:pStyle ns0:val="ListParagraph"/>
+        <ns0:numPr>
+          <ns0:ilvl ns0:val="0"/>
+          <ns0:numId ns0:val="42"/>
+        </ns0:numPr>
+      </ns0:pPr>
+      <ns0:r>
+        <ns0:t>🫱🏻‍🫲🏻 E. Overleg resultaten voor goedkeuring vervolg</ns0:t>
+      </ns0:r>
+    </ns0:p>
+    <ns0:p ns0:rsidR="00B6720F" ns0:rsidP="00B6720F" ns0:rsidRDefault="00CF1D9E">
+      <ns0:pPr>
+        <ns0:pStyle ns0:val="ListParagraph"/>
+        <ns0:numPr>
+          <ns0:ilvl ns0:val="1"/>
+          <ns0:numId ns0:val="42"/>
+        </ns0:numPr>
+      </ns0:pPr>
+      <ns0:r>
+        <ns0:t>8. Ik mail naar baas</ns0:t>
+      </ns0:r>
+    </ns0:p>
+    <ns0:p ns0:rsidR="00B6720F" ns0:rsidP="00B6720F" ns0:rsidRDefault="00CF1D9E">
+      <ns0:pPr>
+        <ns0:pStyle ns0:val="ListParagraph"/>
+        <ns0:numPr>
+          <ns0:ilvl ns0:val="0"/>
+          <ns0:numId ns0:val="42"/>
+        </ns0:numPr>
+      </ns0:pPr>
+      <ns0:r>
+        <ns0:t>🫱🏻‍🫲🏻 F. De baas bepaald volgende status</ns0:t>
+      </ns0:r>
+    </ns0:p>
+    <ns0:p ns0:rsidR="00B6720F" ns0:rsidP="00B6720F" ns0:rsidRDefault="00CF1D9E">
+      <ns0:pPr>
+        <ns0:pStyle ns0:val="ListParagraph"/>
+        <ns0:numPr>
+          <ns0:ilvl ns0:val="1"/>
+          <ns0:numId ns0:val="42"/>
+        </ns0:numPr>
+      </ns0:pPr>
+      <ns0:r>
+        <ns0:t>9. Resultaten zijn goedgekeurd?</ns0:t>
+      </ns0:r>
     </ns0:p>
     <ns0:sectPr ns0:rsidRPr="00B6720F" ns0:rsidR="007E7B91">
       <ns0:pgSz ns0:w="11906" ns0:h="16838" ns0:orient="portrait"/>

</xml_diff>